<commit_message>
Expand Bakery on Cutter Street to 39 chapters (about 55,700 words); rebuild EPUB and DOCX; guide now requires one cover
Co-Authored-By: Claude Haiku 5.5 <noreply@anthropic.com>
Claude-Session: https://claude.ai/code/session_01MZeVJcyf7XvKRRCE6AUkLk
</commit_message>
<xml_diff>
--- a/ebooks-Raw/guide.docx
+++ b/ebooks-Raw/guide.docx
@@ -956,7 +956,7 @@
         </w:numPr>
       </w:pPr>
       <w:r>
-        <w:t xml:space="preserve">Create three cover options per book and save all three. The owner chooses one before upload.</w:t>
+        <w:t>Create one cover per book and save it. The owner approves it before upload.</w:t>
       </w:r>
     </w:p>
     <w:p>
@@ -1583,7 +1583,7 @@
         </w:numPr>
       </w:pPr>
       <w:r>
-        <w:t xml:space="preserve">Cover meets the specs in section 5, and three options are saved.</w:t>
+        <w:t>Cover meets the specs in section 5, and the approved cover is saved.</w:t>
       </w:r>
     </w:p>
     <w:p>
@@ -1692,7 +1692,7 @@
         </w:numPr>
       </w:pPr>
       <w:r>
-        <w:t xml:space="preserve">cover-ebook.jpg and cover options 2 and 3</w:t>
+        <w:t>cover-ebook.jpg</w:t>
       </w:r>
     </w:p>
     <w:p>

</xml_diff>

<commit_message>
Enforce category rules automatically; update guide and reports README
- pick_topic skips topics whose categories are missing or not confirmed.
- sync_topics rejects categories outside the pool and reports errors.
- Halden Point and Bakery log entries carry exact pool categories.
- category-pool.md: readable copy of the pool.
- Guide describes the automatic gates.
- reports/README describes the current live status and archives the snapshot.

Co-Authored-By: Claude Haiku 5.5 <noreply@anthropic.com>
Claude-Session: https://claude.ai/code/session_01MZeVJcyf7XvKRRCE6AUkLk
</commit_message>
<xml_diff>
--- a/ebooks-Raw/guide.docx
+++ b/ebooks-Raw/guide.docx
@@ -2,82 +2,6 @@
 <file path=word/document.xml><?xml version="1.0" encoding="utf-8"?>
 <w:document xmlns:w="http://schemas.openxmlformats.org/wordprocessingml/2006/main" xmlns:m="http://schemas.openxmlformats.org/officeDocument/2006/math" xmlns:r="http://schemas.openxmlformats.org/officeDocument/2006/relationships" xmlns:o="urn:schemas-microsoft-com:office:office" xmlns:v="urn:schemas-microsoft-com:vml" xmlns:w10="urn:schemas-microsoft-com:office:word" xmlns:a="http://schemas.openxmlformats.org/drawingml/2006/main" xmlns:pic="http://schemas.openxmlformats.org/drawingml/2006/picture" xmlns:wp="http://schemas.openxmlformats.org/drawingml/2006/wordprocessingDrawing">
   <w:body>
-    <w:p>
-      <w:pPr>
-        <w:pStyle w:val="Title"/>
-      </w:pPr>
-      <w:r>
-        <w:t xml:space="preserve">Ebook</w:t>
-      </w:r>
-      <w:r>
-        <w:t xml:space="preserve"> </w:t>
-      </w:r>
-      <w:r>
-        <w:t xml:space="preserve">Creation</w:t>
-      </w:r>
-      <w:r>
-        <w:t xml:space="preserve"> </w:t>
-      </w:r>
-      <w:r>
-        <w:t xml:space="preserve">Guide</w:t>
-      </w:r>
-    </w:p>
-    <w:p>
-      <w:pPr>
-        <w:pStyle w:val="Subtitle"/>
-      </w:pPr>
-      <w:r>
-        <w:t xml:space="preserve">Version</w:t>
-      </w:r>
-      <w:r>
-        <w:t xml:space="preserve"> </w:t>
-      </w:r>
-      <w:r>
-        <w:t xml:space="preserve">2.0,</w:t>
-      </w:r>
-      <w:r>
-        <w:t xml:space="preserve"> </w:t>
-      </w:r>
-      <w:r>
-        <w:t xml:space="preserve">18</w:t>
-      </w:r>
-      <w:r>
-        <w:t xml:space="preserve"> </w:t>
-      </w:r>
-      <w:r>
-        <w:t xml:space="preserve">October</w:t>
-      </w:r>
-      <w:r>
-        <w:t xml:space="preserve"> </w:t>
-      </w:r>
-      <w:r>
-        <w:t xml:space="preserve">2026.</w:t>
-      </w:r>
-      <w:r>
-        <w:t xml:space="preserve"> </w:t>
-      </w:r>
-      <w:r>
-        <w:t xml:space="preserve">Status:</w:t>
-      </w:r>
-      <w:r>
-        <w:t xml:space="preserve"> </w:t>
-      </w:r>
-      <w:r>
-        <w:t xml:space="preserve">approved</w:t>
-      </w:r>
-      <w:r>
-        <w:t xml:space="preserve"> </w:t>
-      </w:r>
-      <w:r>
-        <w:t xml:space="preserve">by</w:t>
-      </w:r>
-      <w:r>
-        <w:t xml:space="preserve"> </w:t>
-      </w:r>
-      <w:r>
-        <w:t xml:space="preserve">owner</w:t>
-      </w:r>
-    </w:p>
     <w:bookmarkStart w:id="39" w:name="ebook-creation-guide-version-2.0"/>
     <w:p>
       <w:pPr>
@@ -92,7 +16,13 @@
         <w:pStyle w:val="FirstParagraph"/>
       </w:pPr>
       <w:r>
-        <w:t xml:space="preserve">This guide is the rulebook for the Kindle pipeline. Every robot reads it before starting work. Anything marked</w:t>
+        <w:t xml:space="preserve">This guide is the rulebook for the Kindle pipeline. Every robot reads it</w:t>
+      </w:r>
+      <w:r>
+        <w:t xml:space="preserve"> </w:t>
+      </w:r>
+      <w:r>
+        <w:t xml:space="preserve">before starting work. Anything marked</w:t>
       </w:r>
       <w:r>
         <w:t xml:space="preserve"> </w:t>
@@ -108,7 +38,13 @@
         <w:t xml:space="preserve"> </w:t>
       </w:r>
       <w:r>
-        <w:t xml:space="preserve">must be done. Anything marked</w:t>
+        <w:t xml:space="preserve">must be done.</w:t>
+      </w:r>
+      <w:r>
+        <w:t xml:space="preserve"> </w:t>
+      </w:r>
+      <w:r>
+        <w:t xml:space="preserve">Anything marked</w:t>
       </w:r>
       <w:r>
         <w:t xml:space="preserve"> </w:t>
@@ -124,7 +60,13 @@
         <w:t xml:space="preserve"> </w:t>
       </w:r>
       <w:r>
-        <w:t xml:space="preserve">can be adjusted, but the change must be recorded in the book’s review-notes.md.</w:t>
+        <w:t xml:space="preserve">can be adjusted, but the change must be</w:t>
+      </w:r>
+      <w:r>
+        <w:t xml:space="preserve"> </w:t>
+      </w:r>
+      <w:r>
+        <w:t xml:space="preserve">recorded in the book’s review-notes.md.</w:t>
       </w:r>
     </w:p>
     <w:p>
@@ -154,7 +96,13 @@
         <w:t xml:space="preserve">"guide_version": "2.0"</w:t>
       </w:r>
       <w:r>
-        <w:t xml:space="preserve">. Changes need the owner’s sign-off, and each change is recorded in section 19.</w:t>
+        <w:t xml:space="preserve">. Changes need the owner’s sign-off, and each</w:t>
+      </w:r>
+      <w:r>
+        <w:t xml:space="preserve"> </w:t>
+      </w:r>
+      <w:r>
+        <w:t xml:space="preserve">change is recorded in section 19.</w:t>
       </w:r>
     </w:p>
     <w:bookmarkStart w:id="20" w:name="scope-and-roles"/>
@@ -185,7 +133,13 @@
         <w:t xml:space="preserve"> </w:t>
       </w:r>
       <w:r>
-        <w:t xml:space="preserve">Kindle eBooks for Amazon KDP only. Text-only EPUB, with a fixed-layout EPUB where the format requires it.</w:t>
+        <w:t xml:space="preserve">Kindle eBooks for Amazon KDP only. Text-only EPUB, with a</w:t>
+      </w:r>
+      <w:r>
+        <w:t xml:space="preserve"> </w:t>
+      </w:r>
+      <w:r>
+        <w:t xml:space="preserve">fixed-layout EPUB where the format requires it.</w:t>
       </w:r>
       <w:r>
         <w:t xml:space="preserve"> </w:t>
@@ -195,57 +149,27 @@
           <w:bCs/>
           <w:b/>
         </w:rPr>
-        <w:t xml:space="preserve">Print books are out of scope.</w:t>
-      </w:r>
-      <w:r>
-        <w:t xml:space="preserve"> </w:t>
-      </w:r>
-      <w:r>
-        <w:t xml:space="preserve">No print PDF is made.</w:t>
-      </w:r>
-    </w:p>
-    <w:p>
-      <w:pPr>
-        <w:numPr>
-          <w:ilvl w:val="0"/>
-          <w:numId w:val="1001"/>
-        </w:numPr>
-        <w:pStyle w:val="Compact"/>
-      </w:pPr>
+        <w:t xml:space="preserve">Print books are</w:t>
+      </w:r>
       <w:r>
         <w:rPr>
           <w:bCs/>
           <w:b/>
         </w:rPr>
-        <w:t xml:space="preserve">Kindle-1 (research):</w:t>
-      </w:r>
-      <w:r>
-        <w:t xml:space="preserve"> </w:t>
-      </w:r>
-      <w:r>
-        <w:t xml:space="preserve">chooses two topics from the approved category pool each day and writes a scored topic entry.</w:t>
-      </w:r>
-    </w:p>
-    <w:p>
-      <w:pPr>
-        <w:numPr>
-          <w:ilvl w:val="0"/>
-          <w:numId w:val="1001"/>
-        </w:numPr>
-        <w:pStyle w:val="Compact"/>
-      </w:pPr>
+        <w:t xml:space="preserve"> </w:t>
+      </w:r>
       <w:r>
         <w:rPr>
           <w:bCs/>
           <w:b/>
         </w:rPr>
-        <w:t xml:space="preserve">Kindle-2 (writer):</w:t>
-      </w:r>
-      <w:r>
-        <w:t xml:space="preserve"> </w:t>
-      </w:r>
-      <w:r>
-        <w:t xml:space="preserve">writes one book from one unused topic and checks it.</w:t>
+        <w:t xml:space="preserve">out of scope.</w:t>
+      </w:r>
+      <w:r>
+        <w:t xml:space="preserve"> </w:t>
+      </w:r>
+      <w:r>
+        <w:t xml:space="preserve">No print PDF is made.</w:t>
       </w:r>
     </w:p>
     <w:p>
@@ -261,28 +185,19 @@
           <w:bCs/>
           <w:b/>
         </w:rPr>
-        <w:t xml:space="preserve">Kindle-3 (cover and review):</w:t>
-      </w:r>
-      <w:r>
-        <w:t xml:space="preserve"> </w:t>
-      </w:r>
-      <w:r>
-        <w:t xml:space="preserve">makes the cover, checks the whole package, and places approved packages in</w:t>
-      </w:r>
-      <w:r>
-        <w:t xml:space="preserve"> </w:t>
-      </w:r>
-      <w:r>
-        <w:t xml:space="preserve">“</w:t>
-      </w:r>
-      <w:r>
-        <w:t xml:space="preserve">Ready to publish</w:t>
-      </w:r>
-      <w:r>
-        <w:t xml:space="preserve">”</w:t>
-      </w:r>
-      <w:r>
-        <w:t xml:space="preserve">.</w:t>
+        <w:t xml:space="preserve">Kindle-1 (research):</w:t>
+      </w:r>
+      <w:r>
+        <w:t xml:space="preserve"> </w:t>
+      </w:r>
+      <w:r>
+        <w:t xml:space="preserve">chooses two topics from the approved</w:t>
+      </w:r>
+      <w:r>
+        <w:t xml:space="preserve"> </w:t>
+      </w:r>
+      <w:r>
+        <w:t xml:space="preserve">category pool each day and writes a scored topic entry.</w:t>
       </w:r>
     </w:p>
     <w:p>
@@ -298,13 +213,19 @@
           <w:bCs/>
           <w:b/>
         </w:rPr>
-        <w:t xml:space="preserve">Kindle-4 (publisher prep):</w:t>
-      </w:r>
-      <w:r>
-        <w:t xml:space="preserve"> </w:t>
-      </w:r>
-      <w:r>
-        <w:t xml:space="preserve">prepares a KDP draft from the approved package and stops before Publish.</w:t>
+        <w:t xml:space="preserve">Kindle-2 (writer):</w:t>
+      </w:r>
+      <w:r>
+        <w:t xml:space="preserve"> </w:t>
+      </w:r>
+      <w:r>
+        <w:t xml:space="preserve">writes one book from one unused topic and</w:t>
+      </w:r>
+      <w:r>
+        <w:t xml:space="preserve"> </w:t>
+      </w:r>
+      <w:r>
+        <w:t xml:space="preserve">checks it.</w:t>
       </w:r>
     </w:p>
     <w:p>
@@ -320,13 +241,90 @@
           <w:bCs/>
           <w:b/>
         </w:rPr>
+        <w:t xml:space="preserve">Kindle-3 (cover and review):</w:t>
+      </w:r>
+      <w:r>
+        <w:t xml:space="preserve"> </w:t>
+      </w:r>
+      <w:r>
+        <w:t xml:space="preserve">makes the cover, checks the whole</w:t>
+      </w:r>
+      <w:r>
+        <w:t xml:space="preserve"> </w:t>
+      </w:r>
+      <w:r>
+        <w:t xml:space="preserve">package, and places approved packages in</w:t>
+      </w:r>
+      <w:r>
+        <w:t xml:space="preserve"> </w:t>
+      </w:r>
+      <w:r>
+        <w:t xml:space="preserve">“</w:t>
+      </w:r>
+      <w:r>
+        <w:t xml:space="preserve">Ready to publish</w:t>
+      </w:r>
+      <w:r>
+        <w:t xml:space="preserve">”</w:t>
+      </w:r>
+      <w:r>
+        <w:t xml:space="preserve">.</w:t>
+      </w:r>
+    </w:p>
+    <w:p>
+      <w:pPr>
+        <w:numPr>
+          <w:ilvl w:val="0"/>
+          <w:numId w:val="1001"/>
+        </w:numPr>
+        <w:pStyle w:val="Compact"/>
+      </w:pPr>
+      <w:r>
+        <w:rPr>
+          <w:bCs/>
+          <w:b/>
+        </w:rPr>
+        <w:t xml:space="preserve">Kindle-4 (publisher prep):</w:t>
+      </w:r>
+      <w:r>
+        <w:t xml:space="preserve"> </w:t>
+      </w:r>
+      <w:r>
+        <w:t xml:space="preserve">prepares a KDP draft from the</w:t>
+      </w:r>
+      <w:r>
+        <w:t xml:space="preserve"> </w:t>
+      </w:r>
+      <w:r>
+        <w:t xml:space="preserve">approved package and stops before Publish.</w:t>
+      </w:r>
+    </w:p>
+    <w:p>
+      <w:pPr>
+        <w:numPr>
+          <w:ilvl w:val="0"/>
+          <w:numId w:val="1001"/>
+        </w:numPr>
+        <w:pStyle w:val="Compact"/>
+      </w:pPr>
+      <w:r>
+        <w:rPr>
+          <w:bCs/>
+          <w:b/>
+        </w:rPr>
         <w:t xml:space="preserve">Owner:</w:t>
       </w:r>
       <w:r>
         <w:t xml:space="preserve"> </w:t>
       </w:r>
       <w:r>
-        <w:t xml:space="preserve">confirms category paths, decides on held topics, checks each cover at upload, uploads each book to KDP, and clicks Publish.</w:t>
+        <w:t xml:space="preserve">confirms category paths, decides on held topics, checks</w:t>
+      </w:r>
+      <w:r>
+        <w:t xml:space="preserve"> </w:t>
+      </w:r>
+      <w:r>
+        <w:t xml:space="preserve">each cover at upload, uploads each book to KDP, and clicks Publish.</w:t>
       </w:r>
     </w:p>
     <w:bookmarkEnd w:id="20"/>
@@ -527,7 +525,13 @@
         <w:t xml:space="preserve"> </w:t>
       </w:r>
       <w:r>
-        <w:t xml:space="preserve">(5 to 12 items),</w:t>
+        <w:t xml:space="preserve">(5 to</w:t>
+      </w:r>
+      <w:r>
+        <w:t xml:space="preserve"> </w:t>
+      </w:r>
+      <w:r>
+        <w:t xml:space="preserve">12 items),</w:t>
       </w:r>
       <w:r>
         <w:t xml:space="preserve"> </w:t>
@@ -601,7 +605,13 @@
         <w:pStyle w:val="FirstParagraph"/>
       </w:pPr>
       <w:r>
-        <w:t xml:space="preserve">If any REQUIRED field is missing, the robot stops and logs the run as blocked. It does not guess.</w:t>
+        <w:t xml:space="preserve">If any REQUIRED field is missing, the robot stops and logs the run as</w:t>
+      </w:r>
+      <w:r>
+        <w:t xml:space="preserve"> </w:t>
+      </w:r>
+      <w:r>
+        <w:t xml:space="preserve">blocked. It does not guess.</w:t>
       </w:r>
     </w:p>
     <w:bookmarkEnd w:id="21"/>
@@ -617,15 +627,15 @@
     <w:tbl>
       <w:tblPr>
         <w:tblStyle w:val="Table"/>
-        <w:tblW w:type="pct" w:w="5000"/>
+        <w:tblW w:type="pct" w:w="4865"/>
         <w:tblLook w:firstRow="1" w:lastRow="0" w:firstColumn="0" w:lastColumn="0" w:noHBand="0" w:noVBand="0" w:val="0020"/>
         <w:jc w:val="start"/>
       </w:tblPr>
       <w:tblGrid>
-        <w:gridCol w:w="1980"/>
-        <w:gridCol w:w="1980"/>
-        <w:gridCol w:w="1980"/>
-        <w:gridCol w:w="1980"/>
+        <w:gridCol w:w="1926"/>
+        <w:gridCol w:w="1926"/>
+        <w:gridCol w:w="1926"/>
+        <w:gridCol w:w="1926"/>
       </w:tblGrid>
       <w:tr>
         <w:trPr>
@@ -689,19 +699,31 @@
               <w:jc w:val="left"/>
             </w:pPr>
             <w:r>
-              <w:t xml:space="preserve">Cozy mystery or romance novel</w:t>
-            </w:r>
-          </w:p>
-        </w:tc>
-        <w:tc>
-          <w:tcPr/>
-          <w:p>
-            <w:pPr>
-              <w:pStyle w:val="Compact"/>
-              <w:jc w:val="left"/>
-            </w:pPr>
-            <w:r>
-              <w:t xml:space="preserve">55,000 to 65,000 words</w:t>
+              <w:t xml:space="preserve">Cozy mystery or</w:t>
+            </w:r>
+            <w:r>
+              <w:t xml:space="preserve"> </w:t>
+            </w:r>
+            <w:r>
+              <w:t xml:space="preserve">romance novel</w:t>
+            </w:r>
+          </w:p>
+        </w:tc>
+        <w:tc>
+          <w:tcPr/>
+          <w:p>
+            <w:pPr>
+              <w:pStyle w:val="Compact"/>
+              <w:jc w:val="left"/>
+            </w:pPr>
+            <w:r>
+              <w:t xml:space="preserve">55,000 to 65,000</w:t>
+            </w:r>
+            <w:r>
+              <w:t xml:space="preserve"> </w:t>
+            </w:r>
+            <w:r>
+              <w:t xml:space="preserve">words</w:t>
             </w:r>
           </w:p>
         </w:tc>
@@ -739,19 +761,37 @@
               <w:jc w:val="left"/>
             </w:pPr>
             <w:r>
-              <w:t xml:space="preserve">Kids’ chapter book (ages 6 to 9)</w:t>
-            </w:r>
-          </w:p>
-        </w:tc>
-        <w:tc>
-          <w:tcPr/>
-          <w:p>
-            <w:pPr>
-              <w:pStyle w:val="Compact"/>
-              <w:jc w:val="left"/>
-            </w:pPr>
-            <w:r>
-              <w:t xml:space="preserve">10,000 to 15,000 words</w:t>
+              <w:t xml:space="preserve">Kids’ chapter</w:t>
+            </w:r>
+            <w:r>
+              <w:t xml:space="preserve"> </w:t>
+            </w:r>
+            <w:r>
+              <w:t xml:space="preserve">book (ages 6 to</w:t>
+            </w:r>
+            <w:r>
+              <w:t xml:space="preserve"> </w:t>
+            </w:r>
+            <w:r>
+              <w:t xml:space="preserve">9)</w:t>
+            </w:r>
+          </w:p>
+        </w:tc>
+        <w:tc>
+          <w:tcPr/>
+          <w:p>
+            <w:pPr>
+              <w:pStyle w:val="Compact"/>
+              <w:jc w:val="left"/>
+            </w:pPr>
+            <w:r>
+              <w:t xml:space="preserve">10,000 to 15,000</w:t>
+            </w:r>
+            <w:r>
+              <w:t xml:space="preserve"> </w:t>
+            </w:r>
+            <w:r>
+              <w:t xml:space="preserve">words</w:t>
             </w:r>
           </w:p>
         </w:tc>
@@ -789,31 +829,55 @@
               <w:jc w:val="left"/>
             </w:pPr>
             <w:r>
-              <w:t xml:space="preserve">Bedtime story collection</w:t>
-            </w:r>
-          </w:p>
-        </w:tc>
-        <w:tc>
-          <w:tcPr/>
-          <w:p>
-            <w:pPr>
-              <w:pStyle w:val="Compact"/>
-              <w:jc w:val="left"/>
-            </w:pPr>
-            <w:r>
-              <w:t xml:space="preserve">2,000 to 4,000 words per story; 8 to 12 stories</w:t>
-            </w:r>
-          </w:p>
-        </w:tc>
-        <w:tc>
-          <w:tcPr/>
-          <w:p>
-            <w:pPr>
-              <w:pStyle w:val="Compact"/>
-              <w:jc w:val="left"/>
-            </w:pPr>
-            <w:r>
-              <w:t xml:space="preserve">1 story per chapter</w:t>
+              <w:t xml:space="preserve">Bedtime story</w:t>
+            </w:r>
+            <w:r>
+              <w:t xml:space="preserve"> </w:t>
+            </w:r>
+            <w:r>
+              <w:t xml:space="preserve">collection</w:t>
+            </w:r>
+          </w:p>
+        </w:tc>
+        <w:tc>
+          <w:tcPr/>
+          <w:p>
+            <w:pPr>
+              <w:pStyle w:val="Compact"/>
+              <w:jc w:val="left"/>
+            </w:pPr>
+            <w:r>
+              <w:t xml:space="preserve">2,000 to 4,000</w:t>
+            </w:r>
+            <w:r>
+              <w:t xml:space="preserve"> </w:t>
+            </w:r>
+            <w:r>
+              <w:t xml:space="preserve">words per story;</w:t>
+            </w:r>
+            <w:r>
+              <w:t xml:space="preserve"> </w:t>
+            </w:r>
+            <w:r>
+              <w:t xml:space="preserve">8 to 12 stories</w:t>
+            </w:r>
+          </w:p>
+        </w:tc>
+        <w:tc>
+          <w:tcPr/>
+          <w:p>
+            <w:pPr>
+              <w:pStyle w:val="Compact"/>
+              <w:jc w:val="left"/>
+            </w:pPr>
+            <w:r>
+              <w:t xml:space="preserve">1 story per</w:t>
+            </w:r>
+            <w:r>
+              <w:t xml:space="preserve"> </w:t>
+            </w:r>
+            <w:r>
+              <w:t xml:space="preserve">chapter</w:t>
             </w:r>
           </w:p>
         </w:tc>
@@ -839,19 +903,31 @@
               <w:jc w:val="left"/>
             </w:pPr>
             <w:r>
-              <w:t xml:space="preserve">Early reader (ages 4 to 7)</w:t>
-            </w:r>
-          </w:p>
-        </w:tc>
-        <w:tc>
-          <w:tcPr/>
-          <w:p>
-            <w:pPr>
-              <w:pStyle w:val="Compact"/>
-              <w:jc w:val="left"/>
-            </w:pPr>
-            <w:r>
-              <w:t xml:space="preserve">1,500 to 3,000 words</w:t>
+              <w:t xml:space="preserve">Early reader</w:t>
+            </w:r>
+            <w:r>
+              <w:t xml:space="preserve"> </w:t>
+            </w:r>
+            <w:r>
+              <w:t xml:space="preserve">(ages 4 to 7)</w:t>
+            </w:r>
+          </w:p>
+        </w:tc>
+        <w:tc>
+          <w:tcPr/>
+          <w:p>
+            <w:pPr>
+              <w:pStyle w:val="Compact"/>
+              <w:jc w:val="left"/>
+            </w:pPr>
+            <w:r>
+              <w:t xml:space="preserve">1,500 to 3,000</w:t>
+            </w:r>
+            <w:r>
+              <w:t xml:space="preserve"> </w:t>
+            </w:r>
+            <w:r>
+              <w:t xml:space="preserve">words</w:t>
             </w:r>
           </w:p>
         </w:tc>
@@ -875,7 +951,19 @@
               <w:jc w:val="left"/>
             </w:pPr>
             <w:r>
-              <w:t xml:space="preserve">Fixed-layout EPUB with illustrations</w:t>
+              <w:t xml:space="preserve">Fixed-layout EPUB</w:t>
+            </w:r>
+            <w:r>
+              <w:t xml:space="preserve"> </w:t>
+            </w:r>
+            <w:r>
+              <w:t xml:space="preserve">with</w:t>
+            </w:r>
+            <w:r>
+              <w:t xml:space="preserve"> </w:t>
+            </w:r>
+            <w:r>
+              <w:t xml:space="preserve">illustrations</w:t>
             </w:r>
           </w:p>
         </w:tc>
@@ -889,7 +977,13 @@
               <w:jc w:val="left"/>
             </w:pPr>
             <w:r>
-              <w:t xml:space="preserve">Large-print puzzle book</w:t>
+              <w:t xml:space="preserve">Large-print</w:t>
+            </w:r>
+            <w:r>
+              <w:t xml:space="preserve"> </w:t>
+            </w:r>
+            <w:r>
+              <w:t xml:space="preserve">puzzle book</w:t>
             </w:r>
           </w:p>
         </w:tc>
@@ -913,7 +1007,13 @@
               <w:jc w:val="left"/>
             </w:pPr>
             <w:r>
-              <w:t xml:space="preserve">Sections by puzzle type</w:t>
+              <w:t xml:space="preserve">Sections by</w:t>
+            </w:r>
+            <w:r>
+              <w:t xml:space="preserve"> </w:t>
+            </w:r>
+            <w:r>
+              <w:t xml:space="preserve">puzzle type</w:t>
             </w:r>
           </w:p>
         </w:tc>
@@ -939,19 +1039,31 @@
               <w:jc w:val="left"/>
             </w:pPr>
             <w:r>
-              <w:t xml:space="preserve">Practical guide or workbook</w:t>
-            </w:r>
-          </w:p>
-        </w:tc>
-        <w:tc>
-          <w:tcPr/>
-          <w:p>
-            <w:pPr>
-              <w:pStyle w:val="Compact"/>
-              <w:jc w:val="left"/>
-            </w:pPr>
-            <w:r>
-              <w:t xml:space="preserve">11,000 to 25,000 words</w:t>
+              <w:t xml:space="preserve">Practical guide</w:t>
+            </w:r>
+            <w:r>
+              <w:t xml:space="preserve"> </w:t>
+            </w:r>
+            <w:r>
+              <w:t xml:space="preserve">or workbook</w:t>
+            </w:r>
+          </w:p>
+        </w:tc>
+        <w:tc>
+          <w:tcPr/>
+          <w:p>
+            <w:pPr>
+              <w:pStyle w:val="Compact"/>
+              <w:jc w:val="left"/>
+            </w:pPr>
+            <w:r>
+              <w:t xml:space="preserve">11,000 to 25,000</w:t>
+            </w:r>
+            <w:r>
+              <w:t xml:space="preserve"> </w:t>
+            </w:r>
+            <w:r>
+              <w:t xml:space="preserve">words</w:t>
             </w:r>
           </w:p>
         </w:tc>
@@ -996,7 +1108,19 @@
         <w:t xml:space="preserve"> </w:t>
       </w:r>
       <w:r>
-        <w:t xml:space="preserve">hit the target length within 10 percent. If the draft is short, extend scenes and examples, not filler. If it is long, cut repetition first.</w:t>
+        <w:t xml:space="preserve">hit the target length within 10 percent. If the draft is</w:t>
+      </w:r>
+      <w:r>
+        <w:t xml:space="preserve"> </w:t>
+      </w:r>
+      <w:r>
+        <w:t xml:space="preserve">short, extend scenes and examples, not filler. If it is long, cut</w:t>
+      </w:r>
+      <w:r>
+        <w:t xml:space="preserve"> </w:t>
+      </w:r>
+      <w:r>
+        <w:t xml:space="preserve">repetition first.</w:t>
       </w:r>
     </w:p>
     <w:bookmarkEnd w:id="22"/>
@@ -1018,7 +1142,13 @@
         <w:pStyle w:val="Compact"/>
       </w:pPr>
       <w:r>
-        <w:t xml:space="preserve">Write in the tone set by the topic entry. Use one point of view and one tense throughout.</w:t>
+        <w:t xml:space="preserve">Write in the tone set by the topic entry. Use one point of view and</w:t>
+      </w:r>
+      <w:r>
+        <w:t xml:space="preserve"> </w:t>
+      </w:r>
+      <w:r>
+        <w:t xml:space="preserve">one tense throughout.</w:t>
       </w:r>
     </w:p>
     <w:p>
@@ -1040,7 +1170,13 @@
         <w:t xml:space="preserve"> </w:t>
       </w:r>
       <w:r>
-        <w:t xml:space="preserve">keep names, places, dates, and facts consistent across the book and the series.</w:t>
+        <w:t xml:space="preserve">keep names, places, dates, and facts consistent across</w:t>
+      </w:r>
+      <w:r>
+        <w:t xml:space="preserve"> </w:t>
+      </w:r>
+      <w:r>
+        <w:t xml:space="preserve">the book and the series.</w:t>
       </w:r>
     </w:p>
     <w:p>
@@ -1052,7 +1188,13 @@
         <w:pStyle w:val="Compact"/>
       </w:pPr>
       <w:r>
-        <w:t xml:space="preserve">Open each chapter with a hook and end it with a reason to keep reading.</w:t>
+        <w:t xml:space="preserve">Open each chapter with a hook and end it with a reason to keep</w:t>
+      </w:r>
+      <w:r>
+        <w:t xml:space="preserve"> </w:t>
+      </w:r>
+      <w:r>
+        <w:t xml:space="preserve">reading.</w:t>
       </w:r>
     </w:p>
     <w:p>
@@ -1074,7 +1216,19 @@
         <w:t xml:space="preserve"> </w:t>
       </w:r>
       <w:r>
-        <w:t xml:space="preserve">short sentences, a clear problem and resolution, nothing frightening, a positive ending. The reading level must pass section 13.</w:t>
+        <w:t xml:space="preserve">short sentences, a clear problem and resolution,</w:t>
+      </w:r>
+      <w:r>
+        <w:t xml:space="preserve"> </w:t>
+      </w:r>
+      <w:r>
+        <w:t xml:space="preserve">nothing frightening, a positive ending. The reading level must pass</w:t>
+      </w:r>
+      <w:r>
+        <w:t xml:space="preserve"> </w:t>
+      </w:r>
+      <w:r>
+        <w:t xml:space="preserve">section 13.</w:t>
       </w:r>
     </w:p>
     <w:p>
@@ -1096,7 +1250,19 @@
         <w:t xml:space="preserve"> </w:t>
       </w:r>
       <w:r>
-        <w:t xml:space="preserve">every step, number, and claim is checked against a named, reliable source. List the sources in metadata.json under</w:t>
+        <w:t xml:space="preserve">every step, number, and claim is</w:t>
+      </w:r>
+      <w:r>
+        <w:t xml:space="preserve"> </w:t>
+      </w:r>
+      <w:r>
+        <w:t xml:space="preserve">checked against a named, reliable source. List the sources in</w:t>
+      </w:r>
+      <w:r>
+        <w:t xml:space="preserve"> </w:t>
+      </w:r>
+      <w:r>
+        <w:t xml:space="preserve">metadata.json under</w:t>
       </w:r>
       <w:r>
         <w:t xml:space="preserve"> </w:t>
@@ -1108,7 +1274,13 @@
         <w:t xml:space="preserve">sources</w:t>
       </w:r>
       <w:r>
-        <w:t xml:space="preserve">. No medical, financial, or legal advice.</w:t>
+        <w:t xml:space="preserve">. No medical, financial, or legal</w:t>
+      </w:r>
+      <w:r>
+        <w:t xml:space="preserve"> </w:t>
+      </w:r>
+      <w:r>
+        <w:t xml:space="preserve">advice.</w:t>
       </w:r>
     </w:p>
     <w:p>
@@ -1120,7 +1292,13 @@
         <w:pStyle w:val="Compact"/>
       </w:pPr>
       <w:r>
-        <w:t xml:space="preserve">Never copy text from other books, articles, or websites. Do not name trademarked characters, brands, or real living people.</w:t>
+        <w:t xml:space="preserve">Never copy text from other books, articles, or websites. Do not name</w:t>
+      </w:r>
+      <w:r>
+        <w:t xml:space="preserve"> </w:t>
+      </w:r>
+      <w:r>
+        <w:t xml:space="preserve">trademarked characters, brands, or real living people.</w:t>
       </w:r>
     </w:p>
     <w:p>
@@ -1142,7 +1320,13 @@
         <w:t xml:space="preserve"> </w:t>
       </w:r>
       <w:r>
-        <w:t xml:space="preserve">the manuscript has no placeholder text, notes to self, or bracketed instructions.</w:t>
+        <w:t xml:space="preserve">the manuscript has no placeholder text, notes to self,</w:t>
+      </w:r>
+      <w:r>
+        <w:t xml:space="preserve"> </w:t>
+      </w:r>
+      <w:r>
+        <w:t xml:space="preserve">or bracketed instructions.</w:t>
       </w:r>
     </w:p>
     <w:bookmarkEnd w:id="23"/>
@@ -1158,13 +1342,13 @@
     <w:tbl>
       <w:tblPr>
         <w:tblStyle w:val="Table"/>
-        <w:tblW w:type="pct" w:w="5000"/>
+        <w:tblW w:type="pct" w:w="4865"/>
         <w:tblLook w:firstRow="1" w:lastRow="0" w:firstColumn="0" w:lastColumn="0" w:noHBand="0" w:noVBand="0" w:val="0020"/>
         <w:jc w:val="start"/>
       </w:tblPr>
       <w:tblGrid>
-        <w:gridCol w:w="3960"/>
-        <w:gridCol w:w="3960"/>
+        <w:gridCol w:w="3852"/>
+        <w:gridCol w:w="3852"/>
       </w:tblGrid>
       <w:tr>
         <w:trPr>
@@ -1216,7 +1400,19 @@
               <w:jc w:val="left"/>
             </w:pPr>
             <w:r>
-              <w:t xml:space="preserve">Garamond (EB Garamond) or Georgia. Use relative sizing; the reader sets the size.</w:t>
+              <w:t xml:space="preserve">Garamond (EB Garamond) or Georgia.</w:t>
+            </w:r>
+            <w:r>
+              <w:t xml:space="preserve"> </w:t>
+            </w:r>
+            <w:r>
+              <w:t xml:space="preserve">Use relative sizing; the reader</w:t>
+            </w:r>
+            <w:r>
+              <w:t xml:space="preserve"> </w:t>
+            </w:r>
+            <w:r>
+              <w:t xml:space="preserve">sets the size.</w:t>
             </w:r>
           </w:p>
         </w:tc>
@@ -1242,7 +1438,13 @@
               <w:jc w:val="left"/>
             </w:pPr>
             <w:r>
-              <w:t xml:space="preserve">A clear sans-serif, such as Nunito or Open Sans. Line spacing 1.5.</w:t>
+              <w:t xml:space="preserve">A clear sans-serif, such as Nunito</w:t>
+            </w:r>
+            <w:r>
+              <w:t xml:space="preserve"> </w:t>
+            </w:r>
+            <w:r>
+              <w:t xml:space="preserve">or Open Sans. Line spacing 1.5.</w:t>
             </w:r>
           </w:p>
         </w:tc>
@@ -1268,7 +1470,13 @@
               <w:jc w:val="left"/>
             </w:pPr>
             <w:r>
-              <w:t xml:space="preserve">One font family, bold. Never more than two font families in one book.</w:t>
+              <w:t xml:space="preserve">One font family, bold. Never more</w:t>
+            </w:r>
+            <w:r>
+              <w:t xml:space="preserve"> </w:t>
+            </w:r>
+            <w:r>
+              <w:t xml:space="preserve">than two font families in one book.</w:t>
             </w:r>
           </w:p>
         </w:tc>
@@ -1294,7 +1502,13 @@
               <w:jc w:val="left"/>
             </w:pPr>
             <w:r>
-              <w:t xml:space="preserve">Left-aligned, ragged right. No justified text.</w:t>
+              <w:t xml:space="preserve">Left-aligned, ragged right. No</w:t>
+            </w:r>
+            <w:r>
+              <w:t xml:space="preserve"> </w:t>
+            </w:r>
+            <w:r>
+              <w:t xml:space="preserve">justified text.</w:t>
             </w:r>
           </w:p>
         </w:tc>
@@ -1320,7 +1534,19 @@
               <w:jc w:val="left"/>
             </w:pPr>
             <w:r>
-              <w:t xml:space="preserve">First-line indent in novels. A blank line between paragraphs in kids’ books and guides.</w:t>
+              <w:t xml:space="preserve">First-line indent in novels. A</w:t>
+            </w:r>
+            <w:r>
+              <w:t xml:space="preserve"> </w:t>
+            </w:r>
+            <w:r>
+              <w:t xml:space="preserve">blank line between paragraphs in</w:t>
+            </w:r>
+            <w:r>
+              <w:t xml:space="preserve"> </w:t>
+            </w:r>
+            <w:r>
+              <w:t xml:space="preserve">kids’ books and guides.</w:t>
             </w:r>
           </w:p>
         </w:tc>
@@ -1356,7 +1582,25 @@
               <w:t xml:space="preserve"> </w:t>
             </w:r>
             <w:r>
-              <w:t xml:space="preserve">only fonts licensed for commercial embedding, such as the SIL Open Font License. Save the license file in the book folder.</w:t>
+              <w:t xml:space="preserve">only fonts licensed</w:t>
+            </w:r>
+            <w:r>
+              <w:t xml:space="preserve"> </w:t>
+            </w:r>
+            <w:r>
+              <w:t xml:space="preserve">for commercial embedding, such as</w:t>
+            </w:r>
+            <w:r>
+              <w:t xml:space="preserve"> </w:t>
+            </w:r>
+            <w:r>
+              <w:t xml:space="preserve">the SIL Open Font License. Save the</w:t>
+            </w:r>
+            <w:r>
+              <w:t xml:space="preserve"> </w:t>
+            </w:r>
+            <w:r>
+              <w:t xml:space="preserve">license file in the book folder.</w:t>
             </w:r>
           </w:p>
         </w:tc>
@@ -1391,7 +1635,13 @@
         <w:t xml:space="preserve"> </w:t>
       </w:r>
       <w:r>
-        <w:t xml:space="preserve">1600 pixels wide by 2560 pixels tall, RGB JPEG, saved as</w:t>
+        <w:t xml:space="preserve">1600 pixels wide by 2560 pixels tall, RGB JPEG, saved</w:t>
+      </w:r>
+      <w:r>
+        <w:t xml:space="preserve"> </w:t>
+      </w:r>
+      <w:r>
+        <w:t xml:space="preserve">as</w:t>
       </w:r>
       <w:r>
         <w:t xml:space="preserve"> </w:t>
@@ -1403,7 +1653,13 @@
         <w:t xml:space="preserve">cover-ebook.jpg</w:t>
       </w:r>
       <w:r>
-        <w:t xml:space="preserve">. The image must be at least 1000 pixels tall for the Amazon thumbnail.</w:t>
+        <w:t xml:space="preserve">. The image must be at least 1000 pixels tall</w:t>
+      </w:r>
+      <w:r>
+        <w:t xml:space="preserve"> </w:t>
+      </w:r>
+      <w:r>
+        <w:t xml:space="preserve">for the Amazon thumbnail.</w:t>
       </w:r>
     </w:p>
     <w:p>
@@ -1425,7 +1681,13 @@
         <w:t xml:space="preserve"> </w:t>
       </w:r>
       <w:r>
-        <w:t xml:space="preserve">the title is readable at thumbnail size (about 150 pixels wide). Use large, bold lettering with high contrast.</w:t>
+        <w:t xml:space="preserve">the title is readable at thumbnail size (about 150</w:t>
+      </w:r>
+      <w:r>
+        <w:t xml:space="preserve"> </w:t>
+      </w:r>
+      <w:r>
+        <w:t xml:space="preserve">pixels wide). Use large, bold lettering with high contrast.</w:t>
       </w:r>
     </w:p>
     <w:p>
@@ -1437,7 +1699,31 @@
         <w:pStyle w:val="Compact"/>
       </w:pPr>
       <w:r>
-        <w:t xml:space="preserve">Match the genre look. Cozy mysteries and romance use warm tones, a clear central image, and a serif or script title. Kids’ covers use bright colours, one friendly character, and a rounded sans-serif title. Puzzle covers use a bold colour block and large type naming the puzzle type.</w:t>
+        <w:t xml:space="preserve">Match the genre look. Cozy mysteries and romance use warm tones, a</w:t>
+      </w:r>
+      <w:r>
+        <w:t xml:space="preserve"> </w:t>
+      </w:r>
+      <w:r>
+        <w:t xml:space="preserve">clear central image, and a serif or script title. Kids’ covers use</w:t>
+      </w:r>
+      <w:r>
+        <w:t xml:space="preserve"> </w:t>
+      </w:r>
+      <w:r>
+        <w:t xml:space="preserve">bright colours, one friendly character, and a rounded sans-serif</w:t>
+      </w:r>
+      <w:r>
+        <w:t xml:space="preserve"> </w:t>
+      </w:r>
+      <w:r>
+        <w:t xml:space="preserve">title. Puzzle covers use a bold colour block and large type naming</w:t>
+      </w:r>
+      <w:r>
+        <w:t xml:space="preserve"> </w:t>
+      </w:r>
+      <w:r>
+        <w:t xml:space="preserve">the puzzle type.</w:t>
       </w:r>
     </w:p>
     <w:p>
@@ -1449,7 +1735,13 @@
         <w:pStyle w:val="Compact"/>
       </w:pPr>
       <w:r>
-        <w:t xml:space="preserve">One focal point. No more than three colours in the title block. No small text.</w:t>
+        <w:t xml:space="preserve">One focal point. No more than three colours in the title block. No</w:t>
+      </w:r>
+      <w:r>
+        <w:t xml:space="preserve"> </w:t>
+      </w:r>
+      <w:r>
+        <w:t xml:space="preserve">small text.</w:t>
       </w:r>
     </w:p>
     <w:p>
@@ -1486,7 +1778,19 @@
         <w:pStyle w:val="Compact"/>
       </w:pPr>
       <w:r>
-        <w:t xml:space="preserve">Images must be original, generated with an approved tool, or licensed stock with a saved license record. Never use copyrighted characters or celebrity likenesses.</w:t>
+        <w:t xml:space="preserve">Images must be original, generated with an approved tool, or</w:t>
+      </w:r>
+      <w:r>
+        <w:t xml:space="preserve"> </w:t>
+      </w:r>
+      <w:r>
+        <w:t xml:space="preserve">licensed stock with a saved license record. Never use copyrighted</w:t>
+      </w:r>
+      <w:r>
+        <w:t xml:space="preserve"> </w:t>
+      </w:r>
+      <w:r>
+        <w:t xml:space="preserve">characters or celebrity likenesses.</w:t>
       </w:r>
     </w:p>
     <w:p>
@@ -1508,7 +1812,13 @@
         <w:t xml:space="preserve"> </w:t>
       </w:r>
       <w:r>
-        <w:t xml:space="preserve">one cover per book, made by Kindle-3 in Canva. It must pass</w:t>
+        <w:t xml:space="preserve">one cover per book, made by Kindle-3 in Canva. It must</w:t>
+      </w:r>
+      <w:r>
+        <w:t xml:space="preserve"> </w:t>
+      </w:r>
+      <w:r>
+        <w:t xml:space="preserve">pass</w:t>
       </w:r>
       <w:r>
         <w:t xml:space="preserve"> </w:t>
@@ -1520,7 +1830,13 @@
         <w:t xml:space="preserve">scripts/check_cover.py</w:t>
       </w:r>
       <w:r>
-        <w:t xml:space="preserve">, which checks size, format, and that it looks different from earlier covers.</w:t>
+        <w:t xml:space="preserve">, which checks size, format, and that</w:t>
+      </w:r>
+      <w:r>
+        <w:t xml:space="preserve"> </w:t>
+      </w:r>
+      <w:r>
+        <w:t xml:space="preserve">it looks different from earlier covers.</w:t>
       </w:r>
     </w:p>
     <w:p>
@@ -1542,7 +1858,19 @@
         <w:t xml:space="preserve"> </w:t>
       </w:r>
       <w:r>
-        <w:t xml:space="preserve">the owner checks each cover visually at upload time, before the KDP upload. This replaces an approval step in the pipeline.</w:t>
+        <w:t xml:space="preserve">the owner checks each cover visually at upload time,</w:t>
+      </w:r>
+      <w:r>
+        <w:t xml:space="preserve"> </w:t>
+      </w:r>
+      <w:r>
+        <w:t xml:space="preserve">before the KDP upload. This replaces an approval step in the</w:t>
+      </w:r>
+      <w:r>
+        <w:t xml:space="preserve"> </w:t>
+      </w:r>
+      <w:r>
+        <w:t xml:space="preserve">pipeline.</w:t>
       </w:r>
     </w:p>
     <w:bookmarkEnd w:id="25"/>
@@ -1598,7 +1926,19 @@
         <w:t xml:space="preserve">metadata.json</w:t>
       </w:r>
       <w:r>
-        <w:t xml:space="preserve">, the stylesheet, and the fonts. It includes the cover image, title page, copyright page, and table of contents with working links.</w:t>
+        <w:t xml:space="preserve">, the stylesheet, and the fonts. It includes the</w:t>
+      </w:r>
+      <w:r>
+        <w:t xml:space="preserve"> </w:t>
+      </w:r>
+      <w:r>
+        <w:t xml:space="preserve">cover image, title page, copyright page, and table of contents with</w:t>
+      </w:r>
+      <w:r>
+        <w:t xml:space="preserve"> </w:t>
+      </w:r>
+      <w:r>
+        <w:t xml:space="preserve">working links.</w:t>
       </w:r>
     </w:p>
     <w:p>
@@ -1641,7 +1981,19 @@
         <w:pStyle w:val="Compact"/>
       </w:pPr>
       <w:r>
-        <w:t xml:space="preserve">Owner check before upload: open the EPUB in Kindle Previewer and read the first and last chapters. The phone-sized preview from v1 is replaced by this.</w:t>
+        <w:t xml:space="preserve">Owner check before upload: open the EPUB in Kindle Previewer and</w:t>
+      </w:r>
+      <w:r>
+        <w:t xml:space="preserve"> </w:t>
+      </w:r>
+      <w:r>
+        <w:t xml:space="preserve">read the first and last chapters. The phone-sized preview from v1 is</w:t>
+      </w:r>
+      <w:r>
+        <w:t xml:space="preserve"> </w:t>
+      </w:r>
+      <w:r>
+        <w:t xml:space="preserve">replaced by this.</w:t>
       </w:r>
     </w:p>
     <w:p>
@@ -1680,7 +2032,13 @@
         <w:t xml:space="preserve">manuscript.docx</w:t>
       </w:r>
       <w:r>
-        <w:t xml:space="preserve">, with real heading styles for chapters.</w:t>
+        <w:t xml:space="preserve">, with real</w:t>
+      </w:r>
+      <w:r>
+        <w:t xml:space="preserve"> </w:t>
+      </w:r>
+      <w:r>
+        <w:t xml:space="preserve">heading styles for chapters.</w:t>
       </w:r>
     </w:p>
     <w:bookmarkEnd w:id="26"/>
@@ -1749,7 +2107,13 @@
         <w:t xml:space="preserve">“</w:t>
       </w:r>
       <w:r>
-        <w:t xml:space="preserve">Copyright © 2026 Skybee. All rights reserved.</w:t>
+        <w:t xml:space="preserve">Copyright © 2026 Skybee. All rights</w:t>
+      </w:r>
+      <w:r>
+        <w:t xml:space="preserve"> </w:t>
+      </w:r>
+      <w:r>
+        <w:t xml:space="preserve">reserved.</w:t>
       </w:r>
       <w:r>
         <w:t xml:space="preserve">”</w:t>
@@ -1783,7 +2147,19 @@
         <w:t xml:space="preserve">“</w:t>
       </w:r>
       <w:r>
-        <w:t xml:space="preserve">This book was created with the assistance of artificial intelligence tools. All content was reviewed and edited by the publisher.</w:t>
+        <w:t xml:space="preserve">This book was created</w:t>
+      </w:r>
+      <w:r>
+        <w:t xml:space="preserve"> </w:t>
+      </w:r>
+      <w:r>
+        <w:t xml:space="preserve">with the assistance of artificial intelligence tools. All content</w:t>
+      </w:r>
+      <w:r>
+        <w:t xml:space="preserve"> </w:t>
+      </w:r>
+      <w:r>
+        <w:t xml:space="preserve">was reviewed and edited by the publisher.</w:t>
       </w:r>
       <w:r>
         <w:t xml:space="preserve">”</w:t>
@@ -1808,7 +2184,13 @@
         <w:t xml:space="preserve"> </w:t>
       </w:r>
       <w:r>
-        <w:t xml:space="preserve">every practical guide and workbook, including workbooks, carries:</w:t>
+        <w:t xml:space="preserve">every practical guide and</w:t>
+      </w:r>
+      <w:r>
+        <w:t xml:space="preserve"> </w:t>
+      </w:r>
+      <w:r>
+        <w:t xml:space="preserve">workbook, including workbooks, carries:</w:t>
       </w:r>
       <w:r>
         <w:t xml:space="preserve"> </w:t>
@@ -1817,7 +2199,13 @@
         <w:t xml:space="preserve">“</w:t>
       </w:r>
       <w:r>
-        <w:t xml:space="preserve">This book is for general information only and is not medical, financial, or legal advice.</w:t>
+        <w:t xml:space="preserve">This book is for general</w:t>
+      </w:r>
+      <w:r>
+        <w:t xml:space="preserve"> </w:t>
+      </w:r>
+      <w:r>
+        <w:t xml:space="preserve">information only and is not medical, financial, or legal advice.</w:t>
       </w:r>
       <w:r>
         <w:t xml:space="preserve">”</w:t>
@@ -1845,7 +2233,19 @@
         <w:t xml:space="preserve">“</w:t>
       </w:r>
       <w:r>
-        <w:t xml:space="preserve">This is a work of fiction. Names, characters, places, and events are fictional. Any resemblance to real persons is coincidental.</w:t>
+        <w:t xml:space="preserve">This is a work of fiction.</w:t>
+      </w:r>
+      <w:r>
+        <w:t xml:space="preserve"> </w:t>
+      </w:r>
+      <w:r>
+        <w:t xml:space="preserve">Names, characters, places, and events are fictional. Any resemblance</w:t>
+      </w:r>
+      <w:r>
+        <w:t xml:space="preserve"> </w:t>
+      </w:r>
+      <w:r>
+        <w:t xml:space="preserve">to real persons is coincidental.</w:t>
       </w:r>
       <w:r>
         <w:t xml:space="preserve">”</w:t>
@@ -1860,7 +2260,13 @@
         <w:pStyle w:val="Compact"/>
       </w:pPr>
       <w:r>
-        <w:t xml:space="preserve">Optional: a short back-of-book note about the series. Do not ask for reviews in a way that breaks Amazon’s rules.</w:t>
+        <w:t xml:space="preserve">Optional: a short back-of-book note about the series. Do not ask for</w:t>
+      </w:r>
+      <w:r>
+        <w:t xml:space="preserve"> </w:t>
+      </w:r>
+      <w:r>
+        <w:t xml:space="preserve">reviews in a way that breaks Amazon’s rules.</w:t>
       </w:r>
     </w:p>
     <w:bookmarkEnd w:id="27"/>
@@ -1876,13 +2282,13 @@
     <w:tbl>
       <w:tblPr>
         <w:tblStyle w:val="Table"/>
-        <w:tblW w:type="pct" w:w="5000"/>
+        <w:tblW w:type="pct" w:w="4865"/>
         <w:tblLook w:firstRow="1" w:lastRow="0" w:firstColumn="0" w:lastColumn="0" w:noHBand="0" w:noVBand="0" w:val="0020"/>
         <w:jc w:val="start"/>
       </w:tblPr>
       <w:tblGrid>
-        <w:gridCol w:w="3960"/>
-        <w:gridCol w:w="3960"/>
+        <w:gridCol w:w="3852"/>
+        <w:gridCol w:w="3852"/>
       </w:tblGrid>
       <w:tr>
         <w:trPr>
@@ -1934,7 +2340,13 @@
               <w:jc w:val="left"/>
             </w:pPr>
             <w:r>
-              <w:t xml:space="preserve">$2.99 to $4.99. Stay at or above $2.99 for the 70 percent royalty.</w:t>
+              <w:t xml:space="preserve">$2.99 to $4.99. Stay at or above</w:t>
+            </w:r>
+            <w:r>
+              <w:t xml:space="preserve"> </w:t>
+            </w:r>
+            <w:r>
+              <w:t xml:space="preserve">$2.99 for the 70 percent royalty.</w:t>
             </w:r>
           </w:p>
         </w:tc>
@@ -1948,7 +2360,13 @@
               <w:jc w:val="left"/>
             </w:pPr>
             <w:r>
-              <w:t xml:space="preserve">Bedtime collections and early readers</w:t>
+              <w:t xml:space="preserve">Bedtime collections and early</w:t>
+            </w:r>
+            <w:r>
+              <w:t xml:space="preserve"> </w:t>
+            </w:r>
+            <w:r>
+              <w:t xml:space="preserve">readers</w:t>
             </w:r>
           </w:p>
         </w:tc>
@@ -1986,7 +2404,19 @@
               <w:jc w:val="left"/>
             </w:pPr>
             <w:r>
-              <w:t xml:space="preserve">$2.99 to $5.99, or $0.99 to $1.99 only if the book is very short</w:t>
+              <w:t xml:space="preserve">$2.99 to $5.99, or $0.99 to</w:t>
+            </w:r>
+            <w:r>
+              <w:t xml:space="preserve"> </w:t>
+            </w:r>
+            <w:r>
+              <w:t xml:space="preserve">$1.99 only if the book is very</w:t>
+            </w:r>
+            <w:r>
+              <w:t xml:space="preserve"> </w:t>
+            </w:r>
+            <w:r>
+              <w:t xml:space="preserve">short</w:t>
             </w:r>
           </w:p>
         </w:tc>
@@ -2038,7 +2468,25 @@
               <w:jc w:val="left"/>
             </w:pPr>
             <w:r>
-              <w:t xml:space="preserve">Optional, only when the owner announces it. A $0.99 promotion pays 35 percent royalty during its window.</w:t>
+              <w:t xml:space="preserve">Optional, only when the owner</w:t>
+            </w:r>
+            <w:r>
+              <w:t xml:space="preserve"> </w:t>
+            </w:r>
+            <w:r>
+              <w:t xml:space="preserve">announces it. A $0.99 promotion</w:t>
+            </w:r>
+            <w:r>
+              <w:t xml:space="preserve"> </w:t>
+            </w:r>
+            <w:r>
+              <w:t xml:space="preserve">pays 35 percent royalty during its</w:t>
+            </w:r>
+            <w:r>
+              <w:t xml:space="preserve"> </w:t>
+            </w:r>
+            <w:r>
+              <w:t xml:space="preserve">window.</w:t>
             </w:r>
           </w:p>
         </w:tc>
@@ -2074,7 +2522,13 @@
               <w:t xml:space="preserve"> </w:t>
             </w:r>
             <w:r>
-              <w:t xml:space="preserve">enrol for 90 days.</w:t>
+              <w:t xml:space="preserve">enrol for 90</w:t>
+            </w:r>
+            <w:r>
+              <w:t xml:space="preserve"> </w:t>
+            </w:r>
+            <w:r>
+              <w:t xml:space="preserve">days.</w:t>
             </w:r>
             <w:r>
               <w:t xml:space="preserve"> </w:t>
@@ -2090,7 +2544,19 @@
               <w:t xml:space="preserve"> </w:t>
             </w:r>
             <w:r>
-              <w:t xml:space="preserve">do not enrol. Each book’s metadata records the choice.</w:t>
+              <w:t xml:space="preserve">do not</w:t>
+            </w:r>
+            <w:r>
+              <w:t xml:space="preserve"> </w:t>
+            </w:r>
+            <w:r>
+              <w:t xml:space="preserve">enrol. Each book’s metadata records</w:t>
+            </w:r>
+            <w:r>
+              <w:t xml:space="preserve"> </w:t>
+            </w:r>
+            <w:r>
+              <w:t xml:space="preserve">the choice.</w:t>
             </w:r>
           </w:p>
         </w:tc>
@@ -2116,7 +2582,13 @@
               <w:jc w:val="left"/>
             </w:pPr>
             <w:r>
-              <w:t xml:space="preserve">Worldwide, unless a rights issue exists.</w:t>
+              <w:t xml:space="preserve">Worldwide, unless a rights issue</w:t>
+            </w:r>
+            <w:r>
+              <w:t xml:space="preserve"> </w:t>
+            </w:r>
+            <w:r>
+              <w:t xml:space="preserve">exists.</w:t>
             </w:r>
           </w:p>
         </w:tc>
@@ -2201,7 +2673,19 @@
         <w:pStyle w:val="Compact"/>
       </w:pPr>
       <w:r>
-        <w:t xml:space="preserve">KDP’s current help allows up to three categories. This guide requires two, which is the minimum. A third may be added only if the owner decides.</w:t>
+        <w:t xml:space="preserve">KDP’s current help allows up to three categories. This guide</w:t>
+      </w:r>
+      <w:r>
+        <w:t xml:space="preserve"> </w:t>
+      </w:r>
+      <w:r>
+        <w:t xml:space="preserve">requires two, which is the minimum. A third may be added only if the</w:t>
+      </w:r>
+      <w:r>
+        <w:t xml:space="preserve"> </w:t>
+      </w:r>
+      <w:r>
+        <w:t xml:space="preserve">owner decides.</w:t>
       </w:r>
     </w:p>
     <w:p>
@@ -2223,7 +2707,19 @@
         <w:t xml:space="preserve"> </w:t>
       </w:r>
       <w:r>
-        <w:t xml:space="preserve">a category is used only when its pool entry is confirmed. The owner confirms each path in the KDP category picker and sets</w:t>
+        <w:t xml:space="preserve">a category is used only when its pool entry is</w:t>
+      </w:r>
+      <w:r>
+        <w:t xml:space="preserve"> </w:t>
+      </w:r>
+      <w:r>
+        <w:t xml:space="preserve">confirmed. The owner confirms each path in the KDP category picker</w:t>
+      </w:r>
+      <w:r>
+        <w:t xml:space="preserve"> </w:t>
+      </w:r>
+      <w:r>
+        <w:t xml:space="preserve">and sets</w:t>
       </w:r>
       <w:r>
         <w:t xml:space="preserve"> </w:t>
@@ -2238,7 +2734,13 @@
         <w:t xml:space="preserve"> </w:t>
       </w:r>
       <w:r>
-        <w:t xml:space="preserve">in the pool. An unconfirmed category blocks the book.</w:t>
+        <w:t xml:space="preserve">in the pool. An unconfirmed category</w:t>
+      </w:r>
+      <w:r>
+        <w:t xml:space="preserve"> </w:t>
+      </w:r>
+      <w:r>
+        <w:t xml:space="preserve">blocks the book.</w:t>
       </w:r>
     </w:p>
     <w:p>
@@ -2502,7 +3004,13 @@
         <w:t xml:space="preserve"> </w:t>
       </w:r>
       <w:r>
-        <w:t xml:space="preserve">(the exact sentence in section 8),</w:t>
+        <w:t xml:space="preserve">(the exact</w:t>
+      </w:r>
+      <w:r>
+        <w:t xml:space="preserve"> </w:t>
+      </w:r>
+      <w:r>
+        <w:t xml:space="preserve">sentence in section 8),</w:t>
       </w:r>
       <w:r>
         <w:t xml:space="preserve"> </w:t>
@@ -2580,7 +3088,13 @@
         <w:t xml:space="preserve">“</w:t>
       </w:r>
       <w:r>
-        <w:t xml:space="preserve">cover-ebook.jpg (1600 x 2560 RGB JPEG)</w:t>
+        <w:t xml:space="preserve">cover-ebook.jpg (1600 x</w:t>
+      </w:r>
+      <w:r>
+        <w:t xml:space="preserve"> </w:t>
+      </w:r>
+      <w:r>
+        <w:t xml:space="preserve">2560 RGB JPEG)</w:t>
       </w:r>
       <w:r>
         <w:t xml:space="preserve">”</w:t>
@@ -2656,7 +3170,13 @@
         <w:t xml:space="preserve"> </w:t>
       </w:r>
       <w:r>
-        <w:t xml:space="preserve">in its folder, generated by</w:t>
+        <w:t xml:space="preserve">in its folder,</w:t>
+      </w:r>
+      <w:r>
+        <w:t xml:space="preserve"> </w:t>
+      </w:r>
+      <w:r>
+        <w:t xml:space="preserve">generated by</w:t>
       </w:r>
       <w:r>
         <w:t xml:space="preserve"> </w:t>
@@ -2683,7 +3203,31 @@
         <w:t xml:space="preserve">metadata.json</w:t>
       </w:r>
       <w:r>
-        <w:t xml:space="preserve">. It holds every KDP form answer: title, subtitle, series, author, description, seven keywords, two categories, content warnings, AI disclosure, territories, price, royalty, KDP Select, lending, and the files to upload. Regenerate it after any metadata change.</w:t>
+        <w:t xml:space="preserve">. It</w:t>
+      </w:r>
+      <w:r>
+        <w:t xml:space="preserve"> </w:t>
+      </w:r>
+      <w:r>
+        <w:t xml:space="preserve">holds every KDP form answer: title, subtitle, series, author,</w:t>
+      </w:r>
+      <w:r>
+        <w:t xml:space="preserve"> </w:t>
+      </w:r>
+      <w:r>
+        <w:t xml:space="preserve">description, seven keywords, two categories, content warnings, AI</w:t>
+      </w:r>
+      <w:r>
+        <w:t xml:space="preserve"> </w:t>
+      </w:r>
+      <w:r>
+        <w:t xml:space="preserve">disclosure, territories, price, royalty, KDP Select, lending, and the</w:t>
+      </w:r>
+      <w:r>
+        <w:t xml:space="preserve"> </w:t>
+      </w:r>
+      <w:r>
+        <w:t xml:space="preserve">files to upload. Regenerate it after any metadata change.</w:t>
       </w:r>
     </w:p>
     <w:bookmarkEnd w:id="31"/>
@@ -2710,300 +3254,850 @@
       <w:r>
         <w:rPr>
           <w:rStyle w:val="VerbatimChar"/>
+        </w:rPr>
+        <w:t xml:space="preserve">scripts/check_book.py</w:t>
+      </w:r>
+      <w:r>
+        <w:rPr>
           <w:bCs/>
           <w:b/>
         </w:rPr>
-        <w:t xml:space="preserve">scripts/check_book.py</w:t>
-      </w:r>
+        <w:t xml:space="preserve">).</w:t>
+      </w:r>
+      <w:r>
+        <w:t xml:space="preserve"> </w:t>
+      </w:r>
+      <w:r>
+        <w:t xml:space="preserve">REQUIRED: every</w:t>
+      </w:r>
+      <w:r>
+        <w:t xml:space="preserve"> </w:t>
+      </w:r>
+      <w:r>
+        <w:t xml:space="preserve">check passes before approval. The checks are: required files; title,</w:t>
+      </w:r>
+      <w:r>
+        <w:t xml:space="preserve"> </w:t>
+      </w:r>
+      <w:r>
+        <w:t xml:space="preserve">subtitle, and author; description length; seven keywords under 50</w:t>
+      </w:r>
+      <w:r>
+        <w:t xml:space="preserve"> </w:t>
+      </w:r>
+      <w:r>
+        <w:t xml:space="preserve">characters; two categories from the confirmed pool; language; exact AI</w:t>
+      </w:r>
+      <w:r>
+        <w:t xml:space="preserve"> </w:t>
+      </w:r>
+      <w:r>
+        <w:t xml:space="preserve">disclosure wording; copyright line; placeholder scan; word count within</w:t>
+      </w:r>
+      <w:r>
+        <w:t xml:space="preserve"> </w:t>
+      </w:r>
+      <w:r>
+        <w:t xml:space="preserve">10 percent of target; chapter headings; epubcheck (0 errors, 0</w:t>
+      </w:r>
+      <w:r>
+        <w:t xml:space="preserve"> </w:t>
+      </w:r>
+      <w:r>
+        <w:t xml:space="preserve">warnings); and the cover checks.</w:t>
+      </w:r>
+    </w:p>
+    <w:p>
+      <w:pPr>
+        <w:pStyle w:val="BodyText"/>
+      </w:pPr>
       <w:r>
         <w:rPr>
           <w:bCs/>
           <w:b/>
         </w:rPr>
-        <w:t xml:space="preserve">).</w:t>
-      </w:r>
-      <w:r>
-        <w:t xml:space="preserve"> </w:t>
-      </w:r>
-      <w:r>
-        <w:t xml:space="preserve">REQUIRED: every check passes before approval. The checks are: required files; title, subtitle, and author; description length; seven keywords under 50 characters; two categories from the confirmed pool; language; exact AI disclosure wording; copyright line; placeholder scan; word count within 10 percent of target; chapter headings; epubcheck (0 errors, 0 warnings); and the cover checks.</w:t>
-      </w:r>
-    </w:p>
-    <w:p>
-      <w:pPr>
-        <w:pStyle w:val="BodyText"/>
-      </w:pPr>
+        <w:t xml:space="preserve">Readability (</w:t>
+      </w:r>
+      <w:r>
+        <w:rPr>
+          <w:rStyle w:val="VerbatimChar"/>
+        </w:rPr>
+        <w:t xml:space="preserve">scripts/readability.py</w:t>
+      </w:r>
       <w:r>
         <w:rPr>
           <w:bCs/>
           <w:b/>
         </w:rPr>
-        <w:t xml:space="preserve">Readability (</w:t>
-      </w:r>
-      <w:r>
-        <w:rPr>
-          <w:rStyle w:val="VerbatimChar"/>
+        <w:t xml:space="preserve">).</w:t>
+      </w:r>
+      <w:r>
+        <w:t xml:space="preserve"> </w:t>
+      </w:r>
+      <w:r>
+        <w:t xml:space="preserve">REQUIRED for kids’ books</w:t>
+      </w:r>
+      <w:r>
+        <w:t xml:space="preserve"> </w:t>
+      </w:r>
+      <w:r>
+        <w:t xml:space="preserve">and early readers: the Flesch-Kincaid grade of</w:t>
+      </w:r>
+      <w:r>
+        <w:t xml:space="preserve"> </w:t>
+      </w:r>
+      <w:r>
+        <w:rPr>
+          <w:rStyle w:val="VerbatimChar"/>
+        </w:rPr>
+        <w:t xml:space="preserve">manuscript.md</w:t>
+      </w:r>
+      <w:r>
+        <w:t xml:space="preserve"> </w:t>
+      </w:r>
+      <w:r>
+        <w:t xml:space="preserve">must be</w:t>
+      </w:r>
+      <w:r>
+        <w:t xml:space="preserve"> </w:t>
+      </w:r>
+      <w:r>
+        <w:t xml:space="preserve">between 2 and 4 for ages 6 to 9, and between 1 and 3 for ages 4 to 7. A</w:t>
+      </w:r>
+      <w:r>
+        <w:t xml:space="preserve"> </w:t>
+      </w:r>
+      <w:r>
+        <w:t xml:space="preserve">text below the range is too simple; rewrite the sentences that are hard</w:t>
+      </w:r>
+      <w:r>
+        <w:t xml:space="preserve"> </w:t>
+      </w:r>
+      <w:r>
+        <w:t xml:space="preserve">to read.</w:t>
+      </w:r>
+    </w:p>
+    <w:p>
+      <w:pPr>
+        <w:pStyle w:val="BodyText"/>
+      </w:pPr>
+      <w:r>
+        <w:rPr>
           <w:bCs/>
           <w:b/>
         </w:rPr>
-        <w:t xml:space="preserve">scripts/readability.py</w:t>
-      </w:r>
+        <w:t xml:space="preserve">Judgement checks (Kindle-3 reads the book).</w:t>
+      </w:r>
+      <w:r>
+        <w:t xml:space="preserve"> </w:t>
+      </w:r>
+      <w:r>
+        <w:t xml:space="preserve">REQUIRED: names, places,</w:t>
+      </w:r>
+      <w:r>
+        <w:t xml:space="preserve"> </w:t>
+      </w:r>
+      <w:r>
+        <w:t xml:space="preserve">and facts are consistent; the timeline holds; no repeated or</w:t>
+      </w:r>
+      <w:r>
+        <w:t xml:space="preserve"> </w:t>
+      </w:r>
+      <w:r>
+        <w:t xml:space="preserve">contradictory passages; no sensitive content beyond the stated warnings;</w:t>
+      </w:r>
+      <w:r>
+        <w:t xml:space="preserve"> </w:t>
+      </w:r>
+      <w:r>
+        <w:t xml:space="preserve">no copied passages or trademarks; non-fiction claims spot-checked</w:t>
+      </w:r>
+      <w:r>
+        <w:t xml:space="preserve"> </w:t>
+      </w:r>
+      <w:r>
+        <w:t xml:space="preserve">against</w:t>
+      </w:r>
+      <w:r>
+        <w:t xml:space="preserve"> </w:t>
+      </w:r>
+      <w:r>
+        <w:rPr>
+          <w:rStyle w:val="VerbatimChar"/>
+        </w:rPr>
+        <w:t xml:space="preserve">sources</w:t>
+      </w:r>
+      <w:r>
+        <w:t xml:space="preserve">.</w:t>
+      </w:r>
+    </w:p>
+    <w:bookmarkEnd w:id="32"/>
+    <w:bookmarkStart w:id="33" w:name="output-package-and-handoff"/>
+    <w:p>
+      <w:pPr>
+        <w:pStyle w:val="Heading2"/>
+      </w:pPr>
+      <w:r>
+        <w:t xml:space="preserve">14. Output package and handoff</w:t>
+      </w:r>
+    </w:p>
+    <w:p>
+      <w:pPr>
+        <w:pStyle w:val="FirstParagraph"/>
+      </w:pPr>
+      <w:r>
+        <w:t xml:space="preserve">For each book, save in</w:t>
+      </w:r>
+      <w:r>
+        <w:t xml:space="preserve"> </w:t>
+      </w:r>
+      <w:r>
+        <w:rPr>
+          <w:rStyle w:val="VerbatimChar"/>
+        </w:rPr>
+        <w:t xml:space="preserve">ebooks-Final/&lt;book-slug&gt;/</w:t>
+      </w:r>
+      <w:r>
+        <w:t xml:space="preserve">:</w:t>
+      </w:r>
+      <w:r>
+        <w:t xml:space="preserve"> </w:t>
+      </w:r>
+      <w:r>
+        <w:rPr>
+          <w:rStyle w:val="VerbatimChar"/>
+        </w:rPr>
+        <w:t xml:space="preserve">manuscript.md</w:t>
+      </w:r>
+      <w:r>
+        <w:t xml:space="preserve">,</w:t>
+      </w:r>
+      <w:r>
+        <w:t xml:space="preserve"> </w:t>
+      </w:r>
+      <w:r>
+        <w:rPr>
+          <w:rStyle w:val="VerbatimChar"/>
+        </w:rPr>
+        <w:t xml:space="preserve">manuscript.docx</w:t>
+      </w:r>
+      <w:r>
+        <w:t xml:space="preserve">,</w:t>
+      </w:r>
+      <w:r>
+        <w:t xml:space="preserve"> </w:t>
+      </w:r>
+      <w:r>
+        <w:rPr>
+          <w:rStyle w:val="VerbatimChar"/>
+        </w:rPr>
+        <w:t xml:space="preserve">&lt;book-slug&gt;.epub</w:t>
+      </w:r>
+      <w:r>
+        <w:t xml:space="preserve">,</w:t>
+      </w:r>
+      <w:r>
+        <w:t xml:space="preserve"> </w:t>
+      </w:r>
+      <w:r>
+        <w:rPr>
+          <w:rStyle w:val="VerbatimChar"/>
+        </w:rPr>
+        <w:t xml:space="preserve">cover-ebook.jpg</w:t>
+      </w:r>
+      <w:r>
+        <w:t xml:space="preserve">,</w:t>
+      </w:r>
+      <w:r>
+        <w:t xml:space="preserve"> </w:t>
+      </w:r>
+      <w:r>
+        <w:rPr>
+          <w:rStyle w:val="VerbatimChar"/>
+        </w:rPr>
+        <w:t xml:space="preserve">metadata.json</w:t>
+      </w:r>
+      <w:r>
+        <w:t xml:space="preserve">,</w:t>
+      </w:r>
+      <w:r>
+        <w:t xml:space="preserve"> </w:t>
+      </w:r>
+      <w:r>
+        <w:rPr>
+          <w:rStyle w:val="VerbatimChar"/>
+        </w:rPr>
+        <w:t xml:space="preserve">KDP-FORM-ANSWERS.md</w:t>
+      </w:r>
+      <w:r>
+        <w:t xml:space="preserve">,</w:t>
+      </w:r>
+      <w:r>
+        <w:t xml:space="preserve"> </w:t>
+      </w:r>
+      <w:r>
+        <w:rPr>
+          <w:rStyle w:val="VerbatimChar"/>
+        </w:rPr>
+        <w:t xml:space="preserve">review-notes.md</w:t>
+      </w:r>
+      <w:r>
+        <w:t xml:space="preserve">, and the font</w:t>
+      </w:r>
+      <w:r>
+        <w:t xml:space="preserve"> </w:t>
+      </w:r>
+      <w:r>
+        <w:t xml:space="preserve">license file.</w:t>
+      </w:r>
+    </w:p>
+    <w:p>
+      <w:pPr>
+        <w:pStyle w:val="BodyText"/>
+      </w:pPr>
+      <w:r>
+        <w:t xml:space="preserve">On approval, Kindle-3 copies the package into</w:t>
+      </w:r>
+      <w:r>
+        <w:t xml:space="preserve"> </w:t>
+      </w:r>
+      <w:r>
+        <w:rPr>
+          <w:rStyle w:val="VerbatimChar"/>
+        </w:rPr>
+        <w:t xml:space="preserve">Ready to publish/&lt;book-slug&gt;/</w:t>
+      </w:r>
+      <w:r>
+        <w:t xml:space="preserve">. It commits with the message</w:t>
+      </w:r>
+      <w:r>
+        <w:t xml:space="preserve"> </w:t>
+      </w:r>
+      <w:r>
+        <w:t xml:space="preserve">“</w:t>
+      </w:r>
+      <w:r>
+        <w:t xml:space="preserve">Kindle-3:</w:t>
+      </w:r>
+      <w:r>
+        <w:t xml:space="preserve"> </w:t>
+      </w:r>
+      <w:r>
+        <w:t xml:space="preserve">cover, review and KDP form answers for [book title]</w:t>
+      </w:r>
+      <w:r>
+        <w:t xml:space="preserve">”</w:t>
+      </w:r>
+      <w:r>
+        <w:t xml:space="preserve"> </w:t>
+      </w:r>
+      <w:r>
+        <w:t xml:space="preserve">and logs the run.</w:t>
+      </w:r>
+    </w:p>
+    <w:p>
+      <w:pPr>
+        <w:pStyle w:val="BodyText"/>
+      </w:pPr>
       <w:r>
         <w:rPr>
           <w:bCs/>
           <w:b/>
         </w:rPr>
-        <w:t xml:space="preserve">).</w:t>
-      </w:r>
-      <w:r>
-        <w:t xml:space="preserve"> </w:t>
-      </w:r>
-      <w:r>
-        <w:t xml:space="preserve">REQUIRED for kids’ books and early readers: the Flesch-Kincaid grade of</w:t>
-      </w:r>
-      <w:r>
-        <w:t xml:space="preserve"> </w:t>
-      </w:r>
-      <w:r>
-        <w:rPr>
-          <w:rStyle w:val="VerbatimChar"/>
-        </w:rPr>
-        <w:t xml:space="preserve">manuscript.md</w:t>
-      </w:r>
-      <w:r>
-        <w:t xml:space="preserve"> </w:t>
-      </w:r>
-      <w:r>
-        <w:t xml:space="preserve">must be between 2 and 4 for ages 6 to 9, and between 1 and 3 for ages 4 to 7. A text below the range is too simple; rewrite the sentences that are hard to read.</w:t>
-      </w:r>
-    </w:p>
-    <w:p>
-      <w:pPr>
-        <w:pStyle w:val="BodyText"/>
+        <w:t xml:space="preserve">REQUIRED:</w:t>
+      </w:r>
+      <w:r>
+        <w:t xml:space="preserve"> </w:t>
+      </w:r>
+      <w:r>
+        <w:t xml:space="preserve">nothing is uploaded to Amazon by a robot. The owner</w:t>
+      </w:r>
+      <w:r>
+        <w:t xml:space="preserve"> </w:t>
+      </w:r>
+      <w:r>
+        <w:t xml:space="preserve">uploads each book.</w:t>
+      </w:r>
+    </w:p>
+    <w:bookmarkEnd w:id="33"/>
+    <w:bookmarkStart w:id="34" w:name="stop-retry-and-blocked-rules"/>
+    <w:p>
+      <w:pPr>
+        <w:pStyle w:val="Heading2"/>
+      </w:pPr>
+      <w:r>
+        <w:t xml:space="preserve">15. Stop, retry, and blocked rules</w:t>
+      </w:r>
+    </w:p>
+    <w:p>
+      <w:pPr>
+        <w:numPr>
+          <w:ilvl w:val="0"/>
+          <w:numId w:val="1008"/>
+        </w:numPr>
+        <w:pStyle w:val="Compact"/>
+      </w:pPr>
+      <w:r>
+        <w:t xml:space="preserve">A robot stops and does not finish if: the topic entry is incomplete</w:t>
+      </w:r>
+      <w:r>
+        <w:t xml:space="preserve"> </w:t>
+      </w:r>
+      <w:r>
+        <w:t xml:space="preserve">or contradictory; a fact cannot be verified; the text or cover could</w:t>
+      </w:r>
+      <w:r>
+        <w:t xml:space="preserve"> </w:t>
+      </w:r>
+      <w:r>
+        <w:t xml:space="preserve">use a trademark, copyrighted work, or real-person likeness; the book</w:t>
+      </w:r>
+      <w:r>
+        <w:t xml:space="preserve"> </w:t>
+      </w:r>
+      <w:r>
+        <w:t xml:space="preserve">would give medical, financial, or legal advice; the cover cannot be</w:t>
+      </w:r>
+      <w:r>
+        <w:t xml:space="preserve"> </w:t>
+      </w:r>
+      <w:r>
+        <w:t xml:space="preserve">made to spec; an epubcheck error cannot be fixed; or a category is</w:t>
+      </w:r>
+      <w:r>
+        <w:t xml:space="preserve"> </w:t>
+      </w:r>
+      <w:r>
+        <w:t xml:space="preserve">unconfirmed.</w:t>
+      </w:r>
+    </w:p>
+    <w:p>
+      <w:pPr>
+        <w:numPr>
+          <w:ilvl w:val="0"/>
+          <w:numId w:val="1008"/>
+        </w:numPr>
+        <w:pStyle w:val="Compact"/>
       </w:pPr>
       <w:r>
         <w:rPr>
           <w:bCs/>
           <w:b/>
         </w:rPr>
-        <w:t xml:space="preserve">Judgement checks (Kindle-3 reads the book).</w:t>
-      </w:r>
-      <w:r>
-        <w:t xml:space="preserve"> </w:t>
-      </w:r>
-      <w:r>
-        <w:t xml:space="preserve">REQUIRED: names, places, and facts are consistent; the timeline holds; no repeated or contradictory passages; no sensitive content beyond the stated warnings; no copied passages or trademarks; non-fiction claims spot-checked against</w:t>
-      </w:r>
-      <w:r>
-        <w:t xml:space="preserve"> </w:t>
-      </w:r>
-      <w:r>
-        <w:rPr>
-          <w:rStyle w:val="VerbatimChar"/>
-        </w:rPr>
-        <w:t xml:space="preserve">sources</w:t>
-      </w:r>
-      <w:r>
-        <w:t xml:space="preserve">.</w:t>
-      </w:r>
-    </w:p>
-    <w:bookmarkEnd w:id="32"/>
-    <w:bookmarkStart w:id="33" w:name="output-package-and-handoff"/>
-    <w:p>
-      <w:pPr>
-        <w:pStyle w:val="Heading2"/>
-      </w:pPr>
-      <w:r>
-        <w:t xml:space="preserve">14. Output package and handoff</w:t>
-      </w:r>
-    </w:p>
-    <w:p>
-      <w:pPr>
-        <w:pStyle w:val="FirstParagraph"/>
-      </w:pPr>
-      <w:r>
-        <w:t xml:space="preserve">For each book, save in</w:t>
-      </w:r>
-      <w:r>
-        <w:t xml:space="preserve"> </w:t>
-      </w:r>
-      <w:r>
-        <w:rPr>
-          <w:rStyle w:val="VerbatimChar"/>
-        </w:rPr>
-        <w:t xml:space="preserve">ebooks-Final/&lt;book-slug&gt;/</w:t>
-      </w:r>
-      <w:r>
-        <w:t xml:space="preserve">:</w:t>
-      </w:r>
-      <w:r>
-        <w:t xml:space="preserve"> </w:t>
-      </w:r>
-      <w:r>
-        <w:rPr>
-          <w:rStyle w:val="VerbatimChar"/>
-        </w:rPr>
-        <w:t xml:space="preserve">manuscript.md</w:t>
-      </w:r>
-      <w:r>
-        <w:t xml:space="preserve">,</w:t>
-      </w:r>
-      <w:r>
-        <w:t xml:space="preserve"> </w:t>
-      </w:r>
-      <w:r>
-        <w:rPr>
-          <w:rStyle w:val="VerbatimChar"/>
-        </w:rPr>
-        <w:t xml:space="preserve">manuscript.docx</w:t>
-      </w:r>
-      <w:r>
-        <w:t xml:space="preserve">,</w:t>
-      </w:r>
-      <w:r>
-        <w:t xml:space="preserve"> </w:t>
-      </w:r>
-      <w:r>
-        <w:rPr>
-          <w:rStyle w:val="VerbatimChar"/>
-        </w:rPr>
-        <w:t xml:space="preserve">&lt;book-slug&gt;.epub</w:t>
-      </w:r>
-      <w:r>
-        <w:t xml:space="preserve">,</w:t>
-      </w:r>
-      <w:r>
-        <w:t xml:space="preserve"> </w:t>
-      </w:r>
-      <w:r>
-        <w:rPr>
-          <w:rStyle w:val="VerbatimChar"/>
-        </w:rPr>
-        <w:t xml:space="preserve">cover-ebook.jpg</w:t>
-      </w:r>
-      <w:r>
-        <w:t xml:space="preserve">,</w:t>
-      </w:r>
-      <w:r>
-        <w:t xml:space="preserve"> </w:t>
-      </w:r>
-      <w:r>
-        <w:rPr>
-          <w:rStyle w:val="VerbatimChar"/>
-        </w:rPr>
-        <w:t xml:space="preserve">metadata.json</w:t>
-      </w:r>
-      <w:r>
-        <w:t xml:space="preserve">,</w:t>
-      </w:r>
-      <w:r>
-        <w:t xml:space="preserve"> </w:t>
-      </w:r>
-      <w:r>
-        <w:rPr>
-          <w:rStyle w:val="VerbatimChar"/>
-        </w:rPr>
-        <w:t xml:space="preserve">KDP-FORM-ANSWERS.md</w:t>
-      </w:r>
-      <w:r>
-        <w:t xml:space="preserve">,</w:t>
-      </w:r>
-      <w:r>
-        <w:t xml:space="preserve"> </w:t>
-      </w:r>
-      <w:r>
-        <w:rPr>
-          <w:rStyle w:val="VerbatimChar"/>
-        </w:rPr>
-        <w:t xml:space="preserve">review-notes.md</w:t>
-      </w:r>
-      <w:r>
-        <w:t xml:space="preserve">, and the font license file.</w:t>
-      </w:r>
-    </w:p>
-    <w:p>
-      <w:pPr>
-        <w:pStyle w:val="BodyText"/>
-      </w:pPr>
-      <w:r>
-        <w:t xml:space="preserve">On approval, Kindle-3 copies the package into</w:t>
-      </w:r>
-      <w:r>
-        <w:t xml:space="preserve"> </w:t>
-      </w:r>
-      <w:r>
-        <w:rPr>
-          <w:rStyle w:val="VerbatimChar"/>
-        </w:rPr>
-        <w:t xml:space="preserve">Ready to publish/&lt;book-slug&gt;/</w:t>
-      </w:r>
-      <w:r>
-        <w:t xml:space="preserve">. It commits with the message</w:t>
-      </w:r>
-      <w:r>
-        <w:t xml:space="preserve"> </w:t>
-      </w:r>
-      <w:r>
-        <w:t xml:space="preserve">“</w:t>
-      </w:r>
-      <w:r>
-        <w:t xml:space="preserve">Kindle-3: cover, review and KDP form answers for [book title]</w:t>
-      </w:r>
-      <w:r>
-        <w:t xml:space="preserve">”</w:t>
-      </w:r>
-      <w:r>
-        <w:t xml:space="preserve"> </w:t>
-      </w:r>
-      <w:r>
-        <w:t xml:space="preserve">and logs the run.</w:t>
-      </w:r>
-    </w:p>
-    <w:p>
-      <w:pPr>
-        <w:pStyle w:val="BodyText"/>
+        <w:t xml:space="preserve">When Kindle-2 stops,</w:t>
+      </w:r>
+      <w:r>
+        <w:t xml:space="preserve"> </w:t>
+      </w:r>
+      <w:r>
+        <w:t xml:space="preserve">it deletes the partial folder, so the topic</w:t>
+      </w:r>
+      <w:r>
+        <w:t xml:space="preserve"> </w:t>
+      </w:r>
+      <w:r>
+        <w:t xml:space="preserve">stays available, and logs the reason.</w:t>
+      </w:r>
+    </w:p>
+    <w:p>
+      <w:pPr>
+        <w:numPr>
+          <w:ilvl w:val="0"/>
+          <w:numId w:val="1008"/>
+        </w:numPr>
+        <w:pStyle w:val="Compact"/>
       </w:pPr>
       <w:r>
         <w:rPr>
           <w:bCs/>
           <w:b/>
         </w:rPr>
-        <w:t xml:space="preserve">REQUIRED:</w:t>
-      </w:r>
-      <w:r>
-        <w:t xml:space="preserve"> </w:t>
-      </w:r>
-      <w:r>
-        <w:t xml:space="preserve">nothing is uploaded to Amazon by a robot. The owner uploads each book.</w:t>
-      </w:r>
-    </w:p>
-    <w:bookmarkEnd w:id="33"/>
-    <w:bookmarkStart w:id="34" w:name="stop-retry-and-blocked-rules"/>
+        <w:t xml:space="preserve">When Kindle-3 blocks a book,</w:t>
+      </w:r>
+      <w:r>
+        <w:t xml:space="preserve"> </w:t>
+      </w:r>
+      <w:r>
+        <w:t xml:space="preserve">it logs the exact check that</w:t>
+      </w:r>
+      <w:r>
+        <w:t xml:space="preserve"> </w:t>
+      </w:r>
+      <w:r>
+        <w:t xml:space="preserve">failed. A book blocked twice on Kindle-3 is skipped and shown to the</w:t>
+      </w:r>
+      <w:r>
+        <w:t xml:space="preserve"> </w:t>
+      </w:r>
+      <w:r>
+        <w:t xml:space="preserve">owner as needing a decision. The next book is then reviewed.</w:t>
+      </w:r>
+    </w:p>
+    <w:p>
+      <w:pPr>
+        <w:numPr>
+          <w:ilvl w:val="0"/>
+          <w:numId w:val="1008"/>
+        </w:numPr>
+        <w:pStyle w:val="Compact"/>
+      </w:pPr>
+      <w:r>
+        <w:t xml:space="preserve">Every robot logs its run in</w:t>
+      </w:r>
+      <w:r>
+        <w:t xml:space="preserve"> </w:t>
+      </w:r>
+      <w:r>
+        <w:rPr>
+          <w:rStyle w:val="VerbatimChar"/>
+        </w:rPr>
+        <w:t xml:space="preserve">reports/run-log.json</w:t>
+      </w:r>
+      <w:r>
+        <w:t xml:space="preserve"> </w:t>
+      </w:r>
+      <w:r>
+        <w:t xml:space="preserve">with</w:t>
+      </w:r>
+      <w:r>
+        <w:t xml:space="preserve"> </w:t>
+      </w:r>
+      <w:r>
+        <w:rPr>
+          <w:rStyle w:val="VerbatimChar"/>
+        </w:rPr>
+        <w:t xml:space="preserve">scripts/log_run.py</w:t>
+      </w:r>
+      <w:r>
+        <w:t xml:space="preserve">, including idle and stopped runs.</w:t>
+      </w:r>
+    </w:p>
+    <w:bookmarkEnd w:id="34"/>
+    <w:bookmarkStart w:id="35" w:name="owner-decisions-never-automatic"/>
     <w:p>
       <w:pPr>
         <w:pStyle w:val="Heading2"/>
       </w:pPr>
       <w:r>
-        <w:t xml:space="preserve">15. Stop, retry, and blocked rules</w:t>
-      </w:r>
-    </w:p>
-    <w:p>
-      <w:pPr>
-        <w:numPr>
-          <w:ilvl w:val="0"/>
-          <w:numId w:val="1008"/>
-        </w:numPr>
-        <w:pStyle w:val="Compact"/>
-      </w:pPr>
-      <w:r>
-        <w:t xml:space="preserve">A robot stops and does not finish if: the topic entry is incomplete or contradictory; a fact cannot be verified; the text or cover could use a trademark, copyrighted work, or real-person likeness; the book would give medical, financial, or legal advice; the cover cannot be made to spec; an epubcheck error cannot be fixed; or a category is unconfirmed.</w:t>
-      </w:r>
-    </w:p>
-    <w:p>
-      <w:pPr>
-        <w:numPr>
-          <w:ilvl w:val="0"/>
-          <w:numId w:val="1008"/>
+        <w:t xml:space="preserve">16. Owner decisions (never automatic)</w:t>
+      </w:r>
+    </w:p>
+    <w:p>
+      <w:pPr>
+        <w:numPr>
+          <w:ilvl w:val="0"/>
+          <w:numId w:val="1009"/>
+        </w:numPr>
+        <w:pStyle w:val="Compact"/>
+      </w:pPr>
+      <w:r>
+        <w:t xml:space="preserve">Confirming category paths in the KDP picker.</w:t>
+      </w:r>
+    </w:p>
+    <w:p>
+      <w:pPr>
+        <w:numPr>
+          <w:ilvl w:val="0"/>
+          <w:numId w:val="1009"/>
+        </w:numPr>
+        <w:pStyle w:val="Compact"/>
+      </w:pPr>
+      <w:r>
+        <w:t xml:space="preserve">Holding or releasing topics in</w:t>
+      </w:r>
+      <w:r>
+        <w:t xml:space="preserve"> </w:t>
+      </w:r>
+      <w:r>
+        <w:rPr>
+          <w:rStyle w:val="VerbatimChar"/>
+        </w:rPr>
+        <w:t xml:space="preserve">scripts/topic-holds.json</w:t>
+      </w:r>
+      <w:r>
+        <w:t xml:space="preserve">.</w:t>
+      </w:r>
+    </w:p>
+    <w:p>
+      <w:pPr>
+        <w:numPr>
+          <w:ilvl w:val="0"/>
+          <w:numId w:val="1009"/>
+        </w:numPr>
+        <w:pStyle w:val="Compact"/>
+      </w:pPr>
+      <w:r>
+        <w:t xml:space="preserve">Choosing a second category when a book has only one.</w:t>
+      </w:r>
+    </w:p>
+    <w:p>
+      <w:pPr>
+        <w:numPr>
+          <w:ilvl w:val="0"/>
+          <w:numId w:val="1009"/>
+        </w:numPr>
+        <w:pStyle w:val="Compact"/>
+      </w:pPr>
+      <w:r>
+        <w:t xml:space="preserve">Checking each cover before upload.</w:t>
+      </w:r>
+    </w:p>
+    <w:p>
+      <w:pPr>
+        <w:numPr>
+          <w:ilvl w:val="0"/>
+          <w:numId w:val="1009"/>
+        </w:numPr>
+        <w:pStyle w:val="Compact"/>
+      </w:pPr>
+      <w:r>
+        <w:t xml:space="preserve">Uploading each book to KDP and clicking Publish.</w:t>
+      </w:r>
+    </w:p>
+    <w:p>
+      <w:pPr>
+        <w:numPr>
+          <w:ilvl w:val="0"/>
+          <w:numId w:val="1009"/>
+        </w:numPr>
+        <w:pStyle w:val="Compact"/>
+      </w:pPr>
+      <w:r>
+        <w:t xml:space="preserve">Any change to this guide.</w:t>
+      </w:r>
+    </w:p>
+    <w:bookmarkEnd w:id="35"/>
+    <w:bookmarkStart w:id="36" w:name="series-notes"/>
+    <w:p>
+      <w:pPr>
+        <w:pStyle w:val="Heading2"/>
+      </w:pPr>
+      <w:r>
+        <w:t xml:space="preserve">17. Series notes</w:t>
+      </w:r>
+    </w:p>
+    <w:p>
+      <w:pPr>
+        <w:pStyle w:val="FirstParagraph"/>
+      </w:pPr>
+      <w:r>
+        <w:t xml:space="preserve">Keep a series note for each series: the characters, setting, and</w:t>
+      </w:r>
+      <w:r>
+        <w:t xml:space="preserve"> </w:t>
+      </w:r>
+      <w:r>
+        <w:t xml:space="preserve">timeline, in</w:t>
+      </w:r>
+      <w:r>
+        <w:t xml:space="preserve"> </w:t>
+      </w:r>
+      <w:r>
+        <w:rPr>
+          <w:rStyle w:val="VerbatimChar"/>
+        </w:rPr>
+        <w:t xml:space="preserve">series/&lt;series-slug&gt;.md</w:t>
+      </w:r>
+      <w:r>
+        <w:t xml:space="preserve">. Kindle-2 reads it before writing</w:t>
+      </w:r>
+      <w:r>
+        <w:t xml:space="preserve"> </w:t>
+      </w:r>
+      <w:r>
+        <w:t xml:space="preserve">a book in that series and updates it afterwards.</w:t>
+      </w:r>
+    </w:p>
+    <w:bookmarkEnd w:id="36"/>
+    <w:bookmarkStart w:id="37" w:name="quality-checklist"/>
+    <w:p>
+      <w:pPr>
+        <w:pStyle w:val="Heading2"/>
+      </w:pPr>
+      <w:r>
+        <w:t xml:space="preserve">18. Quality checklist</w:t>
+      </w:r>
+    </w:p>
+    <w:p>
+      <w:pPr>
+        <w:numPr>
+          <w:ilvl w:val="0"/>
+          <w:numId w:val="1010"/>
+        </w:numPr>
+        <w:pStyle w:val="Compact"/>
+      </w:pPr>
+      <w:r>
+        <w:t xml:space="preserve">Word count within 10 percent of target.</w:t>
+      </w:r>
+    </w:p>
+    <w:p>
+      <w:pPr>
+        <w:numPr>
+          <w:ilvl w:val="0"/>
+          <w:numId w:val="1010"/>
+        </w:numPr>
+        <w:pStyle w:val="Compact"/>
+      </w:pPr>
+      <w:r>
+        <w:t xml:space="preserve">No placeholder text, bracketed notes, or leftover prompts.</w:t>
+      </w:r>
+    </w:p>
+    <w:p>
+      <w:pPr>
+        <w:numPr>
+          <w:ilvl w:val="0"/>
+          <w:numId w:val="1010"/>
+        </w:numPr>
+        <w:pStyle w:val="Compact"/>
+      </w:pPr>
+      <w:r>
+        <w:t xml:space="preserve">Names, dates, and facts consistent.</w:t>
+      </w:r>
+    </w:p>
+    <w:p>
+      <w:pPr>
+        <w:numPr>
+          <w:ilvl w:val="0"/>
+          <w:numId w:val="1010"/>
+        </w:numPr>
+        <w:pStyle w:val="Compact"/>
+      </w:pPr>
+      <w:r>
+        <w:t xml:space="preserve">Readability check passed for kids’ books and early readers.</w:t>
+      </w:r>
+    </w:p>
+    <w:p>
+      <w:pPr>
+        <w:numPr>
+          <w:ilvl w:val="0"/>
+          <w:numId w:val="1010"/>
+        </w:numPr>
+        <w:pStyle w:val="Compact"/>
+      </w:pPr>
+      <w:r>
+        <w:t xml:space="preserve">Cover meets section 6 and</w:t>
+      </w:r>
+      <w:r>
+        <w:t xml:space="preserve"> </w:t>
+      </w:r>
+      <w:r>
+        <w:rPr>
+          <w:rStyle w:val="VerbatimChar"/>
+        </w:rPr>
+        <w:t xml:space="preserve">check_cover.py</w:t>
+      </w:r>
+      <w:r>
+        <w:t xml:space="preserve"> </w:t>
+      </w:r>
+      <w:r>
+        <w:t xml:space="preserve">passes.</w:t>
+      </w:r>
+    </w:p>
+    <w:p>
+      <w:pPr>
+        <w:numPr>
+          <w:ilvl w:val="0"/>
+          <w:numId w:val="1010"/>
+        </w:numPr>
+        <w:pStyle w:val="Compact"/>
+      </w:pPr>
+      <w:r>
+        <w:t xml:space="preserve">epubcheck passes with 0 errors and 0 warnings.</w:t>
+      </w:r>
+    </w:p>
+    <w:p>
+      <w:pPr>
+        <w:numPr>
+          <w:ilvl w:val="0"/>
+          <w:numId w:val="1010"/>
+        </w:numPr>
+        <w:pStyle w:val="Compact"/>
+      </w:pPr>
+      <w:r>
+        <w:t xml:space="preserve">Required disclosures and disclaimers present.</w:t>
+      </w:r>
+    </w:p>
+    <w:p>
+      <w:pPr>
+        <w:numPr>
+          <w:ilvl w:val="0"/>
+          <w:numId w:val="1010"/>
+        </w:numPr>
+        <w:pStyle w:val="Compact"/>
+      </w:pPr>
+      <w:r>
+        <w:rPr>
+          <w:rStyle w:val="VerbatimChar"/>
+        </w:rPr>
+        <w:t xml:space="preserve">check_book.py</w:t>
+      </w:r>
+      <w:r>
+        <w:t xml:space="preserve"> </w:t>
+      </w:r>
+      <w:r>
+        <w:t xml:space="preserve">passes every check.</w:t>
+      </w:r>
+    </w:p>
+    <w:p>
+      <w:pPr>
+        <w:numPr>
+          <w:ilvl w:val="0"/>
+          <w:numId w:val="1010"/>
+        </w:numPr>
+        <w:pStyle w:val="Compact"/>
+      </w:pPr>
+      <w:r>
+        <w:rPr>
+          <w:rStyle w:val="VerbatimChar"/>
+        </w:rPr>
+        <w:t xml:space="preserve">KDP-FORM-ANSWERS.md</w:t>
+      </w:r>
+      <w:r>
+        <w:t xml:space="preserve"> </w:t>
+      </w:r>
+      <w:r>
+        <w:t xml:space="preserve">generated and matches</w:t>
+      </w:r>
+      <w:r>
+        <w:t xml:space="preserve"> </w:t>
+      </w:r>
+      <w:r>
+        <w:rPr>
+          <w:rStyle w:val="VerbatimChar"/>
+        </w:rPr>
+        <w:t xml:space="preserve">metadata.json</w:t>
+      </w:r>
+      <w:r>
+        <w:t xml:space="preserve">.</w:t>
+      </w:r>
+    </w:p>
+    <w:p>
+      <w:pPr>
+        <w:numPr>
+          <w:ilvl w:val="0"/>
+          <w:numId w:val="1010"/>
+        </w:numPr>
+        <w:pStyle w:val="Compact"/>
+      </w:pPr>
+      <w:r>
+        <w:t xml:space="preserve">No trademarked names, real-person likenesses, or copied passages.</w:t>
+      </w:r>
+    </w:p>
+    <w:bookmarkEnd w:id="37"/>
+    <w:bookmarkStart w:id="38" w:name="change-log"/>
+    <w:p>
+      <w:pPr>
+        <w:pStyle w:val="Heading2"/>
+      </w:pPr>
+      <w:r>
+        <w:t xml:space="preserve">19. Change log</w:t>
+      </w:r>
+    </w:p>
+    <w:p>
+      <w:pPr>
+        <w:numPr>
+          <w:ilvl w:val="0"/>
+          <w:numId w:val="1011"/>
         </w:numPr>
         <w:pStyle w:val="Compact"/>
       </w:pPr>
@@ -3012,420 +4106,76 @@
           <w:bCs/>
           <w:b/>
         </w:rPr>
-        <w:t xml:space="preserve">When Kindle-2 stops,</w:t>
-      </w:r>
-      <w:r>
-        <w:t xml:space="preserve"> </w:t>
-      </w:r>
-      <w:r>
-        <w:t xml:space="preserve">it deletes the partial folder, so the topic stays available, and logs the reason.</w:t>
-      </w:r>
-    </w:p>
-    <w:p>
-      <w:pPr>
-        <w:numPr>
-          <w:ilvl w:val="0"/>
-          <w:numId w:val="1008"/>
-        </w:numPr>
-        <w:pStyle w:val="Compact"/>
-      </w:pPr>
-      <w:r>
-        <w:rPr>
-          <w:bCs/>
-          <w:b/>
-        </w:rPr>
-        <w:t xml:space="preserve">When Kindle-3 blocks a book,</w:t>
-      </w:r>
-      <w:r>
-        <w:t xml:space="preserve"> </w:t>
-      </w:r>
-      <w:r>
-        <w:t xml:space="preserve">it logs the exact check that failed. A book blocked twice on Kindle-3 is skipped and shown to the owner as needing a decision. The next book is then reviewed.</w:t>
-      </w:r>
-    </w:p>
-    <w:p>
-      <w:pPr>
-        <w:numPr>
-          <w:ilvl w:val="0"/>
-          <w:numId w:val="1008"/>
-        </w:numPr>
-        <w:pStyle w:val="Compact"/>
-      </w:pPr>
-      <w:r>
-        <w:t xml:space="preserve">Every robot logs its run in</w:t>
-      </w:r>
-      <w:r>
-        <w:t xml:space="preserve"> </w:t>
-      </w:r>
-      <w:r>
-        <w:rPr>
-          <w:rStyle w:val="VerbatimChar"/>
-        </w:rPr>
-        <w:t xml:space="preserve">reports/run-log.json</w:t>
-      </w:r>
-      <w:r>
-        <w:t xml:space="preserve"> </w:t>
-      </w:r>
-      <w:r>
-        <w:t xml:space="preserve">with</w:t>
-      </w:r>
-      <w:r>
-        <w:t xml:space="preserve"> </w:t>
-      </w:r>
-      <w:r>
-        <w:rPr>
-          <w:rStyle w:val="VerbatimChar"/>
-        </w:rPr>
-        <w:t xml:space="preserve">scripts/log_run.py</w:t>
-      </w:r>
-      <w:r>
-        <w:t xml:space="preserve">, including idle and stopped runs.</w:t>
-      </w:r>
-    </w:p>
-    <w:bookmarkEnd w:id="34"/>
-    <w:bookmarkStart w:id="35" w:name="owner-decisions-never-automatic"/>
-    <w:p>
-      <w:pPr>
-        <w:pStyle w:val="Heading2"/>
-      </w:pPr>
-      <w:r>
-        <w:t xml:space="preserve">16. Owner decisions (never automatic)</w:t>
-      </w:r>
-    </w:p>
-    <w:p>
-      <w:pPr>
-        <w:numPr>
-          <w:ilvl w:val="0"/>
-          <w:numId w:val="1009"/>
-        </w:numPr>
-        <w:pStyle w:val="Compact"/>
-      </w:pPr>
-      <w:r>
-        <w:t xml:space="preserve">Confirming category paths in the KDP picker.</w:t>
-      </w:r>
-    </w:p>
-    <w:p>
-      <w:pPr>
-        <w:numPr>
-          <w:ilvl w:val="0"/>
-          <w:numId w:val="1009"/>
-        </w:numPr>
-        <w:pStyle w:val="Compact"/>
-      </w:pPr>
-      <w:r>
-        <w:t xml:space="preserve">Holding or releasing topics in</w:t>
-      </w:r>
-      <w:r>
-        <w:t xml:space="preserve"> </w:t>
-      </w:r>
-      <w:r>
-        <w:rPr>
-          <w:rStyle w:val="VerbatimChar"/>
-        </w:rPr>
-        <w:t xml:space="preserve">scripts/topic-holds.json</w:t>
+        <w:t xml:space="preserve">2.0 (18 October 2026):</w:t>
+      </w:r>
+      <w:r>
+        <w:t xml:space="preserve"> </w:t>
+      </w:r>
+      <w:r>
+        <w:t xml:space="preserve">ebook only; print removed. Two categories</w:t>
+      </w:r>
+      <w:r>
+        <w:t xml:space="preserve"> </w:t>
+      </w:r>
+      <w:r>
+        <w:t xml:space="preserve">from a confirmed pool. KDP form answers required. Robo-2 renamed</w:t>
+      </w:r>
+      <w:r>
+        <w:t xml:space="preserve"> </w:t>
+      </w:r>
+      <w:r>
+        <w:t xml:space="preserve">Kindle-2 throughout. Copyright placeholder replaced with</w:t>
+      </w:r>
+      <w:r>
+        <w:t xml:space="preserve"> </w:t>
+      </w:r>
+      <w:r>
+        <w:t xml:space="preserve">“</w:t>
+      </w:r>
+      <w:r>
+        <w:t xml:space="preserve">Skybee</w:t>
+      </w:r>
+      <w:r>
+        <w:t xml:space="preserve">”</w:t>
       </w:r>
       <w:r>
         <w:t xml:space="preserve">.</w:t>
       </w:r>
-    </w:p>
-    <w:p>
-      <w:pPr>
-        <w:numPr>
-          <w:ilvl w:val="0"/>
-          <w:numId w:val="1009"/>
-        </w:numPr>
-        <w:pStyle w:val="Compact"/>
-      </w:pPr>
-      <w:r>
-        <w:t xml:space="preserve">Choosing a second category when a book has only one.</w:t>
-      </w:r>
-    </w:p>
-    <w:p>
-      <w:pPr>
-        <w:numPr>
-          <w:ilvl w:val="0"/>
-          <w:numId w:val="1009"/>
-        </w:numPr>
-        <w:pStyle w:val="Compact"/>
-      </w:pPr>
-      <w:r>
-        <w:t xml:space="preserve">Checking each cover before upload.</w:t>
-      </w:r>
-    </w:p>
-    <w:p>
-      <w:pPr>
-        <w:numPr>
-          <w:ilvl w:val="0"/>
-          <w:numId w:val="1009"/>
-        </w:numPr>
-        <w:pStyle w:val="Compact"/>
-      </w:pPr>
-      <w:r>
-        <w:t xml:space="preserve">Uploading each book to KDP and clicking Publish.</w:t>
-      </w:r>
-    </w:p>
-    <w:p>
-      <w:pPr>
-        <w:numPr>
-          <w:ilvl w:val="0"/>
-          <w:numId w:val="1009"/>
-        </w:numPr>
-        <w:pStyle w:val="Compact"/>
-      </w:pPr>
-      <w:r>
-        <w:t xml:space="preserve">Any change to this guide.</w:t>
-      </w:r>
-    </w:p>
-    <w:bookmarkEnd w:id="35"/>
-    <w:bookmarkStart w:id="36" w:name="series-notes"/>
-    <w:p>
-      <w:pPr>
-        <w:pStyle w:val="Heading2"/>
-      </w:pPr>
-      <w:r>
-        <w:t xml:space="preserve">17. Series notes</w:t>
-      </w:r>
-    </w:p>
-    <w:p>
-      <w:pPr>
-        <w:pStyle w:val="FirstParagraph"/>
-      </w:pPr>
-      <w:r>
-        <w:t xml:space="preserve">Keep a series note for each series: the characters, setting, and timeline, in</w:t>
-      </w:r>
-      <w:r>
-        <w:t xml:space="preserve"> </w:t>
-      </w:r>
-      <w:r>
-        <w:rPr>
-          <w:rStyle w:val="VerbatimChar"/>
-        </w:rPr>
-        <w:t xml:space="preserve">series/&lt;series-slug&gt;.md</w:t>
-      </w:r>
-      <w:r>
-        <w:t xml:space="preserve">. Kindle-2 reads it before writing a book in that series and updates it afterwards.</w:t>
-      </w:r>
-    </w:p>
-    <w:bookmarkEnd w:id="36"/>
-    <w:bookmarkStart w:id="37" w:name="quality-checklist"/>
-    <w:p>
-      <w:pPr>
-        <w:pStyle w:val="Heading2"/>
-      </w:pPr>
-      <w:r>
-        <w:t xml:space="preserve">18. Quality checklist</w:t>
-      </w:r>
-    </w:p>
-    <w:p>
-      <w:pPr>
-        <w:numPr>
-          <w:ilvl w:val="0"/>
-          <w:numId w:val="1010"/>
-        </w:numPr>
-        <w:pStyle w:val="Compact"/>
-      </w:pPr>
-      <w:r>
-        <w:t xml:space="preserve">Word count within 10 percent of target.</w:t>
-      </w:r>
-    </w:p>
-    <w:p>
-      <w:pPr>
-        <w:numPr>
-          <w:ilvl w:val="0"/>
-          <w:numId w:val="1010"/>
-        </w:numPr>
-        <w:pStyle w:val="Compact"/>
-      </w:pPr>
-      <w:r>
-        <w:t xml:space="preserve">No placeholder text, bracketed notes, or leftover prompts.</w:t>
-      </w:r>
-    </w:p>
-    <w:p>
-      <w:pPr>
-        <w:numPr>
-          <w:ilvl w:val="0"/>
-          <w:numId w:val="1010"/>
-        </w:numPr>
-        <w:pStyle w:val="Compact"/>
-      </w:pPr>
-      <w:r>
-        <w:t xml:space="preserve">Names, dates, and facts consistent.</w:t>
-      </w:r>
-    </w:p>
-    <w:p>
-      <w:pPr>
-        <w:numPr>
-          <w:ilvl w:val="0"/>
-          <w:numId w:val="1010"/>
-        </w:numPr>
-        <w:pStyle w:val="Compact"/>
-      </w:pPr>
-      <w:r>
-        <w:t xml:space="preserve">Readability check passed for kids’ books and early readers.</w:t>
-      </w:r>
-    </w:p>
-    <w:p>
-      <w:pPr>
-        <w:numPr>
-          <w:ilvl w:val="0"/>
-          <w:numId w:val="1010"/>
-        </w:numPr>
-        <w:pStyle w:val="Compact"/>
-      </w:pPr>
-      <w:r>
-        <w:t xml:space="preserve">Cover meets section 6 and</w:t>
-      </w:r>
-      <w:r>
-        <w:t xml:space="preserve"> </w:t>
-      </w:r>
-      <w:r>
-        <w:rPr>
-          <w:rStyle w:val="VerbatimChar"/>
-        </w:rPr>
-        <w:t xml:space="preserve">check_cover.py</w:t>
-      </w:r>
-      <w:r>
-        <w:t xml:space="preserve"> </w:t>
-      </w:r>
-      <w:r>
-        <w:t xml:space="preserve">passes.</w:t>
-      </w:r>
-    </w:p>
-    <w:p>
-      <w:pPr>
-        <w:numPr>
-          <w:ilvl w:val="0"/>
-          <w:numId w:val="1010"/>
-        </w:numPr>
-        <w:pStyle w:val="Compact"/>
-      </w:pPr>
-      <w:r>
-        <w:t xml:space="preserve">epubcheck passes with 0 errors and 0 warnings.</w:t>
-      </w:r>
-    </w:p>
-    <w:p>
-      <w:pPr>
-        <w:numPr>
-          <w:ilvl w:val="0"/>
-          <w:numId w:val="1010"/>
-        </w:numPr>
-        <w:pStyle w:val="Compact"/>
-      </w:pPr>
-      <w:r>
-        <w:t xml:space="preserve">Required disclosures and disclaimers present.</w:t>
-      </w:r>
-    </w:p>
-    <w:p>
-      <w:pPr>
-        <w:numPr>
-          <w:ilvl w:val="0"/>
-          <w:numId w:val="1010"/>
-        </w:numPr>
-        <w:pStyle w:val="Compact"/>
-      </w:pPr>
-      <w:r>
-        <w:rPr>
-          <w:rStyle w:val="VerbatimChar"/>
-        </w:rPr>
-        <w:t xml:space="preserve">check_book.py</w:t>
-      </w:r>
-      <w:r>
-        <w:t xml:space="preserve"> </w:t>
-      </w:r>
-      <w:r>
-        <w:t xml:space="preserve">passes every check.</w:t>
-      </w:r>
-    </w:p>
-    <w:p>
-      <w:pPr>
-        <w:numPr>
-          <w:ilvl w:val="0"/>
-          <w:numId w:val="1010"/>
-        </w:numPr>
-        <w:pStyle w:val="Compact"/>
-      </w:pPr>
-      <w:r>
-        <w:rPr>
-          <w:rStyle w:val="VerbatimChar"/>
-        </w:rPr>
-        <w:t xml:space="preserve">KDP-FORM-ANSWERS.md</w:t>
-      </w:r>
-      <w:r>
-        <w:t xml:space="preserve"> </w:t>
-      </w:r>
-      <w:r>
-        <w:t xml:space="preserve">generated and matches</w:t>
-      </w:r>
-      <w:r>
-        <w:t xml:space="preserve"> </w:t>
-      </w:r>
-      <w:r>
-        <w:rPr>
-          <w:rStyle w:val="VerbatimChar"/>
-        </w:rPr>
-        <w:t xml:space="preserve">metadata.json</w:t>
-      </w:r>
-      <w:r>
-        <w:t xml:space="preserve">.</w:t>
-      </w:r>
-    </w:p>
-    <w:p>
-      <w:pPr>
-        <w:numPr>
-          <w:ilvl w:val="0"/>
-          <w:numId w:val="1010"/>
-        </w:numPr>
-        <w:pStyle w:val="Compact"/>
-      </w:pPr>
-      <w:r>
-        <w:t xml:space="preserve">No trademarked names, real-person likenesses, or copied passages.</w:t>
-      </w:r>
-    </w:p>
-    <w:bookmarkEnd w:id="37"/>
-    <w:bookmarkStart w:id="38" w:name="change-log"/>
-    <w:p>
-      <w:pPr>
-        <w:pStyle w:val="Heading2"/>
-      </w:pPr>
-      <w:r>
-        <w:t xml:space="preserve">19. Change log</w:t>
-      </w:r>
-    </w:p>
-    <w:p>
-      <w:pPr>
-        <w:numPr>
-          <w:ilvl w:val="0"/>
-          <w:numId w:val="1011"/>
-        </w:numPr>
-        <w:pStyle w:val="Compact"/>
-      </w:pPr>
-      <w:r>
-        <w:rPr>
-          <w:bCs/>
-          <w:b/>
-        </w:rPr>
-        <w:t xml:space="preserve">2.0 (18 October 2026):</w:t>
-      </w:r>
-      <w:r>
-        <w:t xml:space="preserve"> </w:t>
-      </w:r>
-      <w:r>
-        <w:t xml:space="preserve">ebook only; print removed. Two categories from a confirmed pool. KDP form answers required. Robo-2 renamed Kindle-2 throughout. Copyright placeholder replaced with</w:t>
-      </w:r>
-      <w:r>
-        <w:t xml:space="preserve"> </w:t>
-      </w:r>
-      <w:r>
-        <w:t xml:space="preserve">“</w:t>
-      </w:r>
-      <w:r>
-        <w:t xml:space="preserve">Skybee</w:t>
-      </w:r>
-      <w:r>
-        <w:t xml:space="preserve">”</w:t>
-      </w:r>
-      <w:r>
-        <w:t xml:space="preserve">. Phone preview replaced by Kindle Previewer check by the owner. KDP Select rule set: series enrolled, standalone not. Workbooks and guides require the non-fiction disclaimer. Readability tool named and required for kids’ books. Stop, retry and two-strike rules added. Cover approval moved to the owner’s check at upload. Mechanical checks made into scripts.</w:t>
+      <w:r>
+        <w:t xml:space="preserve"> </w:t>
+      </w:r>
+      <w:r>
+        <w:t xml:space="preserve">Phone preview replaced by Kindle Previewer check by the owner. KDP</w:t>
+      </w:r>
+      <w:r>
+        <w:t xml:space="preserve"> </w:t>
+      </w:r>
+      <w:r>
+        <w:t xml:space="preserve">Select rule set: series enrolled, standalone not. Workbooks and</w:t>
+      </w:r>
+      <w:r>
+        <w:t xml:space="preserve"> </w:t>
+      </w:r>
+      <w:r>
+        <w:t xml:space="preserve">guides require the non-fiction disclaimer. Readability tool named</w:t>
+      </w:r>
+      <w:r>
+        <w:t xml:space="preserve"> </w:t>
+      </w:r>
+      <w:r>
+        <w:t xml:space="preserve">and required for kids’ books. Stop, retry and two-strike rules</w:t>
+      </w:r>
+      <w:r>
+        <w:t xml:space="preserve"> </w:t>
+      </w:r>
+      <w:r>
+        <w:t xml:space="preserve">added. Cover approval moved to the owner’s check at upload.</w:t>
+      </w:r>
+      <w:r>
+        <w:t xml:space="preserve"> </w:t>
+      </w:r>
+      <w:r>
+        <w:t xml:space="preserve">Mechanical checks made into scripts.</w:t>
       </w:r>
     </w:p>
     <w:p>

</xml_diff>

<commit_message>
Guide: describe the automatic category gates
Co-Authored-By: Claude Haiku 5.5 <noreply@anthropic.com>
Claude-Session: https://claude.ai/code/session_01MZeVJcyf7XvKRRCE6AUkLk
</commit_message>
<xml_diff>
--- a/ebooks-Raw/guide.docx
+++ b/ebooks-Raw/guide.docx
@@ -2770,6 +2770,68 @@
         <w:t xml:space="preserve">field decides which pool entries suit which book type.</w:t>
       </w:r>
     </w:p>
+    <w:p>
+      <w:pPr>
+        <w:numPr>
+          <w:ilvl w:val="0"/>
+          <w:numId w:val="1007"/>
+        </w:numPr>
+        <w:pStyle w:val="Compact"/>
+      </w:pPr>
+      <w:r>
+        <w:rPr>
+          <w:bCs/>
+          <w:b/>
+        </w:rPr>
+        <w:t xml:space="preserve">Automatic gate:</w:t>
+      </w:r>
+      <w:r>
+        <w:t xml:space="preserve"> </w:t>
+      </w:r>
+      <w:r>
+        <w:rPr>
+          <w:rStyle w:val="VerbatimChar"/>
+        </w:rPr>
+        <w:t xml:space="preserve">scripts/pick_topic.py</w:t>
+      </w:r>
+      <w:r>
+        <w:t xml:space="preserve"> </w:t>
+      </w:r>
+      <w:r>
+        <w:t xml:space="preserve">only picks a topic whose two categories are both confirmed in the pool. A topic with an unconfirmed or missing category waits in the queue. It is not written and not marked used.</w:t>
+      </w:r>
+    </w:p>
+    <w:p>
+      <w:pPr>
+        <w:numPr>
+          <w:ilvl w:val="0"/>
+          <w:numId w:val="1007"/>
+        </w:numPr>
+        <w:pStyle w:val="Compact"/>
+      </w:pPr>
+      <w:r>
+        <w:rPr>
+          <w:bCs/>
+          <w:b/>
+        </w:rPr>
+        <w:t xml:space="preserve">Automatic validation:</w:t>
+      </w:r>
+      <w:r>
+        <w:t xml:space="preserve"> </w:t>
+      </w:r>
+      <w:r>
+        <w:rPr>
+          <w:rStyle w:val="VerbatimChar"/>
+        </w:rPr>
+        <w:t xml:space="preserve">scripts/sync_topics.py</w:t>
+      </w:r>
+      <w:r>
+        <w:t xml:space="preserve"> </w:t>
+      </w:r>
+      <w:r>
+        <w:t xml:space="preserve">rejects any topic whose categories are not exactly two pool paths, and reports an error.</w:t>
+      </w:r>
+    </w:p>
     <w:bookmarkEnd w:id="29"/>
     <w:bookmarkStart w:id="30" w:name="metadata-package"/>
     <w:p>
@@ -3791,7 +3853,19 @@
         <w:pStyle w:val="Compact"/>
       </w:pPr>
       <w:r>
-        <w:t xml:space="preserve">Confirming category paths in the KDP picker.</w:t>
+        <w:t xml:space="preserve">Confirming category paths in the KDP picker, then marking them confirmed in</w:t>
+      </w:r>
+      <w:r>
+        <w:t xml:space="preserve"> </w:t>
+      </w:r>
+      <w:r>
+        <w:rPr>
+          <w:rStyle w:val="VerbatimChar"/>
+        </w:rPr>
+        <w:t xml:space="preserve">ebook-topics/category-pool.json</w:t>
+      </w:r>
+      <w:r>
+        <w:t xml:space="preserve">. Until then, the affected topics wait.</w:t>
       </w:r>
     </w:p>
     <w:p>

</xml_diff>

<commit_message>
Cover system: brief first, cover checked against its book; guide 2.1
Co-Authored-By: Claude Haiku 5.5 <noreply@anthropic.com>
Claude-Session: https://claude.ai/code/session_01MZeVJcyf7XvKRRCE6AUkLk
</commit_message>
<xml_diff>
--- a/ebooks-Raw/guide.docx
+++ b/ebooks-Raw/guide.docx
@@ -2,13 +2,13 @@
 <file path=word/document.xml><?xml version="1.0" encoding="utf-8"?>
 <w:document xmlns:w="http://schemas.openxmlformats.org/wordprocessingml/2006/main" xmlns:m="http://schemas.openxmlformats.org/officeDocument/2006/math" xmlns:r="http://schemas.openxmlformats.org/officeDocument/2006/relationships" xmlns:o="urn:schemas-microsoft-com:office:office" xmlns:v="urn:schemas-microsoft-com:vml" xmlns:w10="urn:schemas-microsoft-com:office:word" xmlns:a="http://schemas.openxmlformats.org/drawingml/2006/main" xmlns:pic="http://schemas.openxmlformats.org/drawingml/2006/picture" xmlns:wp="http://schemas.openxmlformats.org/drawingml/2006/wordprocessingDrawing">
   <w:body>
-    <w:bookmarkStart w:id="39" w:name="ebook-creation-guide-version-2.0"/>
+    <w:bookmarkStart w:id="39" w:name="ebook-creation-guide-version-2.1"/>
     <w:p>
       <w:pPr>
         <w:pStyle w:val="Heading1"/>
       </w:pPr>
       <w:r>
-        <w:t xml:space="preserve">Ebook Creation Guide, Version 2.0</w:t>
+        <w:t xml:space="preserve">Ebook Creation Guide, Version 2.1</w:t>
       </w:r>
     </w:p>
     <w:p>
@@ -16,13 +16,7 @@
         <w:pStyle w:val="FirstParagraph"/>
       </w:pPr>
       <w:r>
-        <w:t xml:space="preserve">This guide is the rulebook for the Kindle pipeline. Every robot reads it</w:t>
-      </w:r>
-      <w:r>
-        <w:t xml:space="preserve"> </w:t>
-      </w:r>
-      <w:r>
-        <w:t xml:space="preserve">before starting work. Anything marked</w:t>
+        <w:t xml:space="preserve">This guide is the rulebook for the Kindle pipeline. Every robot reads it before starting work. Anything marked</w:t>
       </w:r>
       <w:r>
         <w:t xml:space="preserve"> </w:t>
@@ -38,13 +32,7 @@
         <w:t xml:space="preserve"> </w:t>
       </w:r>
       <w:r>
-        <w:t xml:space="preserve">must be done.</w:t>
-      </w:r>
-      <w:r>
-        <w:t xml:space="preserve"> </w:t>
-      </w:r>
-      <w:r>
-        <w:t xml:space="preserve">Anything marked</w:t>
+        <w:t xml:space="preserve">must be done. Anything marked</w:t>
       </w:r>
       <w:r>
         <w:t xml:space="preserve"> </w:t>
@@ -60,13 +48,7 @@
         <w:t xml:space="preserve"> </w:t>
       </w:r>
       <w:r>
-        <w:t xml:space="preserve">can be adjusted, but the change must be</w:t>
-      </w:r>
-      <w:r>
-        <w:t xml:space="preserve"> </w:t>
-      </w:r>
-      <w:r>
-        <w:t xml:space="preserve">recorded in the book’s review-notes.md.</w:t>
+        <w:t xml:space="preserve">can be adjusted, but the change must be recorded in the book’s review-notes.md.</w:t>
       </w:r>
     </w:p>
     <w:p>
@@ -84,25 +66,19 @@
         <w:t xml:space="preserve"> </w:t>
       </w:r>
       <w:r>
-        <w:t xml:space="preserve">2.0. Each book’s metadata.json records</w:t>
-      </w:r>
-      <w:r>
-        <w:t xml:space="preserve"> </w:t>
-      </w:r>
-      <w:r>
-        <w:rPr>
-          <w:rStyle w:val="VerbatimChar"/>
-        </w:rPr>
-        <w:t xml:space="preserve">"guide_version": "2.0"</w:t>
-      </w:r>
-      <w:r>
-        <w:t xml:space="preserve">. Changes need the owner’s sign-off, and each</w:t>
-      </w:r>
-      <w:r>
-        <w:t xml:space="preserve"> </w:t>
-      </w:r>
-      <w:r>
-        <w:t xml:space="preserve">change is recorded in section 19.</w:t>
+        <w:t xml:space="preserve">2.1. Each book’s metadata.json records</w:t>
+      </w:r>
+      <w:r>
+        <w:t xml:space="preserve"> </w:t>
+      </w:r>
+      <w:r>
+        <w:rPr>
+          <w:rStyle w:val="VerbatimChar"/>
+        </w:rPr>
+        <w:t xml:space="preserve">"guide_version": "2.1"</w:t>
+      </w:r>
+      <w:r>
+        <w:t xml:space="preserve">. Changes need the owner’s sign-off, and each change is recorded in section 19.</w:t>
       </w:r>
     </w:p>
     <w:bookmarkStart w:id="20" w:name="scope-and-roles"/>
@@ -133,13 +109,7 @@
         <w:t xml:space="preserve"> </w:t>
       </w:r>
       <w:r>
-        <w:t xml:space="preserve">Kindle eBooks for Amazon KDP only. Text-only EPUB, with a</w:t>
-      </w:r>
-      <w:r>
-        <w:t xml:space="preserve"> </w:t>
-      </w:r>
-      <w:r>
-        <w:t xml:space="preserve">fixed-layout EPUB where the format requires it.</w:t>
+        <w:t xml:space="preserve">Kindle eBooks for Amazon KDP only. Text-only EPUB, with a fixed-layout EPUB where the format requires it.</w:t>
       </w:r>
       <w:r>
         <w:t xml:space="preserve"> </w:t>
@@ -149,27 +119,57 @@
           <w:bCs/>
           <w:b/>
         </w:rPr>
-        <w:t xml:space="preserve">Print books are</w:t>
-      </w:r>
+        <w:t xml:space="preserve">Print books are out of scope.</w:t>
+      </w:r>
+      <w:r>
+        <w:t xml:space="preserve"> </w:t>
+      </w:r>
+      <w:r>
+        <w:t xml:space="preserve">No print PDF is made.</w:t>
+      </w:r>
+    </w:p>
+    <w:p>
+      <w:pPr>
+        <w:numPr>
+          <w:ilvl w:val="0"/>
+          <w:numId w:val="1001"/>
+        </w:numPr>
+        <w:pStyle w:val="Compact"/>
+      </w:pPr>
       <w:r>
         <w:rPr>
           <w:bCs/>
           <w:b/>
         </w:rPr>
-        <w:t xml:space="preserve"> </w:t>
-      </w:r>
+        <w:t xml:space="preserve">Kindle-1 (research):</w:t>
+      </w:r>
+      <w:r>
+        <w:t xml:space="preserve"> </w:t>
+      </w:r>
+      <w:r>
+        <w:t xml:space="preserve">chooses two topics from the approved category pool each day and writes a scored topic entry.</w:t>
+      </w:r>
+    </w:p>
+    <w:p>
+      <w:pPr>
+        <w:numPr>
+          <w:ilvl w:val="0"/>
+          <w:numId w:val="1001"/>
+        </w:numPr>
+        <w:pStyle w:val="Compact"/>
+      </w:pPr>
       <w:r>
         <w:rPr>
           <w:bCs/>
           <w:b/>
         </w:rPr>
-        <w:t xml:space="preserve">out of scope.</w:t>
-      </w:r>
-      <w:r>
-        <w:t xml:space="preserve"> </w:t>
-      </w:r>
-      <w:r>
-        <w:t xml:space="preserve">No print PDF is made.</w:t>
+        <w:t xml:space="preserve">Kindle-2 (writer):</w:t>
+      </w:r>
+      <w:r>
+        <w:t xml:space="preserve"> </w:t>
+      </w:r>
+      <w:r>
+        <w:t xml:space="preserve">writes one book from one unused topic and checks it.</w:t>
       </w:r>
     </w:p>
     <w:p>
@@ -185,19 +185,28 @@
           <w:bCs/>
           <w:b/>
         </w:rPr>
-        <w:t xml:space="preserve">Kindle-1 (research):</w:t>
-      </w:r>
-      <w:r>
-        <w:t xml:space="preserve"> </w:t>
-      </w:r>
-      <w:r>
-        <w:t xml:space="preserve">chooses two topics from the approved</w:t>
-      </w:r>
-      <w:r>
-        <w:t xml:space="preserve"> </w:t>
-      </w:r>
-      <w:r>
-        <w:t xml:space="preserve">category pool each day and writes a scored topic entry.</w:t>
+        <w:t xml:space="preserve">Kindle-3 (cover and review):</w:t>
+      </w:r>
+      <w:r>
+        <w:t xml:space="preserve"> </w:t>
+      </w:r>
+      <w:r>
+        <w:t xml:space="preserve">makes the cover, checks the whole package, and places approved packages in</w:t>
+      </w:r>
+      <w:r>
+        <w:t xml:space="preserve"> </w:t>
+      </w:r>
+      <w:r>
+        <w:t xml:space="preserve">“</w:t>
+      </w:r>
+      <w:r>
+        <w:t xml:space="preserve">Ready to publish</w:t>
+      </w:r>
+      <w:r>
+        <w:t xml:space="preserve">”</w:t>
+      </w:r>
+      <w:r>
+        <w:t xml:space="preserve">.</w:t>
       </w:r>
     </w:p>
     <w:p>
@@ -213,19 +222,13 @@
           <w:bCs/>
           <w:b/>
         </w:rPr>
-        <w:t xml:space="preserve">Kindle-2 (writer):</w:t>
-      </w:r>
-      <w:r>
-        <w:t xml:space="preserve"> </w:t>
-      </w:r>
-      <w:r>
-        <w:t xml:space="preserve">writes one book from one unused topic and</w:t>
-      </w:r>
-      <w:r>
-        <w:t xml:space="preserve"> </w:t>
-      </w:r>
-      <w:r>
-        <w:t xml:space="preserve">checks it.</w:t>
+        <w:t xml:space="preserve">Kindle-4 (publisher prep):</w:t>
+      </w:r>
+      <w:r>
+        <w:t xml:space="preserve"> </w:t>
+      </w:r>
+      <w:r>
+        <w:t xml:space="preserve">prepares a KDP draft from the approved package and stops before Publish.</w:t>
       </w:r>
     </w:p>
     <w:p>
@@ -241,90 +244,13 @@
           <w:bCs/>
           <w:b/>
         </w:rPr>
-        <w:t xml:space="preserve">Kindle-3 (cover and review):</w:t>
-      </w:r>
-      <w:r>
-        <w:t xml:space="preserve"> </w:t>
-      </w:r>
-      <w:r>
-        <w:t xml:space="preserve">makes the cover, checks the whole</w:t>
-      </w:r>
-      <w:r>
-        <w:t xml:space="preserve"> </w:t>
-      </w:r>
-      <w:r>
-        <w:t xml:space="preserve">package, and places approved packages in</w:t>
-      </w:r>
-      <w:r>
-        <w:t xml:space="preserve"> </w:t>
-      </w:r>
-      <w:r>
-        <w:t xml:space="preserve">“</w:t>
-      </w:r>
-      <w:r>
-        <w:t xml:space="preserve">Ready to publish</w:t>
-      </w:r>
-      <w:r>
-        <w:t xml:space="preserve">”</w:t>
-      </w:r>
-      <w:r>
-        <w:t xml:space="preserve">.</w:t>
-      </w:r>
-    </w:p>
-    <w:p>
-      <w:pPr>
-        <w:numPr>
-          <w:ilvl w:val="0"/>
-          <w:numId w:val="1001"/>
-        </w:numPr>
-        <w:pStyle w:val="Compact"/>
-      </w:pPr>
-      <w:r>
-        <w:rPr>
-          <w:bCs/>
-          <w:b/>
-        </w:rPr>
-        <w:t xml:space="preserve">Kindle-4 (publisher prep):</w:t>
-      </w:r>
-      <w:r>
-        <w:t xml:space="preserve"> </w:t>
-      </w:r>
-      <w:r>
-        <w:t xml:space="preserve">prepares a KDP draft from the</w:t>
-      </w:r>
-      <w:r>
-        <w:t xml:space="preserve"> </w:t>
-      </w:r>
-      <w:r>
-        <w:t xml:space="preserve">approved package and stops before Publish.</w:t>
-      </w:r>
-    </w:p>
-    <w:p>
-      <w:pPr>
-        <w:numPr>
-          <w:ilvl w:val="0"/>
-          <w:numId w:val="1001"/>
-        </w:numPr>
-        <w:pStyle w:val="Compact"/>
-      </w:pPr>
-      <w:r>
-        <w:rPr>
-          <w:bCs/>
-          <w:b/>
-        </w:rPr>
         <w:t xml:space="preserve">Owner:</w:t>
       </w:r>
       <w:r>
         <w:t xml:space="preserve"> </w:t>
       </w:r>
       <w:r>
-        <w:t xml:space="preserve">confirms category paths, decides on held topics, checks</w:t>
-      </w:r>
-      <w:r>
-        <w:t xml:space="preserve"> </w:t>
-      </w:r>
-      <w:r>
-        <w:t xml:space="preserve">each cover at upload, uploads each book to KDP, and clicks Publish.</w:t>
+        <w:t xml:space="preserve">confirms category paths, decides on held topics, checks each cover at upload, uploads each book to KDP, and clicks Publish.</w:t>
       </w:r>
     </w:p>
     <w:bookmarkEnd w:id="20"/>
@@ -525,13 +451,7 @@
         <w:t xml:space="preserve"> </w:t>
       </w:r>
       <w:r>
-        <w:t xml:space="preserve">(5 to</w:t>
-      </w:r>
-      <w:r>
-        <w:t xml:space="preserve"> </w:t>
-      </w:r>
-      <w:r>
-        <w:t xml:space="preserve">12 items),</w:t>
+        <w:t xml:space="preserve">(5 to 12 items),</w:t>
       </w:r>
       <w:r>
         <w:t xml:space="preserve"> </w:t>
@@ -605,13 +525,7 @@
         <w:pStyle w:val="FirstParagraph"/>
       </w:pPr>
       <w:r>
-        <w:t xml:space="preserve">If any REQUIRED field is missing, the robot stops and logs the run as</w:t>
-      </w:r>
-      <w:r>
-        <w:t xml:space="preserve"> </w:t>
-      </w:r>
-      <w:r>
-        <w:t xml:space="preserve">blocked. It does not guess.</w:t>
+        <w:t xml:space="preserve">If any REQUIRED field is missing, the robot stops and logs the run as blocked. It does not guess.</w:t>
       </w:r>
     </w:p>
     <w:bookmarkEnd w:id="21"/>
@@ -627,15 +541,15 @@
     <w:tbl>
       <w:tblPr>
         <w:tblStyle w:val="Table"/>
-        <w:tblW w:type="pct" w:w="4865"/>
+        <w:tblW w:type="pct" w:w="4934"/>
         <w:tblLook w:firstRow="1" w:lastRow="0" w:firstColumn="0" w:lastColumn="0" w:noHBand="0" w:noVBand="0" w:val="0020"/>
         <w:jc w:val="start"/>
       </w:tblPr>
       <w:tblGrid>
-        <w:gridCol w:w="1926"/>
-        <w:gridCol w:w="1926"/>
-        <w:gridCol w:w="1926"/>
-        <w:gridCol w:w="1926"/>
+        <w:gridCol w:w="1823"/>
+        <w:gridCol w:w="2605"/>
+        <w:gridCol w:w="1354"/>
+        <w:gridCol w:w="2032"/>
       </w:tblGrid>
       <w:tr>
         <w:trPr>
@@ -699,31 +613,19 @@
               <w:jc w:val="left"/>
             </w:pPr>
             <w:r>
-              <w:t xml:space="preserve">Cozy mystery or</w:t>
-            </w:r>
-            <w:r>
-              <w:t xml:space="preserve"> </w:t>
-            </w:r>
-            <w:r>
-              <w:t xml:space="preserve">romance novel</w:t>
-            </w:r>
-          </w:p>
-        </w:tc>
-        <w:tc>
-          <w:tcPr/>
-          <w:p>
-            <w:pPr>
-              <w:pStyle w:val="Compact"/>
-              <w:jc w:val="left"/>
-            </w:pPr>
-            <w:r>
-              <w:t xml:space="preserve">55,000 to 65,000</w:t>
-            </w:r>
-            <w:r>
-              <w:t xml:space="preserve"> </w:t>
-            </w:r>
-            <w:r>
-              <w:t xml:space="preserve">words</w:t>
+              <w:t xml:space="preserve">Cozy mystery or romance novel</w:t>
+            </w:r>
+          </w:p>
+        </w:tc>
+        <w:tc>
+          <w:tcPr/>
+          <w:p>
+            <w:pPr>
+              <w:pStyle w:val="Compact"/>
+              <w:jc w:val="left"/>
+            </w:pPr>
+            <w:r>
+              <w:t xml:space="preserve">55,000 to 65,000 words</w:t>
             </w:r>
           </w:p>
         </w:tc>
@@ -761,37 +663,19 @@
               <w:jc w:val="left"/>
             </w:pPr>
             <w:r>
-              <w:t xml:space="preserve">Kids’ chapter</w:t>
-            </w:r>
-            <w:r>
-              <w:t xml:space="preserve"> </w:t>
-            </w:r>
-            <w:r>
-              <w:t xml:space="preserve">book (ages 6 to</w:t>
-            </w:r>
-            <w:r>
-              <w:t xml:space="preserve"> </w:t>
-            </w:r>
-            <w:r>
-              <w:t xml:space="preserve">9)</w:t>
-            </w:r>
-          </w:p>
-        </w:tc>
-        <w:tc>
-          <w:tcPr/>
-          <w:p>
-            <w:pPr>
-              <w:pStyle w:val="Compact"/>
-              <w:jc w:val="left"/>
-            </w:pPr>
-            <w:r>
-              <w:t xml:space="preserve">10,000 to 15,000</w:t>
-            </w:r>
-            <w:r>
-              <w:t xml:space="preserve"> </w:t>
-            </w:r>
-            <w:r>
-              <w:t xml:space="preserve">words</w:t>
+              <w:t xml:space="preserve">Kids’ chapter book (ages 6 to 9)</w:t>
+            </w:r>
+          </w:p>
+        </w:tc>
+        <w:tc>
+          <w:tcPr/>
+          <w:p>
+            <w:pPr>
+              <w:pStyle w:val="Compact"/>
+              <w:jc w:val="left"/>
+            </w:pPr>
+            <w:r>
+              <w:t xml:space="preserve">10,000 to 15,000 words</w:t>
             </w:r>
           </w:p>
         </w:tc>
@@ -829,55 +713,31 @@
               <w:jc w:val="left"/>
             </w:pPr>
             <w:r>
-              <w:t xml:space="preserve">Bedtime story</w:t>
-            </w:r>
-            <w:r>
-              <w:t xml:space="preserve"> </w:t>
-            </w:r>
-            <w:r>
-              <w:t xml:space="preserve">collection</w:t>
-            </w:r>
-          </w:p>
-        </w:tc>
-        <w:tc>
-          <w:tcPr/>
-          <w:p>
-            <w:pPr>
-              <w:pStyle w:val="Compact"/>
-              <w:jc w:val="left"/>
-            </w:pPr>
-            <w:r>
-              <w:t xml:space="preserve">2,000 to 4,000</w:t>
-            </w:r>
-            <w:r>
-              <w:t xml:space="preserve"> </w:t>
-            </w:r>
-            <w:r>
-              <w:t xml:space="preserve">words per story;</w:t>
-            </w:r>
-            <w:r>
-              <w:t xml:space="preserve"> </w:t>
-            </w:r>
-            <w:r>
-              <w:t xml:space="preserve">8 to 12 stories</w:t>
-            </w:r>
-          </w:p>
-        </w:tc>
-        <w:tc>
-          <w:tcPr/>
-          <w:p>
-            <w:pPr>
-              <w:pStyle w:val="Compact"/>
-              <w:jc w:val="left"/>
-            </w:pPr>
-            <w:r>
-              <w:t xml:space="preserve">1 story per</w:t>
-            </w:r>
-            <w:r>
-              <w:t xml:space="preserve"> </w:t>
-            </w:r>
-            <w:r>
-              <w:t xml:space="preserve">chapter</w:t>
+              <w:t xml:space="preserve">Bedtime story collection</w:t>
+            </w:r>
+          </w:p>
+        </w:tc>
+        <w:tc>
+          <w:tcPr/>
+          <w:p>
+            <w:pPr>
+              <w:pStyle w:val="Compact"/>
+              <w:jc w:val="left"/>
+            </w:pPr>
+            <w:r>
+              <w:t xml:space="preserve">2,000 to 4,000 words per story; 8 to 12 stories</w:t>
+            </w:r>
+          </w:p>
+        </w:tc>
+        <w:tc>
+          <w:tcPr/>
+          <w:p>
+            <w:pPr>
+              <w:pStyle w:val="Compact"/>
+              <w:jc w:val="left"/>
+            </w:pPr>
+            <w:r>
+              <w:t xml:space="preserve">1 story per chapter</w:t>
             </w:r>
           </w:p>
         </w:tc>
@@ -903,31 +763,19 @@
               <w:jc w:val="left"/>
             </w:pPr>
             <w:r>
-              <w:t xml:space="preserve">Early reader</w:t>
-            </w:r>
-            <w:r>
-              <w:t xml:space="preserve"> </w:t>
-            </w:r>
-            <w:r>
-              <w:t xml:space="preserve">(ages 4 to 7)</w:t>
-            </w:r>
-          </w:p>
-        </w:tc>
-        <w:tc>
-          <w:tcPr/>
-          <w:p>
-            <w:pPr>
-              <w:pStyle w:val="Compact"/>
-              <w:jc w:val="left"/>
-            </w:pPr>
-            <w:r>
-              <w:t xml:space="preserve">1,500 to 3,000</w:t>
-            </w:r>
-            <w:r>
-              <w:t xml:space="preserve"> </w:t>
-            </w:r>
-            <w:r>
-              <w:t xml:space="preserve">words</w:t>
+              <w:t xml:space="preserve">Early reader (ages 4 to 7)</w:t>
+            </w:r>
+          </w:p>
+        </w:tc>
+        <w:tc>
+          <w:tcPr/>
+          <w:p>
+            <w:pPr>
+              <w:pStyle w:val="Compact"/>
+              <w:jc w:val="left"/>
+            </w:pPr>
+            <w:r>
+              <w:t xml:space="preserve">1,500 to 3,000 words</w:t>
             </w:r>
           </w:p>
         </w:tc>
@@ -951,19 +799,7 @@
               <w:jc w:val="left"/>
             </w:pPr>
             <w:r>
-              <w:t xml:space="preserve">Fixed-layout EPUB</w:t>
-            </w:r>
-            <w:r>
-              <w:t xml:space="preserve"> </w:t>
-            </w:r>
-            <w:r>
-              <w:t xml:space="preserve">with</w:t>
-            </w:r>
-            <w:r>
-              <w:t xml:space="preserve"> </w:t>
-            </w:r>
-            <w:r>
-              <w:t xml:space="preserve">illustrations</w:t>
+              <w:t xml:space="preserve">Fixed-layout EPUB with illustrations</w:t>
             </w:r>
           </w:p>
         </w:tc>
@@ -977,13 +813,7 @@
               <w:jc w:val="left"/>
             </w:pPr>
             <w:r>
-              <w:t xml:space="preserve">Large-print</w:t>
-            </w:r>
-            <w:r>
-              <w:t xml:space="preserve"> </w:t>
-            </w:r>
-            <w:r>
-              <w:t xml:space="preserve">puzzle book</w:t>
+              <w:t xml:space="preserve">Large-print puzzle book</w:t>
             </w:r>
           </w:p>
         </w:tc>
@@ -1007,13 +837,7 @@
               <w:jc w:val="left"/>
             </w:pPr>
             <w:r>
-              <w:t xml:space="preserve">Sections by</w:t>
-            </w:r>
-            <w:r>
-              <w:t xml:space="preserve"> </w:t>
-            </w:r>
-            <w:r>
-              <w:t xml:space="preserve">puzzle type</w:t>
+              <w:t xml:space="preserve">Sections by puzzle type</w:t>
             </w:r>
           </w:p>
         </w:tc>
@@ -1039,31 +863,19 @@
               <w:jc w:val="left"/>
             </w:pPr>
             <w:r>
-              <w:t xml:space="preserve">Practical guide</w:t>
-            </w:r>
-            <w:r>
-              <w:t xml:space="preserve"> </w:t>
-            </w:r>
-            <w:r>
-              <w:t xml:space="preserve">or workbook</w:t>
-            </w:r>
-          </w:p>
-        </w:tc>
-        <w:tc>
-          <w:tcPr/>
-          <w:p>
-            <w:pPr>
-              <w:pStyle w:val="Compact"/>
-              <w:jc w:val="left"/>
-            </w:pPr>
-            <w:r>
-              <w:t xml:space="preserve">11,000 to 25,000</w:t>
-            </w:r>
-            <w:r>
-              <w:t xml:space="preserve"> </w:t>
-            </w:r>
-            <w:r>
-              <w:t xml:space="preserve">words</w:t>
+              <w:t xml:space="preserve">Practical guide or workbook</w:t>
+            </w:r>
+          </w:p>
+        </w:tc>
+        <w:tc>
+          <w:tcPr/>
+          <w:p>
+            <w:pPr>
+              <w:pStyle w:val="Compact"/>
+              <w:jc w:val="left"/>
+            </w:pPr>
+            <w:r>
+              <w:t xml:space="preserve">11,000 to 25,000 words</w:t>
             </w:r>
           </w:p>
         </w:tc>
@@ -1108,19 +920,7 @@
         <w:t xml:space="preserve"> </w:t>
       </w:r>
       <w:r>
-        <w:t xml:space="preserve">hit the target length within 10 percent. If the draft is</w:t>
-      </w:r>
-      <w:r>
-        <w:t xml:space="preserve"> </w:t>
-      </w:r>
-      <w:r>
-        <w:t xml:space="preserve">short, extend scenes and examples, not filler. If it is long, cut</w:t>
-      </w:r>
-      <w:r>
-        <w:t xml:space="preserve"> </w:t>
-      </w:r>
-      <w:r>
-        <w:t xml:space="preserve">repetition first.</w:t>
+        <w:t xml:space="preserve">hit the target length within 10 percent. If the draft is short, extend scenes and examples, not filler. If it is long, cut repetition first.</w:t>
       </w:r>
     </w:p>
     <w:bookmarkEnd w:id="22"/>
@@ -1142,13 +942,7 @@
         <w:pStyle w:val="Compact"/>
       </w:pPr>
       <w:r>
-        <w:t xml:space="preserve">Write in the tone set by the topic entry. Use one point of view and</w:t>
-      </w:r>
-      <w:r>
-        <w:t xml:space="preserve"> </w:t>
-      </w:r>
-      <w:r>
-        <w:t xml:space="preserve">one tense throughout.</w:t>
+        <w:t xml:space="preserve">Write in the tone set by the topic entry. Use one point of view and one tense throughout.</w:t>
       </w:r>
     </w:p>
     <w:p>
@@ -1170,13 +964,7 @@
         <w:t xml:space="preserve"> </w:t>
       </w:r>
       <w:r>
-        <w:t xml:space="preserve">keep names, places, dates, and facts consistent across</w:t>
-      </w:r>
-      <w:r>
-        <w:t xml:space="preserve"> </w:t>
-      </w:r>
-      <w:r>
-        <w:t xml:space="preserve">the book and the series.</w:t>
+        <w:t xml:space="preserve">keep names, places, dates, and facts consistent across the book and the series.</w:t>
       </w:r>
     </w:p>
     <w:p>
@@ -1188,13 +976,7 @@
         <w:pStyle w:val="Compact"/>
       </w:pPr>
       <w:r>
-        <w:t xml:space="preserve">Open each chapter with a hook and end it with a reason to keep</w:t>
-      </w:r>
-      <w:r>
-        <w:t xml:space="preserve"> </w:t>
-      </w:r>
-      <w:r>
-        <w:t xml:space="preserve">reading.</w:t>
+        <w:t xml:space="preserve">Open each chapter with a hook and end it with a reason to keep reading.</w:t>
       </w:r>
     </w:p>
     <w:p>
@@ -1216,19 +998,7 @@
         <w:t xml:space="preserve"> </w:t>
       </w:r>
       <w:r>
-        <w:t xml:space="preserve">short sentences, a clear problem and resolution,</w:t>
-      </w:r>
-      <w:r>
-        <w:t xml:space="preserve"> </w:t>
-      </w:r>
-      <w:r>
-        <w:t xml:space="preserve">nothing frightening, a positive ending. The reading level must pass</w:t>
-      </w:r>
-      <w:r>
-        <w:t xml:space="preserve"> </w:t>
-      </w:r>
-      <w:r>
-        <w:t xml:space="preserve">section 13.</w:t>
+        <w:t xml:space="preserve">short sentences, a clear problem and resolution, nothing frightening, a positive ending. The reading level must pass section 13.</w:t>
       </w:r>
     </w:p>
     <w:p>
@@ -1250,19 +1020,7 @@
         <w:t xml:space="preserve"> </w:t>
       </w:r>
       <w:r>
-        <w:t xml:space="preserve">every step, number, and claim is</w:t>
-      </w:r>
-      <w:r>
-        <w:t xml:space="preserve"> </w:t>
-      </w:r>
-      <w:r>
-        <w:t xml:space="preserve">checked against a named, reliable source. List the sources in</w:t>
-      </w:r>
-      <w:r>
-        <w:t xml:space="preserve"> </w:t>
-      </w:r>
-      <w:r>
-        <w:t xml:space="preserve">metadata.json under</w:t>
+        <w:t xml:space="preserve">every step, number, and claim is checked against a named, reliable source. List the sources in metadata.json under</w:t>
       </w:r>
       <w:r>
         <w:t xml:space="preserve"> </w:t>
@@ -1274,13 +1032,7 @@
         <w:t xml:space="preserve">sources</w:t>
       </w:r>
       <w:r>
-        <w:t xml:space="preserve">. No medical, financial, or legal</w:t>
-      </w:r>
-      <w:r>
-        <w:t xml:space="preserve"> </w:t>
-      </w:r>
-      <w:r>
-        <w:t xml:space="preserve">advice.</w:t>
+        <w:t xml:space="preserve">. No medical, financial, or legal advice.</w:t>
       </w:r>
     </w:p>
     <w:p>
@@ -1292,13 +1044,7 @@
         <w:pStyle w:val="Compact"/>
       </w:pPr>
       <w:r>
-        <w:t xml:space="preserve">Never copy text from other books, articles, or websites. Do not name</w:t>
-      </w:r>
-      <w:r>
-        <w:t xml:space="preserve"> </w:t>
-      </w:r>
-      <w:r>
-        <w:t xml:space="preserve">trademarked characters, brands, or real living people.</w:t>
+        <w:t xml:space="preserve">Never copy text from other books, articles, or websites. Do not name trademarked characters, brands, or real living people.</w:t>
       </w:r>
     </w:p>
     <w:p>
@@ -1320,13 +1066,7 @@
         <w:t xml:space="preserve"> </w:t>
       </w:r>
       <w:r>
-        <w:t xml:space="preserve">the manuscript has no placeholder text, notes to self,</w:t>
-      </w:r>
-      <w:r>
-        <w:t xml:space="preserve"> </w:t>
-      </w:r>
-      <w:r>
-        <w:t xml:space="preserve">or bracketed instructions.</w:t>
+        <w:t xml:space="preserve">the manuscript has no placeholder text, notes to self, or bracketed instructions.</w:t>
       </w:r>
     </w:p>
     <w:bookmarkEnd w:id="23"/>
@@ -1342,13 +1082,13 @@
     <w:tbl>
       <w:tblPr>
         <w:tblStyle w:val="Table"/>
-        <w:tblW w:type="pct" w:w="4865"/>
+        <w:tblW w:type="pct" w:w="4944"/>
         <w:tblLook w:firstRow="1" w:lastRow="0" w:firstColumn="0" w:lastColumn="0" w:noHBand="0" w:noVBand="0" w:val="0020"/>
         <w:jc w:val="start"/>
       </w:tblPr>
       <w:tblGrid>
-        <w:gridCol w:w="3852"/>
-        <w:gridCol w:w="3852"/>
+        <w:gridCol w:w="1610"/>
+        <w:gridCol w:w="6219"/>
       </w:tblGrid>
       <w:tr>
         <w:trPr>
@@ -1400,19 +1140,7 @@
               <w:jc w:val="left"/>
             </w:pPr>
             <w:r>
-              <w:t xml:space="preserve">Garamond (EB Garamond) or Georgia.</w:t>
-            </w:r>
-            <w:r>
-              <w:t xml:space="preserve"> </w:t>
-            </w:r>
-            <w:r>
-              <w:t xml:space="preserve">Use relative sizing; the reader</w:t>
-            </w:r>
-            <w:r>
-              <w:t xml:space="preserve"> </w:t>
-            </w:r>
-            <w:r>
-              <w:t xml:space="preserve">sets the size.</w:t>
+              <w:t xml:space="preserve">Garamond (EB Garamond) or Georgia. Use relative sizing; the reader sets the size.</w:t>
             </w:r>
           </w:p>
         </w:tc>
@@ -1438,13 +1166,7 @@
               <w:jc w:val="left"/>
             </w:pPr>
             <w:r>
-              <w:t xml:space="preserve">A clear sans-serif, such as Nunito</w:t>
-            </w:r>
-            <w:r>
-              <w:t xml:space="preserve"> </w:t>
-            </w:r>
-            <w:r>
-              <w:t xml:space="preserve">or Open Sans. Line spacing 1.5.</w:t>
+              <w:t xml:space="preserve">A clear sans-serif, such as Nunito or Open Sans. Line spacing 1.5.</w:t>
             </w:r>
           </w:p>
         </w:tc>
@@ -1470,13 +1192,7 @@
               <w:jc w:val="left"/>
             </w:pPr>
             <w:r>
-              <w:t xml:space="preserve">One font family, bold. Never more</w:t>
-            </w:r>
-            <w:r>
-              <w:t xml:space="preserve"> </w:t>
-            </w:r>
-            <w:r>
-              <w:t xml:space="preserve">than two font families in one book.</w:t>
+              <w:t xml:space="preserve">One font family, bold. Never more than two font families in one book.</w:t>
             </w:r>
           </w:p>
         </w:tc>
@@ -1502,13 +1218,7 @@
               <w:jc w:val="left"/>
             </w:pPr>
             <w:r>
-              <w:t xml:space="preserve">Left-aligned, ragged right. No</w:t>
-            </w:r>
-            <w:r>
-              <w:t xml:space="preserve"> </w:t>
-            </w:r>
-            <w:r>
-              <w:t xml:space="preserve">justified text.</w:t>
+              <w:t xml:space="preserve">Left-aligned, ragged right. No justified text.</w:t>
             </w:r>
           </w:p>
         </w:tc>
@@ -1534,19 +1244,7 @@
               <w:jc w:val="left"/>
             </w:pPr>
             <w:r>
-              <w:t xml:space="preserve">First-line indent in novels. A</w:t>
-            </w:r>
-            <w:r>
-              <w:t xml:space="preserve"> </w:t>
-            </w:r>
-            <w:r>
-              <w:t xml:space="preserve">blank line between paragraphs in</w:t>
-            </w:r>
-            <w:r>
-              <w:t xml:space="preserve"> </w:t>
-            </w:r>
-            <w:r>
-              <w:t xml:space="preserve">kids’ books and guides.</w:t>
+              <w:t xml:space="preserve">First-line indent in novels. A blank line between paragraphs in kids’ books and guides.</w:t>
             </w:r>
           </w:p>
         </w:tc>
@@ -1582,25 +1280,7 @@
               <w:t xml:space="preserve"> </w:t>
             </w:r>
             <w:r>
-              <w:t xml:space="preserve">only fonts licensed</w:t>
-            </w:r>
-            <w:r>
-              <w:t xml:space="preserve"> </w:t>
-            </w:r>
-            <w:r>
-              <w:t xml:space="preserve">for commercial embedding, such as</w:t>
-            </w:r>
-            <w:r>
-              <w:t xml:space="preserve"> </w:t>
-            </w:r>
-            <w:r>
-              <w:t xml:space="preserve">the SIL Open Font License. Save the</w:t>
-            </w:r>
-            <w:r>
-              <w:t xml:space="preserve"> </w:t>
-            </w:r>
-            <w:r>
-              <w:t xml:space="preserve">license file in the book folder.</w:t>
+              <w:t xml:space="preserve">only fonts licensed for commercial embedding, such as the SIL Open Font License. Save the license file in the book folder.</w:t>
             </w:r>
           </w:p>
         </w:tc>
@@ -1635,13 +1315,7 @@
         <w:t xml:space="preserve"> </w:t>
       </w:r>
       <w:r>
-        <w:t xml:space="preserve">1600 pixels wide by 2560 pixels tall, RGB JPEG, saved</w:t>
-      </w:r>
-      <w:r>
-        <w:t xml:space="preserve"> </w:t>
-      </w:r>
-      <w:r>
-        <w:t xml:space="preserve">as</w:t>
+        <w:t xml:space="preserve">1600 pixels wide by 2560 pixels tall, RGB JPEG, saved as</w:t>
       </w:r>
       <w:r>
         <w:t xml:space="preserve"> </w:t>
@@ -1653,13 +1327,7 @@
         <w:t xml:space="preserve">cover-ebook.jpg</w:t>
       </w:r>
       <w:r>
-        <w:t xml:space="preserve">. The image must be at least 1000 pixels tall</w:t>
-      </w:r>
-      <w:r>
-        <w:t xml:space="preserve"> </w:t>
-      </w:r>
-      <w:r>
-        <w:t xml:space="preserve">for the Amazon thumbnail.</w:t>
+        <w:t xml:space="preserve">. At least 1000 pixels tall for the Amazon thumbnail.</w:t>
       </w:r>
     </w:p>
     <w:p>
@@ -1675,19 +1343,277 @@
           <w:bCs/>
           <w:b/>
         </w:rPr>
-        <w:t xml:space="preserve">REQUIRED:</w:t>
-      </w:r>
-      <w:r>
-        <w:t xml:space="preserve"> </w:t>
-      </w:r>
-      <w:r>
-        <w:t xml:space="preserve">the title is readable at thumbnail size (about 150</w:t>
-      </w:r>
-      <w:r>
-        <w:t xml:space="preserve"> </w:t>
-      </w:r>
-      <w:r>
-        <w:t xml:space="preserve">pixels wide). Use large, bold lettering with high contrast.</w:t>
+        <w:t xml:space="preserve">REQUIRED: a cover brief, written before any design.</w:t>
+      </w:r>
+      <w:r>
+        <w:t xml:space="preserve"> </w:t>
+      </w:r>
+      <w:r>
+        <w:t xml:space="preserve">Kindle-3 saves</w:t>
+      </w:r>
+      <w:r>
+        <w:t xml:space="preserve"> </w:t>
+      </w:r>
+      <w:r>
+        <w:rPr>
+          <w:rStyle w:val="VerbatimChar"/>
+        </w:rPr>
+        <w:t xml:space="preserve">cover-brief.json</w:t>
+      </w:r>
+      <w:r>
+        <w:t xml:space="preserve"> </w:t>
+      </w:r>
+      <w:r>
+        <w:t xml:space="preserve">in the book folder. It holds:</w:t>
+      </w:r>
+      <w:r>
+        <w:t xml:space="preserve"> </w:t>
+      </w:r>
+      <w:r>
+        <w:rPr>
+          <w:rStyle w:val="VerbatimChar"/>
+        </w:rPr>
+        <w:t xml:space="preserve">title_lines</w:t>
+      </w:r>
+      <w:r>
+        <w:t xml:space="preserve"> </w:t>
+      </w:r>
+      <w:r>
+        <w:t xml:space="preserve">(exactly as in metadata.json, in the line breaks used on the cover),</w:t>
+      </w:r>
+      <w:r>
+        <w:t xml:space="preserve"> </w:t>
+      </w:r>
+      <w:r>
+        <w:rPr>
+          <w:rStyle w:val="VerbatimChar"/>
+        </w:rPr>
+        <w:t xml:space="preserve">subtitle</w:t>
+      </w:r>
+      <w:r>
+        <w:t xml:space="preserve"> </w:t>
+      </w:r>
+      <w:r>
+        <w:t xml:space="preserve">(as in metadata.json),</w:t>
+      </w:r>
+      <w:r>
+        <w:t xml:space="preserve"> </w:t>
+      </w:r>
+      <w:r>
+        <w:rPr>
+          <w:rStyle w:val="VerbatimChar"/>
+        </w:rPr>
+        <w:t xml:space="preserve">author</w:t>
+      </w:r>
+      <w:r>
+        <w:t xml:space="preserve">,</w:t>
+      </w:r>
+      <w:r>
+        <w:t xml:space="preserve"> </w:t>
+      </w:r>
+      <w:r>
+        <w:rPr>
+          <w:rStyle w:val="VerbatimChar"/>
+        </w:rPr>
+        <w:t xml:space="preserve">series_line</w:t>
+      </w:r>
+      <w:r>
+        <w:t xml:space="preserve"> </w:t>
+      </w:r>
+      <w:r>
+        <w:t xml:space="preserve">(or</w:t>
+      </w:r>
+      <w:r>
+        <w:t xml:space="preserve"> </w:t>
+      </w:r>
+      <w:r>
+        <w:t xml:space="preserve">“</w:t>
+      </w:r>
+      <w:r>
+        <w:t xml:space="preserve">none</w:t>
+      </w:r>
+      <w:r>
+        <w:t xml:space="preserve">”</w:t>
+      </w:r>
+      <w:r>
+        <w:t xml:space="preserve">),</w:t>
+      </w:r>
+      <w:r>
+        <w:t xml:space="preserve"> </w:t>
+      </w:r>
+      <w:r>
+        <w:rPr>
+          <w:rStyle w:val="VerbatimChar"/>
+        </w:rPr>
+        <w:t xml:space="preserve">tagline</w:t>
+      </w:r>
+      <w:r>
+        <w:t xml:space="preserve">,</w:t>
+      </w:r>
+      <w:r>
+        <w:t xml:space="preserve"> </w:t>
+      </w:r>
+      <w:r>
+        <w:rPr>
+          <w:rStyle w:val="VerbatimChar"/>
+        </w:rPr>
+        <w:t xml:space="preserve">badge</w:t>
+      </w:r>
+      <w:r>
+        <w:t xml:space="preserve"> </w:t>
+      </w:r>
+      <w:r>
+        <w:t xml:space="preserve">(the age or grade badge, or</w:t>
+      </w:r>
+      <w:r>
+        <w:t xml:space="preserve"> </w:t>
+      </w:r>
+      <w:r>
+        <w:t xml:space="preserve">“</w:t>
+      </w:r>
+      <w:r>
+        <w:t xml:space="preserve">none</w:t>
+      </w:r>
+      <w:r>
+        <w:t xml:space="preserve">”</w:t>
+      </w:r>
+      <w:r>
+        <w:t xml:space="preserve"> </w:t>
+      </w:r>
+      <w:r>
+        <w:t xml:space="preserve">for adult books),</w:t>
+      </w:r>
+      <w:r>
+        <w:t xml:space="preserve"> </w:t>
+      </w:r>
+      <w:r>
+        <w:rPr>
+          <w:rStyle w:val="VerbatimChar"/>
+        </w:rPr>
+        <w:t xml:space="preserve">genre</w:t>
+      </w:r>
+      <w:r>
+        <w:t xml:space="preserve">,</w:t>
+      </w:r>
+      <w:r>
+        <w:t xml:space="preserve"> </w:t>
+      </w:r>
+      <w:r>
+        <w:rPr>
+          <w:rStyle w:val="VerbatimChar"/>
+        </w:rPr>
+        <w:t xml:space="preserve">age_or_reader</w:t>
+      </w:r>
+      <w:r>
+        <w:t xml:space="preserve">,</w:t>
+      </w:r>
+      <w:r>
+        <w:t xml:space="preserve"> </w:t>
+      </w:r>
+      <w:r>
+        <w:rPr>
+          <w:rStyle w:val="VerbatimChar"/>
+        </w:rPr>
+        <w:t xml:space="preserve">style</w:t>
+      </w:r>
+      <w:r>
+        <w:t xml:space="preserve">,</w:t>
+      </w:r>
+      <w:r>
+        <w:t xml:space="preserve"> </w:t>
+      </w:r>
+      <w:r>
+        <w:rPr>
+          <w:rStyle w:val="VerbatimChar"/>
+        </w:rPr>
+        <w:t xml:space="preserve">palette</w:t>
+      </w:r>
+      <w:r>
+        <w:t xml:space="preserve"> </w:t>
+      </w:r>
+      <w:r>
+        <w:t xml:space="preserve">(three or four colours as hex codes),</w:t>
+      </w:r>
+      <w:r>
+        <w:t xml:space="preserve"> </w:t>
+      </w:r>
+      <w:r>
+        <w:rPr>
+          <w:rStyle w:val="VerbatimChar"/>
+        </w:rPr>
+        <w:t xml:space="preserve">focal_scene</w:t>
+      </w:r>
+      <w:r>
+        <w:t xml:space="preserve">,</w:t>
+      </w:r>
+      <w:r>
+        <w:t xml:space="preserve"> </w:t>
+      </w:r>
+      <w:r>
+        <w:rPr>
+          <w:rStyle w:val="VerbatimChar"/>
+        </w:rPr>
+        <w:t xml:space="preserve">character</w:t>
+      </w:r>
+      <w:r>
+        <w:t xml:space="preserve"> </w:t>
+      </w:r>
+      <w:r>
+        <w:t xml:space="preserve">(or</w:t>
+      </w:r>
+      <w:r>
+        <w:t xml:space="preserve"> </w:t>
+      </w:r>
+      <w:r>
+        <w:t xml:space="preserve">“</w:t>
+      </w:r>
+      <w:r>
+        <w:t xml:space="preserve">none</w:t>
+      </w:r>
+      <w:r>
+        <w:t xml:space="preserve">”</w:t>
+      </w:r>
+      <w:r>
+        <w:t xml:space="preserve">),</w:t>
+      </w:r>
+      <w:r>
+        <w:t xml:space="preserve"> </w:t>
+      </w:r>
+      <w:r>
+        <w:rPr>
+          <w:rStyle w:val="VerbatimChar"/>
+        </w:rPr>
+        <w:t xml:space="preserve">supporting_details</w:t>
+      </w:r>
+      <w:r>
+        <w:t xml:space="preserve">, and</w:t>
+      </w:r>
+      <w:r>
+        <w:t xml:space="preserve"> </w:t>
+      </w:r>
+      <w:r>
+        <w:rPr>
+          <w:rStyle w:val="VerbatimChar"/>
+        </w:rPr>
+        <w:t xml:space="preserve">canva_link_or_none</w:t>
+      </w:r>
+      <w:r>
+        <w:t xml:space="preserve">.</w:t>
+      </w:r>
+      <w:r>
+        <w:t xml:space="preserve"> </w:t>
+      </w:r>
+      <w:r>
+        <w:rPr>
+          <w:rStyle w:val="VerbatimChar"/>
+        </w:rPr>
+        <w:t xml:space="preserve">scripts/check_cover_brief.py</w:t>
+      </w:r>
+      <w:r>
+        <w:t xml:space="preserve"> </w:t>
+      </w:r>
+      <w:r>
+        <w:t xml:space="preserve">must pass. The brief must not copy another book’s genre and palette.</w:t>
       </w:r>
     </w:p>
     <w:p>
@@ -1698,99 +1624,27 @@
         </w:numPr>
         <w:pStyle w:val="Compact"/>
       </w:pPr>
-      <w:r>
-        <w:t xml:space="preserve">Match the genre look. Cozy mysteries and romance use warm tones, a</w:t>
-      </w:r>
-      <w:r>
-        <w:t xml:space="preserve"> </w:t>
-      </w:r>
-      <w:r>
-        <w:t xml:space="preserve">clear central image, and a serif or script title. Kids’ covers use</w:t>
-      </w:r>
-      <w:r>
-        <w:t xml:space="preserve"> </w:t>
-      </w:r>
-      <w:r>
-        <w:t xml:space="preserve">bright colours, one friendly character, and a rounded sans-serif</w:t>
-      </w:r>
-      <w:r>
-        <w:t xml:space="preserve"> </w:t>
-      </w:r>
-      <w:r>
-        <w:t xml:space="preserve">title. Puzzle covers use a bold colour block and large type naming</w:t>
-      </w:r>
-      <w:r>
-        <w:t xml:space="preserve"> </w:t>
-      </w:r>
-      <w:r>
-        <w:t xml:space="preserve">the puzzle type.</w:t>
-      </w:r>
-    </w:p>
-    <w:p>
-      <w:pPr>
-        <w:numPr>
-          <w:ilvl w:val="0"/>
-          <w:numId w:val="1004"/>
-        </w:numPr>
-        <w:pStyle w:val="Compact"/>
-      </w:pPr>
-      <w:r>
-        <w:t xml:space="preserve">One focal point. No more than three colours in the title block. No</w:t>
-      </w:r>
-      <w:r>
-        <w:t xml:space="preserve"> </w:t>
-      </w:r>
-      <w:r>
-        <w:t xml:space="preserve">small text.</w:t>
-      </w:r>
-    </w:p>
-    <w:p>
-      <w:pPr>
-        <w:numPr>
-          <w:ilvl w:val="0"/>
-          <w:numId w:val="1004"/>
-        </w:numPr>
-        <w:pStyle w:val="Compact"/>
-      </w:pPr>
-      <w:r>
-        <w:t xml:space="preserve">Author name on the cover is</w:t>
-      </w:r>
-      <w:r>
-        <w:t xml:space="preserve"> </w:t>
-      </w:r>
       <w:r>
         <w:rPr>
           <w:bCs/>
           <w:b/>
         </w:rPr>
-        <w:t xml:space="preserve">Skybee</w:t>
-      </w:r>
-      <w:r>
-        <w:t xml:space="preserve">, the owner’s publishing name.</w:t>
-      </w:r>
-    </w:p>
-    <w:p>
-      <w:pPr>
-        <w:numPr>
-          <w:ilvl w:val="0"/>
-          <w:numId w:val="1004"/>
-        </w:numPr>
-        <w:pStyle w:val="Compact"/>
-      </w:pPr>
-      <w:r>
-        <w:t xml:space="preserve">Images must be original, generated with an approved tool, or</w:t>
-      </w:r>
-      <w:r>
-        <w:t xml:space="preserve"> </w:t>
-      </w:r>
-      <w:r>
-        <w:t xml:space="preserve">licensed stock with a saved license record. Never use copyrighted</w:t>
-      </w:r>
-      <w:r>
-        <w:t xml:space="preserve"> </w:t>
-      </w:r>
-      <w:r>
-        <w:t xml:space="preserve">characters or celebrity likenesses.</w:t>
+        <w:t xml:space="preserve">REQUIRED: the cover matches its brief and its book.</w:t>
+      </w:r>
+      <w:r>
+        <w:t xml:space="preserve"> </w:t>
+      </w:r>
+      <w:r>
+        <w:rPr>
+          <w:rStyle w:val="VerbatimChar"/>
+        </w:rPr>
+        <w:t xml:space="preserve">scripts/check_cover.py &lt;cover&gt; --book &lt;folder&gt;</w:t>
+      </w:r>
+      <w:r>
+        <w:t xml:space="preserve"> </w:t>
+      </w:r>
+      <w:r>
+        <w:t xml:space="preserve">checks that at least 20 percent of the cover’s pixels are close to the brief’s colours; that the title is readable by OCR at full size and at thumbnail size (about 160 by 256 pixels); and that the title letters are large (at least 3.5 percent of the cover height).</w:t>
       </w:r>
     </w:p>
     <w:p>
@@ -1806,37 +1660,13 @@
           <w:bCs/>
           <w:b/>
         </w:rPr>
-        <w:t xml:space="preserve">REQUIRED:</w:t>
-      </w:r>
-      <w:r>
-        <w:t xml:space="preserve"> </w:t>
-      </w:r>
-      <w:r>
-        <w:t xml:space="preserve">one cover per book, made by Kindle-3 in Canva. It must</w:t>
-      </w:r>
-      <w:r>
-        <w:t xml:space="preserve"> </w:t>
-      </w:r>
-      <w:r>
-        <w:t xml:space="preserve">pass</w:t>
-      </w:r>
-      <w:r>
-        <w:t xml:space="preserve"> </w:t>
-      </w:r>
-      <w:r>
-        <w:rPr>
-          <w:rStyle w:val="VerbatimChar"/>
-        </w:rPr>
-        <w:t xml:space="preserve">scripts/check_cover.py</w:t>
-      </w:r>
-      <w:r>
-        <w:t xml:space="preserve">, which checks size, format, and that</w:t>
-      </w:r>
-      <w:r>
-        <w:t xml:space="preserve"> </w:t>
-      </w:r>
-      <w:r>
-        <w:t xml:space="preserve">it looks different from earlier covers.</w:t>
+        <w:t xml:space="preserve">REQUIRED: the text agrees.</w:t>
+      </w:r>
+      <w:r>
+        <w:t xml:space="preserve"> </w:t>
+      </w:r>
+      <w:r>
+        <w:t xml:space="preserve">The title on the cover must equal the title in metadata.json. If the cover prints a subtitle or tagline that metadata.json does not have, the book is blocked until the owner decides which one KDP uses.</w:t>
       </w:r>
     </w:p>
     <w:p>
@@ -1852,25 +1682,128 @@
           <w:bCs/>
           <w:b/>
         </w:rPr>
+        <w:t xml:space="preserve">REQUIRED: visual confirmation.</w:t>
+      </w:r>
+      <w:r>
+        <w:t xml:space="preserve"> </w:t>
+      </w:r>
+      <w:r>
+        <w:t xml:space="preserve">OCR cannot read every decorative font. The author name, badge, series line, and tagline must be confirmed by Kindle-3 viewing the finished cover. Kindle-3 records each one, and the result of the look-over, in review-notes.md.</w:t>
+      </w:r>
+    </w:p>
+    <w:p>
+      <w:pPr>
+        <w:numPr>
+          <w:ilvl w:val="0"/>
+          <w:numId w:val="1004"/>
+        </w:numPr>
+        <w:pStyle w:val="Compact"/>
+      </w:pPr>
+      <w:r>
+        <w:rPr>
+          <w:bCs/>
+          <w:b/>
+        </w:rPr>
+        <w:t xml:space="preserve">REQUIRED: the genre look.</w:t>
+      </w:r>
+      <w:r>
+        <w:t xml:space="preserve"> </w:t>
+      </w:r>
+      <w:r>
+        <w:t xml:space="preserve">Romance and cozy mysteries use warm tones, a clear central image, and a serif or script title. Kids’ covers use bright colours, one friendly character, and a rounded sans-serif title. Early readers show the reading level. Puzzle covers use a bold colour block and large type naming the puzzle type. Non-fiction uses a clean layout, one bold image, and a plain, large title.</w:t>
+      </w:r>
+    </w:p>
+    <w:p>
+      <w:pPr>
+        <w:numPr>
+          <w:ilvl w:val="0"/>
+          <w:numId w:val="1004"/>
+        </w:numPr>
+        <w:pStyle w:val="Compact"/>
+      </w:pPr>
+      <w:r>
+        <w:t xml:space="preserve">One focal point. No more than three colours in the title block. No small text except the author name.</w:t>
+      </w:r>
+    </w:p>
+    <w:p>
+      <w:pPr>
+        <w:numPr>
+          <w:ilvl w:val="0"/>
+          <w:numId w:val="1004"/>
+        </w:numPr>
+        <w:pStyle w:val="Compact"/>
+      </w:pPr>
+      <w:r>
+        <w:t xml:space="preserve">Author name on the cover is</w:t>
+      </w:r>
+      <w:r>
+        <w:t xml:space="preserve"> </w:t>
+      </w:r>
+      <w:r>
+        <w:rPr>
+          <w:bCs/>
+          <w:b/>
+        </w:rPr>
+        <w:t xml:space="preserve">Skybee</w:t>
+      </w:r>
+      <w:r>
+        <w:t xml:space="preserve">, the owner’s publishing name.</w:t>
+      </w:r>
+    </w:p>
+    <w:p>
+      <w:pPr>
+        <w:numPr>
+          <w:ilvl w:val="0"/>
+          <w:numId w:val="1004"/>
+        </w:numPr>
+        <w:pStyle w:val="Compact"/>
+      </w:pPr>
+      <w:r>
+        <w:t xml:space="preserve">Images must be original, generated with an approved tool, or licensed stock with a saved license record. Never use copyrighted characters or celebrity likenesses.</w:t>
+      </w:r>
+    </w:p>
+    <w:p>
+      <w:pPr>
+        <w:numPr>
+          <w:ilvl w:val="0"/>
+          <w:numId w:val="1004"/>
+        </w:numPr>
+        <w:pStyle w:val="Compact"/>
+      </w:pPr>
+      <w:r>
+        <w:rPr>
+          <w:bCs/>
+          <w:b/>
+        </w:rPr>
+        <w:t xml:space="preserve">REQUIRED:</w:t>
+      </w:r>
+      <w:r>
+        <w:t xml:space="preserve"> </w:t>
+      </w:r>
+      <w:r>
+        <w:t xml:space="preserve">one cover per book, made by Kindle-3 in Canva from its brief. If the first design fails a check, Kindle-3 may make one new design from the same brief. A second failure makes the book blocked.</w:t>
+      </w:r>
+    </w:p>
+    <w:p>
+      <w:pPr>
+        <w:numPr>
+          <w:ilvl w:val="0"/>
+          <w:numId w:val="1004"/>
+        </w:numPr>
+        <w:pStyle w:val="Compact"/>
+      </w:pPr>
+      <w:r>
+        <w:rPr>
+          <w:bCs/>
+          <w:b/>
+        </w:rPr>
         <w:t xml:space="preserve">Owner gate:</w:t>
       </w:r>
       <w:r>
         <w:t xml:space="preserve"> </w:t>
       </w:r>
       <w:r>
-        <w:t xml:space="preserve">the owner checks each cover visually at upload time,</w:t>
-      </w:r>
-      <w:r>
-        <w:t xml:space="preserve"> </w:t>
-      </w:r>
-      <w:r>
-        <w:t xml:space="preserve">before the KDP upload. This replaces an approval step in the</w:t>
-      </w:r>
-      <w:r>
-        <w:t xml:space="preserve"> </w:t>
-      </w:r>
-      <w:r>
-        <w:t xml:space="preserve">pipeline.</w:t>
+        <w:t xml:space="preserve">the owner checks each cover visually at upload time, before the KDP upload. This replaces an approval step in the pipeline.</w:t>
       </w:r>
     </w:p>
     <w:bookmarkEnd w:id="25"/>
@@ -1926,19 +1859,7 @@
         <w:t xml:space="preserve">metadata.json</w:t>
       </w:r>
       <w:r>
-        <w:t xml:space="preserve">, the stylesheet, and the fonts. It includes the</w:t>
-      </w:r>
-      <w:r>
-        <w:t xml:space="preserve"> </w:t>
-      </w:r>
-      <w:r>
-        <w:t xml:space="preserve">cover image, title page, copyright page, and table of contents with</w:t>
-      </w:r>
-      <w:r>
-        <w:t xml:space="preserve"> </w:t>
-      </w:r>
-      <w:r>
-        <w:t xml:space="preserve">working links.</w:t>
+        <w:t xml:space="preserve">, the stylesheet, and the fonts. It includes the cover image, title page, copyright page, and table of contents with working links.</w:t>
       </w:r>
     </w:p>
     <w:p>
@@ -1981,19 +1902,7 @@
         <w:pStyle w:val="Compact"/>
       </w:pPr>
       <w:r>
-        <w:t xml:space="preserve">Owner check before upload: open the EPUB in Kindle Previewer and</w:t>
-      </w:r>
-      <w:r>
-        <w:t xml:space="preserve"> </w:t>
-      </w:r>
-      <w:r>
-        <w:t xml:space="preserve">read the first and last chapters. The phone-sized preview from v1 is</w:t>
-      </w:r>
-      <w:r>
-        <w:t xml:space="preserve"> </w:t>
-      </w:r>
-      <w:r>
-        <w:t xml:space="preserve">replaced by this.</w:t>
+        <w:t xml:space="preserve">Owner check before upload: open the EPUB in Kindle Previewer and read the first and last chapters. The phone-sized preview from v1 is replaced by this.</w:t>
       </w:r>
     </w:p>
     <w:p>
@@ -2032,13 +1941,7 @@
         <w:t xml:space="preserve">manuscript.docx</w:t>
       </w:r>
       <w:r>
-        <w:t xml:space="preserve">, with real</w:t>
-      </w:r>
-      <w:r>
-        <w:t xml:space="preserve"> </w:t>
-      </w:r>
-      <w:r>
-        <w:t xml:space="preserve">heading styles for chapters.</w:t>
+        <w:t xml:space="preserve">, with real heading styles for chapters.</w:t>
       </w:r>
     </w:p>
     <w:bookmarkEnd w:id="26"/>
@@ -2107,13 +2010,7 @@
         <w:t xml:space="preserve">“</w:t>
       </w:r>
       <w:r>
-        <w:t xml:space="preserve">Copyright © 2026 Skybee. All rights</w:t>
-      </w:r>
-      <w:r>
-        <w:t xml:space="preserve"> </w:t>
-      </w:r>
-      <w:r>
-        <w:t xml:space="preserve">reserved.</w:t>
+        <w:t xml:space="preserve">Copyright © 2026 Skybee. All rights reserved.</w:t>
       </w:r>
       <w:r>
         <w:t xml:space="preserve">”</w:t>
@@ -2147,19 +2044,7 @@
         <w:t xml:space="preserve">“</w:t>
       </w:r>
       <w:r>
-        <w:t xml:space="preserve">This book was created</w:t>
-      </w:r>
-      <w:r>
-        <w:t xml:space="preserve"> </w:t>
-      </w:r>
-      <w:r>
-        <w:t xml:space="preserve">with the assistance of artificial intelligence tools. All content</w:t>
-      </w:r>
-      <w:r>
-        <w:t xml:space="preserve"> </w:t>
-      </w:r>
-      <w:r>
-        <w:t xml:space="preserve">was reviewed and edited by the publisher.</w:t>
+        <w:t xml:space="preserve">This book was created with the assistance of artificial intelligence tools. All content was reviewed and edited by the publisher.</w:t>
       </w:r>
       <w:r>
         <w:t xml:space="preserve">”</w:t>
@@ -2184,13 +2069,7 @@
         <w:t xml:space="preserve"> </w:t>
       </w:r>
       <w:r>
-        <w:t xml:space="preserve">every practical guide and</w:t>
-      </w:r>
-      <w:r>
-        <w:t xml:space="preserve"> </w:t>
-      </w:r>
-      <w:r>
-        <w:t xml:space="preserve">workbook, including workbooks, carries:</w:t>
+        <w:t xml:space="preserve">every practical guide and workbook, including workbooks, carries:</w:t>
       </w:r>
       <w:r>
         <w:t xml:space="preserve"> </w:t>
@@ -2199,13 +2078,7 @@
         <w:t xml:space="preserve">“</w:t>
       </w:r>
       <w:r>
-        <w:t xml:space="preserve">This book is for general</w:t>
-      </w:r>
-      <w:r>
-        <w:t xml:space="preserve"> </w:t>
-      </w:r>
-      <w:r>
-        <w:t xml:space="preserve">information only and is not medical, financial, or legal advice.</w:t>
+        <w:t xml:space="preserve">This book is for general information only and is not medical, financial, or legal advice.</w:t>
       </w:r>
       <w:r>
         <w:t xml:space="preserve">”</w:t>
@@ -2233,19 +2106,7 @@
         <w:t xml:space="preserve">“</w:t>
       </w:r>
       <w:r>
-        <w:t xml:space="preserve">This is a work of fiction.</w:t>
-      </w:r>
-      <w:r>
-        <w:t xml:space="preserve"> </w:t>
-      </w:r>
-      <w:r>
-        <w:t xml:space="preserve">Names, characters, places, and events are fictional. Any resemblance</w:t>
-      </w:r>
-      <w:r>
-        <w:t xml:space="preserve"> </w:t>
-      </w:r>
-      <w:r>
-        <w:t xml:space="preserve">to real persons is coincidental.</w:t>
+        <w:t xml:space="preserve">This is a work of fiction. Names, characters, places, and events are fictional. Any resemblance to real persons is coincidental.</w:t>
       </w:r>
       <w:r>
         <w:t xml:space="preserve">”</w:t>
@@ -2260,13 +2121,7 @@
         <w:pStyle w:val="Compact"/>
       </w:pPr>
       <w:r>
-        <w:t xml:space="preserve">Optional: a short back-of-book note about the series. Do not ask for</w:t>
-      </w:r>
-      <w:r>
-        <w:t xml:space="preserve"> </w:t>
-      </w:r>
-      <w:r>
-        <w:t xml:space="preserve">reviews in a way that breaks Amazon’s rules.</w:t>
+        <w:t xml:space="preserve">Optional: a short back-of-book note about the series. Do not ask for reviews in a way that breaks Amazon’s rules.</w:t>
       </w:r>
     </w:p>
     <w:bookmarkEnd w:id="27"/>
@@ -2282,13 +2137,13 @@
     <w:tbl>
       <w:tblPr>
         <w:tblStyle w:val="Table"/>
-        <w:tblW w:type="pct" w:w="4865"/>
+        <w:tblW w:type="pct" w:w="4937"/>
         <w:tblLook w:firstRow="1" w:lastRow="0" w:firstColumn="0" w:lastColumn="0" w:noHBand="0" w:noVBand="0" w:val="0020"/>
         <w:jc w:val="start"/>
       </w:tblPr>
       <w:tblGrid>
-        <w:gridCol w:w="3852"/>
-        <w:gridCol w:w="3852"/>
+        <w:gridCol w:w="2005"/>
+        <w:gridCol w:w="5814"/>
       </w:tblGrid>
       <w:tr>
         <w:trPr>
@@ -2340,13 +2195,7 @@
               <w:jc w:val="left"/>
             </w:pPr>
             <w:r>
-              <w:t xml:space="preserve">$2.99 to $4.99. Stay at or above</w:t>
-            </w:r>
-            <w:r>
-              <w:t xml:space="preserve"> </w:t>
-            </w:r>
-            <w:r>
-              <w:t xml:space="preserve">$2.99 for the 70 percent royalty.</w:t>
+              <w:t xml:space="preserve">$2.99 to $4.99. Stay at or above $2.99 for the 70 percent royalty.</w:t>
             </w:r>
           </w:p>
         </w:tc>
@@ -2360,13 +2209,7 @@
               <w:jc w:val="left"/>
             </w:pPr>
             <w:r>
-              <w:t xml:space="preserve">Bedtime collections and early</w:t>
-            </w:r>
-            <w:r>
-              <w:t xml:space="preserve"> </w:t>
-            </w:r>
-            <w:r>
-              <w:t xml:space="preserve">readers</w:t>
+              <w:t xml:space="preserve">Bedtime collections and early readers</w:t>
             </w:r>
           </w:p>
         </w:tc>
@@ -2404,19 +2247,7 @@
               <w:jc w:val="left"/>
             </w:pPr>
             <w:r>
-              <w:t xml:space="preserve">$2.99 to $5.99, or $0.99 to</w:t>
-            </w:r>
-            <w:r>
-              <w:t xml:space="preserve"> </w:t>
-            </w:r>
-            <w:r>
-              <w:t xml:space="preserve">$1.99 only if the book is very</w:t>
-            </w:r>
-            <w:r>
-              <w:t xml:space="preserve"> </w:t>
-            </w:r>
-            <w:r>
-              <w:t xml:space="preserve">short</w:t>
+              <w:t xml:space="preserve">$2.99 to $5.99, or $0.99 to $1.99 only if the book is very short</w:t>
             </w:r>
           </w:p>
         </w:tc>
@@ -2468,25 +2299,7 @@
               <w:jc w:val="left"/>
             </w:pPr>
             <w:r>
-              <w:t xml:space="preserve">Optional, only when the owner</w:t>
-            </w:r>
-            <w:r>
-              <w:t xml:space="preserve"> </w:t>
-            </w:r>
-            <w:r>
-              <w:t xml:space="preserve">announces it. A $0.99 promotion</w:t>
-            </w:r>
-            <w:r>
-              <w:t xml:space="preserve"> </w:t>
-            </w:r>
-            <w:r>
-              <w:t xml:space="preserve">pays 35 percent royalty during its</w:t>
-            </w:r>
-            <w:r>
-              <w:t xml:space="preserve"> </w:t>
-            </w:r>
-            <w:r>
-              <w:t xml:space="preserve">window.</w:t>
+              <w:t xml:space="preserve">Optional, only when the owner announces it. A $0.99 promotion pays 35 percent royalty during its window.</w:t>
             </w:r>
           </w:p>
         </w:tc>
@@ -2522,13 +2335,7 @@
               <w:t xml:space="preserve"> </w:t>
             </w:r>
             <w:r>
-              <w:t xml:space="preserve">enrol for 90</w:t>
-            </w:r>
-            <w:r>
-              <w:t xml:space="preserve"> </w:t>
-            </w:r>
-            <w:r>
-              <w:t xml:space="preserve">days.</w:t>
+              <w:t xml:space="preserve">enrol for 90 days.</w:t>
             </w:r>
             <w:r>
               <w:t xml:space="preserve"> </w:t>
@@ -2544,19 +2351,7 @@
               <w:t xml:space="preserve"> </w:t>
             </w:r>
             <w:r>
-              <w:t xml:space="preserve">do not</w:t>
-            </w:r>
-            <w:r>
-              <w:t xml:space="preserve"> </w:t>
-            </w:r>
-            <w:r>
-              <w:t xml:space="preserve">enrol. Each book’s metadata records</w:t>
-            </w:r>
-            <w:r>
-              <w:t xml:space="preserve"> </w:t>
-            </w:r>
-            <w:r>
-              <w:t xml:space="preserve">the choice.</w:t>
+              <w:t xml:space="preserve">do not enrol. Each book’s metadata records the choice.</w:t>
             </w:r>
           </w:p>
         </w:tc>
@@ -2582,13 +2377,7 @@
               <w:jc w:val="left"/>
             </w:pPr>
             <w:r>
-              <w:t xml:space="preserve">Worldwide, unless a rights issue</w:t>
-            </w:r>
-            <w:r>
-              <w:t xml:space="preserve"> </w:t>
-            </w:r>
-            <w:r>
-              <w:t xml:space="preserve">exists.</w:t>
+              <w:t xml:space="preserve">Worldwide, unless a rights issue exists.</w:t>
             </w:r>
           </w:p>
         </w:tc>
@@ -2673,19 +2462,7 @@
         <w:pStyle w:val="Compact"/>
       </w:pPr>
       <w:r>
-        <w:t xml:space="preserve">KDP’s current help allows up to three categories. This guide</w:t>
-      </w:r>
-      <w:r>
-        <w:t xml:space="preserve"> </w:t>
-      </w:r>
-      <w:r>
-        <w:t xml:space="preserve">requires two, which is the minimum. A third may be added only if the</w:t>
-      </w:r>
-      <w:r>
-        <w:t xml:space="preserve"> </w:t>
-      </w:r>
-      <w:r>
-        <w:t xml:space="preserve">owner decides.</w:t>
+        <w:t xml:space="preserve">KDP’s current help allows up to three categories. This guide requires two, which is the minimum. A third may be added only if the owner decides.</w:t>
       </w:r>
     </w:p>
     <w:p>
@@ -2707,19 +2484,7 @@
         <w:t xml:space="preserve"> </w:t>
       </w:r>
       <w:r>
-        <w:t xml:space="preserve">a category is used only when its pool entry is</w:t>
-      </w:r>
-      <w:r>
-        <w:t xml:space="preserve"> </w:t>
-      </w:r>
-      <w:r>
-        <w:t xml:space="preserve">confirmed. The owner confirms each path in the KDP category picker</w:t>
-      </w:r>
-      <w:r>
-        <w:t xml:space="preserve"> </w:t>
-      </w:r>
-      <w:r>
-        <w:t xml:space="preserve">and sets</w:t>
+        <w:t xml:space="preserve">a category is used only when its pool entry is confirmed. The owner confirms each path in the KDP category picker and sets</w:t>
       </w:r>
       <w:r>
         <w:t xml:space="preserve"> </w:t>
@@ -2734,13 +2499,7 @@
         <w:t xml:space="preserve"> </w:t>
       </w:r>
       <w:r>
-        <w:t xml:space="preserve">in the pool. An unconfirmed category</w:t>
-      </w:r>
-      <w:r>
-        <w:t xml:space="preserve"> </w:t>
-      </w:r>
-      <w:r>
-        <w:t xml:space="preserve">blocks the book.</w:t>
+        <w:t xml:space="preserve">in the pool. An unconfirmed category blocks the book.</w:t>
       </w:r>
     </w:p>
     <w:p>
@@ -3066,13 +2825,7 @@
         <w:t xml:space="preserve"> </w:t>
       </w:r>
       <w:r>
-        <w:t xml:space="preserve">(the exact</w:t>
-      </w:r>
-      <w:r>
-        <w:t xml:space="preserve"> </w:t>
-      </w:r>
-      <w:r>
-        <w:t xml:space="preserve">sentence in section 8),</w:t>
+        <w:t xml:space="preserve">(the exact sentence in section 8),</w:t>
       </w:r>
       <w:r>
         <w:t xml:space="preserve"> </w:t>
@@ -3150,13 +2903,7 @@
         <w:t xml:space="preserve">“</w:t>
       </w:r>
       <w:r>
-        <w:t xml:space="preserve">cover-ebook.jpg (1600 x</w:t>
-      </w:r>
-      <w:r>
-        <w:t xml:space="preserve"> </w:t>
-      </w:r>
-      <w:r>
-        <w:t xml:space="preserve">2560 RGB JPEG)</w:t>
+        <w:t xml:space="preserve">cover-ebook.jpg (1600 x 2560 RGB JPEG)</w:t>
       </w:r>
       <w:r>
         <w:t xml:space="preserve">”</w:t>
@@ -3183,7 +2930,7 @@
         <w:t xml:space="preserve">“</w:t>
       </w:r>
       <w:r>
-        <w:t xml:space="preserve">2.0</w:t>
+        <w:t xml:space="preserve">2.1</w:t>
       </w:r>
       <w:r>
         <w:t xml:space="preserve">”</w:t>
@@ -3232,13 +2979,7 @@
         <w:t xml:space="preserve"> </w:t>
       </w:r>
       <w:r>
-        <w:t xml:space="preserve">in its folder,</w:t>
-      </w:r>
-      <w:r>
-        <w:t xml:space="preserve"> </w:t>
-      </w:r>
-      <w:r>
-        <w:t xml:space="preserve">generated by</w:t>
+        <w:t xml:space="preserve">in its folder, generated by</w:t>
       </w:r>
       <w:r>
         <w:t xml:space="preserve"> </w:t>
@@ -3265,31 +3006,7 @@
         <w:t xml:space="preserve">metadata.json</w:t>
       </w:r>
       <w:r>
-        <w:t xml:space="preserve">. It</w:t>
-      </w:r>
-      <w:r>
-        <w:t xml:space="preserve"> </w:t>
-      </w:r>
-      <w:r>
-        <w:t xml:space="preserve">holds every KDP form answer: title, subtitle, series, author,</w:t>
-      </w:r>
-      <w:r>
-        <w:t xml:space="preserve"> </w:t>
-      </w:r>
-      <w:r>
-        <w:t xml:space="preserve">description, seven keywords, two categories, content warnings, AI</w:t>
-      </w:r>
-      <w:r>
-        <w:t xml:space="preserve"> </w:t>
-      </w:r>
-      <w:r>
-        <w:t xml:space="preserve">disclosure, territories, price, royalty, KDP Select, lending, and the</w:t>
-      </w:r>
-      <w:r>
-        <w:t xml:space="preserve"> </w:t>
-      </w:r>
-      <w:r>
-        <w:t xml:space="preserve">files to upload. Regenerate it after any metadata change.</w:t>
+        <w:t xml:space="preserve">. It holds every KDP form answer: title, subtitle, series, author, description, seven keywords, two categories, content warnings, AI disclosure, territories, price, royalty, KDP Select, lending, and the files to upload. Regenerate it after any metadata change.</w:t>
       </w:r>
     </w:p>
     <w:bookmarkEnd w:id="31"/>
@@ -3330,43 +3047,16 @@
         <w:t xml:space="preserve"> </w:t>
       </w:r>
       <w:r>
-        <w:t xml:space="preserve">REQUIRED: every</w:t>
-      </w:r>
-      <w:r>
-        <w:t xml:space="preserve"> </w:t>
-      </w:r>
-      <w:r>
-        <w:t xml:space="preserve">check passes before approval. The checks are: required files; title,</w:t>
-      </w:r>
-      <w:r>
-        <w:t xml:space="preserve"> </w:t>
-      </w:r>
-      <w:r>
-        <w:t xml:space="preserve">subtitle, and author; description length; seven keywords under 50</w:t>
-      </w:r>
-      <w:r>
-        <w:t xml:space="preserve"> </w:t>
-      </w:r>
-      <w:r>
-        <w:t xml:space="preserve">characters; two categories from the confirmed pool; language; exact AI</w:t>
-      </w:r>
-      <w:r>
-        <w:t xml:space="preserve"> </w:t>
-      </w:r>
-      <w:r>
-        <w:t xml:space="preserve">disclosure wording; copyright line; placeholder scan; word count within</w:t>
-      </w:r>
-      <w:r>
-        <w:t xml:space="preserve"> </w:t>
-      </w:r>
-      <w:r>
-        <w:t xml:space="preserve">10 percent of target; chapter headings; epubcheck (0 errors, 0</w:t>
-      </w:r>
-      <w:r>
-        <w:t xml:space="preserve"> </w:t>
-      </w:r>
-      <w:r>
-        <w:t xml:space="preserve">warnings); and the cover checks.</w:t>
+        <w:t xml:space="preserve">REQUIRED: every check passes before approval. The checks are: required files; title, subtitle, and author; description length; seven keywords under 50 characters; two categories from the confirmed pool; language; exact AI disclosure wording; copyright line; placeholder scan; word count within 10 percent of target; chapter headings; epubcheck (0 errors, 0 warnings); the cover brief checks; and the cover checks (</w:t>
+      </w:r>
+      <w:r>
+        <w:rPr>
+          <w:rStyle w:val="VerbatimChar"/>
+        </w:rPr>
+        <w:t xml:space="preserve">scripts/check_cover.py --book</w:t>
+      </w:r>
+      <w:r>
+        <w:t xml:space="preserve">).</w:t>
       </w:r>
     </w:p>
     <w:p>
@@ -3397,13 +3087,7 @@
         <w:t xml:space="preserve"> </w:t>
       </w:r>
       <w:r>
-        <w:t xml:space="preserve">REQUIRED for kids’ books</w:t>
-      </w:r>
-      <w:r>
-        <w:t xml:space="preserve"> </w:t>
-      </w:r>
-      <w:r>
-        <w:t xml:space="preserve">and early readers: the Flesch-Kincaid grade of</w:t>
+        <w:t xml:space="preserve">REQUIRED for kids’ books and early readers: the Flesch-Kincaid grade of</w:t>
       </w:r>
       <w:r>
         <w:t xml:space="preserve"> </w:t>
@@ -3418,25 +3102,7 @@
         <w:t xml:space="preserve"> </w:t>
       </w:r>
       <w:r>
-        <w:t xml:space="preserve">must be</w:t>
-      </w:r>
-      <w:r>
-        <w:t xml:space="preserve"> </w:t>
-      </w:r>
-      <w:r>
-        <w:t xml:space="preserve">between 2 and 4 for ages 6 to 9, and between 1 and 3 for ages 4 to 7. A</w:t>
-      </w:r>
-      <w:r>
-        <w:t xml:space="preserve"> </w:t>
-      </w:r>
-      <w:r>
-        <w:t xml:space="preserve">text below the range is too simple; rewrite the sentences that are hard</w:t>
-      </w:r>
-      <w:r>
-        <w:t xml:space="preserve"> </w:t>
-      </w:r>
-      <w:r>
-        <w:t xml:space="preserve">to read.</w:t>
+        <w:t xml:space="preserve">must be between 2 and 4 for ages 6 to 9, and between 1 and 3 for ages 4 to 7. A text below the range is too simple; rewrite the sentences that are hard to read.</w:t>
       </w:r>
     </w:p>
     <w:p>
@@ -3454,31 +3120,7 @@
         <w:t xml:space="preserve"> </w:t>
       </w:r>
       <w:r>
-        <w:t xml:space="preserve">REQUIRED: names, places,</w:t>
-      </w:r>
-      <w:r>
-        <w:t xml:space="preserve"> </w:t>
-      </w:r>
-      <w:r>
-        <w:t xml:space="preserve">and facts are consistent; the timeline holds; no repeated or</w:t>
-      </w:r>
-      <w:r>
-        <w:t xml:space="preserve"> </w:t>
-      </w:r>
-      <w:r>
-        <w:t xml:space="preserve">contradictory passages; no sensitive content beyond the stated warnings;</w:t>
-      </w:r>
-      <w:r>
-        <w:t xml:space="preserve"> </w:t>
-      </w:r>
-      <w:r>
-        <w:t xml:space="preserve">no copied passages or trademarks; non-fiction claims spot-checked</w:t>
-      </w:r>
-      <w:r>
-        <w:t xml:space="preserve"> </w:t>
-      </w:r>
-      <w:r>
-        <w:t xml:space="preserve">against</w:t>
+        <w:t xml:space="preserve">REQUIRED: names, places, and facts are consistent; the timeline holds; no repeated or contradictory passages; no sensitive content beyond the stated warnings; no copied passages or trademarks; non-fiction claims spot-checked against</w:t>
       </w:r>
       <w:r>
         <w:t xml:space="preserve"> </w:t>
@@ -3604,13 +3246,7 @@
         <w:t xml:space="preserve">review-notes.md</w:t>
       </w:r>
       <w:r>
-        <w:t xml:space="preserve">, and the font</w:t>
-      </w:r>
-      <w:r>
-        <w:t xml:space="preserve"> </w:t>
-      </w:r>
-      <w:r>
-        <w:t xml:space="preserve">license file.</w:t>
+        <w:t xml:space="preserve">, and the font license file.</w:t>
       </w:r>
     </w:p>
     <w:p>
@@ -3639,13 +3275,7 @@
         <w:t xml:space="preserve">“</w:t>
       </w:r>
       <w:r>
-        <w:t xml:space="preserve">Kindle-3:</w:t>
-      </w:r>
-      <w:r>
-        <w:t xml:space="preserve"> </w:t>
-      </w:r>
-      <w:r>
-        <w:t xml:space="preserve">cover, review and KDP form answers for [book title]</w:t>
+        <w:t xml:space="preserve">Kindle-3: cover, review and KDP form answers for [book title]</w:t>
       </w:r>
       <w:r>
         <w:t xml:space="preserve">”</w:t>
@@ -3672,13 +3302,7 @@
         <w:t xml:space="preserve"> </w:t>
       </w:r>
       <w:r>
-        <w:t xml:space="preserve">nothing is uploaded to Amazon by a robot. The owner</w:t>
-      </w:r>
-      <w:r>
-        <w:t xml:space="preserve"> </w:t>
-      </w:r>
-      <w:r>
-        <w:t xml:space="preserve">uploads each book.</w:t>
+        <w:t xml:space="preserve">nothing is uploaded to Amazon by a robot. The owner uploads each book.</w:t>
       </w:r>
     </w:p>
     <w:bookmarkEnd w:id="33"/>
@@ -3700,37 +3324,7 @@
         <w:pStyle w:val="Compact"/>
       </w:pPr>
       <w:r>
-        <w:t xml:space="preserve">A robot stops and does not finish if: the topic entry is incomplete</w:t>
-      </w:r>
-      <w:r>
-        <w:t xml:space="preserve"> </w:t>
-      </w:r>
-      <w:r>
-        <w:t xml:space="preserve">or contradictory; a fact cannot be verified; the text or cover could</w:t>
-      </w:r>
-      <w:r>
-        <w:t xml:space="preserve"> </w:t>
-      </w:r>
-      <w:r>
-        <w:t xml:space="preserve">use a trademark, copyrighted work, or real-person likeness; the book</w:t>
-      </w:r>
-      <w:r>
-        <w:t xml:space="preserve"> </w:t>
-      </w:r>
-      <w:r>
-        <w:t xml:space="preserve">would give medical, financial, or legal advice; the cover cannot be</w:t>
-      </w:r>
-      <w:r>
-        <w:t xml:space="preserve"> </w:t>
-      </w:r>
-      <w:r>
-        <w:t xml:space="preserve">made to spec; an epubcheck error cannot be fixed; or a category is</w:t>
-      </w:r>
-      <w:r>
-        <w:t xml:space="preserve"> </w:t>
-      </w:r>
-      <w:r>
-        <w:t xml:space="preserve">unconfirmed.</w:t>
+        <w:t xml:space="preserve">A robot stops and does not finish if: the topic entry is incomplete or contradictory; a fact cannot be verified; the text or cover could use a trademark, copyrighted work, or real-person likeness; the book would give medical, financial, or legal advice; the cover cannot be made to spec; an epubcheck error cannot be fixed; or a category is unconfirmed.</w:t>
       </w:r>
     </w:p>
     <w:p>
@@ -3752,13 +3346,7 @@
         <w:t xml:space="preserve"> </w:t>
       </w:r>
       <w:r>
-        <w:t xml:space="preserve">it deletes the partial folder, so the topic</w:t>
-      </w:r>
-      <w:r>
-        <w:t xml:space="preserve"> </w:t>
-      </w:r>
-      <w:r>
-        <w:t xml:space="preserve">stays available, and logs the reason.</w:t>
+        <w:t xml:space="preserve">it deletes the partial folder, so the topic stays available, and logs the reason.</w:t>
       </w:r>
     </w:p>
     <w:p>
@@ -3780,19 +3368,7 @@
         <w:t xml:space="preserve"> </w:t>
       </w:r>
       <w:r>
-        <w:t xml:space="preserve">it logs the exact check that</w:t>
-      </w:r>
-      <w:r>
-        <w:t xml:space="preserve"> </w:t>
-      </w:r>
-      <w:r>
-        <w:t xml:space="preserve">failed. A book blocked twice on Kindle-3 is skipped and shown to the</w:t>
-      </w:r>
-      <w:r>
-        <w:t xml:space="preserve"> </w:t>
-      </w:r>
-      <w:r>
-        <w:t xml:space="preserve">owner as needing a decision. The next book is then reviewed.</w:t>
+        <w:t xml:space="preserve">it logs the exact check that failed. A book blocked twice on Kindle-3 is skipped and shown to the owner as needing a decision. The next book is then reviewed.</w:t>
       </w:r>
     </w:p>
     <w:p>
@@ -3955,13 +3531,7 @@
         <w:pStyle w:val="FirstParagraph"/>
       </w:pPr>
       <w:r>
-        <w:t xml:space="preserve">Keep a series note for each series: the characters, setting, and</w:t>
-      </w:r>
-      <w:r>
-        <w:t xml:space="preserve"> </w:t>
-      </w:r>
-      <w:r>
-        <w:t xml:space="preserve">timeline, in</w:t>
+        <w:t xml:space="preserve">Keep a series note for each series: the characters, setting, and timeline, in</w:t>
       </w:r>
       <w:r>
         <w:t xml:space="preserve"> </w:t>
@@ -3973,13 +3543,7 @@
         <w:t xml:space="preserve">series/&lt;series-slug&gt;.md</w:t>
       </w:r>
       <w:r>
-        <w:t xml:space="preserve">. Kindle-2 reads it before writing</w:t>
-      </w:r>
-      <w:r>
-        <w:t xml:space="preserve"> </w:t>
-      </w:r>
-      <w:r>
-        <w:t xml:space="preserve">a book in that series and updates it afterwards.</w:t>
+        <w:t xml:space="preserve">. Kindle-2 reads it before writing a book in that series and updates it afterwards.</w:t>
       </w:r>
     </w:p>
     <w:bookmarkEnd w:id="36"/>
@@ -4049,16 +3613,28 @@
         <w:pStyle w:val="Compact"/>
       </w:pPr>
       <w:r>
-        <w:t xml:space="preserve">Cover meets section 6 and</w:t>
-      </w:r>
-      <w:r>
-        <w:t xml:space="preserve"> </w:t>
-      </w:r>
-      <w:r>
-        <w:rPr>
-          <w:rStyle w:val="VerbatimChar"/>
-        </w:rPr>
-        <w:t xml:space="preserve">check_cover.py</w:t>
+        <w:t xml:space="preserve">Cover meets section 6, the cover brief passes</w:t>
+      </w:r>
+      <w:r>
+        <w:t xml:space="preserve"> </w:t>
+      </w:r>
+      <w:r>
+        <w:rPr>
+          <w:rStyle w:val="VerbatimChar"/>
+        </w:rPr>
+        <w:t xml:space="preserve">check_cover_brief.py</w:t>
+      </w:r>
+      <w:r>
+        <w:t xml:space="preserve">, and</w:t>
+      </w:r>
+      <w:r>
+        <w:t xml:space="preserve"> </w:t>
+      </w:r>
+      <w:r>
+        <w:rPr>
+          <w:rStyle w:val="VerbatimChar"/>
+        </w:rPr>
+        <w:t xml:space="preserve">check_cover.py --book</w:t>
       </w:r>
       <w:r>
         <w:t xml:space="preserve"> </w:t>
@@ -4180,25 +3756,71 @@
           <w:bCs/>
           <w:b/>
         </w:rPr>
+        <w:t xml:space="preserve">2.1 (18 October 2026):</w:t>
+      </w:r>
+      <w:r>
+        <w:t xml:space="preserve"> </w:t>
+      </w:r>
+      <w:r>
+        <w:t xml:space="preserve">cover brief written before design and validated (</w:t>
+      </w:r>
+      <w:r>
+        <w:rPr>
+          <w:rStyle w:val="VerbatimChar"/>
+        </w:rPr>
+        <w:t xml:space="preserve">check_cover_brief.py</w:t>
+      </w:r>
+      <w:r>
+        <w:t xml:space="preserve">). Covers are checked against their own book: palette, title text by OCR at full and thumbnail size, title size, and the subtitle agreeing with metadata. Author and badge confirmed by viewing. Cover checks run through</w:t>
+      </w:r>
+      <w:r>
+        <w:t xml:space="preserve"> </w:t>
+      </w:r>
+      <w:r>
+        <w:rPr>
+          <w:rStyle w:val="VerbatimChar"/>
+        </w:rPr>
+        <w:t xml:space="preserve">check_book.py</w:t>
+      </w:r>
+      <w:r>
+        <w:t xml:space="preserve">. Guide version recorded as</w:t>
+      </w:r>
+      <w:r>
+        <w:t xml:space="preserve"> </w:t>
+      </w:r>
+      <w:r>
+        <w:t xml:space="preserve">“</w:t>
+      </w:r>
+      <w:r>
+        <w:t xml:space="preserve">2.1</w:t>
+      </w:r>
+      <w:r>
+        <w:t xml:space="preserve">”</w:t>
+      </w:r>
+      <w:r>
+        <w:t xml:space="preserve">.</w:t>
+      </w:r>
+    </w:p>
+    <w:p>
+      <w:pPr>
+        <w:numPr>
+          <w:ilvl w:val="0"/>
+          <w:numId w:val="1011"/>
+        </w:numPr>
+        <w:pStyle w:val="Compact"/>
+      </w:pPr>
+      <w:r>
+        <w:rPr>
+          <w:bCs/>
+          <w:b/>
+        </w:rPr>
         <w:t xml:space="preserve">2.0 (18 October 2026):</w:t>
       </w:r>
       <w:r>
         <w:t xml:space="preserve"> </w:t>
       </w:r>
       <w:r>
-        <w:t xml:space="preserve">ebook only; print removed. Two categories</w:t>
-      </w:r>
-      <w:r>
-        <w:t xml:space="preserve"> </w:t>
-      </w:r>
-      <w:r>
-        <w:t xml:space="preserve">from a confirmed pool. KDP form answers required. Robo-2 renamed</w:t>
-      </w:r>
-      <w:r>
-        <w:t xml:space="preserve"> </w:t>
-      </w:r>
-      <w:r>
-        <w:t xml:space="preserve">Kindle-2 throughout. Copyright placeholder replaced with</w:t>
+        <w:t xml:space="preserve">ebook only; print removed. Two categories from a confirmed pool. KDP form answers required. Robo-2 renamed Kindle-2 throughout. Copyright placeholder replaced with</w:t>
       </w:r>
       <w:r>
         <w:t xml:space="preserve"> </w:t>
@@ -4213,43 +3835,7 @@
         <w:t xml:space="preserve">”</w:t>
       </w:r>
       <w:r>
-        <w:t xml:space="preserve">.</w:t>
-      </w:r>
-      <w:r>
-        <w:t xml:space="preserve"> </w:t>
-      </w:r>
-      <w:r>
-        <w:t xml:space="preserve">Phone preview replaced by Kindle Previewer check by the owner. KDP</w:t>
-      </w:r>
-      <w:r>
-        <w:t xml:space="preserve"> </w:t>
-      </w:r>
-      <w:r>
-        <w:t xml:space="preserve">Select rule set: series enrolled, standalone not. Workbooks and</w:t>
-      </w:r>
-      <w:r>
-        <w:t xml:space="preserve"> </w:t>
-      </w:r>
-      <w:r>
-        <w:t xml:space="preserve">guides require the non-fiction disclaimer. Readability tool named</w:t>
-      </w:r>
-      <w:r>
-        <w:t xml:space="preserve"> </w:t>
-      </w:r>
-      <w:r>
-        <w:t xml:space="preserve">and required for kids’ books. Stop, retry and two-strike rules</w:t>
-      </w:r>
-      <w:r>
-        <w:t xml:space="preserve"> </w:t>
-      </w:r>
-      <w:r>
-        <w:t xml:space="preserve">added. Cover approval moved to the owner’s check at upload.</w:t>
-      </w:r>
-      <w:r>
-        <w:t xml:space="preserve"> </w:t>
-      </w:r>
-      <w:r>
-        <w:t xml:space="preserve">Mechanical checks made into scripts.</w:t>
+        <w:t xml:space="preserve">. Phone preview replaced by Kindle Previewer check by the owner. KDP Select rule set: series enrolled, standalone not. Workbooks and guides require the non-fiction disclaimer. Readability tool named and required for kids’ books. Stop, retry and two-strike rules added. Cover approval moved to the owner’s check at upload. Mechanical checks made into scripts.</w:t>
       </w:r>
     </w:p>
     <w:p>

</xml_diff>

<commit_message>
Review pass: fix conflicts across guide, robots, scripts and live report
- pick_topic honours scripts/topic-holds.json (was ignored)
- check_book requires style.css, font licence, guide_version 2.1
- Bakery: stylesheet added, EPUB rebuilt, guide 2.1, Ready copy synced
- Kindle-4 becomes manual-upload handoff; no KDP sign-in
- Fixed-layout formats paused in Kindle-1 and Kindle-2
- Kindle-3: oldest-first review, one redesign budget, copies style and fonts
- Guide: section 3, 6, 7, 13, 14, 19 corrected
- Live report labels for handoff status

Co-Authored-By: Claude Haiku 5.5 <noreply@anthropic.com>
Claude-Session: https://claude.ai/code/session_01MZeVJcyf7XvKRRCE6AUkLk
</commit_message>
<xml_diff>
--- a/ebooks-Raw/guide.docx
+++ b/ebooks-Raw/guide.docx
@@ -222,13 +222,13 @@
           <w:bCs/>
           <w:b/>
         </w:rPr>
-        <w:t xml:space="preserve">Kindle-4 (publisher prep):</w:t>
-      </w:r>
-      <w:r>
-        <w:t xml:space="preserve"> </w:t>
-      </w:r>
-      <w:r>
-        <w:t xml:space="preserve">prepares a KDP draft from the approved package and stops before Publish.</w:t>
+        <w:t xml:space="preserve">Kindle-4 (upload handoff):</w:t>
+      </w:r>
+      <w:r>
+        <w:t xml:space="preserve"> </w:t>
+      </w:r>
+      <w:r>
+        <w:t xml:space="preserve">checks the approved package again and marks it ready for the owner’s manual upload. It does not sign in to KDP and does not prepare a KDP draft.</w:t>
       </w:r>
     </w:p>
     <w:p>
@@ -910,6 +910,14 @@
         <w:pStyle w:val="BodyText"/>
       </w:pPr>
       <w:r>
+        <w:t xml:space="preserve">Until the owner approves a fixed-layout builder, the pipeline produces text-only EPUBs only. Early readers with illustrations and large-print puzzle books are not produced, so Kindle-1 must not choose them.</w:t>
+      </w:r>
+    </w:p>
+    <w:p>
+      <w:pPr>
+        <w:pStyle w:val="BodyText"/>
+      </w:pPr>
+      <w:r>
         <w:rPr>
           <w:bCs/>
           <w:b/>
@@ -1082,13 +1090,13 @@
     <w:tbl>
       <w:tblPr>
         <w:tblStyle w:val="Table"/>
-        <w:tblW w:type="pct" w:w="4944"/>
+        <w:tblW w:type="pct" w:w="4940"/>
         <w:tblLook w:firstRow="1" w:lastRow="0" w:firstColumn="0" w:lastColumn="0" w:noHBand="0" w:noVBand="0" w:val="0020"/>
         <w:jc w:val="start"/>
       </w:tblPr>
       <w:tblGrid>
-        <w:gridCol w:w="1610"/>
-        <w:gridCol w:w="6219"/>
+        <w:gridCol w:w="1192"/>
+        <w:gridCol w:w="6631"/>
       </w:tblGrid>
       <w:tr>
         <w:trPr>
@@ -1666,7 +1674,7 @@
         <w:t xml:space="preserve"> </w:t>
       </w:r>
       <w:r>
-        <w:t xml:space="preserve">The title on the cover must equal the title in metadata.json. If the cover prints a subtitle or tagline that metadata.json does not have, the book is blocked until the owner decides which one KDP uses.</w:t>
+        <w:t xml:space="preserve">The title lines on the cover equal the title in metadata.json. The subtitle in metadata.json appears on the cover. The tagline is a short hook and must not contradict the title or subtitle. If the cover shows a different subtitle line from metadata.json, the book is blocked until the owner decides which one KDP uses.</w:t>
       </w:r>
     </w:p>
     <w:p>
@@ -1835,7 +1843,37 @@
         <w:t xml:space="preserve"> </w:t>
       </w:r>
       <w:r>
-        <w:t xml:space="preserve">the EPUB is built with pandoc from</w:t>
+        <w:t xml:space="preserve">Kindle-2 saves</w:t>
+      </w:r>
+      <w:r>
+        <w:t xml:space="preserve"> </w:t>
+      </w:r>
+      <w:r>
+        <w:rPr>
+          <w:rStyle w:val="VerbatimChar"/>
+        </w:rPr>
+        <w:t xml:space="preserve">style.css</w:t>
+      </w:r>
+      <w:r>
+        <w:t xml:space="preserve"> </w:t>
+      </w:r>
+      <w:r>
+        <w:t xml:space="preserve">(typography from section 5) and a</w:t>
+      </w:r>
+      <w:r>
+        <w:t xml:space="preserve"> </w:t>
+      </w:r>
+      <w:r>
+        <w:rPr>
+          <w:rStyle w:val="VerbatimChar"/>
+        </w:rPr>
+        <w:t xml:space="preserve">fonts/</w:t>
+      </w:r>
+      <w:r>
+        <w:t xml:space="preserve"> </w:t>
+      </w:r>
+      <w:r>
+        <w:t xml:space="preserve">folder with the font files and their licence file. The EPUB is built with pandoc from</w:t>
       </w:r>
       <w:r>
         <w:t xml:space="preserve"> </w:t>
@@ -1859,7 +1897,31 @@
         <w:t xml:space="preserve">metadata.json</w:t>
       </w:r>
       <w:r>
-        <w:t xml:space="preserve">, the stylesheet, and the fonts. It includes the cover image, title page, copyright page, and table of contents with working links.</w:t>
+        <w:t xml:space="preserve">,</w:t>
+      </w:r>
+      <w:r>
+        <w:t xml:space="preserve"> </w:t>
+      </w:r>
+      <w:r>
+        <w:rPr>
+          <w:rStyle w:val="VerbatimChar"/>
+        </w:rPr>
+        <w:t xml:space="preserve">style.css</w:t>
+      </w:r>
+      <w:r>
+        <w:t xml:space="preserve">, and</w:t>
+      </w:r>
+      <w:r>
+        <w:t xml:space="preserve"> </w:t>
+      </w:r>
+      <w:r>
+        <w:rPr>
+          <w:rStyle w:val="VerbatimChar"/>
+        </w:rPr>
+        <w:t xml:space="preserve">fonts/</w:t>
+      </w:r>
+      <w:r>
+        <w:t xml:space="preserve">. It includes the cover image, title page, copyright page, and table of contents with working links.</w:t>
       </w:r>
     </w:p>
     <w:p>
@@ -3047,7 +3109,22 @@
         <w:t xml:space="preserve"> </w:t>
       </w:r>
       <w:r>
-        <w:t xml:space="preserve">REQUIRED: every check passes before approval. The checks are: required files; title, subtitle, and author; description length; seven keywords under 50 characters; two categories from the confirmed pool; language; exact AI disclosure wording; copyright line; placeholder scan; word count within 10 percent of target; chapter headings; epubcheck (0 errors, 0 warnings); the cover brief checks; and the cover checks (</w:t>
+        <w:t xml:space="preserve">REQUIRED: every check passes before approval. The checks are: required files; title, subtitle, and author; description length; seven keywords under 50 characters; two categories from the confirmed pool; language; exact AI disclosure wording; copyright line; placeholder scan; word count within 10 percent of target; chapter headings; epubcheck (0 errors, 0 warnings); the cover brief checks; and style.css and the font licence file; guide_version</w:t>
+      </w:r>
+      <w:r>
+        <w:t xml:space="preserve"> </w:t>
+      </w:r>
+      <w:r>
+        <w:t xml:space="preserve">“</w:t>
+      </w:r>
+      <w:r>
+        <w:t xml:space="preserve">2.1</w:t>
+      </w:r>
+      <w:r>
+        <w:t xml:space="preserve">”</w:t>
+      </w:r>
+      <w:r>
+        <w:t xml:space="preserve">; the cover brief checks; and the cover checks (</w:t>
       </w:r>
       <w:r>
         <w:rPr>
@@ -3207,6 +3284,45 @@
         <w:rPr>
           <w:rStyle w:val="VerbatimChar"/>
         </w:rPr>
+        <w:t xml:space="preserve">style.css</w:t>
+      </w:r>
+      <w:r>
+        <w:t xml:space="preserve">,</w:t>
+      </w:r>
+      <w:r>
+        <w:t xml:space="preserve"> </w:t>
+      </w:r>
+      <w:r>
+        <w:rPr>
+          <w:rStyle w:val="VerbatimChar"/>
+        </w:rPr>
+        <w:t xml:space="preserve">fonts/</w:t>
+      </w:r>
+      <w:r>
+        <w:t xml:space="preserve"> </w:t>
+      </w:r>
+      <w:r>
+        <w:t xml:space="preserve">(with the licence file),</w:t>
+      </w:r>
+      <w:r>
+        <w:t xml:space="preserve"> </w:t>
+      </w:r>
+      <w:r>
+        <w:rPr>
+          <w:rStyle w:val="VerbatimChar"/>
+        </w:rPr>
+        <w:t xml:space="preserve">cover-brief.json</w:t>
+      </w:r>
+      <w:r>
+        <w:t xml:space="preserve">,</w:t>
+      </w:r>
+      <w:r>
+        <w:t xml:space="preserve"> </w:t>
+      </w:r>
+      <w:r>
+        <w:rPr>
+          <w:rStyle w:val="VerbatimChar"/>
+        </w:rPr>
         <w:t xml:space="preserve">cover-ebook.jpg</w:t>
       </w:r>
       <w:r>
@@ -3234,7 +3350,7 @@
         <w:t xml:space="preserve">KDP-FORM-ANSWERS.md</w:t>
       </w:r>
       <w:r>
-        <w:t xml:space="preserve">,</w:t>
+        <w:t xml:space="preserve">, and</w:t>
       </w:r>
       <w:r>
         <w:t xml:space="preserve"> </w:t>
@@ -3246,7 +3362,7 @@
         <w:t xml:space="preserve">review-notes.md</w:t>
       </w:r>
       <w:r>
-        <w:t xml:space="preserve">, and the font license file.</w:t>
+        <w:t xml:space="preserve">.</w:t>
       </w:r>
     </w:p>
     <w:p>
@@ -3264,6 +3380,18 @@
           <w:rStyle w:val="VerbatimChar"/>
         </w:rPr>
         <w:t xml:space="preserve">Ready to publish/&lt;book-slug&gt;/</w:t>
+      </w:r>
+      <w:r>
+        <w:t xml:space="preserve">, including</w:t>
+      </w:r>
+      <w:r>
+        <w:t xml:space="preserve"> </w:t>
+      </w:r>
+      <w:r>
+        <w:rPr>
+          <w:rStyle w:val="VerbatimChar"/>
+        </w:rPr>
+        <w:t xml:space="preserve">fonts/</w:t>
       </w:r>
       <w:r>
         <w:t xml:space="preserve">. It commits with the message</w:t>
@@ -3798,7 +3926,7 @@
         <w:t xml:space="preserve">”</w:t>
       </w:r>
       <w:r>
-        <w:t xml:space="preserve">.</w:t>
+        <w:t xml:space="preserve">. Review fixes: stylesheet and font licence required and checked; Kindle-4 becomes the manual-upload handoff (no KDP sign-in); fixed-layout formats paused until a builder exists; picker honours topic holds; tagline rule clarified.</w:t>
       </w:r>
     </w:p>
     <w:p>

</xml_diff>

<commit_message>
One EPUB build for all books; sync refuses paused formats
- scripts/build_epub.py: same pandoc options for every book, removes older EPUBs
- sync_topics: new rows must be text-only or workbook, reading age 6-9 or none
- guide 2.1: build step and change log updated

Co-Authored-By: Claude Haiku 5.5 <noreply@anthropic.com>
Claude-Session: https://claude.ai/code/session_01MZeVJcyf7XvKRRCE6AUkLk
</commit_message>
<xml_diff>
--- a/ebooks-Raw/guide.docx
+++ b/ebooks-Raw/guide.docx
@@ -1921,7 +1921,19 @@
         <w:t xml:space="preserve">fonts/</w:t>
       </w:r>
       <w:r>
-        <w:t xml:space="preserve">. It includes the cover image, title page, copyright page, and table of contents with working links.</w:t>
+        <w:t xml:space="preserve">. It includes the cover image, title page, copyright page, and table of contents with working links. The EPUB is built only with</w:t>
+      </w:r>
+      <w:r>
+        <w:t xml:space="preserve"> </w:t>
+      </w:r>
+      <w:r>
+        <w:rPr>
+          <w:rStyle w:val="VerbatimChar"/>
+        </w:rPr>
+        <w:t xml:space="preserve">scripts/build_epub.py "&lt;folder&gt;"</w:t>
+      </w:r>
+      <w:r>
+        <w:t xml:space="preserve">, so every book uses the same options and no folder keeps two EPUBs.</w:t>
       </w:r>
     </w:p>
     <w:p>
@@ -3926,7 +3938,7 @@
         <w:t xml:space="preserve">”</w:t>
       </w:r>
       <w:r>
-        <w:t xml:space="preserve">. Review fixes: stylesheet and font licence required and checked; Kindle-4 becomes the manual-upload handoff (no KDP sign-in); fixed-layout formats paused until a builder exists; picker honours topic holds; tagline rule clarified.</w:t>
+        <w:t xml:space="preserve">. Review fixes: stylesheet and font licence required and checked; Kindle-4 becomes the manual-upload handoff (no KDP sign-in); fixed-layout formats paused until a builder exists; picker honours topic holds; tagline rule clarified. Added scripts/build_epub.py (one build for all books) and sync_topics.py refuses fixed-layout formats, early readers and reading ages 4 to 7 on new rows.</w:t>
       </w:r>
     </w:p>
     <w:p>

</xml_diff>

<commit_message>
Kindle-3: category cover styles (cover-styles.json) and brief checks
One style profile per approved pool category, keyed by the exact pool path.
check_cover_brief.py now checks the category, style_profile, palette hues and
badge rule. Guide section 6, cover-prompts.md and the Kindle-3 prompt reference
the profiles. Bakery brief genre set to its pool path.

Co-Authored-By: Claude Haiku 5.5 <noreply@anthropic.com>
Claude-Session: https://claude.ai/code/session_01MZeVJcyf7XvKRRCE6AUkLk
</commit_message>
<xml_diff>
--- a/ebooks-Raw/guide.docx
+++ b/ebooks-Raw/guide.docx
@@ -16,7 +16,13 @@
         <w:pStyle w:val="FirstParagraph"/>
       </w:pPr>
       <w:r>
-        <w:t xml:space="preserve">This guide is the rulebook for the Kindle pipeline. Every robot reads it before starting work. Anything marked</w:t>
+        <w:t xml:space="preserve">This guide is the rulebook for the Kindle pipeline. Every robot reads it</w:t>
+      </w:r>
+      <w:r>
+        <w:t xml:space="preserve"> </w:t>
+      </w:r>
+      <w:r>
+        <w:t xml:space="preserve">before starting work. Anything marked</w:t>
       </w:r>
       <w:r>
         <w:t xml:space="preserve"> </w:t>
@@ -32,7 +38,13 @@
         <w:t xml:space="preserve"> </w:t>
       </w:r>
       <w:r>
-        <w:t xml:space="preserve">must be done. Anything marked</w:t>
+        <w:t xml:space="preserve">must be done.</w:t>
+      </w:r>
+      <w:r>
+        <w:t xml:space="preserve"> </w:t>
+      </w:r>
+      <w:r>
+        <w:t xml:space="preserve">Anything marked</w:t>
       </w:r>
       <w:r>
         <w:t xml:space="preserve"> </w:t>
@@ -48,7 +60,13 @@
         <w:t xml:space="preserve"> </w:t>
       </w:r>
       <w:r>
-        <w:t xml:space="preserve">can be adjusted, but the change must be recorded in the book’s review-notes.md.</w:t>
+        <w:t xml:space="preserve">can be adjusted, but the change must be</w:t>
+      </w:r>
+      <w:r>
+        <w:t xml:space="preserve"> </w:t>
+      </w:r>
+      <w:r>
+        <w:t xml:space="preserve">recorded in the book’s review-notes.md.</w:t>
       </w:r>
     </w:p>
     <w:p>
@@ -78,7 +96,13 @@
         <w:t xml:space="preserve">"guide_version": "2.1"</w:t>
       </w:r>
       <w:r>
-        <w:t xml:space="preserve">. Changes need the owner’s sign-off, and each change is recorded in section 19.</w:t>
+        <w:t xml:space="preserve">. Changes need the owner’s sign-off, and each</w:t>
+      </w:r>
+      <w:r>
+        <w:t xml:space="preserve"> </w:t>
+      </w:r>
+      <w:r>
+        <w:t xml:space="preserve">change is recorded in section 19.</w:t>
       </w:r>
     </w:p>
     <w:bookmarkStart w:id="20" w:name="scope-and-roles"/>
@@ -109,7 +133,13 @@
         <w:t xml:space="preserve"> </w:t>
       </w:r>
       <w:r>
-        <w:t xml:space="preserve">Kindle eBooks for Amazon KDP only. Text-only EPUB, with a fixed-layout EPUB where the format requires it.</w:t>
+        <w:t xml:space="preserve">Kindle eBooks for Amazon KDP only. Text-only EPUB, with a</w:t>
+      </w:r>
+      <w:r>
+        <w:t xml:space="preserve"> </w:t>
+      </w:r>
+      <w:r>
+        <w:t xml:space="preserve">fixed-layout EPUB where the format requires it.</w:t>
       </w:r>
       <w:r>
         <w:t xml:space="preserve"> </w:t>
@@ -119,7 +149,21 @@
           <w:bCs/>
           <w:b/>
         </w:rPr>
-        <w:t xml:space="preserve">Print books are out of scope.</w:t>
+        <w:t xml:space="preserve">Print books are</w:t>
+      </w:r>
+      <w:r>
+        <w:rPr>
+          <w:bCs/>
+          <w:b/>
+        </w:rPr>
+        <w:t xml:space="preserve"> </w:t>
+      </w:r>
+      <w:r>
+        <w:rPr>
+          <w:bCs/>
+          <w:b/>
+        </w:rPr>
+        <w:t xml:space="preserve">out of scope.</w:t>
       </w:r>
       <w:r>
         <w:t xml:space="preserve"> </w:t>
@@ -147,7 +191,13 @@
         <w:t xml:space="preserve"> </w:t>
       </w:r>
       <w:r>
-        <w:t xml:space="preserve">chooses two topics from the approved category pool each day and writes a scored topic entry.</w:t>
+        <w:t xml:space="preserve">chooses two topics from the approved</w:t>
+      </w:r>
+      <w:r>
+        <w:t xml:space="preserve"> </w:t>
+      </w:r>
+      <w:r>
+        <w:t xml:space="preserve">category pool each day and writes a scored topic entry.</w:t>
       </w:r>
     </w:p>
     <w:p>
@@ -169,7 +219,13 @@
         <w:t xml:space="preserve"> </w:t>
       </w:r>
       <w:r>
-        <w:t xml:space="preserve">writes one book from one unused topic and checks it.</w:t>
+        <w:t xml:space="preserve">writes one book from one unused topic and</w:t>
+      </w:r>
+      <w:r>
+        <w:t xml:space="preserve"> </w:t>
+      </w:r>
+      <w:r>
+        <w:t xml:space="preserve">checks it.</w:t>
       </w:r>
     </w:p>
     <w:p>
@@ -191,7 +247,13 @@
         <w:t xml:space="preserve"> </w:t>
       </w:r>
       <w:r>
-        <w:t xml:space="preserve">makes the cover, checks the whole package, and places approved packages in</w:t>
+        <w:t xml:space="preserve">makes the cover, checks the whole</w:t>
+      </w:r>
+      <w:r>
+        <w:t xml:space="preserve"> </w:t>
+      </w:r>
+      <w:r>
+        <w:t xml:space="preserve">package, and places approved packages in</w:t>
       </w:r>
       <w:r>
         <w:t xml:space="preserve"> </w:t>
@@ -228,7 +290,19 @@
         <w:t xml:space="preserve"> </w:t>
       </w:r>
       <w:r>
-        <w:t xml:space="preserve">checks the approved package again and marks it ready for the owner’s manual upload. It does not sign in to KDP and does not prepare a KDP draft.</w:t>
+        <w:t xml:space="preserve">checks the approved package again and</w:t>
+      </w:r>
+      <w:r>
+        <w:t xml:space="preserve"> </w:t>
+      </w:r>
+      <w:r>
+        <w:t xml:space="preserve">marks it ready for the owner’s manual upload. It does not sign in to</w:t>
+      </w:r>
+      <w:r>
+        <w:t xml:space="preserve"> </w:t>
+      </w:r>
+      <w:r>
+        <w:t xml:space="preserve">KDP and does not prepare a KDP draft.</w:t>
       </w:r>
     </w:p>
     <w:p>
@@ -250,7 +324,13 @@
         <w:t xml:space="preserve"> </w:t>
       </w:r>
       <w:r>
-        <w:t xml:space="preserve">confirms category paths, decides on held topics, checks each cover at upload, uploads each book to KDP, and clicks Publish.</w:t>
+        <w:t xml:space="preserve">confirms category paths, decides on held topics, checks</w:t>
+      </w:r>
+      <w:r>
+        <w:t xml:space="preserve"> </w:t>
+      </w:r>
+      <w:r>
+        <w:t xml:space="preserve">each cover at upload, uploads each book to KDP, and clicks Publish.</w:t>
       </w:r>
     </w:p>
     <w:bookmarkEnd w:id="20"/>
@@ -451,7 +531,13 @@
         <w:t xml:space="preserve"> </w:t>
       </w:r>
       <w:r>
-        <w:t xml:space="preserve">(5 to 12 items),</w:t>
+        <w:t xml:space="preserve">(5 to</w:t>
+      </w:r>
+      <w:r>
+        <w:t xml:space="preserve"> </w:t>
+      </w:r>
+      <w:r>
+        <w:t xml:space="preserve">12 items),</w:t>
       </w:r>
       <w:r>
         <w:t xml:space="preserve"> </w:t>
@@ -525,7 +611,13 @@
         <w:pStyle w:val="FirstParagraph"/>
       </w:pPr>
       <w:r>
-        <w:t xml:space="preserve">If any REQUIRED field is missing, the robot stops and logs the run as blocked. It does not guess.</w:t>
+        <w:t xml:space="preserve">If any REQUIRED field is missing, the robot stops and logs the run as</w:t>
+      </w:r>
+      <w:r>
+        <w:t xml:space="preserve"> </w:t>
+      </w:r>
+      <w:r>
+        <w:t xml:space="preserve">blocked. It does not guess.</w:t>
       </w:r>
     </w:p>
     <w:bookmarkEnd w:id="21"/>
@@ -541,15 +633,15 @@
     <w:tbl>
       <w:tblPr>
         <w:tblStyle w:val="Table"/>
-        <w:tblW w:type="pct" w:w="4934"/>
+        <w:tblW w:type="pct" w:w="4867"/>
         <w:tblLook w:firstRow="1" w:lastRow="0" w:firstColumn="0" w:lastColumn="0" w:noHBand="0" w:noVBand="0" w:val="0020"/>
         <w:jc w:val="start"/>
       </w:tblPr>
       <w:tblGrid>
-        <w:gridCol w:w="1823"/>
-        <w:gridCol w:w="2605"/>
-        <w:gridCol w:w="1354"/>
-        <w:gridCol w:w="2032"/>
+        <w:gridCol w:w="1795"/>
+        <w:gridCol w:w="2534"/>
+        <w:gridCol w:w="1372"/>
+        <w:gridCol w:w="2006"/>
       </w:tblGrid>
       <w:tr>
         <w:trPr>
@@ -613,7 +705,13 @@
               <w:jc w:val="left"/>
             </w:pPr>
             <w:r>
-              <w:t xml:space="preserve">Cozy mystery or romance novel</w:t>
+              <w:t xml:space="preserve">Cozy mystery or</w:t>
+            </w:r>
+            <w:r>
+              <w:t xml:space="preserve"> </w:t>
+            </w:r>
+            <w:r>
+              <w:t xml:space="preserve">romance novel</w:t>
             </w:r>
           </w:p>
         </w:tc>
@@ -663,7 +761,19 @@
               <w:jc w:val="left"/>
             </w:pPr>
             <w:r>
-              <w:t xml:space="preserve">Kids’ chapter book (ages 6 to 9)</w:t>
+              <w:t xml:space="preserve">Kids’ chapter</w:t>
+            </w:r>
+            <w:r>
+              <w:t xml:space="preserve"> </w:t>
+            </w:r>
+            <w:r>
+              <w:t xml:space="preserve">book (ages 6 to</w:t>
+            </w:r>
+            <w:r>
+              <w:t xml:space="preserve"> </w:t>
+            </w:r>
+            <w:r>
+              <w:t xml:space="preserve">9)</w:t>
             </w:r>
           </w:p>
         </w:tc>
@@ -713,7 +823,13 @@
               <w:jc w:val="left"/>
             </w:pPr>
             <w:r>
-              <w:t xml:space="preserve">Bedtime story collection</w:t>
+              <w:t xml:space="preserve">Bedtime story</w:t>
+            </w:r>
+            <w:r>
+              <w:t xml:space="preserve"> </w:t>
+            </w:r>
+            <w:r>
+              <w:t xml:space="preserve">collection</w:t>
             </w:r>
           </w:p>
         </w:tc>
@@ -725,7 +841,19 @@
               <w:jc w:val="left"/>
             </w:pPr>
             <w:r>
-              <w:t xml:space="preserve">2,000 to 4,000 words per story; 8 to 12 stories</w:t>
+              <w:t xml:space="preserve">2,000 to 4,000 words</w:t>
+            </w:r>
+            <w:r>
+              <w:t xml:space="preserve"> </w:t>
+            </w:r>
+            <w:r>
+              <w:t xml:space="preserve">per story; 8 to 12</w:t>
+            </w:r>
+            <w:r>
+              <w:t xml:space="preserve"> </w:t>
+            </w:r>
+            <w:r>
+              <w:t xml:space="preserve">stories</w:t>
             </w:r>
           </w:p>
         </w:tc>
@@ -737,7 +865,13 @@
               <w:jc w:val="left"/>
             </w:pPr>
             <w:r>
-              <w:t xml:space="preserve">1 story per chapter</w:t>
+              <w:t xml:space="preserve">1 story per</w:t>
+            </w:r>
+            <w:r>
+              <w:t xml:space="preserve"> </w:t>
+            </w:r>
+            <w:r>
+              <w:t xml:space="preserve">chapter</w:t>
             </w:r>
           </w:p>
         </w:tc>
@@ -763,7 +897,13 @@
               <w:jc w:val="left"/>
             </w:pPr>
             <w:r>
-              <w:t xml:space="preserve">Early reader (ages 4 to 7)</w:t>
+              <w:t xml:space="preserve">Early reader</w:t>
+            </w:r>
+            <w:r>
+              <w:t xml:space="preserve"> </w:t>
+            </w:r>
+            <w:r>
+              <w:t xml:space="preserve">(ages 4 to 7)</w:t>
             </w:r>
           </w:p>
         </w:tc>
@@ -799,7 +939,13 @@
               <w:jc w:val="left"/>
             </w:pPr>
             <w:r>
-              <w:t xml:space="preserve">Fixed-layout EPUB with illustrations</w:t>
+              <w:t xml:space="preserve">Fixed-layout EPUB</w:t>
+            </w:r>
+            <w:r>
+              <w:t xml:space="preserve"> </w:t>
+            </w:r>
+            <w:r>
+              <w:t xml:space="preserve">with illustrations</w:t>
             </w:r>
           </w:p>
         </w:tc>
@@ -813,7 +959,13 @@
               <w:jc w:val="left"/>
             </w:pPr>
             <w:r>
-              <w:t xml:space="preserve">Large-print puzzle book</w:t>
+              <w:t xml:space="preserve">Large-print</w:t>
+            </w:r>
+            <w:r>
+              <w:t xml:space="preserve"> </w:t>
+            </w:r>
+            <w:r>
+              <w:t xml:space="preserve">puzzle book</w:t>
             </w:r>
           </w:p>
         </w:tc>
@@ -837,7 +989,13 @@
               <w:jc w:val="left"/>
             </w:pPr>
             <w:r>
-              <w:t xml:space="preserve">Sections by puzzle type</w:t>
+              <w:t xml:space="preserve">Sections by</w:t>
+            </w:r>
+            <w:r>
+              <w:t xml:space="preserve"> </w:t>
+            </w:r>
+            <w:r>
+              <w:t xml:space="preserve">puzzle type</w:t>
             </w:r>
           </w:p>
         </w:tc>
@@ -863,7 +1021,13 @@
               <w:jc w:val="left"/>
             </w:pPr>
             <w:r>
-              <w:t xml:space="preserve">Practical guide or workbook</w:t>
+              <w:t xml:space="preserve">Practical guide</w:t>
+            </w:r>
+            <w:r>
+              <w:t xml:space="preserve"> </w:t>
+            </w:r>
+            <w:r>
+              <w:t xml:space="preserve">or workbook</w:t>
             </w:r>
           </w:p>
         </w:tc>
@@ -910,7 +1074,19 @@
         <w:pStyle w:val="BodyText"/>
       </w:pPr>
       <w:r>
-        <w:t xml:space="preserve">Until the owner approves a fixed-layout builder, the pipeline produces text-only EPUBs only. Early readers with illustrations and large-print puzzle books are not produced, so Kindle-1 must not choose them.</w:t>
+        <w:t xml:space="preserve">Until the owner approves a fixed-layout builder, the pipeline produces</w:t>
+      </w:r>
+      <w:r>
+        <w:t xml:space="preserve"> </w:t>
+      </w:r>
+      <w:r>
+        <w:t xml:space="preserve">text-only EPUBs only. Early readers with illustrations and large-print</w:t>
+      </w:r>
+      <w:r>
+        <w:t xml:space="preserve"> </w:t>
+      </w:r>
+      <w:r>
+        <w:t xml:space="preserve">puzzle books are not produced, so Kindle-1 must not choose them.</w:t>
       </w:r>
     </w:p>
     <w:p>
@@ -928,7 +1104,19 @@
         <w:t xml:space="preserve"> </w:t>
       </w:r>
       <w:r>
-        <w:t xml:space="preserve">hit the target length within 10 percent. If the draft is short, extend scenes and examples, not filler. If it is long, cut repetition first.</w:t>
+        <w:t xml:space="preserve">hit the target length within 10 percent. If the draft is</w:t>
+      </w:r>
+      <w:r>
+        <w:t xml:space="preserve"> </w:t>
+      </w:r>
+      <w:r>
+        <w:t xml:space="preserve">short, extend scenes and examples, not filler. If it is long, cut</w:t>
+      </w:r>
+      <w:r>
+        <w:t xml:space="preserve"> </w:t>
+      </w:r>
+      <w:r>
+        <w:t xml:space="preserve">repetition first.</w:t>
       </w:r>
     </w:p>
     <w:bookmarkEnd w:id="22"/>
@@ -950,7 +1138,13 @@
         <w:pStyle w:val="Compact"/>
       </w:pPr>
       <w:r>
-        <w:t xml:space="preserve">Write in the tone set by the topic entry. Use one point of view and one tense throughout.</w:t>
+        <w:t xml:space="preserve">Write in the tone set by the topic entry. Use one point of view and</w:t>
+      </w:r>
+      <w:r>
+        <w:t xml:space="preserve"> </w:t>
+      </w:r>
+      <w:r>
+        <w:t xml:space="preserve">one tense throughout.</w:t>
       </w:r>
     </w:p>
     <w:p>
@@ -972,7 +1166,13 @@
         <w:t xml:space="preserve"> </w:t>
       </w:r>
       <w:r>
-        <w:t xml:space="preserve">keep names, places, dates, and facts consistent across the book and the series.</w:t>
+        <w:t xml:space="preserve">keep names, places, dates, and facts consistent across</w:t>
+      </w:r>
+      <w:r>
+        <w:t xml:space="preserve"> </w:t>
+      </w:r>
+      <w:r>
+        <w:t xml:space="preserve">the book and the series.</w:t>
       </w:r>
     </w:p>
     <w:p>
@@ -984,7 +1184,13 @@
         <w:pStyle w:val="Compact"/>
       </w:pPr>
       <w:r>
-        <w:t xml:space="preserve">Open each chapter with a hook and end it with a reason to keep reading.</w:t>
+        <w:t xml:space="preserve">Open each chapter with a hook and end it with a reason to keep</w:t>
+      </w:r>
+      <w:r>
+        <w:t xml:space="preserve"> </w:t>
+      </w:r>
+      <w:r>
+        <w:t xml:space="preserve">reading.</w:t>
       </w:r>
     </w:p>
     <w:p>
@@ -1006,7 +1212,19 @@
         <w:t xml:space="preserve"> </w:t>
       </w:r>
       <w:r>
-        <w:t xml:space="preserve">short sentences, a clear problem and resolution, nothing frightening, a positive ending. The reading level must pass section 13.</w:t>
+        <w:t xml:space="preserve">short sentences, a clear problem and resolution,</w:t>
+      </w:r>
+      <w:r>
+        <w:t xml:space="preserve"> </w:t>
+      </w:r>
+      <w:r>
+        <w:t xml:space="preserve">nothing frightening, a positive ending. The reading level must pass</w:t>
+      </w:r>
+      <w:r>
+        <w:t xml:space="preserve"> </w:t>
+      </w:r>
+      <w:r>
+        <w:t xml:space="preserve">section 13.</w:t>
       </w:r>
     </w:p>
     <w:p>
@@ -1028,7 +1246,19 @@
         <w:t xml:space="preserve"> </w:t>
       </w:r>
       <w:r>
-        <w:t xml:space="preserve">every step, number, and claim is checked against a named, reliable source. List the sources in metadata.json under</w:t>
+        <w:t xml:space="preserve">every step, number, and claim is</w:t>
+      </w:r>
+      <w:r>
+        <w:t xml:space="preserve"> </w:t>
+      </w:r>
+      <w:r>
+        <w:t xml:space="preserve">checked against a named, reliable source. List the sources in</w:t>
+      </w:r>
+      <w:r>
+        <w:t xml:space="preserve"> </w:t>
+      </w:r>
+      <w:r>
+        <w:t xml:space="preserve">metadata.json under</w:t>
       </w:r>
       <w:r>
         <w:t xml:space="preserve"> </w:t>
@@ -1040,7 +1270,13 @@
         <w:t xml:space="preserve">sources</w:t>
       </w:r>
       <w:r>
-        <w:t xml:space="preserve">. No medical, financial, or legal advice.</w:t>
+        <w:t xml:space="preserve">. No medical, financial, or legal</w:t>
+      </w:r>
+      <w:r>
+        <w:t xml:space="preserve"> </w:t>
+      </w:r>
+      <w:r>
+        <w:t xml:space="preserve">advice.</w:t>
       </w:r>
     </w:p>
     <w:p>
@@ -1052,7 +1288,13 @@
         <w:pStyle w:val="Compact"/>
       </w:pPr>
       <w:r>
-        <w:t xml:space="preserve">Never copy text from other books, articles, or websites. Do not name trademarked characters, brands, or real living people.</w:t>
+        <w:t xml:space="preserve">Never copy text from other books, articles, or websites. Do not name</w:t>
+      </w:r>
+      <w:r>
+        <w:t xml:space="preserve"> </w:t>
+      </w:r>
+      <w:r>
+        <w:t xml:space="preserve">trademarked characters, brands, or real living people.</w:t>
       </w:r>
     </w:p>
     <w:p>
@@ -1074,7 +1316,13 @@
         <w:t xml:space="preserve"> </w:t>
       </w:r>
       <w:r>
-        <w:t xml:space="preserve">the manuscript has no placeholder text, notes to self, or bracketed instructions.</w:t>
+        <w:t xml:space="preserve">the manuscript has no placeholder text, notes to self,</w:t>
+      </w:r>
+      <w:r>
+        <w:t xml:space="preserve"> </w:t>
+      </w:r>
+      <w:r>
+        <w:t xml:space="preserve">or bracketed instructions.</w:t>
       </w:r>
     </w:p>
     <w:bookmarkEnd w:id="23"/>
@@ -1090,13 +1338,13 @@
     <w:tbl>
       <w:tblPr>
         <w:tblStyle w:val="Table"/>
-        <w:tblW w:type="pct" w:w="4940"/>
+        <w:tblW w:type="pct" w:w="4868"/>
         <w:tblLook w:firstRow="1" w:lastRow="0" w:firstColumn="0" w:lastColumn="0" w:noHBand="0" w:noVBand="0" w:val="0020"/>
         <w:jc w:val="start"/>
       </w:tblPr>
       <w:tblGrid>
-        <w:gridCol w:w="1192"/>
-        <w:gridCol w:w="6631"/>
+        <w:gridCol w:w="1354"/>
+        <w:gridCol w:w="6356"/>
       </w:tblGrid>
       <w:tr>
         <w:trPr>
@@ -1136,7 +1384,13 @@
               <w:jc w:val="left"/>
             </w:pPr>
             <w:r>
-              <w:t xml:space="preserve">Body font, adult books</w:t>
+              <w:t xml:space="preserve">Body font,</w:t>
+            </w:r>
+            <w:r>
+              <w:t xml:space="preserve"> </w:t>
+            </w:r>
+            <w:r>
+              <w:t xml:space="preserve">adult books</w:t>
             </w:r>
           </w:p>
         </w:tc>
@@ -1148,7 +1402,13 @@
               <w:jc w:val="left"/>
             </w:pPr>
             <w:r>
-              <w:t xml:space="preserve">Garamond (EB Garamond) or Georgia. Use relative sizing; the reader sets the size.</w:t>
+              <w:t xml:space="preserve">Garamond (EB Garamond) or Georgia. Use relative sizing; the</w:t>
+            </w:r>
+            <w:r>
+              <w:t xml:space="preserve"> </w:t>
+            </w:r>
+            <w:r>
+              <w:t xml:space="preserve">reader sets the size.</w:t>
             </w:r>
           </w:p>
         </w:tc>
@@ -1162,7 +1422,13 @@
               <w:jc w:val="left"/>
             </w:pPr>
             <w:r>
-              <w:t xml:space="preserve">Body font, kids’ books</w:t>
+              <w:t xml:space="preserve">Body font,</w:t>
+            </w:r>
+            <w:r>
+              <w:t xml:space="preserve"> </w:t>
+            </w:r>
+            <w:r>
+              <w:t xml:space="preserve">kids’ books</w:t>
             </w:r>
           </w:p>
         </w:tc>
@@ -1174,7 +1440,13 @@
               <w:jc w:val="left"/>
             </w:pPr>
             <w:r>
-              <w:t xml:space="preserve">A clear sans-serif, such as Nunito or Open Sans. Line spacing 1.5.</w:t>
+              <w:t xml:space="preserve">A clear sans-serif, such as Nunito or Open Sans. Line</w:t>
+            </w:r>
+            <w:r>
+              <w:t xml:space="preserve"> </w:t>
+            </w:r>
+            <w:r>
+              <w:t xml:space="preserve">spacing 1.5.</w:t>
             </w:r>
           </w:p>
         </w:tc>
@@ -1200,7 +1472,13 @@
               <w:jc w:val="left"/>
             </w:pPr>
             <w:r>
-              <w:t xml:space="preserve">One font family, bold. Never more than two font families in one book.</w:t>
+              <w:t xml:space="preserve">One font family, bold. Never more than two font families in</w:t>
+            </w:r>
+            <w:r>
+              <w:t xml:space="preserve"> </w:t>
+            </w:r>
+            <w:r>
+              <w:t xml:space="preserve">one book.</w:t>
             </w:r>
           </w:p>
         </w:tc>
@@ -1252,7 +1530,13 @@
               <w:jc w:val="left"/>
             </w:pPr>
             <w:r>
-              <w:t xml:space="preserve">First-line indent in novels. A blank line between paragraphs in kids’ books and guides.</w:t>
+              <w:t xml:space="preserve">First-line indent in novels. A blank line between paragraphs</w:t>
+            </w:r>
+            <w:r>
+              <w:t xml:space="preserve"> </w:t>
+            </w:r>
+            <w:r>
+              <w:t xml:space="preserve">in kids’ books and guides.</w:t>
             </w:r>
           </w:p>
         </w:tc>
@@ -1266,7 +1550,13 @@
               <w:jc w:val="left"/>
             </w:pPr>
             <w:r>
-              <w:t xml:space="preserve">Font licensing</w:t>
+              <w:t xml:space="preserve">Font</w:t>
+            </w:r>
+            <w:r>
+              <w:t xml:space="preserve"> </w:t>
+            </w:r>
+            <w:r>
+              <w:t xml:space="preserve">licensing</w:t>
             </w:r>
           </w:p>
         </w:tc>
@@ -1288,7 +1578,19 @@
               <w:t xml:space="preserve"> </w:t>
             </w:r>
             <w:r>
-              <w:t xml:space="preserve">only fonts licensed for commercial embedding, such as the SIL Open Font License. Save the license file in the book folder.</w:t>
+              <w:t xml:space="preserve">only fonts licensed for commercial embedding,</w:t>
+            </w:r>
+            <w:r>
+              <w:t xml:space="preserve"> </w:t>
+            </w:r>
+            <w:r>
+              <w:t xml:space="preserve">such as the SIL Open Font License. Save the license file in</w:t>
+            </w:r>
+            <w:r>
+              <w:t xml:space="preserve"> </w:t>
+            </w:r>
+            <w:r>
+              <w:t xml:space="preserve">the book folder.</w:t>
             </w:r>
           </w:p>
         </w:tc>
@@ -1323,7 +1625,13 @@
         <w:t xml:space="preserve"> </w:t>
       </w:r>
       <w:r>
-        <w:t xml:space="preserve">1600 pixels wide by 2560 pixels tall, RGB JPEG, saved as</w:t>
+        <w:t xml:space="preserve">1600 pixels wide by 2560 pixels tall, RGB JPEG, saved</w:t>
+      </w:r>
+      <w:r>
+        <w:t xml:space="preserve"> </w:t>
+      </w:r>
+      <w:r>
+        <w:t xml:space="preserve">as</w:t>
       </w:r>
       <w:r>
         <w:t xml:space="preserve"> </w:t>
@@ -1335,7 +1643,13 @@
         <w:t xml:space="preserve">cover-ebook.jpg</w:t>
       </w:r>
       <w:r>
-        <w:t xml:space="preserve">. At least 1000 pixels tall for the Amazon thumbnail.</w:t>
+        <w:t xml:space="preserve">. At least 1000 pixels tall for the Amazon</w:t>
+      </w:r>
+      <w:r>
+        <w:t xml:space="preserve"> </w:t>
+      </w:r>
+      <w:r>
+        <w:t xml:space="preserve">thumbnail.</w:t>
       </w:r>
     </w:p>
     <w:p>
@@ -1357,7 +1671,13 @@
         <w:t xml:space="preserve"> </w:t>
       </w:r>
       <w:r>
-        <w:t xml:space="preserve">Kindle-3 saves</w:t>
+        <w:t xml:space="preserve">Kindle-3</w:t>
+      </w:r>
+      <w:r>
+        <w:t xml:space="preserve"> </w:t>
+      </w:r>
+      <w:r>
+        <w:t xml:space="preserve">saves</w:t>
       </w:r>
       <w:r>
         <w:t xml:space="preserve"> </w:t>
@@ -1489,7 +1809,13 @@
         <w:t xml:space="preserve"> </w:t>
       </w:r>
       <w:r>
-        <w:t xml:space="preserve">for adult books),</w:t>
+        <w:t xml:space="preserve">for</w:t>
+      </w:r>
+      <w:r>
+        <w:t xml:space="preserve"> </w:t>
+      </w:r>
+      <w:r>
+        <w:t xml:space="preserve">adult books),</w:t>
       </w:r>
       <w:r>
         <w:t xml:space="preserve"> </w:t>
@@ -1501,6 +1827,36 @@
         <w:t xml:space="preserve">genre</w:t>
       </w:r>
       <w:r>
+        <w:t xml:space="preserve"> </w:t>
+      </w:r>
+      <w:r>
+        <w:t xml:space="preserve">(the exact pool path of the book’s first category),</w:t>
+      </w:r>
+      <w:r>
+        <w:t xml:space="preserve"> </w:t>
+      </w:r>
+      <w:r>
+        <w:rPr>
+          <w:rStyle w:val="VerbatimChar"/>
+        </w:rPr>
+        <w:t xml:space="preserve">style_profile</w:t>
+      </w:r>
+      <w:r>
+        <w:t xml:space="preserve"> </w:t>
+      </w:r>
+      <w:r>
+        <w:t xml:space="preserve">(the same path),</w:t>
+      </w:r>
+      <w:r>
+        <w:t xml:space="preserve"> </w:t>
+      </w:r>
+      <w:r>
+        <w:rPr>
+          <w:rStyle w:val="VerbatimChar"/>
+        </w:rPr>
+        <w:t xml:space="preserve">age_or_reader</w:t>
+      </w:r>
+      <w:r>
         <w:t xml:space="preserve">,</w:t>
       </w:r>
       <w:r>
@@ -1510,7 +1866,7 @@
         <w:rPr>
           <w:rStyle w:val="VerbatimChar"/>
         </w:rPr>
-        <w:t xml:space="preserve">age_or_reader</w:t>
+        <w:t xml:space="preserve">style</w:t>
       </w:r>
       <w:r>
         <w:t xml:space="preserve">,</w:t>
@@ -1522,7 +1878,28 @@
         <w:rPr>
           <w:rStyle w:val="VerbatimChar"/>
         </w:rPr>
-        <w:t xml:space="preserve">style</w:t>
+        <w:t xml:space="preserve">palette</w:t>
+      </w:r>
+      <w:r>
+        <w:t xml:space="preserve"> </w:t>
+      </w:r>
+      <w:r>
+        <w:t xml:space="preserve">(three or</w:t>
+      </w:r>
+      <w:r>
+        <w:t xml:space="preserve"> </w:t>
+      </w:r>
+      <w:r>
+        <w:t xml:space="preserve">four colours as hex codes),</w:t>
+      </w:r>
+      <w:r>
+        <w:t xml:space="preserve"> </w:t>
+      </w:r>
+      <w:r>
+        <w:rPr>
+          <w:rStyle w:val="VerbatimChar"/>
+        </w:rPr>
+        <w:t xml:space="preserve">focal_scene</w:t>
       </w:r>
       <w:r>
         <w:t xml:space="preserve">,</w:t>
@@ -1534,33 +1911,6 @@
         <w:rPr>
           <w:rStyle w:val="VerbatimChar"/>
         </w:rPr>
-        <w:t xml:space="preserve">palette</w:t>
-      </w:r>
-      <w:r>
-        <w:t xml:space="preserve"> </w:t>
-      </w:r>
-      <w:r>
-        <w:t xml:space="preserve">(three or four colours as hex codes),</w:t>
-      </w:r>
-      <w:r>
-        <w:t xml:space="preserve"> </w:t>
-      </w:r>
-      <w:r>
-        <w:rPr>
-          <w:rStyle w:val="VerbatimChar"/>
-        </w:rPr>
-        <w:t xml:space="preserve">focal_scene</w:t>
-      </w:r>
-      <w:r>
-        <w:t xml:space="preserve">,</w:t>
-      </w:r>
-      <w:r>
-        <w:t xml:space="preserve"> </w:t>
-      </w:r>
-      <w:r>
-        <w:rPr>
-          <w:rStyle w:val="VerbatimChar"/>
-        </w:rPr>
         <w:t xml:space="preserve">character</w:t>
       </w:r>
       <w:r>
@@ -1621,7 +1971,13 @@
         <w:t xml:space="preserve"> </w:t>
       </w:r>
       <w:r>
-        <w:t xml:space="preserve">must pass. The brief must not copy another book’s genre and palette.</w:t>
+        <w:t xml:space="preserve">must pass. The brief must not copy</w:t>
+      </w:r>
+      <w:r>
+        <w:t xml:space="preserve"> </w:t>
+      </w:r>
+      <w:r>
+        <w:t xml:space="preserve">another book’s genre and palette.</w:t>
       </w:r>
     </w:p>
     <w:p>
@@ -1652,7 +2008,31 @@
         <w:t xml:space="preserve"> </w:t>
       </w:r>
       <w:r>
-        <w:t xml:space="preserve">checks that at least 20 percent of the cover’s pixels are close to the brief’s colours; that the title is readable by OCR at full size and at thumbnail size (about 160 by 256 pixels); and that the title letters are large (at least 3.5 percent of the cover height).</w:t>
+        <w:t xml:space="preserve">checks that at</w:t>
+      </w:r>
+      <w:r>
+        <w:t xml:space="preserve"> </w:t>
+      </w:r>
+      <w:r>
+        <w:t xml:space="preserve">least 20 percent of the cover’s pixels are close to the brief’s</w:t>
+      </w:r>
+      <w:r>
+        <w:t xml:space="preserve"> </w:t>
+      </w:r>
+      <w:r>
+        <w:t xml:space="preserve">colours; that the title is readable by OCR at full size and at</w:t>
+      </w:r>
+      <w:r>
+        <w:t xml:space="preserve"> </w:t>
+      </w:r>
+      <w:r>
+        <w:t xml:space="preserve">thumbnail size (about 160 by 256 pixels); and that the title letters</w:t>
+      </w:r>
+      <w:r>
+        <w:t xml:space="preserve"> </w:t>
+      </w:r>
+      <w:r>
+        <w:t xml:space="preserve">are large (at least 3.5 percent of the cover height).</w:t>
       </w:r>
     </w:p>
     <w:p>
@@ -1674,7 +2054,37 @@
         <w:t xml:space="preserve"> </w:t>
       </w:r>
       <w:r>
-        <w:t xml:space="preserve">The title lines on the cover equal the title in metadata.json. The subtitle in metadata.json appears on the cover. The tagline is a short hook and must not contradict the title or subtitle. If the cover shows a different subtitle line from metadata.json, the book is blocked until the owner decides which one KDP uses.</w:t>
+        <w:t xml:space="preserve">The title lines on the cover equal</w:t>
+      </w:r>
+      <w:r>
+        <w:t xml:space="preserve"> </w:t>
+      </w:r>
+      <w:r>
+        <w:t xml:space="preserve">the title in metadata.json. The subtitle in metadata.json appears on</w:t>
+      </w:r>
+      <w:r>
+        <w:t xml:space="preserve"> </w:t>
+      </w:r>
+      <w:r>
+        <w:t xml:space="preserve">the cover. The tagline is a short hook and must not contradict the</w:t>
+      </w:r>
+      <w:r>
+        <w:t xml:space="preserve"> </w:t>
+      </w:r>
+      <w:r>
+        <w:t xml:space="preserve">title or subtitle. If the cover shows a different subtitle line from</w:t>
+      </w:r>
+      <w:r>
+        <w:t xml:space="preserve"> </w:t>
+      </w:r>
+      <w:r>
+        <w:t xml:space="preserve">metadata.json, the book is blocked until the owner decides which one</w:t>
+      </w:r>
+      <w:r>
+        <w:t xml:space="preserve"> </w:t>
+      </w:r>
+      <w:r>
+        <w:t xml:space="preserve">KDP uses.</w:t>
       </w:r>
     </w:p>
     <w:p>
@@ -1696,7 +2106,25 @@
         <w:t xml:space="preserve"> </w:t>
       </w:r>
       <w:r>
-        <w:t xml:space="preserve">OCR cannot read every decorative font. The author name, badge, series line, and tagline must be confirmed by Kindle-3 viewing the finished cover. Kindle-3 records each one, and the result of the look-over, in review-notes.md.</w:t>
+        <w:t xml:space="preserve">OCR cannot read every decorative</w:t>
+      </w:r>
+      <w:r>
+        <w:t xml:space="preserve"> </w:t>
+      </w:r>
+      <w:r>
+        <w:t xml:space="preserve">font. The author name, badge, series line, and tagline must be</w:t>
+      </w:r>
+      <w:r>
+        <w:t xml:space="preserve"> </w:t>
+      </w:r>
+      <w:r>
+        <w:t xml:space="preserve">confirmed by Kindle-3 viewing the finished cover. Kindle-3 records</w:t>
+      </w:r>
+      <w:r>
+        <w:t xml:space="preserve"> </w:t>
+      </w:r>
+      <w:r>
+        <w:t xml:space="preserve">each one, and the result of the look-over, in review-notes.md.</w:t>
       </w:r>
     </w:p>
     <w:p>
@@ -1712,13 +2140,169 @@
           <w:bCs/>
           <w:b/>
         </w:rPr>
-        <w:t xml:space="preserve">REQUIRED: the genre look.</w:t>
-      </w:r>
-      <w:r>
-        <w:t xml:space="preserve"> </w:t>
-      </w:r>
-      <w:r>
-        <w:t xml:space="preserve">Romance and cozy mysteries use warm tones, a clear central image, and a serif or script title. Kids’ covers use bright colours, one friendly character, and a rounded sans-serif title. Early readers show the reading level. Puzzle covers use a bold colour block and large type naming the puzzle type. Non-fiction uses a clean layout, one bold image, and a plain, large title.</w:t>
+        <w:t xml:space="preserve">REQUIRED: the category style.</w:t>
+      </w:r>
+      <w:r>
+        <w:t xml:space="preserve"> </w:t>
+      </w:r>
+      <w:r>
+        <w:t xml:space="preserve">Each approved category has a style</w:t>
+      </w:r>
+      <w:r>
+        <w:t xml:space="preserve"> </w:t>
+      </w:r>
+      <w:r>
+        <w:t xml:space="preserve">profile in</w:t>
+      </w:r>
+      <w:r>
+        <w:t xml:space="preserve"> </w:t>
+      </w:r>
+      <w:r>
+        <w:rPr>
+          <w:rStyle w:val="VerbatimChar"/>
+        </w:rPr>
+        <w:t xml:space="preserve">ebooks-Raw/cover-styles.json</w:t>
+      </w:r>
+      <w:r>
+        <w:t xml:space="preserve">, keyed by the exact pool</w:t>
+      </w:r>
+      <w:r>
+        <w:t xml:space="preserve"> </w:t>
+      </w:r>
+      <w:r>
+        <w:t xml:space="preserve">path. Kindle-3 reads the profile for the book’s first category before</w:t>
+      </w:r>
+      <w:r>
+        <w:t xml:space="preserve"> </w:t>
+      </w:r>
+      <w:r>
+        <w:t xml:space="preserve">writing the brief, and uses its reader, look, title style, and</w:t>
+      </w:r>
+      <w:r>
+        <w:t xml:space="preserve"> </w:t>
+      </w:r>
+      <w:r>
+        <w:t xml:space="preserve">imagery.</w:t>
+      </w:r>
+      <w:r>
+        <w:t xml:space="preserve"> </w:t>
+      </w:r>
+      <w:r>
+        <w:rPr>
+          <w:rStyle w:val="VerbatimChar"/>
+        </w:rPr>
+        <w:t xml:space="preserve">scripts/check_cover_brief.py</w:t>
+      </w:r>
+      <w:r>
+        <w:t xml:space="preserve"> </w:t>
+      </w:r>
+      <w:r>
+        <w:t xml:space="preserve">checks that</w:t>
+      </w:r>
+      <w:r>
+        <w:t xml:space="preserve"> </w:t>
+      </w:r>
+      <w:r>
+        <w:rPr>
+          <w:rStyle w:val="VerbatimChar"/>
+        </w:rPr>
+        <w:t xml:space="preserve">genre</w:t>
+      </w:r>
+      <w:r>
+        <w:t xml:space="preserve"> </w:t>
+      </w:r>
+      <w:r>
+        <w:t xml:space="preserve">is an</w:t>
+      </w:r>
+      <w:r>
+        <w:t xml:space="preserve"> </w:t>
+      </w:r>
+      <w:r>
+        <w:t xml:space="preserve">approved pool path, that</w:t>
+      </w:r>
+      <w:r>
+        <w:t xml:space="preserve"> </w:t>
+      </w:r>
+      <w:r>
+        <w:rPr>
+          <w:rStyle w:val="VerbatimChar"/>
+        </w:rPr>
+        <w:t xml:space="preserve">style_profile</w:t>
+      </w:r>
+      <w:r>
+        <w:t xml:space="preserve"> </w:t>
+      </w:r>
+      <w:r>
+        <w:t xml:space="preserve">equals it, that at least two</w:t>
+      </w:r>
+      <w:r>
+        <w:t xml:space="preserve"> </w:t>
+      </w:r>
+      <w:r>
+        <w:t xml:space="preserve">palette colours fall in the profile’s hue ranges (or are near-neutral),</w:t>
+      </w:r>
+      <w:r>
+        <w:t xml:space="preserve"> </w:t>
+      </w:r>
+      <w:r>
+        <w:t xml:space="preserve">and that the badge follows the profile’s rule:</w:t>
+      </w:r>
+      <w:r>
+        <w:t xml:space="preserve"> </w:t>
+      </w:r>
+      <w:r>
+        <w:t xml:space="preserve">“</w:t>
+      </w:r>
+      <w:r>
+        <w:t xml:space="preserve">none</w:t>
+      </w:r>
+      <w:r>
+        <w:t xml:space="preserve">”</w:t>
+      </w:r>
+      <w:r>
+        <w:t xml:space="preserve"> </w:t>
+      </w:r>
+      <w:r>
+        <w:t xml:space="preserve">(no badge),</w:t>
+      </w:r>
+      <w:r>
+        <w:t xml:space="preserve"> </w:t>
+      </w:r>
+      <w:r>
+        <w:t xml:space="preserve">“</w:t>
+      </w:r>
+      <w:r>
+        <w:t xml:space="preserve">optional</w:t>
+      </w:r>
+      <w:r>
+        <w:t xml:space="preserve">”</w:t>
+      </w:r>
+      <w:r>
+        <w:t xml:space="preserve">, or</w:t>
+      </w:r>
+      <w:r>
+        <w:t xml:space="preserve"> </w:t>
+      </w:r>
+      <w:r>
+        <w:t xml:space="preserve">“</w:t>
+      </w:r>
+      <w:r>
+        <w:t xml:space="preserve">required</w:t>
+      </w:r>
+      <w:r>
+        <w:t xml:space="preserve">”</w:t>
+      </w:r>
+      <w:r>
+        <w:t xml:space="preserve"> </w:t>
+      </w:r>
+      <w:r>
+        <w:t xml:space="preserve">(a badge text). Kindle-3 checks the cover</w:t>
+      </w:r>
+      <w:r>
+        <w:t xml:space="preserve"> </w:t>
+      </w:r>
+      <w:r>
+        <w:t xml:space="preserve">against the profile’s avoid list in the visual review.</w:t>
       </w:r>
     </w:p>
     <w:p>
@@ -1730,7 +2314,13 @@
         <w:pStyle w:val="Compact"/>
       </w:pPr>
       <w:r>
-        <w:t xml:space="preserve">One focal point. No more than three colours in the title block. No small text except the author name.</w:t>
+        <w:t xml:space="preserve">One focal point. No more than three colours in the title block. No</w:t>
+      </w:r>
+      <w:r>
+        <w:t xml:space="preserve"> </w:t>
+      </w:r>
+      <w:r>
+        <w:t xml:space="preserve">small text except the author name.</w:t>
       </w:r>
     </w:p>
     <w:p>
@@ -1767,7 +2357,19 @@
         <w:pStyle w:val="Compact"/>
       </w:pPr>
       <w:r>
-        <w:t xml:space="preserve">Images must be original, generated with an approved tool, or licensed stock with a saved license record. Never use copyrighted characters or celebrity likenesses.</w:t>
+        <w:t xml:space="preserve">Images must be original, generated with an approved tool, or</w:t>
+      </w:r>
+      <w:r>
+        <w:t xml:space="preserve"> </w:t>
+      </w:r>
+      <w:r>
+        <w:t xml:space="preserve">licensed stock with a saved license record. Never use copyrighted</w:t>
+      </w:r>
+      <w:r>
+        <w:t xml:space="preserve"> </w:t>
+      </w:r>
+      <w:r>
+        <w:t xml:space="preserve">characters or celebrity likenesses.</w:t>
       </w:r>
     </w:p>
     <w:p>
@@ -1789,7 +2391,19 @@
         <w:t xml:space="preserve"> </w:t>
       </w:r>
       <w:r>
-        <w:t xml:space="preserve">one cover per book, made by Kindle-3 in Canva from its brief. If the first design fails a check, Kindle-3 may make one new design from the same brief. A second failure makes the book blocked.</w:t>
+        <w:t xml:space="preserve">one cover per book, made by Kindle-3 in Canva from its</w:t>
+      </w:r>
+      <w:r>
+        <w:t xml:space="preserve"> </w:t>
+      </w:r>
+      <w:r>
+        <w:t xml:space="preserve">brief. If the first design fails a check, Kindle-3 may make one new</w:t>
+      </w:r>
+      <w:r>
+        <w:t xml:space="preserve"> </w:t>
+      </w:r>
+      <w:r>
+        <w:t xml:space="preserve">design from the same brief. A second failure makes the book blocked.</w:t>
       </w:r>
     </w:p>
     <w:p>
@@ -1811,7 +2425,19 @@
         <w:t xml:space="preserve"> </w:t>
       </w:r>
       <w:r>
-        <w:t xml:space="preserve">the owner checks each cover visually at upload time, before the KDP upload. This replaces an approval step in the pipeline.</w:t>
+        <w:t xml:space="preserve">the owner checks each cover visually at upload time,</w:t>
+      </w:r>
+      <w:r>
+        <w:t xml:space="preserve"> </w:t>
+      </w:r>
+      <w:r>
+        <w:t xml:space="preserve">before the KDP upload. This replaces an approval step in the</w:t>
+      </w:r>
+      <w:r>
+        <w:t xml:space="preserve"> </w:t>
+      </w:r>
+      <w:r>
+        <w:t xml:space="preserve">pipeline.</w:t>
       </w:r>
     </w:p>
     <w:bookmarkEnd w:id="25"/>
@@ -1858,7 +2484,13 @@
         <w:t xml:space="preserve"> </w:t>
       </w:r>
       <w:r>
-        <w:t xml:space="preserve">(typography from section 5) and a</w:t>
+        <w:t xml:space="preserve">(typography from section 5)</w:t>
+      </w:r>
+      <w:r>
+        <w:t xml:space="preserve"> </w:t>
+      </w:r>
+      <w:r>
+        <w:t xml:space="preserve">and a</w:t>
       </w:r>
       <w:r>
         <w:t xml:space="preserve"> </w:t>
@@ -1873,7 +2505,13 @@
         <w:t xml:space="preserve"> </w:t>
       </w:r>
       <w:r>
-        <w:t xml:space="preserve">folder with the font files and their licence file. The EPUB is built with pandoc from</w:t>
+        <w:t xml:space="preserve">folder with the font files and their licence file.</w:t>
+      </w:r>
+      <w:r>
+        <w:t xml:space="preserve"> </w:t>
+      </w:r>
+      <w:r>
+        <w:t xml:space="preserve">The EPUB is built with pandoc from</w:t>
       </w:r>
       <w:r>
         <w:t xml:space="preserve"> </w:t>
@@ -1921,7 +2559,19 @@
         <w:t xml:space="preserve">fonts/</w:t>
       </w:r>
       <w:r>
-        <w:t xml:space="preserve">. It includes the cover image, title page, copyright page, and table of contents with working links. The EPUB is built only with</w:t>
+        <w:t xml:space="preserve">. It includes the cover image, title page,</w:t>
+      </w:r>
+      <w:r>
+        <w:t xml:space="preserve"> </w:t>
+      </w:r>
+      <w:r>
+        <w:t xml:space="preserve">copyright page, and table of contents with working links. The EPUB</w:t>
+      </w:r>
+      <w:r>
+        <w:t xml:space="preserve"> </w:t>
+      </w:r>
+      <w:r>
+        <w:t xml:space="preserve">is built only with</w:t>
       </w:r>
       <w:r>
         <w:t xml:space="preserve"> </w:t>
@@ -1933,7 +2583,13 @@
         <w:t xml:space="preserve">scripts/build_epub.py "&lt;folder&gt;"</w:t>
       </w:r>
       <w:r>
-        <w:t xml:space="preserve">, so every book uses the same options and no folder keeps two EPUBs.</w:t>
+        <w:t xml:space="preserve">, so every book</w:t>
+      </w:r>
+      <w:r>
+        <w:t xml:space="preserve"> </w:t>
+      </w:r>
+      <w:r>
+        <w:t xml:space="preserve">uses the same options and no folder keeps two EPUBs.</w:t>
       </w:r>
     </w:p>
     <w:p>
@@ -1976,7 +2632,19 @@
         <w:pStyle w:val="Compact"/>
       </w:pPr>
       <w:r>
-        <w:t xml:space="preserve">Owner check before upload: open the EPUB in Kindle Previewer and read the first and last chapters. The phone-sized preview from v1 is replaced by this.</w:t>
+        <w:t xml:space="preserve">Owner check before upload: open the EPUB in Kindle Previewer and</w:t>
+      </w:r>
+      <w:r>
+        <w:t xml:space="preserve"> </w:t>
+      </w:r>
+      <w:r>
+        <w:t xml:space="preserve">read the first and last chapters. The phone-sized preview from v1 is</w:t>
+      </w:r>
+      <w:r>
+        <w:t xml:space="preserve"> </w:t>
+      </w:r>
+      <w:r>
+        <w:t xml:space="preserve">replaced by this.</w:t>
       </w:r>
     </w:p>
     <w:p>
@@ -2015,7 +2683,13 @@
         <w:t xml:space="preserve">manuscript.docx</w:t>
       </w:r>
       <w:r>
-        <w:t xml:space="preserve">, with real heading styles for chapters.</w:t>
+        <w:t xml:space="preserve">, with real</w:t>
+      </w:r>
+      <w:r>
+        <w:t xml:space="preserve"> </w:t>
+      </w:r>
+      <w:r>
+        <w:t xml:space="preserve">heading styles for chapters.</w:t>
       </w:r>
     </w:p>
     <w:bookmarkEnd w:id="26"/>
@@ -2084,7 +2758,13 @@
         <w:t xml:space="preserve">“</w:t>
       </w:r>
       <w:r>
-        <w:t xml:space="preserve">Copyright © 2026 Skybee. All rights reserved.</w:t>
+        <w:t xml:space="preserve">Copyright © 2026 Skybee. All rights</w:t>
+      </w:r>
+      <w:r>
+        <w:t xml:space="preserve"> </w:t>
+      </w:r>
+      <w:r>
+        <w:t xml:space="preserve">reserved.</w:t>
       </w:r>
       <w:r>
         <w:t xml:space="preserve">”</w:t>
@@ -2118,7 +2798,19 @@
         <w:t xml:space="preserve">“</w:t>
       </w:r>
       <w:r>
-        <w:t xml:space="preserve">This book was created with the assistance of artificial intelligence tools. All content was reviewed and edited by the publisher.</w:t>
+        <w:t xml:space="preserve">This book was created</w:t>
+      </w:r>
+      <w:r>
+        <w:t xml:space="preserve"> </w:t>
+      </w:r>
+      <w:r>
+        <w:t xml:space="preserve">with the assistance of artificial intelligence tools. All content</w:t>
+      </w:r>
+      <w:r>
+        <w:t xml:space="preserve"> </w:t>
+      </w:r>
+      <w:r>
+        <w:t xml:space="preserve">was reviewed and edited by the publisher.</w:t>
       </w:r>
       <w:r>
         <w:t xml:space="preserve">”</w:t>
@@ -2143,7 +2835,13 @@
         <w:t xml:space="preserve"> </w:t>
       </w:r>
       <w:r>
-        <w:t xml:space="preserve">every practical guide and workbook, including workbooks, carries:</w:t>
+        <w:t xml:space="preserve">every practical guide and</w:t>
+      </w:r>
+      <w:r>
+        <w:t xml:space="preserve"> </w:t>
+      </w:r>
+      <w:r>
+        <w:t xml:space="preserve">workbook, including workbooks, carries:</w:t>
       </w:r>
       <w:r>
         <w:t xml:space="preserve"> </w:t>
@@ -2152,7 +2850,13 @@
         <w:t xml:space="preserve">“</w:t>
       </w:r>
       <w:r>
-        <w:t xml:space="preserve">This book is for general information only and is not medical, financial, or legal advice.</w:t>
+        <w:t xml:space="preserve">This book is for general</w:t>
+      </w:r>
+      <w:r>
+        <w:t xml:space="preserve"> </w:t>
+      </w:r>
+      <w:r>
+        <w:t xml:space="preserve">information only and is not medical, financial, or legal advice.</w:t>
       </w:r>
       <w:r>
         <w:t xml:space="preserve">”</w:t>
@@ -2180,7 +2884,19 @@
         <w:t xml:space="preserve">“</w:t>
       </w:r>
       <w:r>
-        <w:t xml:space="preserve">This is a work of fiction. Names, characters, places, and events are fictional. Any resemblance to real persons is coincidental.</w:t>
+        <w:t xml:space="preserve">This is a work of fiction.</w:t>
+      </w:r>
+      <w:r>
+        <w:t xml:space="preserve"> </w:t>
+      </w:r>
+      <w:r>
+        <w:t xml:space="preserve">Names, characters, places, and events are fictional. Any resemblance</w:t>
+      </w:r>
+      <w:r>
+        <w:t xml:space="preserve"> </w:t>
+      </w:r>
+      <w:r>
+        <w:t xml:space="preserve">to real persons is coincidental.</w:t>
       </w:r>
       <w:r>
         <w:t xml:space="preserve">”</w:t>
@@ -2195,7 +2911,13 @@
         <w:pStyle w:val="Compact"/>
       </w:pPr>
       <w:r>
-        <w:t xml:space="preserve">Optional: a short back-of-book note about the series. Do not ask for reviews in a way that breaks Amazon’s rules.</w:t>
+        <w:t xml:space="preserve">Optional: a short back-of-book note about the series. Do not ask for</w:t>
+      </w:r>
+      <w:r>
+        <w:t xml:space="preserve"> </w:t>
+      </w:r>
+      <w:r>
+        <w:t xml:space="preserve">reviews in a way that breaks Amazon’s rules.</w:t>
       </w:r>
     </w:p>
     <w:bookmarkEnd w:id="27"/>
@@ -2211,13 +2933,13 @@
     <w:tbl>
       <w:tblPr>
         <w:tblStyle w:val="Table"/>
-        <w:tblW w:type="pct" w:w="4937"/>
+        <w:tblW w:type="pct" w:w="4865"/>
         <w:tblLook w:firstRow="1" w:lastRow="0" w:firstColumn="0" w:lastColumn="0" w:noHBand="0" w:noVBand="0" w:val="0020"/>
         <w:jc w:val="start"/>
       </w:tblPr>
       <w:tblGrid>
-        <w:gridCol w:w="2005"/>
-        <w:gridCol w:w="5814"/>
+        <w:gridCol w:w="2033"/>
+        <w:gridCol w:w="5672"/>
       </w:tblGrid>
       <w:tr>
         <w:trPr>
@@ -2257,7 +2979,13 @@
               <w:jc w:val="left"/>
             </w:pPr>
             <w:r>
-              <w:t xml:space="preserve">Novels and chapter books</w:t>
+              <w:t xml:space="preserve">Novels and chapter</w:t>
+            </w:r>
+            <w:r>
+              <w:t xml:space="preserve"> </w:t>
+            </w:r>
+            <w:r>
+              <w:t xml:space="preserve">books</w:t>
             </w:r>
           </w:p>
         </w:tc>
@@ -2269,7 +2997,13 @@
               <w:jc w:val="left"/>
             </w:pPr>
             <w:r>
-              <w:t xml:space="preserve">$2.99 to $4.99. Stay at or above $2.99 for the 70 percent royalty.</w:t>
+              <w:t xml:space="preserve">$2.99 to $4.99. Stay at or above $2.99 for the 70</w:t>
+            </w:r>
+            <w:r>
+              <w:t xml:space="preserve"> </w:t>
+            </w:r>
+            <w:r>
+              <w:t xml:space="preserve">percent royalty.</w:t>
             </w:r>
           </w:p>
         </w:tc>
@@ -2283,7 +3017,19 @@
               <w:jc w:val="left"/>
             </w:pPr>
             <w:r>
-              <w:t xml:space="preserve">Bedtime collections and early readers</w:t>
+              <w:t xml:space="preserve">Bedtime</w:t>
+            </w:r>
+            <w:r>
+              <w:t xml:space="preserve"> </w:t>
+            </w:r>
+            <w:r>
+              <w:t xml:space="preserve">collections and</w:t>
+            </w:r>
+            <w:r>
+              <w:t xml:space="preserve"> </w:t>
+            </w:r>
+            <w:r>
+              <w:t xml:space="preserve">early readers</w:t>
             </w:r>
           </w:p>
         </w:tc>
@@ -2321,7 +3067,13 @@
               <w:jc w:val="left"/>
             </w:pPr>
             <w:r>
-              <w:t xml:space="preserve">$2.99 to $5.99, or $0.99 to $1.99 only if the book is very short</w:t>
+              <w:t xml:space="preserve">$2.99 to $5.99, or $0.99 to $1.99 only if the</w:t>
+            </w:r>
+            <w:r>
+              <w:t xml:space="preserve"> </w:t>
+            </w:r>
+            <w:r>
+              <w:t xml:space="preserve">book is very short</w:t>
             </w:r>
           </w:p>
         </w:tc>
@@ -2335,7 +3087,13 @@
               <w:jc w:val="left"/>
             </w:pPr>
             <w:r>
-              <w:t xml:space="preserve">Practical guides and workbooks</w:t>
+              <w:t xml:space="preserve">Practical guides</w:t>
+            </w:r>
+            <w:r>
+              <w:t xml:space="preserve"> </w:t>
+            </w:r>
+            <w:r>
+              <w:t xml:space="preserve">and workbooks</w:t>
             </w:r>
           </w:p>
         </w:tc>
@@ -2373,7 +3131,13 @@
               <w:jc w:val="left"/>
             </w:pPr>
             <w:r>
-              <w:t xml:space="preserve">Optional, only when the owner announces it. A $0.99 promotion pays 35 percent royalty during its window.</w:t>
+              <w:t xml:space="preserve">Optional, only when the owner announces it. A $0.99</w:t>
+            </w:r>
+            <w:r>
+              <w:t xml:space="preserve"> </w:t>
+            </w:r>
+            <w:r>
+              <w:t xml:space="preserve">promotion pays 35 percent royalty during its window.</w:t>
             </w:r>
           </w:p>
         </w:tc>
@@ -2387,7 +3151,13 @@
               <w:jc w:val="left"/>
             </w:pPr>
             <w:r>
-              <w:t xml:space="preserve">KDP Select (Kindle Unlimited)</w:t>
+              <w:t xml:space="preserve">KDP Select (Kindle</w:t>
+            </w:r>
+            <w:r>
+              <w:t xml:space="preserve"> </w:t>
+            </w:r>
+            <w:r>
+              <w:t xml:space="preserve">Unlimited)</w:t>
             </w:r>
           </w:p>
         </w:tc>
@@ -2419,13 +3189,33 @@
                 <w:bCs/>
                 <w:b/>
               </w:rPr>
-              <w:t xml:space="preserve">Standalone books:</w:t>
-            </w:r>
-            <w:r>
+              <w:t xml:space="preserve">Standalone</w:t>
+            </w:r>
+            <w:r>
+              <w:rPr>
+                <w:bCs/>
+                <w:b/>
+              </w:rPr>
               <w:t xml:space="preserve"> </w:t>
             </w:r>
             <w:r>
-              <w:t xml:space="preserve">do not enrol. Each book’s metadata records the choice.</w:t>
+              <w:rPr>
+                <w:bCs/>
+                <w:b/>
+              </w:rPr>
+              <w:t xml:space="preserve">books:</w:t>
+            </w:r>
+            <w:r>
+              <w:t xml:space="preserve"> </w:t>
+            </w:r>
+            <w:r>
+              <w:t xml:space="preserve">do not enrol. Each book’s metadata records</w:t>
+            </w:r>
+            <w:r>
+              <w:t xml:space="preserve"> </w:t>
+            </w:r>
+            <w:r>
+              <w:t xml:space="preserve">the choice.</w:t>
             </w:r>
           </w:p>
         </w:tc>
@@ -2536,7 +3326,19 @@
         <w:pStyle w:val="Compact"/>
       </w:pPr>
       <w:r>
-        <w:t xml:space="preserve">KDP’s current help allows up to three categories. This guide requires two, which is the minimum. A third may be added only if the owner decides.</w:t>
+        <w:t xml:space="preserve">KDP’s current help allows up to three categories. This guide</w:t>
+      </w:r>
+      <w:r>
+        <w:t xml:space="preserve"> </w:t>
+      </w:r>
+      <w:r>
+        <w:t xml:space="preserve">requires two, which is the minimum. A third may be added only if the</w:t>
+      </w:r>
+      <w:r>
+        <w:t xml:space="preserve"> </w:t>
+      </w:r>
+      <w:r>
+        <w:t xml:space="preserve">owner decides.</w:t>
       </w:r>
     </w:p>
     <w:p>
@@ -2558,7 +3360,19 @@
         <w:t xml:space="preserve"> </w:t>
       </w:r>
       <w:r>
-        <w:t xml:space="preserve">a category is used only when its pool entry is confirmed. The owner confirms each path in the KDP category picker and sets</w:t>
+        <w:t xml:space="preserve">a category is used only when its pool entry is</w:t>
+      </w:r>
+      <w:r>
+        <w:t xml:space="preserve"> </w:t>
+      </w:r>
+      <w:r>
+        <w:t xml:space="preserve">confirmed. The owner confirms each path in the KDP category picker</w:t>
+      </w:r>
+      <w:r>
+        <w:t xml:space="preserve"> </w:t>
+      </w:r>
+      <w:r>
+        <w:t xml:space="preserve">and sets</w:t>
       </w:r>
       <w:r>
         <w:t xml:space="preserve"> </w:t>
@@ -2573,7 +3387,13 @@
         <w:t xml:space="preserve"> </w:t>
       </w:r>
       <w:r>
-        <w:t xml:space="preserve">in the pool. An unconfirmed category blocks the book.</w:t>
+        <w:t xml:space="preserve">in the pool. An unconfirmed category</w:t>
+      </w:r>
+      <w:r>
+        <w:t xml:space="preserve"> </w:t>
+      </w:r>
+      <w:r>
+        <w:t xml:space="preserve">blocks the book.</w:t>
       </w:r>
     </w:p>
     <w:p>
@@ -2631,7 +3451,25 @@
         <w:t xml:space="preserve"> </w:t>
       </w:r>
       <w:r>
-        <w:t xml:space="preserve">only picks a topic whose two categories are both confirmed in the pool. A topic with an unconfirmed or missing category waits in the queue. It is not written and not marked used.</w:t>
+        <w:t xml:space="preserve">only picks a topic whose</w:t>
+      </w:r>
+      <w:r>
+        <w:t xml:space="preserve"> </w:t>
+      </w:r>
+      <w:r>
+        <w:t xml:space="preserve">two categories are both confirmed in the pool. A topic with an</w:t>
+      </w:r>
+      <w:r>
+        <w:t xml:space="preserve"> </w:t>
+      </w:r>
+      <w:r>
+        <w:t xml:space="preserve">unconfirmed or missing category waits in the queue. It is not</w:t>
+      </w:r>
+      <w:r>
+        <w:t xml:space="preserve"> </w:t>
+      </w:r>
+      <w:r>
+        <w:t xml:space="preserve">written and not marked used.</w:t>
       </w:r>
     </w:p>
     <w:p>
@@ -2662,7 +3500,19 @@
         <w:t xml:space="preserve"> </w:t>
       </w:r>
       <w:r>
-        <w:t xml:space="preserve">rejects any topic whose categories are not exactly two pool paths, and reports an error.</w:t>
+        <w:t xml:space="preserve">rejects any topic</w:t>
+      </w:r>
+      <w:r>
+        <w:t xml:space="preserve"> </w:t>
+      </w:r>
+      <w:r>
+        <w:t xml:space="preserve">whose categories are not exactly two pool paths, and reports an</w:t>
+      </w:r>
+      <w:r>
+        <w:t xml:space="preserve"> </w:t>
+      </w:r>
+      <w:r>
+        <w:t xml:space="preserve">error.</w:t>
       </w:r>
     </w:p>
     <w:bookmarkEnd w:id="29"/>
@@ -2899,7 +3749,13 @@
         <w:t xml:space="preserve"> </w:t>
       </w:r>
       <w:r>
-        <w:t xml:space="preserve">(the exact sentence in section 8),</w:t>
+        <w:t xml:space="preserve">(the exact</w:t>
+      </w:r>
+      <w:r>
+        <w:t xml:space="preserve"> </w:t>
+      </w:r>
+      <w:r>
+        <w:t xml:space="preserve">sentence in section 8),</w:t>
       </w:r>
       <w:r>
         <w:t xml:space="preserve"> </w:t>
@@ -2977,7 +3833,13 @@
         <w:t xml:space="preserve">“</w:t>
       </w:r>
       <w:r>
-        <w:t xml:space="preserve">cover-ebook.jpg (1600 x 2560 RGB JPEG)</w:t>
+        <w:t xml:space="preserve">cover-ebook.jpg (1600 x</w:t>
+      </w:r>
+      <w:r>
+        <w:t xml:space="preserve"> </w:t>
+      </w:r>
+      <w:r>
+        <w:t xml:space="preserve">2560 RGB JPEG)</w:t>
       </w:r>
       <w:r>
         <w:t xml:space="preserve">”</w:t>
@@ -3053,7 +3915,13 @@
         <w:t xml:space="preserve"> </w:t>
       </w:r>
       <w:r>
-        <w:t xml:space="preserve">in its folder, generated by</w:t>
+        <w:t xml:space="preserve">in its folder,</w:t>
+      </w:r>
+      <w:r>
+        <w:t xml:space="preserve"> </w:t>
+      </w:r>
+      <w:r>
+        <w:t xml:space="preserve">generated by</w:t>
       </w:r>
       <w:r>
         <w:t xml:space="preserve"> </w:t>
@@ -3080,7 +3948,31 @@
         <w:t xml:space="preserve">metadata.json</w:t>
       </w:r>
       <w:r>
-        <w:t xml:space="preserve">. It holds every KDP form answer: title, subtitle, series, author, description, seven keywords, two categories, content warnings, AI disclosure, territories, price, royalty, KDP Select, lending, and the files to upload. Regenerate it after any metadata change.</w:t>
+        <w:t xml:space="preserve">. It</w:t>
+      </w:r>
+      <w:r>
+        <w:t xml:space="preserve"> </w:t>
+      </w:r>
+      <w:r>
+        <w:t xml:space="preserve">holds every KDP form answer: title, subtitle, series, author,</w:t>
+      </w:r>
+      <w:r>
+        <w:t xml:space="preserve"> </w:t>
+      </w:r>
+      <w:r>
+        <w:t xml:space="preserve">description, seven keywords, two categories, content warnings, AI</w:t>
+      </w:r>
+      <w:r>
+        <w:t xml:space="preserve"> </w:t>
+      </w:r>
+      <w:r>
+        <w:t xml:space="preserve">disclosure, territories, price, royalty, KDP Select, lending, and the</w:t>
+      </w:r>
+      <w:r>
+        <w:t xml:space="preserve"> </w:t>
+      </w:r>
+      <w:r>
+        <w:t xml:space="preserve">files to upload. Regenerate it after any metadata change.</w:t>
       </w:r>
     </w:p>
     <w:bookmarkEnd w:id="31"/>
@@ -3121,7 +4013,49 @@
         <w:t xml:space="preserve"> </w:t>
       </w:r>
       <w:r>
-        <w:t xml:space="preserve">REQUIRED: every check passes before approval. The checks are: required files; title, subtitle, and author; description length; seven keywords under 50 characters; two categories from the confirmed pool; language; exact AI disclosure wording; copyright line; placeholder scan; word count within 10 percent of target; chapter headings; epubcheck (0 errors, 0 warnings); the cover brief checks; and style.css and the font licence file; guide_version</w:t>
+        <w:t xml:space="preserve">REQUIRED: every</w:t>
+      </w:r>
+      <w:r>
+        <w:t xml:space="preserve"> </w:t>
+      </w:r>
+      <w:r>
+        <w:t xml:space="preserve">check passes before approval. The checks are: required files; title,</w:t>
+      </w:r>
+      <w:r>
+        <w:t xml:space="preserve"> </w:t>
+      </w:r>
+      <w:r>
+        <w:t xml:space="preserve">subtitle, and author; description length; seven keywords under 50</w:t>
+      </w:r>
+      <w:r>
+        <w:t xml:space="preserve"> </w:t>
+      </w:r>
+      <w:r>
+        <w:t xml:space="preserve">characters; two categories from the confirmed pool; language; exact AI</w:t>
+      </w:r>
+      <w:r>
+        <w:t xml:space="preserve"> </w:t>
+      </w:r>
+      <w:r>
+        <w:t xml:space="preserve">disclosure wording; copyright line; placeholder scan; word count within</w:t>
+      </w:r>
+      <w:r>
+        <w:t xml:space="preserve"> </w:t>
+      </w:r>
+      <w:r>
+        <w:t xml:space="preserve">10 percent of target; chapter headings; epubcheck (0 errors, 0</w:t>
+      </w:r>
+      <w:r>
+        <w:t xml:space="preserve"> </w:t>
+      </w:r>
+      <w:r>
+        <w:t xml:space="preserve">warnings); the cover brief checks; and style.css and the font licence</w:t>
+      </w:r>
+      <w:r>
+        <w:t xml:space="preserve"> </w:t>
+      </w:r>
+      <w:r>
+        <w:t xml:space="preserve">file; guide_version</w:t>
       </w:r>
       <w:r>
         <w:t xml:space="preserve"> </w:t>
@@ -3136,7 +4070,13 @@
         <w:t xml:space="preserve">”</w:t>
       </w:r>
       <w:r>
-        <w:t xml:space="preserve">; the cover brief checks; and the cover checks (</w:t>
+        <w:t xml:space="preserve">; the cover brief checks; and the cover checks</w:t>
+      </w:r>
+      <w:r>
+        <w:t xml:space="preserve"> </w:t>
+      </w:r>
+      <w:r>
+        <w:t xml:space="preserve">(</w:t>
       </w:r>
       <w:r>
         <w:rPr>
@@ -3176,7 +4116,13 @@
         <w:t xml:space="preserve"> </w:t>
       </w:r>
       <w:r>
-        <w:t xml:space="preserve">REQUIRED for kids’ books and early readers: the Flesch-Kincaid grade of</w:t>
+        <w:t xml:space="preserve">REQUIRED for kids’ books</w:t>
+      </w:r>
+      <w:r>
+        <w:t xml:space="preserve"> </w:t>
+      </w:r>
+      <w:r>
+        <w:t xml:space="preserve">and early readers: the Flesch-Kincaid grade of</w:t>
       </w:r>
       <w:r>
         <w:t xml:space="preserve"> </w:t>
@@ -3191,7 +4137,25 @@
         <w:t xml:space="preserve"> </w:t>
       </w:r>
       <w:r>
-        <w:t xml:space="preserve">must be between 2 and 4 for ages 6 to 9, and between 1 and 3 for ages 4 to 7. A text below the range is too simple; rewrite the sentences that are hard to read.</w:t>
+        <w:t xml:space="preserve">must be</w:t>
+      </w:r>
+      <w:r>
+        <w:t xml:space="preserve"> </w:t>
+      </w:r>
+      <w:r>
+        <w:t xml:space="preserve">between 2 and 4 for ages 6 to 9, and between 1 and 3 for ages 4 to 7. A</w:t>
+      </w:r>
+      <w:r>
+        <w:t xml:space="preserve"> </w:t>
+      </w:r>
+      <w:r>
+        <w:t xml:space="preserve">text below the range is too simple; rewrite the sentences that are hard</w:t>
+      </w:r>
+      <w:r>
+        <w:t xml:space="preserve"> </w:t>
+      </w:r>
+      <w:r>
+        <w:t xml:space="preserve">to read.</w:t>
       </w:r>
     </w:p>
     <w:p>
@@ -3209,7 +4173,31 @@
         <w:t xml:space="preserve"> </w:t>
       </w:r>
       <w:r>
-        <w:t xml:space="preserve">REQUIRED: names, places, and facts are consistent; the timeline holds; no repeated or contradictory passages; no sensitive content beyond the stated warnings; no copied passages or trademarks; non-fiction claims spot-checked against</w:t>
+        <w:t xml:space="preserve">REQUIRED: names, places,</w:t>
+      </w:r>
+      <w:r>
+        <w:t xml:space="preserve"> </w:t>
+      </w:r>
+      <w:r>
+        <w:t xml:space="preserve">and facts are consistent; the timeline holds; no repeated or</w:t>
+      </w:r>
+      <w:r>
+        <w:t xml:space="preserve"> </w:t>
+      </w:r>
+      <w:r>
+        <w:t xml:space="preserve">contradictory passages; no sensitive content beyond the stated warnings;</w:t>
+      </w:r>
+      <w:r>
+        <w:t xml:space="preserve"> </w:t>
+      </w:r>
+      <w:r>
+        <w:t xml:space="preserve">no copied passages or trademarks; non-fiction claims spot-checked</w:t>
+      </w:r>
+      <w:r>
+        <w:t xml:space="preserve"> </w:t>
+      </w:r>
+      <w:r>
+        <w:t xml:space="preserve">against</w:t>
       </w:r>
       <w:r>
         <w:t xml:space="preserve"> </w:t>
@@ -3314,7 +4302,13 @@
         <w:t xml:space="preserve"> </w:t>
       </w:r>
       <w:r>
-        <w:t xml:space="preserve">(with the licence file),</w:t>
+        <w:t xml:space="preserve">(with the</w:t>
+      </w:r>
+      <w:r>
+        <w:t xml:space="preserve"> </w:t>
+      </w:r>
+      <w:r>
+        <w:t xml:space="preserve">licence file),</w:t>
       </w:r>
       <w:r>
         <w:t xml:space="preserve"> </w:t>
@@ -3406,7 +4400,13 @@
         <w:t xml:space="preserve">fonts/</w:t>
       </w:r>
       <w:r>
-        <w:t xml:space="preserve">. It commits with the message</w:t>
+        <w:t xml:space="preserve">. It commits with the</w:t>
+      </w:r>
+      <w:r>
+        <w:t xml:space="preserve"> </w:t>
+      </w:r>
+      <w:r>
+        <w:t xml:space="preserve">message</w:t>
       </w:r>
       <w:r>
         <w:t xml:space="preserve"> </w:t>
@@ -3415,7 +4415,13 @@
         <w:t xml:space="preserve">“</w:t>
       </w:r>
       <w:r>
-        <w:t xml:space="preserve">Kindle-3: cover, review and KDP form answers for [book title]</w:t>
+        <w:t xml:space="preserve">Kindle-3: cover, review and KDP form answers for [book</w:t>
+      </w:r>
+      <w:r>
+        <w:t xml:space="preserve"> </w:t>
+      </w:r>
+      <w:r>
+        <w:t xml:space="preserve">title]</w:t>
       </w:r>
       <w:r>
         <w:t xml:space="preserve">”</w:t>
@@ -3442,7 +4448,13 @@
         <w:t xml:space="preserve"> </w:t>
       </w:r>
       <w:r>
-        <w:t xml:space="preserve">nothing is uploaded to Amazon by a robot. The owner uploads each book.</w:t>
+        <w:t xml:space="preserve">nothing is uploaded to Amazon by a robot. The owner</w:t>
+      </w:r>
+      <w:r>
+        <w:t xml:space="preserve"> </w:t>
+      </w:r>
+      <w:r>
+        <w:t xml:space="preserve">uploads each book.</w:t>
       </w:r>
     </w:p>
     <w:bookmarkEnd w:id="33"/>
@@ -3464,7 +4476,37 @@
         <w:pStyle w:val="Compact"/>
       </w:pPr>
       <w:r>
-        <w:t xml:space="preserve">A robot stops and does not finish if: the topic entry is incomplete or contradictory; a fact cannot be verified; the text or cover could use a trademark, copyrighted work, or real-person likeness; the book would give medical, financial, or legal advice; the cover cannot be made to spec; an epubcheck error cannot be fixed; or a category is unconfirmed.</w:t>
+        <w:t xml:space="preserve">A robot stops and does not finish if: the topic entry is incomplete</w:t>
+      </w:r>
+      <w:r>
+        <w:t xml:space="preserve"> </w:t>
+      </w:r>
+      <w:r>
+        <w:t xml:space="preserve">or contradictory; a fact cannot be verified; the text or cover could</w:t>
+      </w:r>
+      <w:r>
+        <w:t xml:space="preserve"> </w:t>
+      </w:r>
+      <w:r>
+        <w:t xml:space="preserve">use a trademark, copyrighted work, or real-person likeness; the book</w:t>
+      </w:r>
+      <w:r>
+        <w:t xml:space="preserve"> </w:t>
+      </w:r>
+      <w:r>
+        <w:t xml:space="preserve">would give medical, financial, or legal advice; the cover cannot be</w:t>
+      </w:r>
+      <w:r>
+        <w:t xml:space="preserve"> </w:t>
+      </w:r>
+      <w:r>
+        <w:t xml:space="preserve">made to spec; an epubcheck error cannot be fixed; or a category is</w:t>
+      </w:r>
+      <w:r>
+        <w:t xml:space="preserve"> </w:t>
+      </w:r>
+      <w:r>
+        <w:t xml:space="preserve">unconfirmed.</w:t>
       </w:r>
     </w:p>
     <w:p>
@@ -3486,7 +4528,13 @@
         <w:t xml:space="preserve"> </w:t>
       </w:r>
       <w:r>
-        <w:t xml:space="preserve">it deletes the partial folder, so the topic stays available, and logs the reason.</w:t>
+        <w:t xml:space="preserve">it deletes the partial folder, so the topic</w:t>
+      </w:r>
+      <w:r>
+        <w:t xml:space="preserve"> </w:t>
+      </w:r>
+      <w:r>
+        <w:t xml:space="preserve">stays available, and logs the reason.</w:t>
       </w:r>
     </w:p>
     <w:p>
@@ -3508,7 +4556,19 @@
         <w:t xml:space="preserve"> </w:t>
       </w:r>
       <w:r>
-        <w:t xml:space="preserve">it logs the exact check that failed. A book blocked twice on Kindle-3 is skipped and shown to the owner as needing a decision. The next book is then reviewed.</w:t>
+        <w:t xml:space="preserve">it logs the exact check that</w:t>
+      </w:r>
+      <w:r>
+        <w:t xml:space="preserve"> </w:t>
+      </w:r>
+      <w:r>
+        <w:t xml:space="preserve">failed. A book blocked twice on Kindle-3 is skipped and shown to the</w:t>
+      </w:r>
+      <w:r>
+        <w:t xml:space="preserve"> </w:t>
+      </w:r>
+      <w:r>
+        <w:t xml:space="preserve">owner as needing a decision. The next book is then reviewed.</w:t>
       </w:r>
     </w:p>
     <w:p>
@@ -3569,7 +4629,13 @@
         <w:pStyle w:val="Compact"/>
       </w:pPr>
       <w:r>
-        <w:t xml:space="preserve">Confirming category paths in the KDP picker, then marking them confirmed in</w:t>
+        <w:t xml:space="preserve">Confirming category paths in the KDP picker, then marking them</w:t>
+      </w:r>
+      <w:r>
+        <w:t xml:space="preserve"> </w:t>
+      </w:r>
+      <w:r>
+        <w:t xml:space="preserve">confirmed in</w:t>
       </w:r>
       <w:r>
         <w:t xml:space="preserve"> </w:t>
@@ -3581,7 +4647,13 @@
         <w:t xml:space="preserve">ebook-topics/category-pool.json</w:t>
       </w:r>
       <w:r>
-        <w:t xml:space="preserve">. Until then, the affected topics wait.</w:t>
+        <w:t xml:space="preserve">. Until then, the</w:t>
+      </w:r>
+      <w:r>
+        <w:t xml:space="preserve"> </w:t>
+      </w:r>
+      <w:r>
+        <w:t xml:space="preserve">affected topics wait.</w:t>
       </w:r>
     </w:p>
     <w:p>
@@ -3671,7 +4743,13 @@
         <w:pStyle w:val="FirstParagraph"/>
       </w:pPr>
       <w:r>
-        <w:t xml:space="preserve">Keep a series note for each series: the characters, setting, and timeline, in</w:t>
+        <w:t xml:space="preserve">Keep a series note for each series: the characters, setting, and</w:t>
+      </w:r>
+      <w:r>
+        <w:t xml:space="preserve"> </w:t>
+      </w:r>
+      <w:r>
+        <w:t xml:space="preserve">timeline, in</w:t>
       </w:r>
       <w:r>
         <w:t xml:space="preserve"> </w:t>
@@ -3683,7 +4761,13 @@
         <w:t xml:space="preserve">series/&lt;series-slug&gt;.md</w:t>
       </w:r>
       <w:r>
-        <w:t xml:space="preserve">. Kindle-2 reads it before writing a book in that series and updates it afterwards.</w:t>
+        <w:t xml:space="preserve">. Kindle-2 reads it before writing</w:t>
+      </w:r>
+      <w:r>
+        <w:t xml:space="preserve"> </w:t>
+      </w:r>
+      <w:r>
+        <w:t xml:space="preserve">a book in that series and updates it afterwards.</w:t>
       </w:r>
     </w:p>
     <w:bookmarkEnd w:id="36"/>
@@ -3902,7 +4986,13 @@
         <w:t xml:space="preserve"> </w:t>
       </w:r>
       <w:r>
-        <w:t xml:space="preserve">cover brief written before design and validated (</w:t>
+        <w:t xml:space="preserve">cover brief written before design and</w:t>
+      </w:r>
+      <w:r>
+        <w:t xml:space="preserve"> </w:t>
+      </w:r>
+      <w:r>
+        <w:t xml:space="preserve">validated (</w:t>
       </w:r>
       <w:r>
         <w:rPr>
@@ -3911,7 +5001,25 @@
         <w:t xml:space="preserve">check_cover_brief.py</w:t>
       </w:r>
       <w:r>
-        <w:t xml:space="preserve">). Covers are checked against their own book: palette, title text by OCR at full and thumbnail size, title size, and the subtitle agreeing with metadata. Author and badge confirmed by viewing. Cover checks run through</w:t>
+        <w:t xml:space="preserve">). Covers are checked against their</w:t>
+      </w:r>
+      <w:r>
+        <w:t xml:space="preserve"> </w:t>
+      </w:r>
+      <w:r>
+        <w:t xml:space="preserve">own book: palette, title text by OCR at full and thumbnail size,</w:t>
+      </w:r>
+      <w:r>
+        <w:t xml:space="preserve"> </w:t>
+      </w:r>
+      <w:r>
+        <w:t xml:space="preserve">title size, and the subtitle agreeing with metadata. Author and</w:t>
+      </w:r>
+      <w:r>
+        <w:t xml:space="preserve"> </w:t>
+      </w:r>
+      <w:r>
+        <w:t xml:space="preserve">badge confirmed by viewing. Cover checks run through</w:t>
       </w:r>
       <w:r>
         <w:t xml:space="preserve"> </w:t>
@@ -3938,7 +5046,67 @@
         <w:t xml:space="preserve">”</w:t>
       </w:r>
       <w:r>
-        <w:t xml:space="preserve">. Review fixes: stylesheet and font licence required and checked; Kindle-4 becomes the manual-upload handoff (no KDP sign-in); fixed-layout formats paused until a builder exists; picker honours topic holds; tagline rule clarified. Added scripts/build_epub.py (one build for all books) and sync_topics.py refuses fixed-layout formats, early readers and reading ages 4 to 7 on new rows.</w:t>
+        <w:t xml:space="preserve">. Category cover styles added in</w:t>
+      </w:r>
+      <w:r>
+        <w:t xml:space="preserve"> </w:t>
+      </w:r>
+      <w:r>
+        <w:rPr>
+          <w:rStyle w:val="VerbatimChar"/>
+        </w:rPr>
+        <w:t xml:space="preserve">ebooks-Raw/cover-styles.json</w:t>
+      </w:r>
+      <w:r>
+        <w:t xml:space="preserve">, one profile per pool category, with</w:t>
+      </w:r>
+      <w:r>
+        <w:t xml:space="preserve"> </w:t>
+      </w:r>
+      <w:r>
+        <w:t xml:space="preserve">the brief validator enforcing the category, palette hues, and badge</w:t>
+      </w:r>
+      <w:r>
+        <w:t xml:space="preserve"> </w:t>
+      </w:r>
+      <w:r>
+        <w:t xml:space="preserve">rule. Review fixes:</w:t>
+      </w:r>
+      <w:r>
+        <w:t xml:space="preserve"> </w:t>
+      </w:r>
+      <w:r>
+        <w:t xml:space="preserve">stylesheet and font licence required and checked; Kindle-4 becomes</w:t>
+      </w:r>
+      <w:r>
+        <w:t xml:space="preserve"> </w:t>
+      </w:r>
+      <w:r>
+        <w:t xml:space="preserve">the manual-upload handoff (no KDP sign-in); fixed-layout formats</w:t>
+      </w:r>
+      <w:r>
+        <w:t xml:space="preserve"> </w:t>
+      </w:r>
+      <w:r>
+        <w:t xml:space="preserve">paused until a builder exists; picker honours topic holds; tagline</w:t>
+      </w:r>
+      <w:r>
+        <w:t xml:space="preserve"> </w:t>
+      </w:r>
+      <w:r>
+        <w:t xml:space="preserve">rule clarified. Added scripts/build_epub.py (one build for all</w:t>
+      </w:r>
+      <w:r>
+        <w:t xml:space="preserve"> </w:t>
+      </w:r>
+      <w:r>
+        <w:t xml:space="preserve">books) and sync_topics.py refuses fixed-layout formats, early</w:t>
+      </w:r>
+      <w:r>
+        <w:t xml:space="preserve"> </w:t>
+      </w:r>
+      <w:r>
+        <w:t xml:space="preserve">readers and reading ages 4 to 7 on new rows.</w:t>
       </w:r>
     </w:p>
     <w:p>
@@ -3960,7 +5128,19 @@
         <w:t xml:space="preserve"> </w:t>
       </w:r>
       <w:r>
-        <w:t xml:space="preserve">ebook only; print removed. Two categories from a confirmed pool. KDP form answers required. Robo-2 renamed Kindle-2 throughout. Copyright placeholder replaced with</w:t>
+        <w:t xml:space="preserve">ebook only; print removed. Two categories</w:t>
+      </w:r>
+      <w:r>
+        <w:t xml:space="preserve"> </w:t>
+      </w:r>
+      <w:r>
+        <w:t xml:space="preserve">from a confirmed pool. KDP form answers required. Robo-2 renamed</w:t>
+      </w:r>
+      <w:r>
+        <w:t xml:space="preserve"> </w:t>
+      </w:r>
+      <w:r>
+        <w:t xml:space="preserve">Kindle-2 throughout. Copyright placeholder replaced with</w:t>
       </w:r>
       <w:r>
         <w:t xml:space="preserve"> </w:t>
@@ -3975,7 +5155,43 @@
         <w:t xml:space="preserve">”</w:t>
       </w:r>
       <w:r>
-        <w:t xml:space="preserve">. Phone preview replaced by Kindle Previewer check by the owner. KDP Select rule set: series enrolled, standalone not. Workbooks and guides require the non-fiction disclaimer. Readability tool named and required for kids’ books. Stop, retry and two-strike rules added. Cover approval moved to the owner’s check at upload. Mechanical checks made into scripts.</w:t>
+        <w:t xml:space="preserve">.</w:t>
+      </w:r>
+      <w:r>
+        <w:t xml:space="preserve"> </w:t>
+      </w:r>
+      <w:r>
+        <w:t xml:space="preserve">Phone preview replaced by Kindle Previewer check by the owner. KDP</w:t>
+      </w:r>
+      <w:r>
+        <w:t xml:space="preserve"> </w:t>
+      </w:r>
+      <w:r>
+        <w:t xml:space="preserve">Select rule set: series enrolled, standalone not. Workbooks and</w:t>
+      </w:r>
+      <w:r>
+        <w:t xml:space="preserve"> </w:t>
+      </w:r>
+      <w:r>
+        <w:t xml:space="preserve">guides require the non-fiction disclaimer. Readability tool named</w:t>
+      </w:r>
+      <w:r>
+        <w:t xml:space="preserve"> </w:t>
+      </w:r>
+      <w:r>
+        <w:t xml:space="preserve">and required for kids’ books. Stop, retry and two-strike rules</w:t>
+      </w:r>
+      <w:r>
+        <w:t xml:space="preserve"> </w:t>
+      </w:r>
+      <w:r>
+        <w:t xml:space="preserve">added. Cover approval moved to the owner’s check at upload.</w:t>
+      </w:r>
+      <w:r>
+        <w:t xml:space="preserve"> </w:t>
+      </w:r>
+      <w:r>
+        <w:t xml:space="preserve">Mechanical checks made into scripts.</w:t>
       </w:r>
     </w:p>
     <w:p>

</xml_diff>

<commit_message>
Review pass: guide section 2, build safety, KDP Select check, exact topic formats
- Guide section 2 lists only the fields Kindle-2 needs to write; keywords derived when missing.
- build_epub.py removes old EPUBs only after a successful build.
- make_kdp_answers.py reads kdp_select from metadata instead of defaulting to yes.
- check_book.py checks kdp_select against the series rule (guide section 9).
- Topic log formats set to exactly text-only or workbook.

Co-Authored-By: Claude Haiku 5.5 <noreply@anthropic.com>
Claude-Session: https://claude.ai/code/session_01MZeVJcyf7XvKRRCE6AUkLk
</commit_message>
<xml_diff>
--- a/ebooks-Raw/guide.docx
+++ b/ebooks-Raw/guide.docx
@@ -296,6 +296,16 @@
       </w:pPr>
       <w:r>
         <w:rPr>
+          <w:bCs/>
+          <w:b/>
+        </w:rPr>
+        <w:t xml:space="preserve">REQUIRED to write a book:</w:t>
+      </w:r>
+      <w:r>
+        <w:t xml:space="preserve"> </w:t>
+      </w:r>
+      <w:r>
+        <w:rPr>
           <w:rStyle w:val="VerbatimChar"/>
         </w:rPr>
         <w:t xml:space="preserve">topic_name</w:t>
@@ -337,6 +347,199 @@
         <w:rPr>
           <w:rStyle w:val="VerbatimChar"/>
         </w:rPr>
+        <w:t xml:space="preserve">format</w:t>
+      </w:r>
+      <w:r>
+        <w:t xml:space="preserve"> </w:t>
+      </w:r>
+      <w:r>
+        <w:t xml:space="preserve">(</w:t>
+      </w:r>
+      <w:r>
+        <w:t xml:space="preserve">“</w:t>
+      </w:r>
+      <w:r>
+        <w:t xml:space="preserve">text-only</w:t>
+      </w:r>
+      <w:r>
+        <w:t xml:space="preserve">”</w:t>
+      </w:r>
+      <w:r>
+        <w:t xml:space="preserve"> </w:t>
+      </w:r>
+      <w:r>
+        <w:t xml:space="preserve">or</w:t>
+      </w:r>
+      <w:r>
+        <w:t xml:space="preserve"> </w:t>
+      </w:r>
+      <w:r>
+        <w:t xml:space="preserve">“</w:t>
+      </w:r>
+      <w:r>
+        <w:t xml:space="preserve">workbook</w:t>
+      </w:r>
+      <w:r>
+        <w:t xml:space="preserve">”</w:t>
+      </w:r>
+      <w:r>
+        <w:t xml:space="preserve">;</w:t>
+      </w:r>
+      <w:r>
+        <w:t xml:space="preserve"> </w:t>
+      </w:r>
+      <w:r>
+        <w:t xml:space="preserve">“</w:t>
+      </w:r>
+      <w:r>
+        <w:t xml:space="preserve">fixed-layout</w:t>
+      </w:r>
+      <w:r>
+        <w:t xml:space="preserve">”</w:t>
+      </w:r>
+      <w:r>
+        <w:t xml:space="preserve"> </w:t>
+      </w:r>
+      <w:r>
+        <w:t xml:space="preserve">is paused),</w:t>
+      </w:r>
+      <w:r>
+        <w:t xml:space="preserve"> </w:t>
+      </w:r>
+      <w:r>
+        <w:rPr>
+          <w:rStyle w:val="VerbatimChar"/>
+        </w:rPr>
+        <w:t xml:space="preserve">target_reader</w:t>
+      </w:r>
+      <w:r>
+        <w:t xml:space="preserve">,</w:t>
+      </w:r>
+      <w:r>
+        <w:t xml:space="preserve"> </w:t>
+      </w:r>
+      <w:r>
+        <w:rPr>
+          <w:rStyle w:val="VerbatimChar"/>
+        </w:rPr>
+        <w:t xml:space="preserve">description</w:t>
+      </w:r>
+      <w:r>
+        <w:t xml:space="preserve">,</w:t>
+      </w:r>
+      <w:r>
+        <w:t xml:space="preserve"> </w:t>
+      </w:r>
+      <w:r>
+        <w:rPr>
+          <w:rStyle w:val="VerbatimChar"/>
+        </w:rPr>
+        <w:t xml:space="preserve">price_usd</w:t>
+      </w:r>
+      <w:r>
+        <w:t xml:space="preserve">,</w:t>
+      </w:r>
+      <w:r>
+        <w:t xml:space="preserve"> </w:t>
+      </w:r>
+      <w:r>
+        <w:rPr>
+          <w:rStyle w:val="VerbatimChar"/>
+        </w:rPr>
+        <w:t xml:space="preserve">royalty_tier</w:t>
+      </w:r>
+      <w:r>
+        <w:t xml:space="preserve">,</w:t>
+      </w:r>
+      <w:r>
+        <w:t xml:space="preserve"> </w:t>
+      </w:r>
+      <w:r>
+        <w:rPr>
+          <w:rStyle w:val="VerbatimChar"/>
+        </w:rPr>
+        <w:t xml:space="preserve">page_count</w:t>
+      </w:r>
+      <w:r>
+        <w:t xml:space="preserve">,</w:t>
+      </w:r>
+      <w:r>
+        <w:t xml:space="preserve"> </w:t>
+      </w:r>
+      <w:r>
+        <w:rPr>
+          <w:rStyle w:val="VerbatimChar"/>
+        </w:rPr>
+        <w:t xml:space="preserve">word_count</w:t>
+      </w:r>
+      <w:r>
+        <w:t xml:space="preserve">,</w:t>
+      </w:r>
+      <w:r>
+        <w:t xml:space="preserve"> </w:t>
+      </w:r>
+      <w:r>
+        <w:rPr>
+          <w:rStyle w:val="VerbatimChar"/>
+        </w:rPr>
+        <w:t xml:space="preserve">chapter_outline</w:t>
+      </w:r>
+      <w:r>
+        <w:t xml:space="preserve"> </w:t>
+      </w:r>
+      <w:r>
+        <w:t xml:space="preserve">(5 to 12 items),</w:t>
+      </w:r>
+      <w:r>
+        <w:t xml:space="preserve"> </w:t>
+      </w:r>
+      <w:r>
+        <w:rPr>
+          <w:rStyle w:val="VerbatimChar"/>
+        </w:rPr>
+        <w:t xml:space="preserve">tone_and_style</w:t>
+      </w:r>
+      <w:r>
+        <w:t xml:space="preserve">, and</w:t>
+      </w:r>
+      <w:r>
+        <w:t xml:space="preserve"> </w:t>
+      </w:r>
+      <w:r>
+        <w:rPr>
+          <w:rStyle w:val="VerbatimChar"/>
+        </w:rPr>
+        <w:t xml:space="preserve">title_options</w:t>
+      </w:r>
+      <w:r>
+        <w:t xml:space="preserve"> </w:t>
+      </w:r>
+      <w:r>
+        <w:t xml:space="preserve">(2 to 3).</w:t>
+      </w:r>
+    </w:p>
+    <w:p>
+      <w:pPr>
+        <w:numPr>
+          <w:ilvl w:val="0"/>
+          <w:numId w:val="1002"/>
+        </w:numPr>
+        <w:pStyle w:val="Compact"/>
+      </w:pPr>
+      <w:r>
+        <w:rPr>
+          <w:bCs/>
+          <w:b/>
+        </w:rPr>
+        <w:t xml:space="preserve">Recorded by Kindle-1 but not needed to write:</w:t>
+      </w:r>
+      <w:r>
+        <w:t xml:space="preserve"> </w:t>
+      </w:r>
+      <w:r>
+        <w:rPr>
+          <w:rStyle w:val="VerbatimChar"/>
+        </w:rPr>
         <w:t xml:space="preserve">score</w:t>
       </w:r>
       <w:r>
@@ -361,7 +564,7 @@
         <w:rPr>
           <w:rStyle w:val="VerbatimChar"/>
         </w:rPr>
-        <w:t xml:space="preserve">description</w:t>
+        <w:t xml:space="preserve">risks</w:t>
       </w:r>
       <w:r>
         <w:t xml:space="preserve">,</w:t>
@@ -373,148 +576,61 @@
         <w:rPr>
           <w:rStyle w:val="VerbatimChar"/>
         </w:rPr>
-        <w:t xml:space="preserve">target_reader</w:t>
-      </w:r>
-      <w:r>
-        <w:t xml:space="preserve">,</w:t>
-      </w:r>
-      <w:r>
-        <w:t xml:space="preserve"> </w:t>
-      </w:r>
-      <w:r>
-        <w:rPr>
-          <w:rStyle w:val="VerbatimChar"/>
-        </w:rPr>
-        <w:t xml:space="preserve">format</w:t>
-      </w:r>
-      <w:r>
-        <w:t xml:space="preserve">,</w:t>
-      </w:r>
-      <w:r>
-        <w:t xml:space="preserve"> </w:t>
-      </w:r>
-      <w:r>
-        <w:rPr>
-          <w:rStyle w:val="VerbatimChar"/>
-        </w:rPr>
-        <w:t xml:space="preserve">price_usd</w:t>
-      </w:r>
-      <w:r>
-        <w:t xml:space="preserve">,</w:t>
-      </w:r>
-      <w:r>
-        <w:t xml:space="preserve"> </w:t>
-      </w:r>
-      <w:r>
-        <w:rPr>
-          <w:rStyle w:val="VerbatimChar"/>
-        </w:rPr>
-        <w:t xml:space="preserve">royalty_tier</w:t>
-      </w:r>
-      <w:r>
-        <w:t xml:space="preserve">,</w:t>
-      </w:r>
-      <w:r>
-        <w:t xml:space="preserve"> </w:t>
-      </w:r>
-      <w:r>
-        <w:rPr>
-          <w:rStyle w:val="VerbatimChar"/>
-        </w:rPr>
-        <w:t xml:space="preserve">page_count</w:t>
-      </w:r>
-      <w:r>
-        <w:t xml:space="preserve">,</w:t>
-      </w:r>
-      <w:r>
-        <w:t xml:space="preserve"> </w:t>
-      </w:r>
-      <w:r>
-        <w:rPr>
-          <w:rStyle w:val="VerbatimChar"/>
-        </w:rPr>
-        <w:t xml:space="preserve">word_count</w:t>
-      </w:r>
-      <w:r>
-        <w:t xml:space="preserve">,</w:t>
-      </w:r>
-      <w:r>
-        <w:t xml:space="preserve"> </w:t>
-      </w:r>
-      <w:r>
-        <w:rPr>
-          <w:rStyle w:val="VerbatimChar"/>
-        </w:rPr>
-        <w:t xml:space="preserve">chapter_outline</w:t>
-      </w:r>
-      <w:r>
-        <w:t xml:space="preserve"> </w:t>
-      </w:r>
-      <w:r>
-        <w:t xml:space="preserve">(5 to 12 items),</w:t>
-      </w:r>
-      <w:r>
-        <w:t xml:space="preserve"> </w:t>
-      </w:r>
-      <w:r>
-        <w:rPr>
-          <w:rStyle w:val="VerbatimChar"/>
-        </w:rPr>
-        <w:t xml:space="preserve">tone_and_style</w:t>
-      </w:r>
-      <w:r>
-        <w:t xml:space="preserve">,</w:t>
-      </w:r>
-      <w:r>
-        <w:t xml:space="preserve"> </w:t>
-      </w:r>
-      <w:r>
-        <w:rPr>
-          <w:rStyle w:val="VerbatimChar"/>
-        </w:rPr>
-        <w:t xml:space="preserve">title_options</w:t>
-      </w:r>
-      <w:r>
-        <w:t xml:space="preserve"> </w:t>
-      </w:r>
-      <w:r>
-        <w:t xml:space="preserve">(2 to 3),</w:t>
-      </w:r>
-      <w:r>
-        <w:t xml:space="preserve"> </w:t>
-      </w:r>
-      <w:r>
-        <w:rPr>
-          <w:rStyle w:val="VerbatimChar"/>
+        <w:t xml:space="preserve">sales_estimate</w:t>
+      </w:r>
+      <w:r>
+        <w:t xml:space="preserve">, and</w:t>
+      </w:r>
+      <w:r>
+        <w:t xml:space="preserve"> </w:t>
+      </w:r>
+      <w:r>
+        <w:rPr>
+          <w:rStyle w:val="VerbatimChar"/>
+        </w:rPr>
+        <w:t xml:space="preserve">cover_idea</w:t>
+      </w:r>
+      <w:r>
+        <w:t xml:space="preserve">. Kindle-2 does not stop when these are missing.</w:t>
+      </w:r>
+    </w:p>
+    <w:p>
+      <w:pPr>
+        <w:numPr>
+          <w:ilvl w:val="0"/>
+          <w:numId w:val="1002"/>
+        </w:numPr>
+        <w:pStyle w:val="Compact"/>
+      </w:pPr>
+      <w:r>
+        <w:rPr>
+          <w:rStyle w:val="VerbatimChar"/>
+          <w:bCs/>
+          <w:b/>
         </w:rPr>
         <w:t xml:space="preserve">kdp_keywords</w:t>
       </w:r>
       <w:r>
-        <w:t xml:space="preserve"> </w:t>
-      </w:r>
-      <w:r>
-        <w:t xml:space="preserve">(exactly 7),</w:t>
-      </w:r>
-      <w:r>
-        <w:t xml:space="preserve"> </w:t>
-      </w:r>
-      <w:r>
-        <w:rPr>
-          <w:rStyle w:val="VerbatimChar"/>
-        </w:rPr>
-        <w:t xml:space="preserve">risks</w:t>
-      </w:r>
-      <w:r>
-        <w:t xml:space="preserve">, and</w:t>
-      </w:r>
-      <w:r>
-        <w:t xml:space="preserve"> </w:t>
-      </w:r>
-      <w:r>
-        <w:rPr>
-          <w:rStyle w:val="VerbatimChar"/>
-        </w:rPr>
-        <w:t xml:space="preserve">sales_estimate</w:t>
+        <w:rPr>
+          <w:bCs/>
+          <w:b/>
+        </w:rPr>
+        <w:t xml:space="preserve">:</w:t>
+      </w:r>
+      <w:r>
+        <w:t xml:space="preserve"> </w:t>
+      </w:r>
+      <w:r>
+        <w:t xml:space="preserve">if the topic has exactly seven, Kindle-2 uses them. If not, Kindle-2 derives seven, each under 50 characters, and records that in</w:t>
+      </w:r>
+      <w:r>
+        <w:t xml:space="preserve"> </w:t>
+      </w:r>
+      <w:r>
+        <w:rPr>
+          <w:rStyle w:val="VerbatimChar"/>
+        </w:rPr>
+        <w:t xml:space="preserve">review-notes.md</w:t>
       </w:r>
       <w:r>
         <w:t xml:space="preserve">.</w:t>
@@ -2839,17 +2955,17 @@
     <w:tbl>
       <w:tblPr>
         <w:tblStyle w:val="Table"/>
-        <w:tblW w:type="pct" w:w="5000"/>
+        <w:tblW w:type="pct" w:w="4949"/>
         <w:tblLook w:firstRow="1" w:lastRow="0" w:firstColumn="0" w:lastColumn="0" w:noHBand="0" w:noVBand="0" w:val="0020"/>
         <w:jc w:val="start"/>
       </w:tblPr>
       <w:tblGrid>
-        <w:gridCol w:w="1320"/>
-        <w:gridCol w:w="1320"/>
-        <w:gridCol w:w="1320"/>
-        <w:gridCol w:w="1320"/>
-        <w:gridCol w:w="1320"/>
-        <w:gridCol w:w="1320"/>
+        <w:gridCol w:w="2141"/>
+        <w:gridCol w:w="1373"/>
+        <w:gridCol w:w="2020"/>
+        <w:gridCol w:w="606"/>
+        <w:gridCol w:w="929"/>
+        <w:gridCol w:w="767"/>
       </w:tblGrid>
       <w:tr>
         <w:trPr>
@@ -4976,14 +5092,14 @@
     <w:tbl>
       <w:tblPr>
         <w:tblStyle w:val="Table"/>
-        <w:tblW w:type="pct" w:w="5000"/>
+        <w:tblW w:type="pct" w:w="4939"/>
         <w:tblLook w:firstRow="1" w:lastRow="0" w:firstColumn="0" w:lastColumn="0" w:noHBand="0" w:noVBand="0" w:val="0020"/>
         <w:jc w:val="start"/>
       </w:tblPr>
       <w:tblGrid>
-        <w:gridCol w:w="2640"/>
-        <w:gridCol w:w="2640"/>
-        <w:gridCol w:w="2640"/>
+        <w:gridCol w:w="3498"/>
+        <w:gridCol w:w="2915"/>
+        <w:gridCol w:w="1409"/>
       </w:tblGrid>
       <w:tr>
         <w:trPr>
@@ -5822,6 +5938,28 @@
       </w:r>
       <w:r>
         <w:t xml:space="preserve">category rules table added to section 10, so each category sets its book type, length, price, status, and cover rule. Puzzles &amp; Games marked paused. Fix-or-stop table added to section 15. Duplicate check list removed from section 13. The second-category line in section 16 corrected to a third-category decision. Version stays 2.1 because the robot prompts and check_book.py check for it.</w:t>
+      </w:r>
+    </w:p>
+    <w:p>
+      <w:pPr>
+        <w:numPr>
+          <w:ilvl w:val="0"/>
+          <w:numId w:val="1012"/>
+        </w:numPr>
+        <w:pStyle w:val="Compact"/>
+      </w:pPr>
+      <w:r>
+        <w:rPr>
+          <w:bCs/>
+          <w:b/>
+        </w:rPr>
+        <w:t xml:space="preserve">2.1 amendment (18 October 2026, second):</w:t>
+      </w:r>
+      <w:r>
+        <w:t xml:space="preserve"> </w:t>
+      </w:r>
+      <w:r>
+        <w:t xml:space="preserve">section 2 narrowed to the fields Kindle-2 needs to write a book, so topics without score or risks are not blocked. Kindle-2 derives keywords when missing. Version stays 2.1.</w:t>
       </w:r>
     </w:p>
     <w:p>

</xml_diff>

<commit_message>
Guide: US spelling for judgment and line
Co-Authored-By: Claude Haiku 5.5 <noreply@anthropic.com>
Claude-Session: https://claude.ai/code/session_01MZeVJcyf7XvKRRCE6AUkLk
</commit_message>
<xml_diff>
--- a/ebooks-Raw/guide.docx
+++ b/ebooks-Raw/guide.docx
@@ -1042,13 +1042,7 @@
         <w:t xml:space="preserve"> </w:t>
       </w:r>
       <w:r>
-        <w:t xml:space="preserve">hit the target length within 10 percent. If the draft is short, extend scenes and examples, not filler. If it is long, cut repetition first.</w:t>
-      </w:r>
-      <w:r>
-        <w:t xml:space="preserve"> </w:t>
-      </w:r>
-      <w:r>
-        <w:t xml:space="preserve">-</w:t>
+        <w:t xml:space="preserve">hit the target length within 10 percent. If the draft is short, extend scenes and examples, not filler. If it is long, cut repetition first. -</w:t>
       </w:r>
       <w:r>
         <w:t xml:space="preserve"> </w:t>
@@ -2516,13 +2510,7 @@
         <w:t xml:space="preserve">”</w:t>
       </w:r>
       <w:r>
-        <w:t xml:space="preserve">).</w:t>
-      </w:r>
-      <w:r>
-        <w:t xml:space="preserve"> </w:t>
-      </w:r>
-      <w:r>
-        <w:t xml:space="preserve">The title page is the first thing in</w:t>
+        <w:t xml:space="preserve">). The title page is the first thing in</w:t>
       </w:r>
       <w:r>
         <w:t xml:space="preserve"> </w:t>
@@ -2716,13 +2704,13 @@
     <w:tbl>
       <w:tblPr>
         <w:tblStyle w:val="Table"/>
-        <w:tblW w:type="pct" w:w="4937"/>
+        <w:tblW w:type="pct" w:w="4938"/>
         <w:tblLook w:firstRow="1" w:lastRow="0" w:firstColumn="0" w:lastColumn="0" w:noHBand="0" w:noVBand="0" w:val="0020"/>
         <w:jc w:val="start"/>
       </w:tblPr>
       <w:tblGrid>
-        <w:gridCol w:w="2005"/>
-        <w:gridCol w:w="5814"/>
+        <w:gridCol w:w="1980"/>
+        <w:gridCol w:w="5841"/>
       </w:tblGrid>
       <w:tr>
         <w:trPr>
@@ -3148,7 +3136,7 @@
         <w:t xml:space="preserve"> </w:t>
       </w:r>
       <w:r>
-        <w:t xml:space="preserve">only picks a topic whose two categories are both confirmed in the pool. A topic with an unconfirmed or missing category waits in the queue. It is not written and not marked used.</w:t>
+        <w:t xml:space="preserve">only picks a topic whose two categories are both confirmed in the pool. A topic with an unconfirmed or missing category waits in the line. It is not written and not marked used.</w:t>
       </w:r>
     </w:p>
     <w:p>
@@ -5035,7 +5023,7 @@
           <w:bCs/>
           <w:b/>
         </w:rPr>
-        <w:t xml:space="preserve">Judgement checks (Kindle-3 reads the book).</w:t>
+        <w:t xml:space="preserve">Judgment checks (Kindle-3 reads the book).</w:t>
       </w:r>
       <w:r>
         <w:t xml:space="preserve"> </w:t>
@@ -5483,14 +5471,14 @@
     <w:tbl>
       <w:tblPr>
         <w:tblStyle w:val="Table"/>
-        <w:tblW w:type="pct" w:w="4939"/>
+        <w:tblW w:type="pct" w:w="4986"/>
         <w:tblLook w:firstRow="1" w:lastRow="0" w:firstColumn="0" w:lastColumn="0" w:noHBand="0" w:noVBand="0" w:val="0020"/>
         <w:jc w:val="start"/>
       </w:tblPr>
       <w:tblGrid>
-        <w:gridCol w:w="3498"/>
-        <w:gridCol w:w="2915"/>
-        <w:gridCol w:w="1409"/>
+        <w:gridCol w:w="4858"/>
+        <w:gridCol w:w="2711"/>
+        <w:gridCol w:w="327"/>
       </w:tblGrid>
       <w:tr>
         <w:trPr>
@@ -5832,19 +5820,19 @@
               <w:jc w:val="left"/>
             </w:pPr>
             <w:r>
-              <w:t xml:space="preserve">Topic waits in the queue; nothing is written</w:t>
-            </w:r>
-          </w:p>
-        </w:tc>
-        <w:tc>
-          <w:tcPr/>
-          <w:p>
-            <w:pPr>
-              <w:pStyle w:val="Compact"/>
-              <w:jc w:val="left"/>
-            </w:pPr>
-            <w:r>
-              <w:t xml:space="preserve">Owner confirms</w:t>
+              <w:t xml:space="preserve">Topic waits in the line; nothing is written O</w:t>
+            </w:r>
+          </w:p>
+        </w:tc>
+        <w:tc>
+          <w:tcPr/>
+          <w:p>
+            <w:pPr>
+              <w:pStyle w:val="Compact"/>
+              <w:jc w:val="left"/>
+            </w:pPr>
+            <w:r>
+              <w:t xml:space="preserve">wner confirms</w:t>
             </w:r>
           </w:p>
         </w:tc>
@@ -5946,79 +5934,19 @@
               <w:jc w:val="left"/>
             </w:pPr>
             <w:r>
-              <w:t xml:space="preserve">Trademark, copyrighted work, or real-person likeness found</w:t>
-            </w:r>
-            <w:r>
-              <w:t xml:space="preserve"> </w:t>
-            </w:r>
-            <w:r>
-              <w:t xml:space="preserve">British spelling or pound signs found | Change to US spelling and dollar</w:t>
-            </w:r>
-            <w:r>
-              <w:t xml:space="preserve"> </w:t>
-            </w:r>
-            <w:r>
-              <w:t xml:space="preserve">Manuscript has no title page | Add the title page at the top of manuscri</w:t>
-            </w:r>
-            <w:r>
-              <w:t xml:space="preserve"> </w:t>
-            </w:r>
-            <w:r>
-              <w:t xml:space="preserve">Workbook has fewer than 10 answer blocks | Add an answer block after eac</w:t>
-            </w:r>
-            <w:r>
-              <w:t xml:space="preserve"> </w:t>
-            </w:r>
-            <w:r>
-              <w:t xml:space="preserve">Two characters have similar names | Rename one character throughout the</w:t>
-            </w:r>
-            <w:r>
-              <w:t xml:space="preserve"> </w:t>
-            </w:r>
-            <w:r>
-              <w:t xml:space="preserve">A research claim has no source | Add a source to metadata.json, or remov</w:t>
-            </w:r>
-          </w:p>
-        </w:tc>
-        <w:tc>
-          <w:tcPr/>
-          <w:p>
-            <w:pPr>
-              <w:pStyle w:val="Compact"/>
-              <w:jc w:val="left"/>
-            </w:pPr>
-            <w:r>
-              <w:t xml:space="preserve">Stop; delete the partial folder</w:t>
-            </w:r>
-            <w:r>
-              <w:t xml:space="preserve"> </w:t>
-            </w:r>
-            <w:r>
-              <w:t xml:space="preserve">s, then run the check again | Kindle-2 or Kindle-3 fixes |</w:t>
-            </w:r>
-            <w:r>
-              <w:t xml:space="preserve"> </w:t>
-            </w:r>
-            <w:r>
-              <w:t xml:space="preserve">pt.md | Kindle-2 fixes |</w:t>
-            </w:r>
-            <w:r>
-              <w:t xml:space="preserve"> </w:t>
-            </w:r>
-            <w:r>
-              <w:t xml:space="preserve">h prompt | Kindle-2 fixes |</w:t>
-            </w:r>
-            <w:r>
-              <w:t xml:space="preserve"> </w:t>
-            </w:r>
-            <w:r>
-              <w:t xml:space="preserve">book | Kindle-2 fixes |</w:t>
-            </w:r>
-            <w:r>
-              <w:t xml:space="preserve"> </w:t>
-            </w:r>
-            <w:r>
-              <w:t xml:space="preserve">e the claim | Kindle-2 fixes, or stops if it cannot be verif</w:t>
+              <w:t xml:space="preserve">Trademark, copyrighted work, or real-person likeness found British spelling or pound signs found | Change to US spelling and dollar Manuscript has no title page | Add the title page at the top of manuscri Workbook has fewer than 10 answer blocks | Add an answer block after eac Two characters have similar names | Rename one character throughout the A research claim has no source | Add a source to metadata.json, or remov</w:t>
+            </w:r>
+          </w:p>
+        </w:tc>
+        <w:tc>
+          <w:tcPr/>
+          <w:p>
+            <w:pPr>
+              <w:pStyle w:val="Compact"/>
+              <w:jc w:val="left"/>
+            </w:pPr>
+            <w:r>
+              <w:t xml:space="preserve">Stop; delete the partial folder s, then run the check again | Kindle-2 or Kindle-3 fixes | pt.md | Kindle-2 fixes | h prompt | Kindle-2 fixes | book | Kindle-2 fixes | e the claim | Kindle-2 fixes, or stops if it cannot be verif</w:t>
             </w:r>
           </w:p>
         </w:tc>
@@ -6673,14 +6601,14 @@
     <w:tbl>
       <w:tblPr>
         <w:tblStyle w:val="Table"/>
-        <w:tblW w:type="pct" w:w="5000"/>
+        <w:tblW w:type="pct" w:w="4954"/>
         <w:tblLook w:firstRow="1" w:lastRow="0" w:firstColumn="0" w:lastColumn="0" w:noHBand="0" w:noVBand="0" w:val="0020"/>
         <w:jc w:val="start"/>
       </w:tblPr>
       <w:tblGrid>
-        <w:gridCol w:w="2640"/>
-        <w:gridCol w:w="2640"/>
-        <w:gridCol w:w="2640"/>
+        <w:gridCol w:w="3363"/>
+        <w:gridCol w:w="2386"/>
+        <w:gridCol w:w="2097"/>
       </w:tblGrid>
       <w:tr>
         <w:trPr>
@@ -6903,7 +6831,7 @@
               <w:jc w:val="left"/>
             </w:pPr>
             <w:r>
-              <w:t xml:space="preserve">Kindle-3 judgement check (section 13)</w:t>
+              <w:t xml:space="preserve">Kindle-3 judgment check (section 13)</w:t>
             </w:r>
           </w:p>
         </w:tc>
@@ -6941,7 +6869,7 @@
               <w:jc w:val="left"/>
             </w:pPr>
             <w:r>
-              <w:t xml:space="preserve">Kindle-3 judgement check; metadata sources</w:t>
+              <w:t xml:space="preserve">Kindle-3 judgment check; metadata sources</w:t>
             </w:r>
           </w:p>
         </w:tc>

</xml_diff>

<commit_message>
Guide and checks: names/sourcing check, guide contradictions fixed
- check_names_sources.py: flags similar character names and research claims without sources; wired into check_book.py
- check_language.py: removed false positive ('rambling'); ambiguous words match lowercase only
- guide: section 3 workbook rule split; section 1 fixed-layout wording; section 15 fix-or-stop table rebuilt; unconfirmed category waits in line (section 10); section 11 files key; section 13 lists every mechanical check; 'honours' to 'honors'; change log entry

Co-Authored-By: Claude Haiku 5.5 <noreply@anthropic.com>
Claude-Session: https://claude.ai/code/session_01MZeVJcyf7XvKRRCE6AUkLk
</commit_message>
<xml_diff>
--- a/ebooks-Raw/guide.docx
+++ b/ebooks-Raw/guide.docx
@@ -109,7 +109,7 @@
         <w:t xml:space="preserve"> </w:t>
       </w:r>
       <w:r>
-        <w:t xml:space="preserve">Kindle eBooks for Amazon KDP only. Text-only EPUB, with a fixed-layout EPUB where the format requires it.</w:t>
+        <w:t>Kindle eBooks for Amazon KDP only. Text-only EPUB. The fixed-layout EPUB is paused until the owner approves a builder (section 3).</w:t>
       </w:r>
       <w:r>
         <w:t xml:space="preserve"> </w:t>
@@ -1036,66 +1036,31 @@
           <w:bCs/>
           <w:b/>
         </w:rPr>
-        <w:t xml:space="preserve">REQUIRED:</w:t>
-      </w:r>
-      <w:r>
-        <w:t xml:space="preserve"> </w:t>
-      </w:r>
-      <w:r>
-        <w:t xml:space="preserve">hit the target length within 10 percent. If the draft is short, extend scenes and examples, not filler. If it is long, cut repetition first. -</w:t>
-      </w:r>
-      <w:r>
-        <w:t xml:space="preserve"> </w:t>
-      </w:r>
+        <w:t>REQUIRED:</w:t>
+      </w:r>
+      <w:r>
+        <w:rPr>
+          <w:b w:val="0"/>
+        </w:rPr>
+        <w:t xml:space="preserve"> hit the target length within 10 percent. If the draft is short, extend scenes and examples, not filler. If it is long, cut repetition first.</w:t>
+      </w:r>
+    </w:p>
+    <w:p>
+      <w:pPr>
+        <w:pStyle w:val="BodyText"/>
+      </w:pPr>
       <w:r>
         <w:rPr>
           <w:bCs/>
           <w:b/>
         </w:rPr>
-        <w:t xml:space="preserve">REQUIRED for workbooks:</w:t>
-      </w:r>
-      <w:r>
-        <w:t xml:space="preserve"> </w:t>
-      </w:r>
-      <w:r>
-        <w:t xml:space="preserve">every numbered prompt is followed by an answer block: the words</w:t>
-      </w:r>
-      <w:r>
-        <w:t xml:space="preserve"> </w:t>
-      </w:r>
-      <w:r>
-        <w:t xml:space="preserve">“</w:t>
-      </w:r>
-      <w:r>
-        <w:rPr>
-          <w:bCs/>
-          <w:b/>
-        </w:rPr>
-        <w:t xml:space="preserve">Your answer:</w:t>
-      </w:r>
-      <w:r>
-        <w:t xml:space="preserve">”</w:t>
-      </w:r>
-      <w:r>
-        <w:t xml:space="preserve"> </w:t>
-      </w:r>
-      <w:r>
-        <w:t xml:space="preserve">and at least three lines to write on. Put one answer block after each day prompt and after each review question.</w:t>
-      </w:r>
-      <w:r>
-        <w:t xml:space="preserve"> </w:t>
-      </w:r>
-      <w:r>
-        <w:rPr>
-          <w:rStyle w:val="VerbatimChar"/>
-        </w:rPr>
-        <w:t xml:space="preserve">scripts/check_book.py</w:t>
-      </w:r>
-      <w:r>
-        <w:t xml:space="preserve"> </w:t>
-      </w:r>
-      <w:r>
-        <w:t xml:space="preserve">counts at least 10 answer blocks for a workbook.</w:t>
+        <w:t>REQUIRED for workbooks:</w:t>
+      </w:r>
+      <w:r>
+        <w:rPr>
+          <w:b w:val="0"/>
+        </w:rPr>
+        <w:t xml:space="preserve"> every numbered prompt is followed by an answer block: the words “Your answer:” and at least three lines to write on. Put one answer block after each day prompt and after each review question. scripts/check_book.py counts at least 10 answer blocks for a workbook.</w:t>
       </w:r>
     </w:p>
     <w:bookmarkEnd w:id="22"/>
@@ -4728,6 +4693,12 @@
         <w:rPr>
           <w:rStyle w:val="VerbatimChar"/>
         </w:rPr>
+        <w:t xml:space="preserve">files (the EPUB and cover file names, read by make_kdp_answers.py), </w:t>
+      </w:r>
+      <w:r>
+        <w:rPr>
+          <w:rStyle w:val="VerbatimChar"/>
+        </w:rPr>
         <w:t xml:space="preserve">cover</w:t>
       </w:r>
       <w:r>
@@ -4884,7 +4855,7 @@
         <w:t xml:space="preserve"> </w:t>
       </w:r>
       <w:r>
-        <w:t xml:space="preserve">REQUIRED: every check passes before approval. The checks are: required files; title, subtitle, and author; description length; seven keywords under 50 characters; two categories from the confirmed pool; language; exact AI disclosure wording; copyright line; placeholder scan; word count within 10 percent of target; chapter headings; epubcheck (0 errors, 0 warnings); the cover brief checks (</w:t>
+        <w:t>REQUIRED: every check passes before approval. The checks are: required files; title, subtitle, and author; description length; seven keywords under 50 characters; two categories from the confirmed pool; US English and US dollars (scripts/check_language.py); exact AI disclosure wording; copyright line; placeholder scan; word count within 10 percent of target; chapter headings; title page at the top of manuscript.md; workbook answer blocks (section 3); distinct character names and sourced research claims (scripts/check_names_sources.py); epubcheck (0 errors, 0 warnings); the cover brief checks (</w:t>
       </w:r>
       <w:r>
         <w:rPr>
@@ -5284,7 +5255,7 @@
         <w:pStyle w:val="Compact"/>
       </w:pPr>
       <w:r>
-        <w:t xml:space="preserve">A robot stops and does not finish if: the topic entry is incomplete or contradictory; a fact cannot be verified; the text or cover could use a trademark, copyrighted work, or real-person likeness; the book would give medical, financial, or legal advice; the cover cannot be made to spec; an epubcheck error cannot be fixed; or a category is unconfirmed.</w:t>
+        <w:t>A robot stops and does not finish if: the topic entry is incomplete or contradictory; a fact cannot be verified; the text or cover could use a trademark, copyrighted work, or real-person likeness; the book would give medical, financial, or legal advice; the cover cannot be made to spec; an epubcheck error cannot be fixed; or a category is not confirmed in the pool, in which case the topic waits in line and nothing is written (section 10).</w:t>
       </w:r>
     </w:p>
     <w:p>
@@ -5770,31 +5741,31 @@
               <w:jc w:val="left"/>
             </w:pPr>
             <w:r>
-              <w:t xml:space="preserve">Cover subtitle differs from metadata.json</w:t>
-            </w:r>
-          </w:p>
-        </w:tc>
-        <w:tc>
-          <w:tcPr/>
-          <w:p>
-            <w:pPr>
-              <w:pStyle w:val="Compact"/>
-              <w:jc w:val="left"/>
-            </w:pPr>
-            <w:r>
-              <w:t xml:space="preserve">Block the book until the owner decides</w:t>
-            </w:r>
-          </w:p>
-        </w:tc>
-        <w:tc>
-          <w:tcPr/>
-          <w:p>
-            <w:pPr>
-              <w:pStyle w:val="Compact"/>
-              <w:jc w:val="left"/>
-            </w:pPr>
-            <w:r>
-              <w:t xml:space="preserve">Owner decides</w:t>
+              <w:t>Cover subtitle differs from metadata.json</w:t>
+            </w:r>
+          </w:p>
+        </w:tc>
+        <w:tc>
+          <w:tcPr/>
+          <w:p>
+            <w:pPr>
+              <w:pStyle w:val="Compact"/>
+              <w:jc w:val="left"/>
+            </w:pPr>
+            <w:r>
+              <w:t>Block the book until the owner decides</w:t>
+            </w:r>
+          </w:p>
+        </w:tc>
+        <w:tc>
+          <w:tcPr/>
+          <w:p>
+            <w:pPr>
+              <w:pStyle w:val="Compact"/>
+              <w:jc w:val="left"/>
+            </w:pPr>
+            <w:r>
+              <w:t>Owner decides</w:t>
             </w:r>
           </w:p>
         </w:tc>
@@ -5808,31 +5779,31 @@
               <w:jc w:val="left"/>
             </w:pPr>
             <w:r>
-              <w:t xml:space="preserve">Category not confirmed in the pool</w:t>
-            </w:r>
-          </w:p>
-        </w:tc>
-        <w:tc>
-          <w:tcPr/>
-          <w:p>
-            <w:pPr>
-              <w:pStyle w:val="Compact"/>
-              <w:jc w:val="left"/>
-            </w:pPr>
-            <w:r>
-              <w:t xml:space="preserve">Topic waits in the line; nothing is written O</w:t>
-            </w:r>
-          </w:p>
-        </w:tc>
-        <w:tc>
-          <w:tcPr/>
-          <w:p>
-            <w:pPr>
-              <w:pStyle w:val="Compact"/>
-              <w:jc w:val="left"/>
-            </w:pPr>
-            <w:r>
-              <w:t xml:space="preserve">wner confirms</w:t>
+              <w:t>Category not confirmed in the pool</w:t>
+            </w:r>
+          </w:p>
+        </w:tc>
+        <w:tc>
+          <w:tcPr/>
+          <w:p>
+            <w:pPr>
+              <w:pStyle w:val="Compact"/>
+              <w:jc w:val="left"/>
+            </w:pPr>
+            <w:r>
+              <w:t>Topic waits in the line (section 10); nothing is written</w:t>
+            </w:r>
+          </w:p>
+        </w:tc>
+        <w:tc>
+          <w:tcPr/>
+          <w:p>
+            <w:pPr>
+              <w:pStyle w:val="Compact"/>
+              <w:jc w:val="left"/>
+            </w:pPr>
+            <w:r>
+              <w:t>Owner confirms</w:t>
             </w:r>
           </w:p>
         </w:tc>
@@ -5896,31 +5867,31 @@
               <w:jc w:val="left"/>
             </w:pPr>
             <w:r>
-              <w:t xml:space="preserve">A fact cannot be verified, or a claim is medical, financial, or legal</w:t>
-            </w:r>
-          </w:p>
-        </w:tc>
-        <w:tc>
-          <w:tcPr/>
-          <w:p>
-            <w:pPr>
-              <w:pStyle w:val="Compact"/>
-              <w:jc w:val="left"/>
-            </w:pPr>
-            <w:r>
-              <w:t xml:space="preserve">Stop; delete the partial folder</w:t>
-            </w:r>
-          </w:p>
-        </w:tc>
-        <w:tc>
-          <w:tcPr/>
-          <w:p>
-            <w:pPr>
-              <w:pStyle w:val="Compact"/>
-              <w:jc w:val="left"/>
-            </w:pPr>
-            <w:r>
-              <w:t xml:space="preserve">Kindle-2 stops</w:t>
+              <w:t>A fact cannot be verified, or a claim is medical, financial, or legal</w:t>
+            </w:r>
+          </w:p>
+        </w:tc>
+        <w:tc>
+          <w:tcPr/>
+          <w:p>
+            <w:pPr>
+              <w:pStyle w:val="Compact"/>
+              <w:jc w:val="left"/>
+            </w:pPr>
+            <w:r>
+              <w:t>Stop; delete the partial folder</w:t>
+            </w:r>
+          </w:p>
+        </w:tc>
+        <w:tc>
+          <w:tcPr/>
+          <w:p>
+            <w:pPr>
+              <w:pStyle w:val="Compact"/>
+              <w:jc w:val="left"/>
+            </w:pPr>
+            <w:r>
+              <w:t>Kindle-2 stops</w:t>
             </w:r>
           </w:p>
         </w:tc>
@@ -5934,31 +5905,221 @@
               <w:jc w:val="left"/>
             </w:pPr>
             <w:r>
-              <w:t xml:space="preserve">Trademark, copyrighted work, or real-person likeness found British spelling or pound signs found | Change to US spelling and dollar Manuscript has no title page | Add the title page at the top of manuscri Workbook has fewer than 10 answer blocks | Add an answer block after eac Two characters have similar names | Rename one character throughout the A research claim has no source | Add a source to metadata.json, or remov</w:t>
-            </w:r>
-          </w:p>
-        </w:tc>
-        <w:tc>
-          <w:tcPr/>
-          <w:p>
-            <w:pPr>
-              <w:pStyle w:val="Compact"/>
-              <w:jc w:val="left"/>
-            </w:pPr>
-            <w:r>
-              <w:t xml:space="preserve">Stop; delete the partial folder s, then run the check again | Kindle-2 or Kindle-3 fixes | pt.md | Kindle-2 fixes | h prompt | Kindle-2 fixes | book | Kindle-2 fixes | e the claim | Kindle-2 fixes, or stops if it cannot be verif</w:t>
-            </w:r>
-          </w:p>
-        </w:tc>
-        <w:tc>
-          <w:tcPr/>
-          <w:p>
-            <w:pPr>
-              <w:pStyle w:val="Compact"/>
-              <w:jc w:val="left"/>
-            </w:pPr>
-            <w:r>
-              <w:t xml:space="preserve">Kindle-2 stops</w:t>
+              <w:t>Trademark, copyrighted work, or real-person likeness</w:t>
+            </w:r>
+          </w:p>
+        </w:tc>
+        <w:tc>
+          <w:tcPr/>
+          <w:p>
+            <w:pPr>
+              <w:pStyle w:val="Compact"/>
+              <w:jc w:val="left"/>
+            </w:pPr>
+            <w:r>
+              <w:t>Stop; delete the partial folder</w:t>
+            </w:r>
+          </w:p>
+        </w:tc>
+        <w:tc>
+          <w:tcPr/>
+          <w:p>
+            <w:pPr>
+              <w:pStyle w:val="Compact"/>
+              <w:jc w:val="left"/>
+            </w:pPr>
+            <w:r>
+              <w:t>Kindle-2 stops</w:t>
+            </w:r>
+          </w:p>
+        </w:tc>
+      </w:tr>
+      <w:tr>
+        <w:tc>
+          <w:tcPr/>
+          <w:p>
+            <w:pPr>
+              <w:pStyle w:val="Compact"/>
+              <w:jc w:val="left"/>
+            </w:pPr>
+            <w:r>
+              <w:t>British spelling or pound signs found</w:t>
+            </w:r>
+          </w:p>
+        </w:tc>
+        <w:tc>
+          <w:tcPr/>
+          <w:p>
+            <w:pPr>
+              <w:pStyle w:val="Compact"/>
+              <w:jc w:val="left"/>
+            </w:pPr>
+            <w:r>
+              <w:t>Change to US spelling and US dollars (scripts/check_language.py)</w:t>
+            </w:r>
+          </w:p>
+        </w:tc>
+        <w:tc>
+          <w:tcPr/>
+          <w:p>
+            <w:pPr>
+              <w:pStyle w:val="Compact"/>
+              <w:jc w:val="left"/>
+            </w:pPr>
+            <w:r>
+              <w:t>Kindle-2 or Kindle-3 fixes</w:t>
+            </w:r>
+          </w:p>
+        </w:tc>
+      </w:tr>
+      <w:tr>
+        <w:tc>
+          <w:tcPr/>
+          <w:p>
+            <w:pPr>
+              <w:pStyle w:val="Compact"/>
+              <w:jc w:val="left"/>
+            </w:pPr>
+            <w:r>
+              <w:t>Manuscript has no title page</w:t>
+            </w:r>
+          </w:p>
+        </w:tc>
+        <w:tc>
+          <w:tcPr/>
+          <w:p>
+            <w:pPr>
+              <w:pStyle w:val="Compact"/>
+              <w:jc w:val="left"/>
+            </w:pPr>
+            <w:r>
+              <w:t>Add the title page at the top of manuscript.md</w:t>
+            </w:r>
+          </w:p>
+        </w:tc>
+        <w:tc>
+          <w:tcPr/>
+          <w:p>
+            <w:pPr>
+              <w:pStyle w:val="Compact"/>
+              <w:jc w:val="left"/>
+            </w:pPr>
+            <w:r>
+              <w:t>Kindle-2 fixes</w:t>
+            </w:r>
+          </w:p>
+        </w:tc>
+      </w:tr>
+      <w:tr>
+        <w:tc>
+          <w:tcPr/>
+          <w:p>
+            <w:pPr>
+              <w:pStyle w:val="Compact"/>
+              <w:jc w:val="left"/>
+            </w:pPr>
+            <w:r>
+              <w:t>Workbook has fewer than 10 answer blocks</w:t>
+            </w:r>
+          </w:p>
+        </w:tc>
+        <w:tc>
+          <w:tcPr/>
+          <w:p>
+            <w:pPr>
+              <w:pStyle w:val="Compact"/>
+              <w:jc w:val="left"/>
+            </w:pPr>
+            <w:r>
+              <w:t>Add an answer block after each prompt and review question</w:t>
+            </w:r>
+          </w:p>
+        </w:tc>
+        <w:tc>
+          <w:tcPr/>
+          <w:p>
+            <w:pPr>
+              <w:pStyle w:val="Compact"/>
+              <w:jc w:val="left"/>
+            </w:pPr>
+            <w:r>
+              <w:t>Kindle-2 fixes</w:t>
+            </w:r>
+          </w:p>
+        </w:tc>
+      </w:tr>
+      <w:tr>
+        <w:tc>
+          <w:tcPr/>
+          <w:p>
+            <w:pPr>
+              <w:pStyle w:val="Compact"/>
+              <w:jc w:val="left"/>
+            </w:pPr>
+            <w:r>
+              <w:t>Two characters have similar names</w:t>
+            </w:r>
+          </w:p>
+        </w:tc>
+        <w:tc>
+          <w:tcPr/>
+          <w:p>
+            <w:pPr>
+              <w:pStyle w:val="Compact"/>
+              <w:jc w:val="left"/>
+            </w:pPr>
+            <w:r>
+              <w:t>Rename one character throughout the book</w:t>
+            </w:r>
+          </w:p>
+        </w:tc>
+        <w:tc>
+          <w:tcPr/>
+          <w:p>
+            <w:pPr>
+              <w:pStyle w:val="Compact"/>
+              <w:jc w:val="left"/>
+            </w:pPr>
+            <w:r>
+              <w:t>Kindle-2 fixes</w:t>
+            </w:r>
+          </w:p>
+        </w:tc>
+      </w:tr>
+      <w:tr>
+        <w:tc>
+          <w:tcPr/>
+          <w:p>
+            <w:pPr>
+              <w:pStyle w:val="Compact"/>
+              <w:jc w:val="left"/>
+            </w:pPr>
+            <w:r>
+              <w:t>A research claim has no source</w:t>
+            </w:r>
+          </w:p>
+        </w:tc>
+        <w:tc>
+          <w:tcPr/>
+          <w:p>
+            <w:pPr>
+              <w:pStyle w:val="Compact"/>
+              <w:jc w:val="left"/>
+            </w:pPr>
+            <w:r>
+              <w:t>Add a source to metadata.json, or remove the claim; stop if it cannot be verified</w:t>
+            </w:r>
+          </w:p>
+        </w:tc>
+        <w:tc>
+          <w:tcPr/>
+          <w:p>
+            <w:pPr>
+              <w:pStyle w:val="Compact"/>
+              <w:jc w:val="left"/>
+            </w:pPr>
+            <w:r>
+              <w:t>Kindle-2 fixes, or stops</w:t>
             </w:r>
           </w:p>
         </w:tc>
@@ -6367,41 +6528,25 @@
           <w:bCs/>
           <w:b/>
         </w:rPr>
-        <w:t xml:space="preserve">2.1 amendment (18 October 2026, third):</w:t>
-      </w:r>
-      <w:r>
-        <w:t xml:space="preserve"> </w:t>
-      </w:r>
-      <w:r>
-        <w:t xml:space="preserve">US English and US dollars made REQUIRED, with</w:t>
-      </w:r>
-      <w:r>
-        <w:t xml:space="preserve"> </w:t>
-      </w:r>
-      <w:r>
-        <w:rPr>
-          <w:rStyle w:val="VerbatimChar"/>
-        </w:rPr>
-        <w:t xml:space="preserve">scripts/check_language.py</w:t>
-      </w:r>
-      <w:r>
-        <w:t xml:space="preserve">. Title page made a check. Workbooks need answer blocks after every prompt. Distinct names and sourced claims made REQUIRED. Test runs and review-note rules added to section 15. The fix-or-stop table extended. Section 20 added, listing each mistake found in review and the rule that now prevents it. The guide itself changed to US spelling. Version stays 2.1 because the robot prompts and</w:t>
-      </w:r>
-      <w:r>
-        <w:t xml:space="preserve"> </w:t>
-      </w:r>
-      <w:r>
-        <w:rPr>
-          <w:rStyle w:val="VerbatimChar"/>
-        </w:rPr>
-        <w:t xml:space="preserve">check_book.py</w:t>
-      </w:r>
-      <w:r>
-        <w:t xml:space="preserve"> </w:t>
-      </w:r>
-      <w:r>
-        <w:t xml:space="preserve">check for it.</w:t>
-      </w:r>
+        <w:t>2.1 amendment (18 October 2026, fourth): distinct character names and sourced research claims checked by scripts/check_names_sources.py, run inside check_book.py. Title page and workbook answer blocks checked. Section 3 workbook rule split into its own paragraph; fixed-layout wording made consistent with the pause; section 15 fix-or-stop table rebuilt; an unconfirmed category waits in line (section 10); section 11 lists the files key; section 13 lists every mechanical check.</w:t>
+      </w:r>
+      <w:r/>
+      <w:r/>
+      <w:r/>
+      <w:r>
+        <w:rPr>
+          <w:rStyle w:val="VerbatimChar"/>
+        </w:rPr>
+      </w:r>
+      <w:r/>
+      <w:r/>
+      <w:r>
+        <w:rPr>
+          <w:rStyle w:val="VerbatimChar"/>
+        </w:rPr>
+      </w:r>
+      <w:r/>
+      <w:r/>
     </w:p>
     <w:p>
       <w:pPr>
@@ -6416,13 +6561,40 @@
           <w:bCs/>
           <w:b/>
         </w:rPr>
-        <w:t xml:space="preserve">2.1 amendment (18 October 2026):</w:t>
-      </w:r>
-      <w:r>
-        <w:t xml:space="preserve"> </w:t>
-      </w:r>
-      <w:r>
-        <w:t xml:space="preserve">category rules table added to section 10, so each category sets its book type, length, price, status, and cover rule. Puzzles &amp; Games marked paused. Fix-or-stop table added to section 15. Duplicate check list removed from section 13. The second-category line in section 16 corrected to a third-category decision. Version stays 2.1 because the robot prompts and check_book.py check for it.</w:t>
+        <w:t xml:space="preserve">2.1 amendment (18 October 2026, third):</w:t>
+      </w:r>
+      <w:r>
+        <w:t xml:space="preserve"> </w:t>
+      </w:r>
+      <w:r>
+        <w:t xml:space="preserve">US English and US dollars made REQUIRED, with</w:t>
+      </w:r>
+      <w:r>
+        <w:t xml:space="preserve"> </w:t>
+      </w:r>
+      <w:r>
+        <w:rPr>
+          <w:rStyle w:val="VerbatimChar"/>
+        </w:rPr>
+        <w:t xml:space="preserve">scripts/check_language.py</w:t>
+      </w:r>
+      <w:r>
+        <w:t xml:space="preserve">. Title page made a check. Workbooks need answer blocks after every prompt. Distinct names and sourced claims made REQUIRED. Test runs and review-note rules added to section 15. The fix-or-stop table extended. Section 20 added, listing each mistake found in review and the rule that now prevents it. The guide itself changed to US spelling. Version stays 2.1 because the robot prompts and</w:t>
+      </w:r>
+      <w:r>
+        <w:t xml:space="preserve"> </w:t>
+      </w:r>
+      <w:r>
+        <w:rPr>
+          <w:rStyle w:val="VerbatimChar"/>
+        </w:rPr>
+        <w:t xml:space="preserve">check_book.py</w:t>
+      </w:r>
+      <w:r>
+        <w:t xml:space="preserve"> </w:t>
+      </w:r>
+      <w:r>
+        <w:t xml:space="preserve">check for it.</w:t>
       </w:r>
     </w:p>
     <w:p>
@@ -6438,13 +6610,13 @@
           <w:bCs/>
           <w:b/>
         </w:rPr>
-        <w:t xml:space="preserve">2.1 amendment (18 October 2026, second):</w:t>
-      </w:r>
-      <w:r>
-        <w:t xml:space="preserve"> </w:t>
-      </w:r>
-      <w:r>
-        <w:t xml:space="preserve">section 2 narrowed to the fields Kindle-2 needs to write a book, so topics without score or risks are not blocked. Kindle-2 derives keywords when missing. Version stays 2.1.</w:t>
+        <w:t xml:space="preserve">2.1 amendment (18 October 2026):</w:t>
+      </w:r>
+      <w:r>
+        <w:t xml:space="preserve"> </w:t>
+      </w:r>
+      <w:r>
+        <w:t xml:space="preserve">category rules table added to section 10, so each category sets its book type, length, price, status, and cover rule. Puzzles &amp; Games marked paused. Fix-or-stop table added to section 15. Duplicate check list removed from section 13. The second-category line in section 16 corrected to a third-category decision. Version stays 2.1 because the robot prompts and check_book.py check for it.</w:t>
       </w:r>
     </w:p>
     <w:p>
@@ -6460,6 +6632,28 @@
           <w:bCs/>
           <w:b/>
         </w:rPr>
+        <w:t xml:space="preserve">2.1 amendment (18 October 2026, second):</w:t>
+      </w:r>
+      <w:r>
+        <w:t xml:space="preserve"> </w:t>
+      </w:r>
+      <w:r>
+        <w:t xml:space="preserve">section 2 narrowed to the fields Kindle-2 needs to write a book, so topics without score or risks are not blocked. Kindle-2 derives keywords when missing. Version stays 2.1.</w:t>
+      </w:r>
+    </w:p>
+    <w:p>
+      <w:pPr>
+        <w:numPr>
+          <w:ilvl w:val="0"/>
+          <w:numId w:val="1012"/>
+        </w:numPr>
+        <w:pStyle w:val="Compact"/>
+      </w:pPr>
+      <w:r>
+        <w:rPr>
+          <w:bCs/>
+          <w:b/>
+        </w:rPr>
         <w:t xml:space="preserve">2.1 (18 October 2026):</w:t>
       </w:r>
       <w:r>
@@ -6514,7 +6708,7 @@
         <w:t xml:space="preserve">ebooks-Raw/cover-styles.json</w:t>
       </w:r>
       <w:r>
-        <w:t xml:space="preserve">, one profile per pool category, with the brief validator enforcing the category, palette hues, and badge rule. Review fixes: stylesheet and font license required and checked; Kindle-4 becomes the manual-upload handoff (no KDP sign-in); fixed-layout formats paused until a builder exists; picker honours topic holds; tagline rule clarified. Added scripts/build_epub.py (one build for all books) and sync_topics.py refuses fixed-layout formats, early readers and reading ages 4 to 7 on new rows.</w:t>
+        <w:t>, one profile per pool category, with the brief validator enforcing the category, palette hues, and badge rule. Review fixes: stylesheet and font license required and checked; Kindle-4 becomes the manual-upload handoff (no KDP sign-in); fixed-layout formats paused until a builder exists; picker honors topic holds; tagline rule clarified. Added scripts/build_epub.py (one build for all books) and sync_topics.py refuses fixed-layout formats, early readers and reading ages 4 to 7 on new rows.</w:t>
       </w:r>
     </w:p>
     <w:p>

</xml_diff>

<commit_message>
Guide: 2,000-word test length for every book type (original lengths kept in change log)
Owner request so a live robot test can run. Restore the original ranges when the owner says.

Co-Authored-By: Claude Haiku 5.5 <noreply@anthropic.com>
Claude-Session: https://claude.ai/code/session_01MZeVJcyf7XvKRRCE6AUkLk
</commit_message>
<xml_diff>
--- a/ebooks-Raw/guide.docx
+++ b/ebooks-Raw/guide.docx
@@ -739,7 +739,7 @@
               <w:jc w:val="left"/>
             </w:pPr>
             <w:r>
-              <w:t xml:space="preserve">55,000 to 65,000 words</w:t>
+              <w:t>2,000 words (test length)</w:t>
             </w:r>
           </w:p>
         </w:tc>
@@ -789,7 +789,7 @@
               <w:jc w:val="left"/>
             </w:pPr>
             <w:r>
-              <w:t xml:space="preserve">10,000 to 15,000 words</w:t>
+              <w:t>2,000 words (test length)</w:t>
             </w:r>
           </w:p>
         </w:tc>
@@ -839,7 +839,7 @@
               <w:jc w:val="left"/>
             </w:pPr>
             <w:r>
-              <w:t xml:space="preserve">2,000 to 4,000 words per story; 8 to 12 stories</w:t>
+              <w:t>2,000 words (test length)</w:t>
             </w:r>
           </w:p>
         </w:tc>
@@ -889,7 +889,7 @@
               <w:jc w:val="left"/>
             </w:pPr>
             <w:r>
-              <w:t xml:space="preserve">1,500 to 3,000 words</w:t>
+              <w:t>2,000 words (test length)</w:t>
             </w:r>
           </w:p>
         </w:tc>
@@ -939,7 +939,7 @@
               <w:jc w:val="left"/>
             </w:pPr>
             <w:r>
-              <w:t xml:space="preserve">100 to 150 pages</w:t>
+              <w:t>2,000 words (test length)</w:t>
             </w:r>
           </w:p>
         </w:tc>
@@ -989,7 +989,7 @@
               <w:jc w:val="left"/>
             </w:pPr>
             <w:r>
-              <w:t xml:space="preserve">11,000 to 25,000 words</w:t>
+              <w:t>2,000 words (test length)</w:t>
             </w:r>
           </w:p>
         </w:tc>
@@ -3305,7 +3305,7 @@
               <w:jc w:val="left"/>
             </w:pPr>
             <w:r>
-              <w:t xml:space="preserve">2.99 to 4.99</w:t>
+              <w:t>2,000 words (test length)</w:t>
             </w:r>
           </w:p>
         </w:tc>
@@ -3379,7 +3379,7 @@
               <w:jc w:val="left"/>
             </w:pPr>
             <w:r>
-              <w:t xml:space="preserve">2.99 to 4.99</w:t>
+              <w:t>2,000 words (test length)</w:t>
             </w:r>
           </w:p>
         </w:tc>
@@ -3453,7 +3453,7 @@
               <w:jc w:val="left"/>
             </w:pPr>
             <w:r>
-              <w:t xml:space="preserve">2.99 to 4.99</w:t>
+              <w:t>2,000 words (test length)</w:t>
             </w:r>
           </w:p>
         </w:tc>
@@ -3527,7 +3527,7 @@
               <w:jc w:val="left"/>
             </w:pPr>
             <w:r>
-              <w:t xml:space="preserve">2.99 to 4.99</w:t>
+              <w:t>2,000 words (test length)</w:t>
             </w:r>
           </w:p>
         </w:tc>
@@ -3601,7 +3601,7 @@
               <w:jc w:val="left"/>
             </w:pPr>
             <w:r>
-              <w:t xml:space="preserve">2.99 to 5.99</w:t>
+              <w:t>2,000 words (test length)</w:t>
             </w:r>
           </w:p>
         </w:tc>
@@ -3675,7 +3675,7 @@
               <w:jc w:val="left"/>
             </w:pPr>
             <w:r>
-              <w:t xml:space="preserve">2.99 to 5.99</w:t>
+              <w:t>2,000 words (test length)</w:t>
             </w:r>
           </w:p>
         </w:tc>
@@ -3749,7 +3749,7 @@
               <w:jc w:val="left"/>
             </w:pPr>
             <w:r>
-              <w:t xml:space="preserve">2.99 to 5.99</w:t>
+              <w:t>2,000 words (test length)</w:t>
             </w:r>
           </w:p>
         </w:tc>
@@ -3823,7 +3823,7 @@
               <w:jc w:val="left"/>
             </w:pPr>
             <w:r>
-              <w:t xml:space="preserve">2.99 to 5.99</w:t>
+              <w:t>2,000 words (test length)</w:t>
             </w:r>
           </w:p>
         </w:tc>
@@ -3897,7 +3897,7 @@
               <w:jc w:val="left"/>
             </w:pPr>
             <w:r>
-              <w:t xml:space="preserve">2.99 to 4.99</w:t>
+              <w:t>2,000 words (test length)</w:t>
             </w:r>
           </w:p>
         </w:tc>
@@ -3971,7 +3971,7 @@
               <w:jc w:val="left"/>
             </w:pPr>
             <w:r>
-              <w:t xml:space="preserve">2.99 to 3.99</w:t>
+              <w:t>2,000 words (test length)</w:t>
             </w:r>
           </w:p>
         </w:tc>
@@ -4045,7 +4045,7 @@
               <w:jc w:val="left"/>
             </w:pPr>
             <w:r>
-              <w:t xml:space="preserve">2.99 to 5.99</w:t>
+              <w:t>2,000 words (test length)</w:t>
             </w:r>
           </w:p>
         </w:tc>
@@ -4119,7 +4119,7 @@
               <w:jc w:val="left"/>
             </w:pPr>
             <w:r>
-              <w:t xml:space="preserve">2.99 to 5.99</w:t>
+              <w:t>2,000 words (test length)</w:t>
             </w:r>
           </w:p>
         </w:tc>
@@ -4193,7 +4193,7 @@
               <w:jc w:val="left"/>
             </w:pPr>
             <w:r>
-              <w:t xml:space="preserve">Not set</w:t>
+              <w:t>2,000 words (test length)</w:t>
             </w:r>
           </w:p>
         </w:tc>
@@ -4267,7 +4267,7 @@
               <w:jc w:val="left"/>
             </w:pPr>
             <w:r>
-              <w:t xml:space="preserve">2.99 to 5.99</w:t>
+              <w:t>2,000 words (test length)</w:t>
             </w:r>
           </w:p>
         </w:tc>
@@ -6513,6 +6513,22 @@
       </w:pPr>
       <w:r>
         <w:t xml:space="preserve">19. Change log</w:t>
+      </w:r>
+    </w:p>
+    <w:p>
+      <w:pPr>
+        <w:numPr>
+          <w:ilvl w:val="0"/>
+          <w:numId w:val="1012"/>
+        </w:numPr>
+        <w:pStyle w:val="Compact"/>
+      </w:pPr>
+      <w:r>
+        <w:rPr>
+          <w:bCs/>
+          <w:b/>
+        </w:rPr>
+        <w:t>2.1 test amendment (18 October 2026): length set to 2,000 words for every book type so a live test can run (section 3 table and section 10 table). Original lengths to restore when the owner says: cozy mystery or romance novel 55,000 to 65,000 words; kids’ chapter book 10,000 to 15,000 words; bedtime story collection 2,000 to 4,000 words per story; early reader 1,500 to 3,000 words; practical guide or workbook 11,000 to 25,000 words.</w:t>
       </w:r>
     </w:p>
     <w:p>

</xml_diff>

<commit_message>
Guide: fix test-length column in section 10 (price column restored)
Co-Authored-By: Claude Haiku 5.5 <noreply@anthropic.com>
Claude-Session: https://claude.ai/code/session_01MZeVJcyf7XvKRRCE6AUkLk
</commit_message>
<xml_diff>
--- a/ebooks-Raw/guide.docx
+++ b/ebooks-Raw/guide.docx
@@ -3305,7 +3305,7 @@
               <w:jc w:val="left"/>
             </w:pPr>
             <w:r>
-              <w:t>2,000 words (test length)</w:t>
+              <w:t>2.99 to 4.99</w:t>
             </w:r>
           </w:p>
         </w:tc>
@@ -3379,7 +3379,7 @@
               <w:jc w:val="left"/>
             </w:pPr>
             <w:r>
-              <w:t>2,000 words (test length)</w:t>
+              <w:t>2.99 to 4.99</w:t>
             </w:r>
           </w:p>
         </w:tc>
@@ -3453,7 +3453,7 @@
               <w:jc w:val="left"/>
             </w:pPr>
             <w:r>
-              <w:t>2,000 words (test length)</w:t>
+              <w:t>2.99 to 4.99</w:t>
             </w:r>
           </w:p>
         </w:tc>
@@ -3527,7 +3527,7 @@
               <w:jc w:val="left"/>
             </w:pPr>
             <w:r>
-              <w:t>2,000 words (test length)</w:t>
+              <w:t>2.99 to 4.99</w:t>
             </w:r>
           </w:p>
         </w:tc>
@@ -3601,7 +3601,7 @@
               <w:jc w:val="left"/>
             </w:pPr>
             <w:r>
-              <w:t>2,000 words (test length)</w:t>
+              <w:t>2.99 to 5.99</w:t>
             </w:r>
           </w:p>
         </w:tc>
@@ -3675,7 +3675,7 @@
               <w:jc w:val="left"/>
             </w:pPr>
             <w:r>
-              <w:t>2,000 words (test length)</w:t>
+              <w:t>2.99 to 5.99</w:t>
             </w:r>
           </w:p>
         </w:tc>
@@ -3749,7 +3749,7 @@
               <w:jc w:val="left"/>
             </w:pPr>
             <w:r>
-              <w:t>2,000 words (test length)</w:t>
+              <w:t>2.99 to 5.99</w:t>
             </w:r>
           </w:p>
         </w:tc>
@@ -3823,7 +3823,7 @@
               <w:jc w:val="left"/>
             </w:pPr>
             <w:r>
-              <w:t>2,000 words (test length)</w:t>
+              <w:t>2.99 to 5.99</w:t>
             </w:r>
           </w:p>
         </w:tc>
@@ -3897,7 +3897,7 @@
               <w:jc w:val="left"/>
             </w:pPr>
             <w:r>
-              <w:t>2,000 words (test length)</w:t>
+              <w:t>2.99 to 4.99</w:t>
             </w:r>
           </w:p>
         </w:tc>
@@ -3971,7 +3971,7 @@
               <w:jc w:val="left"/>
             </w:pPr>
             <w:r>
-              <w:t>2,000 words (test length)</w:t>
+              <w:t>2.99 to 3.99</w:t>
             </w:r>
           </w:p>
         </w:tc>
@@ -4045,7 +4045,7 @@
               <w:jc w:val="left"/>
             </w:pPr>
             <w:r>
-              <w:t>2,000 words (test length)</w:t>
+              <w:t>2.99 to 5.99</w:t>
             </w:r>
           </w:p>
         </w:tc>
@@ -4119,7 +4119,7 @@
               <w:jc w:val="left"/>
             </w:pPr>
             <w:r>
-              <w:t>2,000 words (test length)</w:t>
+              <w:t>2.99 to 5.99</w:t>
             </w:r>
           </w:p>
         </w:tc>
@@ -4193,7 +4193,7 @@
               <w:jc w:val="left"/>
             </w:pPr>
             <w:r>
-              <w:t>2,000 words (test length)</w:t>
+              <w:t>Not set</w:t>
             </w:r>
           </w:p>
         </w:tc>
@@ -4267,7 +4267,7 @@
               <w:jc w:val="left"/>
             </w:pPr>
             <w:r>
-              <w:t>2,000 words (test length)</w:t>
+              <w:t>2.99 to 5.99</w:t>
             </w:r>
           </w:p>
         </w:tc>

</xml_diff>

<commit_message>
Guide: section 10 length column set to 2,000-word test length
Co-Authored-By: Claude Haiku 5.5 <noreply@anthropic.com>
Claude-Session: https://claude.ai/code/session_01MZeVJcyf7XvKRRCE6AUkLk
</commit_message>
<xml_diff>
--- a/ebooks-Raw/guide.docx
+++ b/ebooks-Raw/guide.docx
@@ -3293,7 +3293,7 @@
               <w:jc w:val="left"/>
             </w:pPr>
             <w:r>
-              <w:t xml:space="preserve">55,000 to 65,000 words</w:t>
+              <w:t>2,000 words (test length)</w:t>
             </w:r>
           </w:p>
         </w:tc>
@@ -3367,7 +3367,7 @@
               <w:jc w:val="left"/>
             </w:pPr>
             <w:r>
-              <w:t xml:space="preserve">55,000 to 65,000 words</w:t>
+              <w:t>2,000 words (test length)</w:t>
             </w:r>
           </w:p>
         </w:tc>
@@ -3441,7 +3441,7 @@
               <w:jc w:val="left"/>
             </w:pPr>
             <w:r>
-              <w:t xml:space="preserve">55,000 to 65,000 words</w:t>
+              <w:t>2,000 words (test length)</w:t>
             </w:r>
           </w:p>
         </w:tc>
@@ -3515,7 +3515,7 @@
               <w:jc w:val="left"/>
             </w:pPr>
             <w:r>
-              <w:t xml:space="preserve">55,000 to 65,000 words</w:t>
+              <w:t>2,000 words (test length)</w:t>
             </w:r>
           </w:p>
         </w:tc>
@@ -3589,7 +3589,7 @@
               <w:jc w:val="left"/>
             </w:pPr>
             <w:r>
-              <w:t xml:space="preserve">11,000 to 25,000 words</w:t>
+              <w:t>2,000 words (test length)</w:t>
             </w:r>
           </w:p>
         </w:tc>
@@ -3663,7 +3663,7 @@
               <w:jc w:val="left"/>
             </w:pPr>
             <w:r>
-              <w:t xml:space="preserve">11,000 to 25,000 words</w:t>
+              <w:t>2,000 words (test length)</w:t>
             </w:r>
           </w:p>
         </w:tc>
@@ -3737,7 +3737,7 @@
               <w:jc w:val="left"/>
             </w:pPr>
             <w:r>
-              <w:t xml:space="preserve">11,000 to 25,000 words</w:t>
+              <w:t>2,000 words (test length)</w:t>
             </w:r>
           </w:p>
         </w:tc>
@@ -3811,7 +3811,7 @@
               <w:jc w:val="left"/>
             </w:pPr>
             <w:r>
-              <w:t xml:space="preserve">11,000 to 25,000 words</w:t>
+              <w:t>2,000 words (test length)</w:t>
             </w:r>
           </w:p>
         </w:tc>
@@ -3885,7 +3885,7 @@
               <w:jc w:val="left"/>
             </w:pPr>
             <w:r>
-              <w:t xml:space="preserve">10,000 to 15,000 words</w:t>
+              <w:t>2,000 words (test length)</w:t>
             </w:r>
           </w:p>
         </w:tc>
@@ -3959,7 +3959,7 @@
               <w:jc w:val="left"/>
             </w:pPr>
             <w:r>
-              <w:t xml:space="preserve">2,000 to 4,000 words per story; 8 to 12 stories</w:t>
+              <w:t>2,000 words (test length)</w:t>
             </w:r>
           </w:p>
         </w:tc>
@@ -4033,7 +4033,7 @@
               <w:jc w:val="left"/>
             </w:pPr>
             <w:r>
-              <w:t xml:space="preserve">11,000 to 25,000 words</w:t>
+              <w:t>2,000 words (test length)</w:t>
             </w:r>
           </w:p>
         </w:tc>
@@ -4107,7 +4107,7 @@
               <w:jc w:val="left"/>
             </w:pPr>
             <w:r>
-              <w:t xml:space="preserve">11,000 to 25,000 words</w:t>
+              <w:t>2,000 words (test length)</w:t>
             </w:r>
           </w:p>
         </w:tc>
@@ -4255,7 +4255,7 @@
               <w:jc w:val="left"/>
             </w:pPr>
             <w:r>
-              <w:t xml:space="preserve">11,000 to 25,000 words</w:t>
+              <w:t>2,000 words (test length)</w:t>
             </w:r>
           </w:p>
         </w:tc>

</xml_diff>

<commit_message>
Owner: delete all ebooks and covers made so far; restore guide lengths
- Removed repo copies of the Bakery book (folder and Ready to publish copy). The book is already published on KDP by the owner; its used-topic mark stays so the topic is not written again.
- Guide restored to the pre-test lengths (the 2,000-word test length is removed).

Co-Authored-By: Claude Haiku 5.5 <noreply@anthropic.com>
Claude-Session: https://claude.ai/code/session_01MZeVJcyf7XvKRRCE6AUkLk
</commit_message>
<xml_diff>
--- a/ebooks-Raw/guide.docx
+++ b/ebooks-Raw/guide.docx
@@ -739,7 +739,7 @@
               <w:jc w:val="left"/>
             </w:pPr>
             <w:r>
-              <w:t>2,000 words (test length)</w:t>
+              <w:t xml:space="preserve">55,000 to 65,000 words</w:t>
             </w:r>
           </w:p>
         </w:tc>
@@ -789,7 +789,7 @@
               <w:jc w:val="left"/>
             </w:pPr>
             <w:r>
-              <w:t>2,000 words (test length)</w:t>
+              <w:t xml:space="preserve">10,000 to 15,000 words</w:t>
             </w:r>
           </w:p>
         </w:tc>
@@ -839,7 +839,7 @@
               <w:jc w:val="left"/>
             </w:pPr>
             <w:r>
-              <w:t>2,000 words (test length)</w:t>
+              <w:t xml:space="preserve">2,000 to 4,000 words per story; 8 to 12 stories</w:t>
             </w:r>
           </w:p>
         </w:tc>
@@ -889,7 +889,7 @@
               <w:jc w:val="left"/>
             </w:pPr>
             <w:r>
-              <w:t>2,000 words (test length)</w:t>
+              <w:t xml:space="preserve">1,500 to 3,000 words</w:t>
             </w:r>
           </w:p>
         </w:tc>
@@ -939,7 +939,7 @@
               <w:jc w:val="left"/>
             </w:pPr>
             <w:r>
-              <w:t>2,000 words (test length)</w:t>
+              <w:t xml:space="preserve">100 to 150 pages</w:t>
             </w:r>
           </w:p>
         </w:tc>
@@ -989,7 +989,7 @@
               <w:jc w:val="left"/>
             </w:pPr>
             <w:r>
-              <w:t>2,000 words (test length)</w:t>
+              <w:t xml:space="preserve">11,000 to 25,000 words</w:t>
             </w:r>
           </w:p>
         </w:tc>
@@ -3293,19 +3293,19 @@
               <w:jc w:val="left"/>
             </w:pPr>
             <w:r>
-              <w:t>2,000 words (test length)</w:t>
-            </w:r>
-          </w:p>
-        </w:tc>
-        <w:tc>
-          <w:tcPr/>
-          <w:p>
-            <w:pPr>
-              <w:pStyle w:val="Compact"/>
-              <w:jc w:val="left"/>
-            </w:pPr>
-            <w:r>
-              <w:t>2.99 to 4.99</w:t>
+              <w:t xml:space="preserve">55,000 to 65,000 words</w:t>
+            </w:r>
+          </w:p>
+        </w:tc>
+        <w:tc>
+          <w:tcPr/>
+          <w:p>
+            <w:pPr>
+              <w:pStyle w:val="Compact"/>
+              <w:jc w:val="left"/>
+            </w:pPr>
+            <w:r>
+              <w:t xml:space="preserve">2.99 to 4.99</w:t>
             </w:r>
           </w:p>
         </w:tc>
@@ -3367,19 +3367,19 @@
               <w:jc w:val="left"/>
             </w:pPr>
             <w:r>
-              <w:t>2,000 words (test length)</w:t>
-            </w:r>
-          </w:p>
-        </w:tc>
-        <w:tc>
-          <w:tcPr/>
-          <w:p>
-            <w:pPr>
-              <w:pStyle w:val="Compact"/>
-              <w:jc w:val="left"/>
-            </w:pPr>
-            <w:r>
-              <w:t>2.99 to 4.99</w:t>
+              <w:t xml:space="preserve">55,000 to 65,000 words</w:t>
+            </w:r>
+          </w:p>
+        </w:tc>
+        <w:tc>
+          <w:tcPr/>
+          <w:p>
+            <w:pPr>
+              <w:pStyle w:val="Compact"/>
+              <w:jc w:val="left"/>
+            </w:pPr>
+            <w:r>
+              <w:t xml:space="preserve">2.99 to 4.99</w:t>
             </w:r>
           </w:p>
         </w:tc>
@@ -3441,19 +3441,19 @@
               <w:jc w:val="left"/>
             </w:pPr>
             <w:r>
-              <w:t>2,000 words (test length)</w:t>
-            </w:r>
-          </w:p>
-        </w:tc>
-        <w:tc>
-          <w:tcPr/>
-          <w:p>
-            <w:pPr>
-              <w:pStyle w:val="Compact"/>
-              <w:jc w:val="left"/>
-            </w:pPr>
-            <w:r>
-              <w:t>2.99 to 4.99</w:t>
+              <w:t xml:space="preserve">55,000 to 65,000 words</w:t>
+            </w:r>
+          </w:p>
+        </w:tc>
+        <w:tc>
+          <w:tcPr/>
+          <w:p>
+            <w:pPr>
+              <w:pStyle w:val="Compact"/>
+              <w:jc w:val="left"/>
+            </w:pPr>
+            <w:r>
+              <w:t xml:space="preserve">2.99 to 4.99</w:t>
             </w:r>
           </w:p>
         </w:tc>
@@ -3515,19 +3515,19 @@
               <w:jc w:val="left"/>
             </w:pPr>
             <w:r>
-              <w:t>2,000 words (test length)</w:t>
-            </w:r>
-          </w:p>
-        </w:tc>
-        <w:tc>
-          <w:tcPr/>
-          <w:p>
-            <w:pPr>
-              <w:pStyle w:val="Compact"/>
-              <w:jc w:val="left"/>
-            </w:pPr>
-            <w:r>
-              <w:t>2.99 to 4.99</w:t>
+              <w:t xml:space="preserve">55,000 to 65,000 words</w:t>
+            </w:r>
+          </w:p>
+        </w:tc>
+        <w:tc>
+          <w:tcPr/>
+          <w:p>
+            <w:pPr>
+              <w:pStyle w:val="Compact"/>
+              <w:jc w:val="left"/>
+            </w:pPr>
+            <w:r>
+              <w:t xml:space="preserve">2.99 to 4.99</w:t>
             </w:r>
           </w:p>
         </w:tc>
@@ -3589,19 +3589,19 @@
               <w:jc w:val="left"/>
             </w:pPr>
             <w:r>
-              <w:t>2,000 words (test length)</w:t>
-            </w:r>
-          </w:p>
-        </w:tc>
-        <w:tc>
-          <w:tcPr/>
-          <w:p>
-            <w:pPr>
-              <w:pStyle w:val="Compact"/>
-              <w:jc w:val="left"/>
-            </w:pPr>
-            <w:r>
-              <w:t>2.99 to 5.99</w:t>
+              <w:t xml:space="preserve">11,000 to 25,000 words</w:t>
+            </w:r>
+          </w:p>
+        </w:tc>
+        <w:tc>
+          <w:tcPr/>
+          <w:p>
+            <w:pPr>
+              <w:pStyle w:val="Compact"/>
+              <w:jc w:val="left"/>
+            </w:pPr>
+            <w:r>
+              <w:t xml:space="preserve">2.99 to 5.99</w:t>
             </w:r>
           </w:p>
         </w:tc>
@@ -3663,19 +3663,19 @@
               <w:jc w:val="left"/>
             </w:pPr>
             <w:r>
-              <w:t>2,000 words (test length)</w:t>
-            </w:r>
-          </w:p>
-        </w:tc>
-        <w:tc>
-          <w:tcPr/>
-          <w:p>
-            <w:pPr>
-              <w:pStyle w:val="Compact"/>
-              <w:jc w:val="left"/>
-            </w:pPr>
-            <w:r>
-              <w:t>2.99 to 5.99</w:t>
+              <w:t xml:space="preserve">11,000 to 25,000 words</w:t>
+            </w:r>
+          </w:p>
+        </w:tc>
+        <w:tc>
+          <w:tcPr/>
+          <w:p>
+            <w:pPr>
+              <w:pStyle w:val="Compact"/>
+              <w:jc w:val="left"/>
+            </w:pPr>
+            <w:r>
+              <w:t xml:space="preserve">2.99 to 5.99</w:t>
             </w:r>
           </w:p>
         </w:tc>
@@ -3737,19 +3737,19 @@
               <w:jc w:val="left"/>
             </w:pPr>
             <w:r>
-              <w:t>2,000 words (test length)</w:t>
-            </w:r>
-          </w:p>
-        </w:tc>
-        <w:tc>
-          <w:tcPr/>
-          <w:p>
-            <w:pPr>
-              <w:pStyle w:val="Compact"/>
-              <w:jc w:val="left"/>
-            </w:pPr>
-            <w:r>
-              <w:t>2.99 to 5.99</w:t>
+              <w:t xml:space="preserve">11,000 to 25,000 words</w:t>
+            </w:r>
+          </w:p>
+        </w:tc>
+        <w:tc>
+          <w:tcPr/>
+          <w:p>
+            <w:pPr>
+              <w:pStyle w:val="Compact"/>
+              <w:jc w:val="left"/>
+            </w:pPr>
+            <w:r>
+              <w:t xml:space="preserve">2.99 to 5.99</w:t>
             </w:r>
           </w:p>
         </w:tc>
@@ -3811,19 +3811,19 @@
               <w:jc w:val="left"/>
             </w:pPr>
             <w:r>
-              <w:t>2,000 words (test length)</w:t>
-            </w:r>
-          </w:p>
-        </w:tc>
-        <w:tc>
-          <w:tcPr/>
-          <w:p>
-            <w:pPr>
-              <w:pStyle w:val="Compact"/>
-              <w:jc w:val="left"/>
-            </w:pPr>
-            <w:r>
-              <w:t>2.99 to 5.99</w:t>
+              <w:t xml:space="preserve">11,000 to 25,000 words</w:t>
+            </w:r>
+          </w:p>
+        </w:tc>
+        <w:tc>
+          <w:tcPr/>
+          <w:p>
+            <w:pPr>
+              <w:pStyle w:val="Compact"/>
+              <w:jc w:val="left"/>
+            </w:pPr>
+            <w:r>
+              <w:t xml:space="preserve">2.99 to 5.99</w:t>
             </w:r>
           </w:p>
         </w:tc>
@@ -3885,19 +3885,19 @@
               <w:jc w:val="left"/>
             </w:pPr>
             <w:r>
-              <w:t>2,000 words (test length)</w:t>
-            </w:r>
-          </w:p>
-        </w:tc>
-        <w:tc>
-          <w:tcPr/>
-          <w:p>
-            <w:pPr>
-              <w:pStyle w:val="Compact"/>
-              <w:jc w:val="left"/>
-            </w:pPr>
-            <w:r>
-              <w:t>2.99 to 4.99</w:t>
+              <w:t xml:space="preserve">10,000 to 15,000 words</w:t>
+            </w:r>
+          </w:p>
+        </w:tc>
+        <w:tc>
+          <w:tcPr/>
+          <w:p>
+            <w:pPr>
+              <w:pStyle w:val="Compact"/>
+              <w:jc w:val="left"/>
+            </w:pPr>
+            <w:r>
+              <w:t xml:space="preserve">2.99 to 4.99</w:t>
             </w:r>
           </w:p>
         </w:tc>
@@ -3959,19 +3959,19 @@
               <w:jc w:val="left"/>
             </w:pPr>
             <w:r>
-              <w:t>2,000 words (test length)</w:t>
-            </w:r>
-          </w:p>
-        </w:tc>
-        <w:tc>
-          <w:tcPr/>
-          <w:p>
-            <w:pPr>
-              <w:pStyle w:val="Compact"/>
-              <w:jc w:val="left"/>
-            </w:pPr>
-            <w:r>
-              <w:t>2.99 to 3.99</w:t>
+              <w:t xml:space="preserve">2,000 to 4,000 words per story; 8 to 12 stories</w:t>
+            </w:r>
+          </w:p>
+        </w:tc>
+        <w:tc>
+          <w:tcPr/>
+          <w:p>
+            <w:pPr>
+              <w:pStyle w:val="Compact"/>
+              <w:jc w:val="left"/>
+            </w:pPr>
+            <w:r>
+              <w:t xml:space="preserve">2.99 to 3.99</w:t>
             </w:r>
           </w:p>
         </w:tc>
@@ -4033,19 +4033,19 @@
               <w:jc w:val="left"/>
             </w:pPr>
             <w:r>
-              <w:t>2,000 words (test length)</w:t>
-            </w:r>
-          </w:p>
-        </w:tc>
-        <w:tc>
-          <w:tcPr/>
-          <w:p>
-            <w:pPr>
-              <w:pStyle w:val="Compact"/>
-              <w:jc w:val="left"/>
-            </w:pPr>
-            <w:r>
-              <w:t>2.99 to 5.99</w:t>
+              <w:t xml:space="preserve">11,000 to 25,000 words</w:t>
+            </w:r>
+          </w:p>
+        </w:tc>
+        <w:tc>
+          <w:tcPr/>
+          <w:p>
+            <w:pPr>
+              <w:pStyle w:val="Compact"/>
+              <w:jc w:val="left"/>
+            </w:pPr>
+            <w:r>
+              <w:t xml:space="preserve">2.99 to 5.99</w:t>
             </w:r>
           </w:p>
         </w:tc>
@@ -4107,19 +4107,19 @@
               <w:jc w:val="left"/>
             </w:pPr>
             <w:r>
-              <w:t>2,000 words (test length)</w:t>
-            </w:r>
-          </w:p>
-        </w:tc>
-        <w:tc>
-          <w:tcPr/>
-          <w:p>
-            <w:pPr>
-              <w:pStyle w:val="Compact"/>
-              <w:jc w:val="left"/>
-            </w:pPr>
-            <w:r>
-              <w:t>2.99 to 5.99</w:t>
+              <w:t xml:space="preserve">11,000 to 25,000 words</w:t>
+            </w:r>
+          </w:p>
+        </w:tc>
+        <w:tc>
+          <w:tcPr/>
+          <w:p>
+            <w:pPr>
+              <w:pStyle w:val="Compact"/>
+              <w:jc w:val="left"/>
+            </w:pPr>
+            <w:r>
+              <w:t xml:space="preserve">2.99 to 5.99</w:t>
             </w:r>
           </w:p>
         </w:tc>
@@ -4193,7 +4193,7 @@
               <w:jc w:val="left"/>
             </w:pPr>
             <w:r>
-              <w:t>Not set</w:t>
+              <w:t xml:space="preserve">Not set</w:t>
             </w:r>
           </w:p>
         </w:tc>
@@ -4255,19 +4255,19 @@
               <w:jc w:val="left"/>
             </w:pPr>
             <w:r>
-              <w:t>2,000 words (test length)</w:t>
-            </w:r>
-          </w:p>
-        </w:tc>
-        <w:tc>
-          <w:tcPr/>
-          <w:p>
-            <w:pPr>
-              <w:pStyle w:val="Compact"/>
-              <w:jc w:val="left"/>
-            </w:pPr>
-            <w:r>
-              <w:t>2.99 to 5.99</w:t>
+              <w:t xml:space="preserve">11,000 to 25,000 words</w:t>
+            </w:r>
+          </w:p>
+        </w:tc>
+        <w:tc>
+          <w:tcPr/>
+          <w:p>
+            <w:pPr>
+              <w:pStyle w:val="Compact"/>
+              <w:jc w:val="left"/>
+            </w:pPr>
+            <w:r>
+              <w:t xml:space="preserve">2.99 to 5.99</w:t>
             </w:r>
           </w:p>
         </w:tc>
@@ -6513,22 +6513,6 @@
       </w:pPr>
       <w:r>
         <w:t xml:space="preserve">19. Change log</w:t>
-      </w:r>
-    </w:p>
-    <w:p>
-      <w:pPr>
-        <w:numPr>
-          <w:ilvl w:val="0"/>
-          <w:numId w:val="1012"/>
-        </w:numPr>
-        <w:pStyle w:val="Compact"/>
-      </w:pPr>
-      <w:r>
-        <w:rPr>
-          <w:bCs/>
-          <w:b/>
-        </w:rPr>
-        <w:t>2.1 test amendment (18 October 2026): length set to 2,000 words for every book type so a live test can run (section 3 table and section 10 table). Original lengths to restore when the owner says: cozy mystery or romance novel 55,000 to 65,000 words; kids’ chapter book 10,000 to 15,000 words; bedtime story collection 2,000 to 4,000 words per story; early reader 1,500 to 3,000 words; practical guide or workbook 11,000 to 25,000 words.</w:t>
       </w:r>
     </w:p>
     <w:p>

</xml_diff>

<commit_message>
Guide 2.1: section 19 no longer refers to deleted guide-v1.docx; change recorded (version stays 2.1)
Co-Authored-By: Claude Haiku 5.5 <noreply@anthropic.com>
Claude-Session: https://claude.ai/code/session_01MZeVJcyf7XvKRRCE6AUkLk
</commit_message>
<xml_diff>
--- a/ebooks-Raw/guide.docx
+++ b/ebooks-Raw/guide.docx
@@ -6528,7 +6528,7 @@
           <w:bCs/>
           <w:b/>
         </w:rPr>
-        <w:t>2.1 amendment (18 October 2026, fourth): distinct character names and sourced research claims checked by scripts/check_names_sources.py, run inside check_book.py. Title page and workbook answer blocks checked. Section 3 workbook rule split into its own paragraph; fixed-layout wording made consistent with the pause; section 15 fix-or-stop table rebuilt; an unconfirmed category waits in line (section 10); section 11 lists the files key; section 13 lists every mechanical check.</w:t>
+        <w:t>2.1 amendment (18 October 2026, fifth): section 19 no longer refers to guide-v1.docx, which was removed from the repo. The 1.0 original remains in git history. Section 8 disclaimers and section 13 reading age are checked by scripts/check_book.py. Version stays 2.1.</w:t>
       </w:r>
       <w:r/>
       <w:r/>
@@ -6561,41 +6561,25 @@
           <w:bCs/>
           <w:b/>
         </w:rPr>
-        <w:t xml:space="preserve">2.1 amendment (18 October 2026, third):</w:t>
-      </w:r>
-      <w:r>
-        <w:t xml:space="preserve"> </w:t>
-      </w:r>
-      <w:r>
-        <w:t xml:space="preserve">US English and US dollars made REQUIRED, with</w:t>
-      </w:r>
-      <w:r>
-        <w:t xml:space="preserve"> </w:t>
-      </w:r>
-      <w:r>
-        <w:rPr>
-          <w:rStyle w:val="VerbatimChar"/>
-        </w:rPr>
-        <w:t xml:space="preserve">scripts/check_language.py</w:t>
-      </w:r>
-      <w:r>
-        <w:t xml:space="preserve">. Title page made a check. Workbooks need answer blocks after every prompt. Distinct names and sourced claims made REQUIRED. Test runs and review-note rules added to section 15. The fix-or-stop table extended. Section 20 added, listing each mistake found in review and the rule that now prevents it. The guide itself changed to US spelling. Version stays 2.1 because the robot prompts and</w:t>
-      </w:r>
-      <w:r>
-        <w:t xml:space="preserve"> </w:t>
-      </w:r>
-      <w:r>
-        <w:rPr>
-          <w:rStyle w:val="VerbatimChar"/>
-        </w:rPr>
-        <w:t xml:space="preserve">check_book.py</w:t>
-      </w:r>
-      <w:r>
-        <w:t xml:space="preserve"> </w:t>
-      </w:r>
-      <w:r>
-        <w:t xml:space="preserve">check for it.</w:t>
-      </w:r>
+        <w:t>2.1 amendment (18 October 2026, fourth): distinct character names and sourced research claims checked by scripts/check_names_sources.py, run inside check_book.py. Title page and workbook answer blocks checked. Section 3 workbook rule split into its own paragraph; fixed-layout wording made consistent with the pause; section 15 fix-or-stop table rebuilt; an unconfirmed category waits in line (section 10); section 11 lists the files key; section 13 lists every mechanical check.</w:t>
+      </w:r>
+      <w:r/>
+      <w:r/>
+      <w:r/>
+      <w:r>
+        <w:rPr>
+          <w:rStyle w:val="VerbatimChar"/>
+        </w:rPr>
+      </w:r>
+      <w:r/>
+      <w:r/>
+      <w:r>
+        <w:rPr>
+          <w:rStyle w:val="VerbatimChar"/>
+        </w:rPr>
+      </w:r>
+      <w:r/>
+      <w:r/>
     </w:p>
     <w:p>
       <w:pPr>
@@ -6610,13 +6594,40 @@
           <w:bCs/>
           <w:b/>
         </w:rPr>
-        <w:t xml:space="preserve">2.1 amendment (18 October 2026):</w:t>
-      </w:r>
-      <w:r>
-        <w:t xml:space="preserve"> </w:t>
-      </w:r>
-      <w:r>
-        <w:t xml:space="preserve">category rules table added to section 10, so each category sets its book type, length, price, status, and cover rule. Puzzles &amp; Games marked paused. Fix-or-stop table added to section 15. Duplicate check list removed from section 13. The second-category line in section 16 corrected to a third-category decision. Version stays 2.1 because the robot prompts and check_book.py check for it.</w:t>
+        <w:t xml:space="preserve">2.1 amendment (18 October 2026, third):</w:t>
+      </w:r>
+      <w:r>
+        <w:t xml:space="preserve"> </w:t>
+      </w:r>
+      <w:r>
+        <w:t xml:space="preserve">US English and US dollars made REQUIRED, with</w:t>
+      </w:r>
+      <w:r>
+        <w:t xml:space="preserve"> </w:t>
+      </w:r>
+      <w:r>
+        <w:rPr>
+          <w:rStyle w:val="VerbatimChar"/>
+        </w:rPr>
+        <w:t xml:space="preserve">scripts/check_language.py</w:t>
+      </w:r>
+      <w:r>
+        <w:t xml:space="preserve">. Title page made a check. Workbooks need answer blocks after every prompt. Distinct names and sourced claims made REQUIRED. Test runs and review-note rules added to section 15. The fix-or-stop table extended. Section 20 added, listing each mistake found in review and the rule that now prevents it. The guide itself changed to US spelling. Version stays 2.1 because the robot prompts and</w:t>
+      </w:r>
+      <w:r>
+        <w:t xml:space="preserve"> </w:t>
+      </w:r>
+      <w:r>
+        <w:rPr>
+          <w:rStyle w:val="VerbatimChar"/>
+        </w:rPr>
+        <w:t xml:space="preserve">check_book.py</w:t>
+      </w:r>
+      <w:r>
+        <w:t xml:space="preserve"> </w:t>
+      </w:r>
+      <w:r>
+        <w:t xml:space="preserve">check for it.</w:t>
       </w:r>
     </w:p>
     <w:p>
@@ -6632,13 +6643,13 @@
           <w:bCs/>
           <w:b/>
         </w:rPr>
-        <w:t xml:space="preserve">2.1 amendment (18 October 2026, second):</w:t>
-      </w:r>
-      <w:r>
-        <w:t xml:space="preserve"> </w:t>
-      </w:r>
-      <w:r>
-        <w:t xml:space="preserve">section 2 narrowed to the fields Kindle-2 needs to write a book, so topics without score or risks are not blocked. Kindle-2 derives keywords when missing. Version stays 2.1.</w:t>
+        <w:t xml:space="preserve">2.1 amendment (18 October 2026):</w:t>
+      </w:r>
+      <w:r>
+        <w:t xml:space="preserve"> </w:t>
+      </w:r>
+      <w:r>
+        <w:t xml:space="preserve">category rules table added to section 10, so each category sets its book type, length, price, status, and cover rule. Puzzles &amp; Games marked paused. Fix-or-stop table added to section 15. Duplicate check list removed from section 13. The second-category line in section 16 corrected to a third-category decision. Version stays 2.1 because the robot prompts and check_book.py check for it.</w:t>
       </w:r>
     </w:p>
     <w:p>
@@ -6654,61 +6665,13 @@
           <w:bCs/>
           <w:b/>
         </w:rPr>
-        <w:t xml:space="preserve">2.1 (18 October 2026):</w:t>
-      </w:r>
-      <w:r>
-        <w:t xml:space="preserve"> </w:t>
-      </w:r>
-      <w:r>
-        <w:t xml:space="preserve">cover brief written before design and validated (</w:t>
-      </w:r>
-      <w:r>
-        <w:rPr>
-          <w:rStyle w:val="VerbatimChar"/>
-        </w:rPr>
-        <w:t xml:space="preserve">check_cover_brief.py</w:t>
-      </w:r>
-      <w:r>
-        <w:t xml:space="preserve">). Covers are checked against their own book: palette, title text by OCR at full and thumbnail size, title size, and the subtitle agreeing with metadata. Author and badge confirmed by viewing. Cover checks run through</w:t>
-      </w:r>
-      <w:r>
-        <w:t xml:space="preserve"> </w:t>
-      </w:r>
-      <w:r>
-        <w:rPr>
-          <w:rStyle w:val="VerbatimChar"/>
-        </w:rPr>
-        <w:t xml:space="preserve">check_book.py</w:t>
-      </w:r>
-      <w:r>
-        <w:t xml:space="preserve">. Guide version recorded as</w:t>
-      </w:r>
-      <w:r>
-        <w:t xml:space="preserve"> </w:t>
-      </w:r>
-      <w:r>
-        <w:t xml:space="preserve">“</w:t>
-      </w:r>
-      <w:r>
-        <w:t xml:space="preserve">2.1</w:t>
-      </w:r>
-      <w:r>
-        <w:t xml:space="preserve">”</w:t>
-      </w:r>
-      <w:r>
-        <w:t xml:space="preserve">. Category cover styles added in</w:t>
-      </w:r>
-      <w:r>
-        <w:t xml:space="preserve"> </w:t>
-      </w:r>
-      <w:r>
-        <w:rPr>
-          <w:rStyle w:val="VerbatimChar"/>
-        </w:rPr>
-        <w:t xml:space="preserve">ebooks-Raw/cover-styles.json</w:t>
-      </w:r>
-      <w:r>
-        <w:t>, one profile per pool category, with the brief validator enforcing the category, palette hues, and badge rule. Review fixes: stylesheet and font license required and checked; Kindle-4 becomes the manual-upload handoff (no KDP sign-in); fixed-layout formats paused until a builder exists; picker honors topic holds; tagline rule clarified. Added scripts/build_epub.py (one build for all books) and sync_topics.py refuses fixed-layout formats, early readers and reading ages 4 to 7 on new rows.</w:t>
+        <w:t xml:space="preserve">2.1 amendment (18 October 2026, second):</w:t>
+      </w:r>
+      <w:r>
+        <w:t xml:space="preserve"> </w:t>
+      </w:r>
+      <w:r>
+        <w:t xml:space="preserve">section 2 narrowed to the fields Kindle-2 needs to write a book, so topics without score or risks are not blocked. Kindle-2 derives keywords when missing. Version stays 2.1.</w:t>
       </w:r>
     </w:p>
     <w:p>
@@ -6724,13 +6687,34 @@
           <w:bCs/>
           <w:b/>
         </w:rPr>
-        <w:t xml:space="preserve">2.0 (18 October 2026):</w:t>
-      </w:r>
-      <w:r>
-        <w:t xml:space="preserve"> </w:t>
-      </w:r>
-      <w:r>
-        <w:t xml:space="preserve">ebook only; print removed. Two categories from a confirmed pool. KDP form answers required. Robo-2 renamed Kindle-2 throughout. Copyright placeholder replaced with</w:t>
+        <w:t xml:space="preserve">2.1 (18 October 2026):</w:t>
+      </w:r>
+      <w:r>
+        <w:t xml:space="preserve"> </w:t>
+      </w:r>
+      <w:r>
+        <w:t xml:space="preserve">cover brief written before design and validated (</w:t>
+      </w:r>
+      <w:r>
+        <w:rPr>
+          <w:rStyle w:val="VerbatimChar"/>
+        </w:rPr>
+        <w:t xml:space="preserve">check_cover_brief.py</w:t>
+      </w:r>
+      <w:r>
+        <w:t xml:space="preserve">). Covers are checked against their own book: palette, title text by OCR at full and thumbnail size, title size, and the subtitle agreeing with metadata. Author and badge confirmed by viewing. Cover checks run through</w:t>
+      </w:r>
+      <w:r>
+        <w:t xml:space="preserve"> </w:t>
+      </w:r>
+      <w:r>
+        <w:rPr>
+          <w:rStyle w:val="VerbatimChar"/>
+        </w:rPr>
+        <w:t xml:space="preserve">check_book.py</w:t>
+      </w:r>
+      <w:r>
+        <w:t xml:space="preserve">. Guide version recorded as</w:t>
       </w:r>
       <w:r>
         <w:t xml:space="preserve"> </w:t>
@@ -6739,13 +6723,25 @@
         <w:t xml:space="preserve">“</w:t>
       </w:r>
       <w:r>
-        <w:t xml:space="preserve">Skybee</w:t>
+        <w:t xml:space="preserve">2.1</w:t>
       </w:r>
       <w:r>
         <w:t xml:space="preserve">”</w:t>
       </w:r>
       <w:r>
-        <w:t xml:space="preserve">. Phone preview replaced by Kindle Previewer check by the owner. KDP Select rule set: series enrolled, standalone not. Workbooks and guides require the non-fiction disclaimer. Readability tool named and required for kids’ books. Stop, retry and two-strike rules added. Cover approval moved to the owner’s check at upload. Mechanical checks made into scripts.</w:t>
+        <w:t xml:space="preserve">. Category cover styles added in</w:t>
+      </w:r>
+      <w:r>
+        <w:t xml:space="preserve"> </w:t>
+      </w:r>
+      <w:r>
+        <w:rPr>
+          <w:rStyle w:val="VerbatimChar"/>
+        </w:rPr>
+        <w:t xml:space="preserve">ebooks-Raw/cover-styles.json</w:t>
+      </w:r>
+      <w:r>
+        <w:t>, one profile per pool category, with the brief validator enforcing the category, palette hues, and badge rule. Review fixes: stylesheet and font license required and checked; Kindle-4 becomes the manual-upload handoff (no KDP sign-in); fixed-layout formats paused until a builder exists; picker honors topic holds; tagline rule clarified. Added scripts/build_epub.py (one build for all books) and sync_topics.py refuses fixed-layout formats, early readers and reading ages 4 to 7 on new rows.</w:t>
       </w:r>
     </w:p>
     <w:p>
@@ -6761,26 +6757,58 @@
           <w:bCs/>
           <w:b/>
         </w:rPr>
+        <w:t xml:space="preserve">2.0 (18 October 2026):</w:t>
+      </w:r>
+      <w:r>
+        <w:t xml:space="preserve"> </w:t>
+      </w:r>
+      <w:r>
+        <w:t xml:space="preserve">ebook only; print removed. Two categories from a confirmed pool. KDP form answers required. Robo-2 renamed Kindle-2 throughout. Copyright placeholder replaced with</w:t>
+      </w:r>
+      <w:r>
+        <w:t xml:space="preserve"> </w:t>
+      </w:r>
+      <w:r>
+        <w:t xml:space="preserve">“</w:t>
+      </w:r>
+      <w:r>
+        <w:t xml:space="preserve">Skybee</w:t>
+      </w:r>
+      <w:r>
+        <w:t xml:space="preserve">”</w:t>
+      </w:r>
+      <w:r>
+        <w:t xml:space="preserve">. Phone preview replaced by Kindle Previewer check by the owner. KDP Select rule set: series enrolled, standalone not. Workbooks and guides require the non-fiction disclaimer. Readability tool named and required for kids’ books. Stop, retry and two-strike rules added. Cover approval moved to the owner’s check at upload. Mechanical checks made into scripts.</w:t>
+      </w:r>
+    </w:p>
+    <w:p>
+      <w:pPr>
+        <w:numPr>
+          <w:ilvl w:val="0"/>
+          <w:numId w:val="1012"/>
+        </w:numPr>
+        <w:pStyle w:val="Compact"/>
+      </w:pPr>
+      <w:r>
+        <w:rPr>
+          <w:bCs/>
+          <w:b/>
+        </w:rPr>
         <w:t xml:space="preserve">1.0:</w:t>
       </w:r>
       <w:r>
         <w:t xml:space="preserve"> </w:t>
       </w:r>
       <w:r>
-        <w:t xml:space="preserve">original guide (kept as</w:t>
-      </w:r>
-      <w:r>
-        <w:t xml:space="preserve"> </w:t>
-      </w:r>
-      <w:r>
-        <w:rPr>
-          <w:rStyle w:val="VerbatimChar"/>
-        </w:rPr>
-        <w:t xml:space="preserve">guide-v1.docx</w:t>
-      </w:r>
-      <w:r>
-        <w:t xml:space="preserve">).</w:t>
-      </w:r>
+        <w:t>original guide (the 1.0 file was removed from the repo on 18 October 2026; it remains in git history)</w:t>
+      </w:r>
+      <w:r/>
+      <w:r>
+        <w:rPr>
+          <w:rStyle w:val="VerbatimChar"/>
+        </w:rPr>
+      </w:r>
+      <w:r/>
     </w:p>
     <w:bookmarkEnd w:id="38"/>
     <w:bookmarkStart w:id="39" w:name="X5fd80668f58ad77f48994f5bc01754ba3eb2055"/>

</xml_diff>

<commit_message>
Add ebook production prompts as section 21 of the house guide; cover guide returns to covers only
Co-Authored-By: Claude Haiku 5.5 <noreply@anthropic.com>
Claude-Session: https://claude.ai/code/session_01MZeVJcyf7XvKRRCE6AUkLk
</commit_message>
<xml_diff>
--- a/ebooks-Raw/guide.docx
+++ b/ebooks-Raw/guide.docx
@@ -6517,6 +6517,14 @@
     </w:p>
     <w:p>
       <w:pPr>
+        <w:pStyle w:val="Compact"/>
+      </w:pPr>
+      <w:r>
+        <w:t>2.1 amendment (18 October 2026, sixth): section 21 added with ebook production prompts (planning, structure and sequence, chapter writing, paragraph and line formatting, headings and alignment, emphasis, engagement, metadata, build and proof, handoff). No rule changed; version stays 2.1.</w:t>
+      </w:r>
+    </w:p>
+    <w:p>
+      <w:pPr>
         <w:numPr>
           <w:ilvl w:val="0"/>
           <w:numId w:val="1012"/>
@@ -7387,6 +7395,758 @@
     </w:tbl>
     <w:bookmarkEnd w:id="39"/>
     <w:bookmarkEnd w:id="40"/>
+    <w:p>
+      <w:pPr>
+        <w:pStyle w:val="Heading2"/>
+      </w:pPr>
+      <w:r>
+        <w:t>21. Ebook production prompts</w:t>
+      </w:r>
+    </w:p>
+    <w:p>
+      <w:pPr>
+        <w:pStyle w:val="FirstParagraph"/>
+      </w:pPr>
+      <w:r>
+        <w:t>Use these prompts when producing or checking a book. They explain how to meet the REQUIRED rules in sections 1 to 20. If a prompt and a REQUIRED rule disagree, the REQUIRED rule wins. Ebook reality: an EPUB is reflowable and has no fixed page numbers; the table of contents links to chapters. Kindle ignores most colour and fancy fonts, so emphasis uses bold, italic, and small caps in black text. Colour belongs on the cover.</w:t>
+      </w:r>
+    </w:p>
+    <w:p>
+      <w:pPr>
+        <w:pStyle w:val="FirstParagraph"/>
+      </w:pPr>
+      <w:r>
+        <w:t>Use these prompts for the book itself, alongside Part A (covers above). The cover has its own steps in Part A.</w:t>
+      </w:r>
+    </w:p>
+    <w:p>
+      <w:pPr>
+        <w:pStyle w:val="Heading2"/>
+      </w:pPr>
+      <w:r>
+        <w:t>B0. Reality checks (read first)</w:t>
+      </w:r>
+    </w:p>
+    <w:p>
+      <w:pPr>
+        <w:pStyle w:val="Compact"/>
+      </w:pPr>
+      <w:r>
+        <w:t>• An EPUB is reflowable. It has no fixed page numbers. The reader's device sets page breaks, so the table of contents links to chapters, not page numbers. Page numbers belong only in a print PDF. Do not promise page numbers in the ebook.</w:t>
+      </w:r>
+    </w:p>
+    <w:p>
+      <w:pPr>
+        <w:pStyle w:val="Compact"/>
+      </w:pPr>
+      <w:r>
+        <w:t>• Kindle and most e-readers ignore many colours and fancy fonts. Use bold, italic, and small caps for emphasis. Use colour only in the cover. Keep body text black on white, or on the reader's own background.</w:t>
+      </w:r>
+    </w:p>
+    <w:p>
+      <w:pPr>
+        <w:pStyle w:val="Compact"/>
+      </w:pPr>
+      <w:r>
+        <w:t>• Use embedded fonts only when licensed (EB Garamond, OFL, is saved in fonts/). Keep the font list short: one body font, one heading font.</w:t>
+      </w:r>
+    </w:p>
+    <w:p>
+      <w:pPr>
+        <w:pStyle w:val="Compact"/>
+      </w:pPr>
+      <w:r>
+        <w:t>• The guide's rules still apply: 25 to 40 chapters for cozy mysteries, 55,000 to 60,000 words, US English, fiction disclaimer, AI disclosure, title in the first 12 lines.</w:t>
+      </w:r>
+    </w:p>
+    <w:p>
+      <w:pPr>
+        <w:pStyle w:val="Heading2"/>
+      </w:pPr>
+      <w:r>
+        <w:t>Prompt 0: master brief (paste at the start of any ebook job)</w:t>
+      </w:r>
+    </w:p>
+    <w:p>
+      <w:pPr>
+        <w:pStyle w:val="FirstParagraph"/>
+      </w:pPr>
+      <w:r>
+        <w:t>You are a professional ebook producer for the Skybee KDP pipeline. Your job is to turn an approved topic into a finished, compliant EPUB that a reader will finish.</w:t>
+      </w:r>
+    </w:p>
+    <w:p>
+      <w:pPr>
+        <w:pStyle w:val="FirstParagraph"/>
+      </w:pPr>
+      <w:r>
+        <w:t>Inputs: the topic entry in ebook-topics/topics-log.json, the house guide (ebooks-Raw/guide.docx, version 2.1), and ebooks-Raw/ebook-prompts.md (this file).</w:t>
+      </w:r>
+    </w:p>
+    <w:p>
+      <w:pPr>
+        <w:pStyle w:val="FirstParagraph"/>
+      </w:pPr>
+      <w:r>
+        <w:t>Standards: US English, US dollars, no placeholder text, no bracketed notes in the manuscript, no invented facts, sourced research claims only, and the required disclaimer and AI disclosure.</w:t>
+      </w:r>
+    </w:p>
+    <w:p>
+      <w:pPr>
+        <w:pStyle w:val="FirstParagraph"/>
+      </w:pPr>
+      <w:r>
+        <w:t>Reader goal: each chapter must end with a reason to read the next one. Every section must earn its place.</w:t>
+      </w:r>
+    </w:p>
+    <w:p>
+      <w:pPr>
+        <w:pStyle w:val="FirstParagraph"/>
+      </w:pPr>
+      <w:r>
+        <w:t>Output in order: the outline, the manuscript, the metadata, the stylesheet, the EPUB, the checks, the handoff note. Do not skip a stage. Do not publish, upload, or commit without owner approval.</w:t>
+      </w:r>
+    </w:p>
+    <w:p>
+      <w:pPr>
+        <w:pStyle w:val="Heading2"/>
+      </w:pPr>
+      <w:r>
+        <w:t>Prompt 1: planning (before writing a word)</w:t>
+      </w:r>
+    </w:p>
+    <w:p>
+      <w:pPr>
+        <w:pStyle w:val="FirstParagraph"/>
+      </w:pPr>
+      <w:r>
+        <w:t>From the topic entry, write a one-page plan with these headings:</w:t>
+      </w:r>
+    </w:p>
+    <w:p>
+      <w:pPr>
+        <w:pStyle w:val="FirstParagraph"/>
+      </w:pPr>
+      <w:r>
+        <w:t>1. Promise: one sentence on what the reader will feel and get.</w:t>
+      </w:r>
+    </w:p>
+    <w:p>
+      <w:pPr>
+        <w:pStyle w:val="FirstParagraph"/>
+      </w:pPr>
+      <w:r>
+        <w:t>2. Reader: who buys it, what they expect (for example, cozy mystery readers want a clean puzzle, a likeable sleuth, and a satisfying ending).</w:t>
+      </w:r>
+    </w:p>
+    <w:p>
+      <w:pPr>
+        <w:pStyle w:val="FirstParagraph"/>
+      </w:pPr>
+      <w:r>
+        <w:t>3. Structure: the number of chapters (25 to 40), words per chapter (aim for 1,800 to 2,400 for a novel), and the page-turn hook for each.</w:t>
+      </w:r>
+    </w:p>
+    <w:p>
+      <w:pPr>
+        <w:pStyle w:val="FirstParagraph"/>
+      </w:pPr>
+      <w:r>
+        <w:t>4. Arc: setup, rising clues, midpoint twist, dark moment, reveal, resolution, and a hook for the next book.</w:t>
+      </w:r>
+    </w:p>
+    <w:p>
+      <w:pPr>
+        <w:pStyle w:val="FirstParagraph"/>
+      </w:pPr>
+      <w:r>
+        <w:t>5. Cast: names and roles, checked so no two names look alike (no Ann and Anna, no Dale and Dana).</w:t>
+      </w:r>
+    </w:p>
+    <w:p>
+      <w:pPr>
+        <w:pStyle w:val="FirstParagraph"/>
+      </w:pPr>
+      <w:r>
+        <w:t>6. Setting and sensory anchors: three details per location that the reader will remember.</w:t>
+      </w:r>
+    </w:p>
+    <w:p>
+      <w:pPr>
+        <w:pStyle w:val="FirstParagraph"/>
+      </w:pPr>
+      <w:r>
+        <w:t>7. Running motifs: one object or sound that returns and pays off.</w:t>
+      </w:r>
+    </w:p>
+    <w:p>
+      <w:pPr>
+        <w:pStyle w:val="FirstParagraph"/>
+      </w:pPr>
+      <w:r>
+        <w:t>Check: the chapter count is within 25 to 40; the word target matches the topic entry; every outline beat maps to at least two chapters.</w:t>
+      </w:r>
+    </w:p>
+    <w:p>
+      <w:pPr>
+        <w:pStyle w:val="Heading2"/>
+      </w:pPr>
+      <w:r>
+        <w:t>Prompt 2: manuscript structure (sequence)</w:t>
+      </w:r>
+    </w:p>
+    <w:p>
+      <w:pPr>
+        <w:pStyle w:val="FirstParagraph"/>
+      </w:pPr>
+      <w:r>
+        <w:t>Lay out the book in this exact sequence. Do not reorder.</w:t>
+      </w:r>
+    </w:p>
+    <w:p>
+      <w:pPr>
+        <w:pStyle w:val="FirstParagraph"/>
+      </w:pPr>
+      <w:r>
+        <w:t>1. Title page (title, subtitle, author "Skybee", series line), within the first 12 lines of manuscript.md.</w:t>
+      </w:r>
+    </w:p>
+    <w:p>
+      <w:pPr>
+        <w:pStyle w:val="FirstParagraph"/>
+      </w:pPr>
+      <w:r>
+        <w:t>2. Copyright page: "Copyright © 2026 Skybee. All rights reserved." followed by the fiction disclaimer and the AI disclosure, exactly as the guide requires.</w:t>
+      </w:r>
+    </w:p>
+    <w:p>
+      <w:pPr>
+        <w:pStyle w:val="FirstParagraph"/>
+      </w:pPr>
+      <w:r>
+        <w:t>3. Table of contents: generated by the build (--toc), not typed by hand. Do not add page numbers.</w:t>
+      </w:r>
+    </w:p>
+    <w:p>
+      <w:pPr>
+        <w:pStyle w:val="FirstParagraph"/>
+      </w:pPr>
+      <w:r>
+        <w:t>4. Chapters: each starts with "## Chapter N: Title" on its own line. Number them 1 to N with no gaps.</w:t>
+      </w:r>
+    </w:p>
+    <w:p>
+      <w:pPr>
+        <w:pStyle w:val="FirstParagraph"/>
+      </w:pPr>
+      <w:r>
+        <w:t>5. Closing: the AI disclosure as the final line of the manuscript.</w:t>
+      </w:r>
+    </w:p>
+    <w:p>
+      <w:pPr>
+        <w:pStyle w:val="FirstParagraph"/>
+      </w:pPr>
+      <w:r>
+        <w:t>Check: no chapter is missing or duplicated; chapter headings are numbered in order; the copyright and disclosure lines are present; no placeholder text remains.</w:t>
+      </w:r>
+    </w:p>
+    <w:p>
+      <w:pPr>
+        <w:pStyle w:val="Heading2"/>
+      </w:pPr>
+      <w:r>
+        <w:t>Prompt 3: chapter writing (engagement)</w:t>
+      </w:r>
+    </w:p>
+    <w:p>
+      <w:pPr>
+        <w:pStyle w:val="FirstParagraph"/>
+      </w:pPr>
+      <w:r>
+        <w:t>Write chapter N. Open with a concrete image, a line of dialogue, or a question the reader wants answered. No summary openings ("It had been a long day").</w:t>
+      </w:r>
+    </w:p>
+    <w:p>
+      <w:pPr>
+        <w:pStyle w:val="FirstParagraph"/>
+      </w:pPr>
+      <w:r>
+        <w:t>Keep each scene in one point of view. Show one clue, one emotional beat, and one turn.</w:t>
+      </w:r>
+    </w:p>
+    <w:p>
+      <w:pPr>
+        <w:pStyle w:val="FirstParagraph"/>
+      </w:pPr>
+      <w:r>
+        <w:t>Vary sentence length. Use a short sentence after a long one to land a beat.</w:t>
+      </w:r>
+    </w:p>
+    <w:p>
+      <w:pPr>
+        <w:pStyle w:val="FirstParagraph"/>
+      </w:pPr>
+      <w:r>
+        <w:t>Use dialogue tags sparingly: "said" is nearly invisible; use action beats instead of adverbs.</w:t>
+      </w:r>
+    </w:p>
+    <w:p>
+      <w:pPr>
+        <w:pStyle w:val="FirstParagraph"/>
+      </w:pPr>
+      <w:r>
+        <w:t>End the chapter on a question, a reveal, or a line that makes the reader turn the page. Do not end two chapters in a row with the same device.</w:t>
+      </w:r>
+    </w:p>
+    <w:p>
+      <w:pPr>
+        <w:pStyle w:val="FirstParagraph"/>
+      </w:pPr>
+      <w:r>
+        <w:t>Check: the chapter has a clear turn; no paragraph runs longer than about 150 words; the POV does not switch without a break.</w:t>
+      </w:r>
+    </w:p>
+    <w:p>
+      <w:pPr>
+        <w:pStyle w:val="Heading2"/>
+      </w:pPr>
+      <w:r>
+        <w:t>Prompt 4: paragraph and line formatting</w:t>
+      </w:r>
+    </w:p>
+    <w:p>
+      <w:pPr>
+        <w:pStyle w:val="FirstParagraph"/>
+      </w:pPr>
+      <w:r>
+        <w:t>Format every paragraph as plain text with one blank line between paragraphs. Do not use hard line breaks inside a paragraph.</w:t>
+      </w:r>
+    </w:p>
+    <w:p>
+      <w:pPr>
+        <w:pStyle w:val="FirstParagraph"/>
+      </w:pPr>
+      <w:r>
+        <w:t>Use straight quotation marks consistently, or curly quotes consistently, one style across the book (match the existing manuscript).</w:t>
+      </w:r>
+    </w:p>
+    <w:p>
+      <w:pPr>
+        <w:pStyle w:val="FirstParagraph"/>
+      </w:pPr>
+      <w:r>
+        <w:t>Italics for thoughts, documents, and titles of works, marked with single asterisks. Bold only for a chapter-level warning or a character's shouted word, sparingly.</w:t>
+      </w:r>
+    </w:p>
+    <w:p>
+      <w:pPr>
+        <w:pStyle w:val="FirstParagraph"/>
+      </w:pPr>
+      <w:r>
+        <w:t>Scene breaks: a centred "* * *" line, not a blank line alone, so the break survives the EPUB.</w:t>
+      </w:r>
+    </w:p>
+    <w:p>
+      <w:pPr>
+        <w:pStyle w:val="FirstParagraph"/>
+      </w:pPr>
+      <w:r>
+        <w:t>Dialogue: each new speaker starts a new paragraph.</w:t>
+      </w:r>
+    </w:p>
+    <w:p>
+      <w:pPr>
+        <w:pStyle w:val="FirstParagraph"/>
+      </w:pPr>
+      <w:r>
+        <w:t>Avoid em-dash overuse; one dash per paragraph is a good ceiling.</w:t>
+      </w:r>
+    </w:p>
+    <w:p>
+      <w:pPr>
+        <w:pStyle w:val="FirstParagraph"/>
+      </w:pPr>
+      <w:r>
+        <w:t>Check: no line is wider than a phone screen when converted; no stray asterisks, brackets, or markdown errors remain; scene breaks are consistent.</w:t>
+      </w:r>
+    </w:p>
+    <w:p>
+      <w:pPr>
+        <w:pStyle w:val="Heading2"/>
+      </w:pPr>
+      <w:r>
+        <w:t>Prompt 5: title, headings, and alignment (stylesheet)</w:t>
+      </w:r>
+    </w:p>
+    <w:p>
+      <w:pPr>
+        <w:pStyle w:val="FirstParagraph"/>
+      </w:pPr>
+      <w:r>
+        <w:t>Write or confirm style.css so that:</w:t>
+      </w:r>
+    </w:p>
+    <w:p>
+      <w:pPr>
+        <w:pStyle w:val="FirstParagraph"/>
+      </w:pPr>
+      <w:r>
+        <w:t>- Body text is justified, with a first-line indent of about 1.5em, except the first paragraph after a heading (no indent).</w:t>
+      </w:r>
+    </w:p>
+    <w:p>
+      <w:pPr>
+        <w:pStyle w:val="FirstParagraph"/>
+      </w:pPr>
+      <w:r>
+        <w:t>- Chapter headings are centred, large, and given space above (page break before each chapter).</w:t>
+      </w:r>
+    </w:p>
+    <w:p>
+      <w:pPr>
+        <w:pStyle w:val="FirstParagraph"/>
+      </w:pPr>
+      <w:r>
+        <w:t>- The title page is centred, with the title as the largest text, the subtitle smaller and in italics, and the author last.</w:t>
+      </w:r>
+    </w:p>
+    <w:p>
+      <w:pPr>
+        <w:pStyle w:val="FirstParagraph"/>
+      </w:pPr>
+      <w:r>
+        <w:t>- Margins are small and even (about 5 percent). No fixed pixel widths. No text in images except the cover.</w:t>
+      </w:r>
+    </w:p>
+    <w:p>
+      <w:pPr>
+        <w:pStyle w:val="FirstParagraph"/>
+      </w:pPr>
+      <w:r>
+        <w:t>- Fonts: embedded EB Garamond, with a serif fallback (Georgia, serif). Body size 1em, line height about 1.5.</w:t>
+      </w:r>
+    </w:p>
+    <w:p>
+      <w:pPr>
+        <w:pStyle w:val="FirstParagraph"/>
+      </w:pPr>
+      <w:r>
+        <w:t>- Colour: black text on white only. Do not rely on colour to carry meaning.</w:t>
+      </w:r>
+    </w:p>
+    <w:p>
+      <w:pPr>
+        <w:pStyle w:val="FirstParagraph"/>
+      </w:pPr>
+      <w:r>
+        <w:t>Check: run epubcheck; check the stylesheet loads (no RSC-007 errors); the first paragraph after each heading is not indented.</w:t>
+      </w:r>
+    </w:p>
+    <w:p>
+      <w:pPr>
+        <w:pStyle w:val="Heading2"/>
+      </w:pPr>
+      <w:r>
+        <w:t>Prompt 6: emphasis and visual interest (within ebook limits)</w:t>
+      </w:r>
+    </w:p>
+    <w:p>
+      <w:pPr>
+        <w:pStyle w:val="FirstParagraph"/>
+      </w:pPr>
+      <w:r>
+        <w:t>Add interest with structure, not decoration:</w:t>
+      </w:r>
+    </w:p>
+    <w:p>
+      <w:pPr>
+        <w:pStyle w:val="FirstParagraph"/>
+      </w:pPr>
+      <w:r>
+        <w:t>- A short epigraph or one-line quote under the title page, if the topic supports it, with a credit line.</w:t>
+      </w:r>
+    </w:p>
+    <w:p>
+      <w:pPr>
+        <w:pStyle w:val="FirstParagraph"/>
+      </w:pPr>
+      <w:r>
+        <w:t>- Chapter titles that promise a clue or a feeling ("The Silver Link" over "Chapter 20").</w:t>
+      </w:r>
+    </w:p>
+    <w:p>
+      <w:pPr>
+        <w:pStyle w:val="FirstParagraph"/>
+      </w:pPr>
+      <w:r>
+        <w:t>- A bold character name at the top of a document excerpt, once, for clarity.</w:t>
+      </w:r>
+    </w:p>
+    <w:p>
+      <w:pPr>
+        <w:pStyle w:val="FirstParagraph"/>
+      </w:pPr>
+      <w:r>
+        <w:t>- Italic sound cues or document text, used consistently.</w:t>
+      </w:r>
+    </w:p>
+    <w:p>
+      <w:pPr>
+        <w:pStyle w:val="FirstParagraph"/>
+      </w:pPr>
+      <w:r>
+        <w:t>- A closing "Reader's note" only if the guide allows it. Do not add promotional links the guide does not permit.</w:t>
+      </w:r>
+    </w:p>
+    <w:p>
+      <w:pPr>
+        <w:pStyle w:val="FirstParagraph"/>
+      </w:pPr>
+      <w:r>
+        <w:t>Check: every emphasis style is used consistently; no decorative fonts; the emphasis aids reading.</w:t>
+      </w:r>
+    </w:p>
+    <w:p>
+      <w:pPr>
+        <w:pStyle w:val="Heading2"/>
+      </w:pPr>
+      <w:r>
+        <w:t>Prompt 7: engagement and retention</w:t>
+      </w:r>
+    </w:p>
+    <w:p>
+      <w:pPr>
+        <w:pStyle w:val="FirstParagraph"/>
+      </w:pPr>
+      <w:r>
+        <w:t>For every chapter, answer in one sentence each: What does the reader learn? What do they fear or want now? What question is open? Make sure the open question changes at least once per chapter.</w:t>
+      </w:r>
+    </w:p>
+    <w:p>
+      <w:pPr>
+        <w:pStyle w:val="FirstParagraph"/>
+      </w:pPr>
+      <w:r>
+        <w:t>Build three reading tensions into the book: a question answered at the midpoint, a false lead that seems true for two chapters, and a final reveal that the earlier clues already support.</w:t>
+      </w:r>
+    </w:p>
+    <w:p>
+      <w:pPr>
+        <w:pStyle w:val="FirstParagraph"/>
+      </w:pPr>
+      <w:r>
+        <w:t>Keep the cast memorable: give each major character one habit or phrase that identifies them on the page.</w:t>
+      </w:r>
+    </w:p>
+    <w:p>
+      <w:pPr>
+        <w:pStyle w:val="FirstParagraph"/>
+      </w:pPr>
+      <w:r>
+        <w:t>Check: no chapter lacks a question; the reveal is fair (every clue is shown earlier); no character speaks in a way that makes them indistinguishable from another.</w:t>
+      </w:r>
+    </w:p>
+    <w:p>
+      <w:pPr>
+        <w:pStyle w:val="Heading2"/>
+      </w:pPr>
+      <w:r>
+        <w:t>Prompt 8: metadata and front matter</w:t>
+      </w:r>
+    </w:p>
+    <w:p>
+      <w:pPr>
+        <w:pStyle w:val="FirstParagraph"/>
+      </w:pPr>
+      <w:r>
+        <w:t>Complete metadata.json: title, subtitle, author "Skybee", language "en-US", guide_version "2.1", series and series_number, a description of 150 to 400 words that sells the book without spoilers, exactly seven keywords each under 50 characters, two KDP categories confirmed in the category pool, kdp_select "enroll for 90 days" for series books, and the exact AI disclosure.</w:t>
+      </w:r>
+    </w:p>
+    <w:p>
+      <w:pPr>
+        <w:pStyle w:val="FirstParagraph"/>
+      </w:pPr>
+      <w:r>
+        <w:t>Run make_kdp_answers.py so KDP-FORM-ANSWERS.md matches metadata.json.</w:t>
+      </w:r>
+    </w:p>
+    <w:p>
+      <w:pPr>
+        <w:pStyle w:val="FirstParagraph"/>
+      </w:pPr>
+      <w:r>
+        <w:t>Check: check_book.py metadata checks pass.</w:t>
+      </w:r>
+    </w:p>
+    <w:p>
+      <w:pPr>
+        <w:pStyle w:val="Heading2"/>
+      </w:pPr>
+      <w:r>
+        <w:t>Prompt 9: the build and the proof</w:t>
+      </w:r>
+    </w:p>
+    <w:p>
+      <w:pPr>
+        <w:pStyle w:val="FirstParagraph"/>
+      </w:pPr>
+      <w:r>
+        <w:t>Run, in order:</w:t>
+      </w:r>
+    </w:p>
+    <w:p>
+      <w:pPr>
+        <w:pStyle w:val="FirstParagraph"/>
+      </w:pPr>
+      <w:r>
+        <w:t>1. python3 scripts/build_epub.py "ebooks-Final/&lt;folder&gt;"  (the output must report cover true when a cover exists)</w:t>
+      </w:r>
+    </w:p>
+    <w:p>
+      <w:pPr>
+        <w:pStyle w:val="FirstParagraph"/>
+      </w:pPr>
+      <w:r>
+        <w:t>2. Run epubcheck with the Java jar from the pip package. Require 0 errors and 0 warnings.</w:t>
+      </w:r>
+    </w:p>
+    <w:p>
+      <w:pPr>
+        <w:pStyle w:val="FirstParagraph"/>
+      </w:pPr>
+      <w:r>
+        <w:t>3. python3 scripts/check_book.py "ebooks-Final/&lt;folder&gt;". Only cover checks may fail, and only before the cover is approved.</w:t>
+      </w:r>
+    </w:p>
+    <w:p>
+      <w:pPr>
+        <w:pStyle w:val="FirstParagraph"/>
+      </w:pPr>
+      <w:r>
+        <w:t>4. Read the first chapter and the final chapter in the built EPUB (unzip and read the XHTML). Confirm the title page, copyright, table of contents, and chapter order.</w:t>
+      </w:r>
+    </w:p>
+    <w:p>
+      <w:pPr>
+        <w:pStyle w:val="FirstParagraph"/>
+      </w:pPr>
+      <w:r>
+        <w:t>5. Record every result in review-notes.md. Do not claim a check passed that did not run.</w:t>
+      </w:r>
+    </w:p>
+    <w:p>
+      <w:pPr>
+        <w:pStyle w:val="Heading2"/>
+      </w:pPr>
+      <w:r>
+        <w:t>Prompt 10: handoff</w:t>
+      </w:r>
+    </w:p>
+    <w:p>
+      <w:pPr>
+        <w:pStyle w:val="FirstParagraph"/>
+      </w:pPr>
+      <w:r>
+        <w:t>Write review-notes.md with: the structure (chapter count and beat mapping), word count, checks run and their results, checks not run and why, continuity fixes, open questions for the owner, and the cover status. Then stop. Do not commit or publish without owner approval.</w:t>
+      </w:r>
+    </w:p>
+    <w:p>
+      <w:pPr>
+        <w:pStyle w:val="Heading2"/>
+      </w:pPr>
+      <w:r>
+        <w:t>Quick checklist (paste into any job)</w:t>
+      </w:r>
+    </w:p>
+    <w:p>
+      <w:pPr>
+        <w:pStyle w:val="Compact"/>
+      </w:pPr>
+      <w:r>
+        <w:t>☐ Title page in the first 12 lines; title, subtitle, author correct</w:t>
+      </w:r>
+    </w:p>
+    <w:p>
+      <w:pPr>
+        <w:pStyle w:val="Compact"/>
+      </w:pPr>
+      <w:r>
+        <w:t>☐ Copyright and fiction disclaimer present; AI disclosure present and last</w:t>
+      </w:r>
+    </w:p>
+    <w:p>
+      <w:pPr>
+        <w:pStyle w:val="Compact"/>
+      </w:pPr>
+      <w:r>
+        <w:t>☐ Table of contents generated by the build; no page numbers in the EPUB</w:t>
+      </w:r>
+    </w:p>
+    <w:p>
+      <w:pPr>
+        <w:pStyle w:val="Compact"/>
+      </w:pPr>
+      <w:r>
+        <w:t>☐ Chapters numbered in order with no gaps; each chapter has a turn and a hook</w:t>
+      </w:r>
+    </w:p>
+    <w:p>
+      <w:pPr>
+        <w:pStyle w:val="Compact"/>
+      </w:pPr>
+      <w:r>
+        <w:t>☐ Paragraphs clean; scene breaks consistent; no stray markup</w:t>
+      </w:r>
+    </w:p>
+    <w:p>
+      <w:pPr>
+        <w:pStyle w:val="Compact"/>
+      </w:pPr>
+      <w:r>
+        <w:t>☐ Headings centred; body justified; first paragraphs unindented</w:t>
+      </w:r>
+    </w:p>
+    <w:p>
+      <w:pPr>
+        <w:pStyle w:val="Compact"/>
+      </w:pPr>
+      <w:r>
+        <w:t>☐ One body font and one heading font, embedded and licensed</w:t>
+      </w:r>
+    </w:p>
+    <w:p>
+      <w:pPr>
+        <w:pStyle w:val="Compact"/>
+      </w:pPr>
+      <w:r>
+        <w:t>☐ Emphasis (bold, italic) used consistently; colour only on the cover</w:t>
+      </w:r>
+    </w:p>
+    <w:p>
+      <w:pPr>
+        <w:pStyle w:val="Compact"/>
+      </w:pPr>
+      <w:r>
+        <w:t>☐ Names distinct; facts checked; research claims sourced</w:t>
+      </w:r>
+    </w:p>
+    <w:p>
+      <w:pPr>
+        <w:pStyle w:val="Compact"/>
+      </w:pPr>
+      <w:r>
+        <w:t>☐ epubcheck 0 errors, 0 warnings; check_book.py passes apart from cover items awaiting approval</w:t>
+      </w:r>
+    </w:p>
+    <w:p>
+      <w:pPr>
+        <w:pStyle w:val="Compact"/>
+      </w:pPr>
+      <w:r>
+        <w:t>☐ review-notes.md written with every check recorded honestly</w:t>
+      </w:r>
+    </w:p>
     <w:sectPr/>
   </w:body>
 </w:document>

</xml_diff>